<commit_message>
Reframe PCF manuscript compression section
</commit_message>
<xml_diff>
--- a/docs/PAPER_DRAFT_v5.docx
+++ b/docs/PAPER_DRAFT_v5.docx
@@ -47,7 +47,7 @@
         <w:spacing w:after="100" w:line="259" w:lineRule="auto"/>
       </w:pPr>
       <w:r>
-        <w:t>Vision transformers represent an image as a fixed sequence of patch slots, yet the role of each slot’s image-specific content in late layers remains unclear. We causally replace selected late-layer patch activations with class-agnostic calibration surrogates while preserving token slots, sequence length, model weights, and all subsequent computation. In the tested models, this fixed-slot content replacement reveals conditional fungibility bounded by feature geometry and token diversity, distinct from token pruning or merging. Mechanistic audits associate replaceability with anisotropic functional sensitivity, coherent accumulation and sign-dependent cancellation through the attention Value path, and declining normalized effective rank across all four tested models; near-null expansion at the primary threshold is evident in three models but small in DINOv2. For compression, an end-to-end downstream Jacobian serves as an offline, per-image oracle for the operator-aware objective; we evaluate the resulting variants on 1,000 held-out images per architecture. At the most aggressive tested budgets, operator-aware variants improve classification accuracy by 4.2–12.0 percentage points over the strongest pruning baseline for each architecture; the accuracy-token frontier shifts on three of four architectures, while a strong merging baseline remains competitive. Together, these findings provide a mechanistic account of late-layer patch-content fungibility through downstream functional geometry and attention-mediated cancellation, and demonstrate how this understanding can guide operator-aware token compression.</w:t>
+        <w:t>Vision transformers represent images as fixed sequences of patch slots, yet the role of each slot’s image-specific content in late layers remains unclear. We causally replace selected late-layer patch activations with class-agnostic calibration surrogates while preserving token positions, sequence length, model weights, and all subsequent computation. Across four tested vision-transformer families, this fixed-slot intervention reveals conditional patch-content fungibility bounded by feature geometry and token-position diversity. Mechanistic analyses associate replaceability with anisotropic functional sensitivity, coherent accumulation and sign-dependent cancellation along the attention Value path, and declining normalized effective rank; near-null expansion at the primary threshold is evident in three models but small in DINOv2. As a bounded application, we evaluate operator-aware compression using an offline, per-image downstream-Jacobian oracle on 1,000 held-out images per architecture. At the most aggressive tested budgets, operator-aware variants improve Top-1 by 4.2–12.0 percentage points over the strongest pruning baseline, but ToMe remains competitive and Full-J is not uniformly better than Group Mean or ToMe. In a separate held-out classifier-carrier study, calibration-frozen feature-subspace corrections yield architecture-dependent outcomes, including losses for DeiT-Small and DINOv2 and a modest gain in one tested architecture; measured full-model throughput adds only one narrow frontier point among the tested architectures. The evidence supports Patch-Content Fungibility as a mechanistic account and an oracle-level compression opportunity, but does not establish a general deployment advantage.</w:t>
       </w:r>
     </w:p>
     <w:p>
@@ -146,7 +146,7 @@
         <w:spacing w:after="100" w:line="259" w:lineRule="auto"/>
       </w:pPr>
       <w:r>
-        <w:t>This leads to three linked questions: whether a late patch slot needs its image-specific activation or can carry a class-agnostic surrogate; how feature geometry, token-position coherence, and downstream transmission jointly bound replacement tolerance; and whether those mechanisms can inform operator-aware compression, including where the translation fails. We study these questions as a ViT-specific account of Patch-Content Fungibility (PCF), with compression as a bounded application: a separate carrier study tests translation to nonlinear classification and measured throughput.</w:t>
+        <w:t>This leads to three linked questions: whether a late patch slot needs its image-specific activation or can carry a class-agnostic surrogate; how feature geometry, token-position coherence, and downstream transmission jointly bound replacement tolerance; and whether those mechanisms can inform operator-aware compression, including where the translation fails. We study these questions as a ViT-specific account of Patch-Content Fungibility (PCF). The argument proceeds from fixed-slot causal replacement, through geometric and functional mechanisms, to compression as a bounded application whose nonlinear classification and measured throughput must be assessed separately.</w:t>
       </w:r>
     </w:p>
     <w:p>
@@ -8876,7 +8876,7 @@
         <w:spacing w:after="100" w:line="259" w:lineRule="auto"/>
       </w:pPr>
       <w:r>
-        <w:t xml:space="preserve">A separate post-hoc sensitivity analysis on 200 class-randomized calibration images found that factor 10 attained or tied the highest Top-1 in five of eight architecture–budget cells and was within 0.5 percentage points of the maximum in the other three (Supplementary Section S15). The maximizing factor varied across cells, while smaller factors consistently lowered the linearized residual and increased carrier displacement; factor 10 reduced nonlinear logit damage relative to Group Mean in all eight cells. These results support factor 10 as a reasonable empirical tradeoff in this cohort, not as a demonstrated global optimum, and do not verify the historical timing or rationale for its selection. The per-image closed-form carrier update is</w:t>
+        <w:t>A separate post-hoc sensitivity analysis on 200 class-randomized calibration images found that factor 10 attained or tied the highest Top-1 in five of eight architecture–budget cells and was within 0.5 percentage points of the maximum in the other three (Supplementary Section S15). The maximizing factor varied across cells, while smaller factors consistently lowered the linearized residual and increased carrier displacement; factor 10 reduced nonlinear logit damage relative to Group Mean in all eight cells. These results support factor 10 as a reasonable empirical tradeoff in this cohort, not as a demonstrated global optimum, and do not verify the historical timing or rationale for its selection. The per-image closed-form carrier update is</w:t>
       </w:r>
     </w:p>
     <w:tbl>
@@ -9860,6 +9860,12 @@
                   </w:rPr>
                   <m:t xml:space="preserve">=1, </m:t>
                 </m:r>
+                <m:r>
+                  <w:rPr>
+                    <w:rFonts w:ascii="Cambria Math" w:hAnsi="Cambria Math"/>
+                  </w:rPr>
+                  <m:t xml:space="preserve"> </m:t>
+                </m:r>
                 <m:sSub>
                   <m:sSubPr>
                     <m:ctrlPr>
@@ -10059,7 +10065,6 @@
         <w:rPr>
           <w:rFonts w:ascii="Times New Roman" w:hAnsi="Times New Roman"/>
         </w:rPr>
-        <w:lastRenderedPageBreak/>
         <w:t>6.2 Confirmatory Compression Results</w:t>
       </w:r>
     </w:p>
@@ -10068,7 +10073,7 @@
         <w:spacing w:after="100" w:line="259" w:lineRule="auto"/>
       </w:pPr>
       <w:r>
-        <w:t>At each architecture’s most aggressive tested token budget, Table II reports the exact Top-1 comparison among the best pruning baseline, Group Mean, ToMe, the full-J oracle, and its rank-16 and rank-32 approximations. The selected budgets differ by architecture (32 retained tokens for DeiT-Tiny, DeiT-Small, and ViT-B/16 AugReg; 42 for DINOv2 ViT-S/14), so the rows are within-architecture comparisons rather than a matched token-count experiment. Figure 8 presents the full accuracy-token curves.</w:t>
+        <w:t>At each architecture’s most aggressive tested token budget, Table II compares the strongest of the tested conventional pruning baselines with Group Mean, ToMe, the per-image Full-J oracle, and rank-16 and rank-32 operator-aware variants. Operator-aware variants exceed the strongest pruning result by 4.2–12.0 percentage points in these rows. The margin is smaller against Group Mean and ToMe: Full-J ranges from 0.6 points below Group Mean for DeiT-Small to 1.3 points above it for DINOv2, and is 0.6 points below ToMe for DeiT-Small while exceeding it in the other three rows. The rank-restricted results also vary by architecture. These comparisons therefore do not show universal dominance over the stronger merging baselines. Full-J requires an image-specific downstream Jacobian and is an offline oracle, not a practical inference method. The budgets differ by architecture (32 retained tokens for DeiT-Tiny, DeiT-Small, and ViT-B/16 AugReg; 42 for DINOv2 ViT-S/14), so rows are within-architecture comparisons rather than a matched token-count experiment. Figure 8 presents the full accuracy-token curves.</w:t>
       </w:r>
     </w:p>
     <w:p>
@@ -11350,7 +11355,7 @@
         <w:rPr>
           <w:rFonts w:ascii="Times New Roman" w:hAnsi="Times New Roman"/>
         </w:rPr>
-        <w:t>7. Practical Carrier Evaluation</w:t>
+        <w:t>7. From Operator-Aware Optimization to Practical Compression</w:t>
       </w:r>
     </w:p>
     <w:p>
@@ -11361,7 +11366,7 @@
         <w:rPr>
           <w:rFonts w:ascii="Times New Roman" w:hAnsi="Times New Roman"/>
         </w:rPr>
-        <w:t>7.1 Static Feature-PCA Corrections</w:t>
+        <w:t>7.1 Calibration-Frozen Carrier Corrections</w:t>
       </w:r>
     </w:p>
     <w:p>
@@ -11369,7 +11374,21 @@
         <w:spacing w:after="100" w:line="259" w:lineRule="auto"/>
       </w:pPr>
       <w:r>
-        <w:t>In the separate operator-space cohort, static Feature-PCA at q=16 recovers 54.91% of the restricted-oracle ‖J E‖ gain for DeiT-Small. In a separate q=16 ablation, shuffling PCA coordinates raises mean ‖J E‖ from 6.602 to 8.076 (Δ=1.474). Both are linearized operator-space results, not classifier-level recovery rates.</w:t>
+        <w:t>The Full-J and restricted carrier oracles choose an image-conditioned correction using that image’s downstream Jacobian. To test whether some of this operator-space benefit could be retained with reusable quantities, the calibration-frozen Feature-PCA variant constructs a low-dimensional feature basis from calibration activations and estimates average correction coefficients on calibration data. These directions and coefficients are then frozen for evaluation, avoiding a per-image Jacobian solve. In the classifier-carrier protocol, the correction is added to fixed-spatial Group Mean carriers and evaluated with the actual model suffix and classifier; the calibration and evaluation images are disjoint.</w:t>
+      </w:r>
+    </w:p>
+    <w:p>
+      <w:pPr>
+        <w:spacing w:after="100" w:line="259" w:lineRule="auto"/>
+      </w:pPr>
+      <w:r>
+        <w:rPr>
+          <w:rFonts w:ascii="Times New Roman" w:hAnsi="Times New Roman"/>
+          <w:i w:val="0"/>
+          <w:color w:val="202A32"/>
+          <w:sz w:val="20"/>
+        </w:rPr>
+        <w:t>For DeiT-Small at q=16, the calibration-average correction reduces the held-out linearized residual from 12.5234 for Group Mean to 9.2724. The per-image restricted q=16 oracle reaches 6.6023, so the calibration-average correction recovers 54.91% of that restricted-oracle residual gain. This operator-space audit uses 500 calibration images and 100 held-out operator-space images; it is not a nonlinear classification recovery rate. In a separate q=16 control on that cohort, shuffling the PCA coordinates raises mean ‖J E‖ from 6.6023 to 8.0763 (Δ=1.4740), consistent with the tested directions carrying relevant operator-space structure. Neither result establishes an accuracy or speed benefit.</w:t>
       </w:r>
     </w:p>
     <w:p>
@@ -11380,7 +11399,7 @@
         <w:rPr>
           <w:rFonts w:ascii="Times New Roman" w:hAnsi="Times New Roman"/>
         </w:rPr>
-        <w:t>7.2 Classification and Throughput Evaluation</w:t>
+        <w:t>7.2 Held-Out Classification and Throughput</w:t>
       </w:r>
     </w:p>
     <w:p>
@@ -11388,7 +11407,7 @@
         <w:spacing w:after="100" w:line="259" w:lineRule="auto"/>
       </w:pPr>
       <w:r>
-        <w:t>Static Feature-PCA does not consistently improve classifier accuracy over Hybrid Group Mean: both DeiT-Small budgets and the aggressive DINOv2 budget are at or below the baseline, while ViT-B/16 AugReg shows a modest positive case (Table III).</w:t>
+        <w:t>We evaluate actual nonlinear predictions with the separate classifier-carrier protocol: PCA directions and average coefficients are fitted using 500 calibration images (seed 7101), then tested on 1,000 disjoint held-out images per architecture (seed 9201). Table III compares Static Feature-PCA with Hybrid Group Mean, the baseline for this experiment. Results vary by architecture and budget: q=16 is 1.5 pp below Hybrid Group Mean for DeiT-Small at B=49 and 4.5 pp below it for DINOv2 at B=42, while ViT-B/16 AugReg shows a modest +0.7 pp at B=49. This Hybrid Group Mean result is distinct from the Group Mean condition in the confirmatory compression benchmark (Table II).</w:t>
       </w:r>
     </w:p>
     <w:p>
@@ -12279,7 +12298,7 @@
         <w:spacing w:after="100" w:line="259" w:lineRule="auto"/>
       </w:pPr>
       <w:r>
-        <w:t>The measured held-out classifier-carrier accuracy–throughput boundary at batch size 64 is shown in Supplementary Figure S13.</w:t>
+        <w:t>Throughput was measured separately with the actual full-model call at batch size 64; it is not inferred from operator-space residuals. Supplementary Figure S13 shows the measured accuracy–throughput boundary: q=16 contributes a narrow ViT-B/16 AugReg point at some batch sizes, while q=32 and selective q=16 do not establish a general frontier improvement. For example, at B=98 and batch size 64, ViT-B q=16 is 73.7% Top-1 at 263 images/s versus 73.6% at 297 images/s for Hybrid Group Mean. The tested result is a small accuracy–throughput tradeoff on one architecture, not a general efficiency gain.</w:t>
       </w:r>
     </w:p>
     <w:p>
@@ -12287,7 +12306,22 @@
         <w:spacing w:after="100" w:line="259" w:lineRule="auto"/>
       </w:pPr>
       <w:r>
-        <w:t>Calibration-frozen selective risk gating also lacks a consistent classifier benefit: at DeiT-Small budget 98 it reaches 75.8% versus 76.4% for Hybrid Group Mean, and at DINOv2 budget 42 it reaches 58.5% versus 61.3%. The exploratory operator-space gate has area under the receiver operating characteristic curve (AUROC) 0.784. On the measured accuracy-throughput frontier, Clean is non-dominated in several regimes, Group Mean is a practical batched baseline, and q=16 adds a narrow ViT-B/16 AugReg point at some batch sizes; q=32 and selective q=16 do not establish a general frontier improvement. These timings cover the full model call rather than isolated operator overhead.</w:t>
+        <w:t>Calibration-frozen selective gating is not consistently beneficial: at DeiT-Small B=98 it reaches 75.8% versus 76.4% for Hybrid Group Mean, and at DINOv2 B=42 it reaches 58.5% versus 61.3%. The exploratory operator-space gate has area under the receiver operating characteristic curve (AUROC) 0.784, which does not establish classification gains. A separate sequence-collapse experiment (Supplementary Section S8) found that shorter sequences reduced measured latency, while random pruning and an unweighted centroid matched or outperformed the tested multiplicity-aware carrier in accuracy. Those latency results come from a different protocol and do not measure Static Feature-PCA; other S8 variants likewise show no general classifier or throughput gains.</w:t>
+      </w:r>
+    </w:p>
+    <w:p>
+      <w:pPr>
+        <w:pStyle w:val="Heading2"/>
+        <w:keepNext/>
+      </w:pPr>
+      <w:r>
+        <w:rPr>
+          <w:rFonts w:ascii="Times New Roman" w:hAnsi="Times New Roman"/>
+          <w:b/>
+          <w:color w:val="000000"/>
+          <w:sz w:val="23"/>
+        </w:rPr>
+        <w:t>7.3 The Oracle-to-Deployment Gap</w:t>
       </w:r>
     </w:p>
     <w:p>
@@ -12295,7 +12329,13 @@
         <w:spacing w:after="100" w:line="259" w:lineRule="auto"/>
       </w:pPr>
       <w:r>
-        <w:t>Additional exploratory correction variants are summarized in Supplementary Section S8; they do not change the distinction between operator-space performance and classifier or deployment benefit.</w:t>
+        <w:rPr>
+          <w:rFonts w:ascii="Times New Roman" w:hAnsi="Times New Roman"/>
+          <w:i w:val="0"/>
+          <w:color w:val="202A32"/>
+          <w:sz w:val="20"/>
+        </w:rPr>
+        <w:t>The results separate three levels of evidence. First, operator-aware optimization can reduce a linearized downstream residual: Full-J is the per-image oracle, and the calibration-average q=16 correction retains part of the restricted-oracle gain in the operator-space cohort. Second, nonlinear classification is not determined by that residual: the held-out carrier results are mixed, with clear losses in some architecture–budget settings. Third, the measured accuracy–throughput frontier improves only narrowly, with no general advantage established for the tested lower-cost carrier approximations. A local first-order approximation, the difference between a fixed calibration correction and an image-conditioned optimum, and nonlinear downstream interactions are plausible explanations for this gap; the experiments do not identify a definitive cause of Static Feature-PCA’s classification limitations. PCF therefore establishes a mechanistic account and oracle-level opportunities, while the tested practical carrier approximations do not establish a general deployment advantage.</w:t>
       </w:r>
     </w:p>
     <w:p>
@@ -12314,7 +12354,7 @@
         <w:spacing w:after="100" w:line="259" w:lineRule="auto"/>
       </w:pPr>
       <w:r>
-        <w:t>Mechanistic evidence comes from the finite cohorts in Table I and four pretrained vision-transformer families evaluated on one ImageNet validation subset; broader model and task coverage remains untested. The exploratory joint-stream grid reuses its N=100 images for direction estimation and response measurement, so it is descriptive rather than held out. The margin-gradient and readout-Jacobian analyses characterize local, first-order behavior, and a threshold-defined near-null fraction does not establish exact nonlinear invariance. The full-J compression objective is an offline oracle requiring per-image Jacobian construction. Classifier-carrier results show that reducing linearized error alone is not sufficient for a deployment gain; measured full-model runtime is specific to the tested hardware, batch sizes, and implementations and does not isolate operator overhead.</w:t>
+        <w:t>Mechanistic evidence comes from the finite, protocol-specific cohorts in Table I and four pretrained ViT families evaluated on one ImageNet validation subset; broader model and task coverage remains untested. The exploratory joint-stream grid reuses its N=100 images for direction estimation and response measurement, so it is descriptive rather than held out. The margin-gradient and readout-Jacobian analyses characterize local, first-order behavior, and a threshold-defined near-null fraction does not establish exact nonlinear invariance. Full-J requires a per-image Jacobian and is an offline oracle. The classifier-carrier and operator-space studies use separate cohorts and endpoints; their results cannot be merged into a single accuracy or residual estimate. Measured full-model runtime is specific to the tested hardware, batch sizes, and implementations. The data show that lowering linearized error alone does not guarantee better nonlinear classification or a better measured accuracy–throughput frontier, and do not identify the cause of the practical carrier’s limitations.</w:t>
       </w:r>
     </w:p>
     <w:p>
@@ -12333,62 +12373,7 @@
         <w:spacing w:after="100" w:line="259" w:lineRule="auto"/>
       </w:pPr>
       <w:r>
-        <w:t xml:space="preserve">Across four tested ViT families, late-layer patch content is conditionally replaceable under feature-geometry and token-position-diversity constraints. The mechanism studies associate this tolerance with architecture-dependent functional sensitivity and coherent Value-path accumulation and cancellation. Normalized effective rank declines with depth in all four models, while near-null expansion at the </w:t>
-      </w:r>
-      <m:oMath>
-        <m:sSup>
-          <m:sSupPr>
-            <m:ctrlPr>
-              <w:rPr>
-                <w:rFonts w:ascii="Cambria Math" w:hAnsi="Cambria Math"/>
-              </w:rPr>
-            </m:ctrlPr>
-          </m:sSupPr>
-          <m:e>
-            <m:r>
-              <w:rPr>
-                <w:rFonts w:ascii="Cambria Math" w:hAnsi="Cambria Math"/>
-              </w:rPr>
-              <m:t>10</m:t>
-            </m:r>
-          </m:e>
-          <m:sup>
-            <m:r>
-              <w:rPr>
-                <w:rFonts w:ascii="Cambria Math" w:hAnsi="Cambria Math"/>
-              </w:rPr>
-              <m:t>-3</m:t>
-            </m:r>
-          </m:sup>
-        </m:sSup>
-        <m:sSub>
-          <m:sSubPr>
-            <m:ctrlPr>
-              <w:rPr>
-                <w:rFonts w:ascii="Cambria Math" w:hAnsi="Cambria Math"/>
-              </w:rPr>
-            </m:ctrlPr>
-          </m:sSubPr>
-          <m:e>
-            <m:r>
-              <w:rPr>
-                <w:rFonts w:ascii="Cambria Math" w:hAnsi="Cambria Math"/>
-              </w:rPr>
-              <m:t>λ</m:t>
-            </m:r>
-          </m:e>
-          <m:sub>
-            <m:r>
-              <w:rPr>
-                <w:rFonts w:ascii="Cambria Math" w:hAnsi="Cambria Math"/>
-              </w:rPr>
-              <m:t>max</m:t>
-            </m:r>
-          </m:sub>
-        </m:sSub>
-      </m:oMath>
-      <w:r>
-        <w:t xml:space="preserve"> threshold is strong in three and small in DINOv2. For the tested four-family mixture of 100 perturbation vectors per model, end-to-end Jacobian predictions are more strongly associated with measured damage than single-block predictions. At the most aggressive tested budgets, operator-aware compression improves on the strongest pruning baseline by 4.2–12.0 percentage points and shifts the accuracy-token frontier in three of four architectures, while ToMe remains competitive and rank-16/32 outcomes vary by architecture and budget. The per-image Jacobian remains an offline oracle, and the practical carrier results do not establish a general deployment gain. Together, these findings link fixed-slot patch-content fungibility to downstream functional geometry and attention-mediated cancellation and show how these mechanisms can guide operator-aware token compression.</w:t>
+        <w:t>Across four tested ViT families, late-layer patch content is conditionally replaceable under feature-geometry and token-position-diversity constraints. The mechanistic evidence links this fixed-slot intervention to architecture-dependent functional sensitivity, coherent Value-path accumulation and cancellation, and depth-varying effective rank. End-to-end Jacobian predictions are more strongly associated with measured damage than single-block predictions under the tested mixture of 100 perturbation vectors per model. In the separate confirmatory compression benchmark, operator-aware variants exceed the strongest pruning baselines by 4.2–12.0 percentage points at the most aggressive tested budgets, but ToMe remains competitive, Group Mean is not uniformly worse, and rank-restricted outcomes vary across architectures. The per-image Full-J Jacobian is an offline oracle. Calibration-frozen carrier corrections yield mixed nonlinear classification results and only a narrow measured accuracy–throughput frontier point. Thus, PCF provides a mechanistic account of patch-content fungibility and an operator-aware compression opportunity, but the tested practical approximations do not establish a general deployment advantage.</w:t>
       </w:r>
     </w:p>
     <w:p>

</xml_diff>

<commit_message>
Move practical carrier results to supplementary S13
</commit_message>
<xml_diff>
--- a/docs/PAPER_DRAFT_v5.docx
+++ b/docs/PAPER_DRAFT_v5.docx
@@ -47,7 +47,7 @@
         <w:spacing w:after="100" w:line="259" w:lineRule="auto"/>
       </w:pPr>
       <w:r>
-        <w:t>Vision transformers represent images as fixed sequences of patch slots, yet the role of each slot’s image-specific content in late layers remains unclear. We causally replace selected late-layer patch activations with class-agnostic calibration surrogates while preserving token positions, sequence length, model weights, and all subsequent computation. Across four tested vision-transformer families, this fixed-slot intervention reveals conditional patch-content fungibility bounded by feature geometry and token-position diversity. Mechanistic analyses associate replaceability with anisotropic functional sensitivity, coherent accumulation and sign-dependent cancellation along the attention Value path, and declining normalized effective rank; near-null expansion at the primary threshold is evident in three models but small in DINOv2. As a bounded application, we evaluate operator-aware compression using an offline, per-image downstream-Jacobian oracle on 1,000 held-out images per architecture. At the most aggressive tested budgets, operator-aware variants improve Top-1 by 4.2–12.0 percentage points over the strongest pruning baseline, but ToMe remains competitive and Full-J is not uniformly better than Group Mean or ToMe. In a separate held-out classifier-carrier study, calibration-frozen feature-subspace corrections yield architecture-dependent outcomes, including losses for DeiT-Small and DINOv2 and a modest gain in one tested architecture; measured full-model throughput adds only one narrow frontier point among the tested architectures. The evidence supports Patch-Content Fungibility as a mechanistic account and an oracle-level compression opportunity, but does not establish a general deployment advantage.</w:t>
+        <w:t>Vision transformers represent images as fixed sequences of patch slots, yet the role of each slot’s image-specific content in late layers remains unclear. We causally replace selected late-layer patch activations with class-agnostic calibration surrogates while preserving token positions, sequence length, model weights, and all subsequent computation. Across four tested vision-transformer families, this fixed-slot intervention reveals conditional patch-content fungibility bounded by feature geometry and token-position diversity. Mechanistic analyses associate replaceability with anisotropic functional sensitivity, coherent accumulation and sign-dependent cancellation along the attention Value path, and declining normalized effective rank; near-null expansion at the primary threshold is evident in three models but small in DINOv2. As a bounded application, we evaluate operator-aware compression using an offline, per-image downstream-Jacobian oracle on 1,000 held-out images per architecture. At the most aggressive tested budgets, operator-aware variants improve Top-1 by 4.2–12.0 percentage points over the strongest pruning baseline, but ToMe remains competitive and Full-J is not uniformly better than Group Mean or ToMe. The evidence supports Patch-Content Fungibility as a mechanistic account and an oracle-level compression opportunity, but does not establish a general deployment advantage.</w:t>
       </w:r>
     </w:p>
     <w:p>
@@ -209,7 +209,7 @@
         <w:spacing w:after="100" w:line="259" w:lineRule="auto"/>
       </w:pPr>
       <w:r>
-        <w:t>Image-based studies use frozen pretrained models on ImageNet-1k validation data. The principal replacement studies and strict confirmatory compression use disjoint calibration and evaluation cohorts, with calibration-derived quantities estimated from calibration images only. The confirmatory compression protocol freezes a 1,000-image calibration set (seed 9101) and evaluates 1,000 held-out images per architecture, one per class (seed 9201); no tuning uses held-out images. Exploratory mechanistic audits follow protocol-specific cohorts rather than one shared N=100 set. In particular, joint-stream geometry estimates feature directions and measures downstream responses on the same 100 images per model, so those outcomes are within-cohort descriptive results, not held-out estimates. N denotes the sampling unit shown in Table I; image, operator-space, and perturbation cohorts remain distinct and are never pooled.</w:t>
+        <w:t>Image-based studies use frozen pretrained models on ImageNet-1k validation data. The principal replacement studies and strict confirmatory compression use disjoint calibration and evaluation cohorts, with calibration-derived quantities estimated from calibration images only. The confirmatory compression protocol freezes a 1,000-image calibration set (seed 9101) and evaluates 1,000 held-out images per architecture, one per class (seed 9201); no tuning uses held-out images. Exploratory mechanistic audits follow protocol-specific cohorts rather than one shared N=100 set. In particular, joint-stream geometry estimates feature directions and measures downstream responses on the same 100 images per model, so those outcomes are within-cohort descriptive results, not held-out estimates. N denotes the sampling unit shown in Table I; image and perturbation cohorts remain distinct. Supplementary Section S13 describes the separate practical-carrier cohorts and operator-space endpoints.</w:t>
       </w:r>
     </w:p>
     <w:p>
@@ -233,7 +233,7 @@
         <w:spacing w:after="100" w:line="259" w:lineRule="auto"/>
       </w:pPr>
       <w:r>
-        <w:t>Summary of the primary study families, evaluation units, controls, and main findings. Cohorts and endpoints remain distinct: the multi-block unit counts held-out perturbations, while classifier-carrier and operator-space analyses use separate units.</w:t>
+        <w:t>Summary of the primary study families, evaluation units, controls, and main findings. The multi-block unit counts held-out perturbations; cohort and endpoint details remain protocol-specific.</w:t>
       </w:r>
     </w:p>
     <w:tbl>
@@ -822,6 +822,9 @@
         </w:tc>
       </w:tr>
       <w:tr>
+        <w:trPr>
+          <w:cantSplit/>
+        </w:trPr>
         <w:tc>
           <w:tcPr>
             <w:tcW w:w="2498" w:type="dxa"/>
@@ -929,124 +932,6 @@
               </w:rPr>
               <w:lastRenderedPageBreak/>
               <w:t>pruning baselines by 4.2–12.0 pp; ToMe remains competitive.</w:t>
-            </w:r>
-          </w:p>
-        </w:tc>
-      </w:tr>
-      <w:tr>
-        <w:tc>
-          <w:tcPr>
-            <w:tcW w:w="2498" w:type="dxa"/>
-            <w:tcBorders>
-              <w:bottom w:val="single" w:sz="4" w:space="0" w:color="auto"/>
-            </w:tcBorders>
-            <w:tcMar>
-              <w:top w:w="55" w:type="dxa"/>
-              <w:left w:w="65" w:type="dxa"/>
-              <w:bottom w:w="55" w:type="dxa"/>
-              <w:right w:w="65" w:type="dxa"/>
-            </w:tcMar>
-            <w:vAlign w:val="center"/>
-          </w:tcPr>
-          <w:p>
-            <w:pPr>
-              <w:rPr>
-                <w:szCs w:val="28"/>
-              </w:rPr>
-            </w:pPr>
-            <w:r>
-              <w:rPr>
-                <w:szCs w:val="28"/>
-              </w:rPr>
-              <w:lastRenderedPageBreak/>
-              <w:t>Practical carrier evaluation</w:t>
-            </w:r>
-          </w:p>
-        </w:tc>
-        <w:tc>
-          <w:tcPr>
-            <w:tcW w:w="2498" w:type="dxa"/>
-            <w:tcBorders>
-              <w:bottom w:val="single" w:sz="4" w:space="0" w:color="auto"/>
-            </w:tcBorders>
-            <w:tcMar>
-              <w:top w:w="55" w:type="dxa"/>
-              <w:left w:w="65" w:type="dxa"/>
-              <w:bottom w:w="55" w:type="dxa"/>
-              <w:right w:w="65" w:type="dxa"/>
-            </w:tcMar>
-            <w:vAlign w:val="center"/>
-          </w:tcPr>
-          <w:p>
-            <w:pPr>
-              <w:jc w:val="center"/>
-              <w:rPr>
-                <w:szCs w:val="28"/>
-              </w:rPr>
-            </w:pPr>
-            <w:r>
-              <w:rPr>
-                <w:szCs w:val="28"/>
-              </w:rPr>
-              <w:t>Classifier: N=1,000 held-out images per architecture; operator-space: N=100 held-out operator-space images (separate cohort)</w:t>
-            </w:r>
-          </w:p>
-        </w:tc>
-        <w:tc>
-          <w:tcPr>
-            <w:tcW w:w="2498" w:type="dxa"/>
-            <w:tcBorders>
-              <w:bottom w:val="single" w:sz="4" w:space="0" w:color="auto"/>
-            </w:tcBorders>
-            <w:tcMar>
-              <w:top w:w="55" w:type="dxa"/>
-              <w:left w:w="65" w:type="dxa"/>
-              <w:bottom w:w="55" w:type="dxa"/>
-              <w:right w:w="65" w:type="dxa"/>
-            </w:tcMar>
-            <w:vAlign w:val="center"/>
-          </w:tcPr>
-          <w:p>
-            <w:pPr>
-              <w:jc w:val="center"/>
-              <w:rPr>
-                <w:szCs w:val="28"/>
-              </w:rPr>
-            </w:pPr>
-            <w:r>
-              <w:rPr>
-                <w:szCs w:val="28"/>
-              </w:rPr>
-              <w:t>Separate classifier/throughput and operator-space protocols</w:t>
-            </w:r>
-          </w:p>
-        </w:tc>
-        <w:tc>
-          <w:tcPr>
-            <w:tcW w:w="2498" w:type="dxa"/>
-            <w:tcBorders>
-              <w:bottom w:val="single" w:sz="4" w:space="0" w:color="auto"/>
-            </w:tcBorders>
-            <w:tcMar>
-              <w:top w:w="55" w:type="dxa"/>
-              <w:left w:w="65" w:type="dxa"/>
-              <w:bottom w:w="55" w:type="dxa"/>
-              <w:right w:w="65" w:type="dxa"/>
-            </w:tcMar>
-            <w:vAlign w:val="center"/>
-          </w:tcPr>
-          <w:p>
-            <w:pPr>
-              <w:jc w:val="center"/>
-              <w:rPr>
-                <w:szCs w:val="28"/>
-              </w:rPr>
-            </w:pPr>
-            <w:r>
-              <w:rPr>
-                <w:szCs w:val="28"/>
-              </w:rPr>
-              <w:t>Classifier and throughput gains are mixed; operator-space gains do not establish reliable classification or general deployment improvement.</w:t>
             </w:r>
           </w:p>
         </w:tc>
@@ -1764,16 +1649,7 @@
         <w:spacing w:after="100" w:line="259" w:lineRule="auto"/>
       </w:pPr>
       <w:r>
-        <w:t>For practical carrier evaluation, q counts directions from the centered calibration activation covariance Σ</w:t>
-      </w:r>
-      <w:r>
-        <w:rPr>
-          <w:vertAlign w:val="subscript"/>
-        </w:rPr>
-        <w:t>act,ℓ</w:t>
-      </w:r>
-      <w:r>
-        <w:t>; a separate low-rank subspace of calibration-derived downstream-Jacobian targets estimates a fixed coefficient vector α. The basis and coefficients are frozen before held-out classification, which uses no evaluation labels or per-image Jacobian. The operator-space audit and classifier evaluation use separate cohorts (Table I); the latter uses 500 calibration and 1,000 held-out images per architecture. Throughput measurements include the complete model call, with 50 warm-up and 100 timed iterations per row.</w:t>
+        <w:t>Practical-carrier classifier, operator-space, and throughput procedures are described separately in Supplementary Section S13.</w:t>
       </w:r>
     </w:p>
     <w:p>
@@ -11349,24 +11225,21 @@
     </w:p>
     <w:p>
       <w:pPr>
+        <w:spacing w:after="100" w:line="259" w:lineRule="auto"/>
+      </w:pPr>
+      <w:r>
+        <w:t>The Full-J formulation is evaluated as an offline, image-conditioned oracle rather than a deployable efficient-inference algorithm. Calibration-frozen carrier approximations and measured accuracy–throughput tradeoffs are evaluated separately in Supplementary Section S13; these experiments do not establish a general deployment advantage.</w:t>
+      </w:r>
+    </w:p>
+    <w:p>
+      <w:pPr>
         <w:pStyle w:val="Heading1"/>
       </w:pPr>
       <w:r>
         <w:rPr>
           <w:rFonts w:ascii="Times New Roman" w:hAnsi="Times New Roman"/>
         </w:rPr>
-        <w:t>7. From Operator-Aware Optimization to Practical Compression</w:t>
-      </w:r>
-    </w:p>
-    <w:p>
-      <w:pPr>
-        <w:pStyle w:val="Heading2"/>
-      </w:pPr>
-      <w:r>
-        <w:rPr>
-          <w:rFonts w:ascii="Times New Roman" w:hAnsi="Times New Roman"/>
-        </w:rPr>
-        <w:t>7.1 Calibration-Frozen Carrier Corrections</w:t>
+        <w:t>7. Limitations</w:t>
       </w:r>
     </w:p>
     <w:p>
@@ -11374,7 +11247,18 @@
         <w:spacing w:after="100" w:line="259" w:lineRule="auto"/>
       </w:pPr>
       <w:r>
-        <w:t>The Full-J and restricted carrier oracles choose an image-conditioned correction using that image’s downstream Jacobian. To test whether some of this operator-space benefit could be retained with reusable quantities, the calibration-frozen Feature-PCA variant constructs a low-dimensional feature basis from calibration activations and estimates average correction coefficients on calibration data. These directions and coefficients are then frozen for evaluation, avoiding a per-image Jacobian solve. In the classifier-carrier protocol, the correction is added to fixed-spatial Group Mean carriers and evaluated with the actual model suffix and classifier; the calibration and evaluation images are disjoint.</w:t>
+        <w:t>Mechanistic evidence comes from finite, protocol-specific cohorts in Table I and four pretrained ViT families evaluated on one ImageNet validation subset; broader model and task coverage remains untested. The exploratory joint-stream grid reuses its N=100 images for direction estimation and response measurement, so it is descriptive rather than held out. The margin-gradient and readout-Jacobian analyses characterize local, first-order behavior, and a threshold-defined near-null fraction does not establish exact nonlinear invariance. Full-J requires a per-image Jacobian and is an offline oracle. The practical-carrier and operator-space studies use distinct protocols and endpoints, while measured full-model runtime is specific to the tested hardware, batch sizes, and implementations. The evidence does not establish a general deployment advantage.</w:t>
+      </w:r>
+    </w:p>
+    <w:p>
+      <w:pPr>
+        <w:pStyle w:val="Heading1"/>
+      </w:pPr>
+      <w:r>
+        <w:rPr>
+          <w:rFonts w:ascii="Times New Roman" w:hAnsi="Times New Roman"/>
+        </w:rPr>
+        <w:t>8. Conclusion</w:t>
       </w:r>
     </w:p>
     <w:p>
@@ -11382,998 +11266,7 @@
         <w:spacing w:after="100" w:line="259" w:lineRule="auto"/>
       </w:pPr>
       <w:r>
-        <w:rPr>
-          <w:rFonts w:ascii="Times New Roman" w:hAnsi="Times New Roman"/>
-          <w:i w:val="0"/>
-          <w:color w:val="202A32"/>
-          <w:sz w:val="20"/>
-        </w:rPr>
-        <w:t>For DeiT-Small at q=16, the calibration-average correction reduces the held-out linearized residual from 12.5234 for Group Mean to 9.2724. The per-image restricted q=16 oracle reaches 6.6023, so the calibration-average correction recovers 54.91% of that restricted-oracle residual gain. This operator-space audit uses 500 calibration images and 100 held-out operator-space images; it is not a nonlinear classification recovery rate. In a separate q=16 control on that cohort, shuffling the PCA coordinates raises mean ‖J E‖ from 6.6023 to 8.0763 (Δ=1.4740), consistent with the tested directions carrying relevant operator-space structure. Neither result establishes an accuracy or speed benefit.</w:t>
-      </w:r>
-    </w:p>
-    <w:p>
-      <w:pPr>
-        <w:pStyle w:val="Heading2"/>
-      </w:pPr>
-      <w:r>
-        <w:rPr>
-          <w:rFonts w:ascii="Times New Roman" w:hAnsi="Times New Roman"/>
-        </w:rPr>
-        <w:t>7.2 Held-Out Classification and Throughput</w:t>
-      </w:r>
-    </w:p>
-    <w:p>
-      <w:pPr>
-        <w:spacing w:after="100" w:line="259" w:lineRule="auto"/>
-      </w:pPr>
-      <w:r>
-        <w:t>We evaluate actual nonlinear predictions with the separate classifier-carrier protocol: PCA directions and average coefficients are fitted using 500 calibration images (seed 7101), then tested on 1,000 disjoint held-out images per architecture (seed 9201). Table III compares Static Feature-PCA with Hybrid Group Mean, the baseline for this experiment. Results vary by architecture and budget: q=16 is 1.5 pp below Hybrid Group Mean for DeiT-Small at B=49 and 4.5 pp below it for DINOv2 at B=42, while ViT-B/16 AugReg shows a modest +0.7 pp at B=49. This Hybrid Group Mean result is distinct from the Group Mean condition in the confirmatory compression benchmark (Table II).</w:t>
-      </w:r>
-    </w:p>
-    <w:p>
-      <w:pPr>
-        <w:spacing w:after="100" w:line="259" w:lineRule="auto"/>
-      </w:pPr>
-      <w:r>
-        <w:t>TABLE III</w:t>
-      </w:r>
-    </w:p>
-    <w:p>
-      <w:pPr>
-        <w:spacing w:after="100" w:line="259" w:lineRule="auto"/>
-      </w:pPr>
-      <w:r>
-        <w:t>CLASSIFIER-CARRIER COUNTS AT REPORTED BUDGETS</w:t>
-      </w:r>
-    </w:p>
-    <w:p>
-      <w:pPr>
-        <w:spacing w:after="100" w:line="259" w:lineRule="auto"/>
-      </w:pPr>
-      <w:r>
-        <w:t>Correct-prediction counts and Top-1 accuracy on 1,000 held-out images. Parenthetical values are percentage-point (pp) changes from Hybrid Group Mean at the same architecture and budget; the classifier cohort is separate from the operator-space study.</w:t>
-      </w:r>
-    </w:p>
-    <w:tbl>
-      <w:tblPr>
-        <w:tblStyle w:val="TableGrid"/>
-        <w:tblW w:w="0" w:type="auto"/>
-        <w:tblBorders>
-          <w:top w:val="none" w:sz="0" w:space="0" w:color="auto"/>
-          <w:left w:val="none" w:sz="0" w:space="0" w:color="auto"/>
-          <w:bottom w:val="none" w:sz="0" w:space="0" w:color="auto"/>
-          <w:right w:val="none" w:sz="0" w:space="0" w:color="auto"/>
-          <w:insideH w:val="none" w:sz="0" w:space="0" w:color="auto"/>
-          <w:insideV w:val="none" w:sz="0" w:space="0" w:color="auto"/>
-        </w:tblBorders>
-        <w:tblLook w:val="04A0" w:firstRow="1" w:lastRow="0" w:firstColumn="1" w:lastColumn="0" w:noHBand="0" w:noVBand="1"/>
-      </w:tblPr>
-      <w:tblGrid>
-        <w:gridCol w:w="1999"/>
-        <w:gridCol w:w="1999"/>
-        <w:gridCol w:w="1999"/>
-        <w:gridCol w:w="1999"/>
-        <w:gridCol w:w="1999"/>
-      </w:tblGrid>
-      <w:tr>
-        <w:trPr>
-          <w:tblHeader/>
-        </w:trPr>
-        <w:tc>
-          <w:tcPr>
-            <w:tcW w:w="1999" w:type="dxa"/>
-            <w:tcBorders>
-              <w:top w:val="single" w:sz="4" w:space="0" w:color="auto"/>
-              <w:bottom w:val="single" w:sz="4" w:space="0" w:color="auto"/>
-            </w:tcBorders>
-            <w:tcMar>
-              <w:top w:w="55" w:type="dxa"/>
-              <w:left w:w="65" w:type="dxa"/>
-              <w:bottom w:w="55" w:type="dxa"/>
-              <w:right w:w="65" w:type="dxa"/>
-            </w:tcMar>
-            <w:vAlign w:val="center"/>
-          </w:tcPr>
-          <w:p>
-            <w:pPr>
-              <w:jc w:val="center"/>
-              <w:rPr>
-                <w:szCs w:val="28"/>
-              </w:rPr>
-            </w:pPr>
-            <w:r>
-              <w:rPr>
-                <w:b/>
-                <w:color w:val="17232D"/>
-                <w:szCs w:val="28"/>
-              </w:rPr>
-              <w:t>Architecture</w:t>
-            </w:r>
-          </w:p>
-        </w:tc>
-        <w:tc>
-          <w:tcPr>
-            <w:tcW w:w="1999" w:type="dxa"/>
-            <w:tcBorders>
-              <w:top w:val="single" w:sz="4" w:space="0" w:color="auto"/>
-              <w:bottom w:val="single" w:sz="4" w:space="0" w:color="auto"/>
-            </w:tcBorders>
-            <w:tcMar>
-              <w:top w:w="55" w:type="dxa"/>
-              <w:left w:w="65" w:type="dxa"/>
-              <w:bottom w:w="55" w:type="dxa"/>
-              <w:right w:w="65" w:type="dxa"/>
-            </w:tcMar>
-            <w:vAlign w:val="center"/>
-          </w:tcPr>
-          <w:p>
-            <w:pPr>
-              <w:jc w:val="center"/>
-              <w:rPr>
-                <w:szCs w:val="28"/>
-              </w:rPr>
-            </w:pPr>
-            <w:r>
-              <w:rPr>
-                <w:b/>
-                <w:color w:val="17232D"/>
-                <w:szCs w:val="28"/>
-              </w:rPr>
-              <w:t>Budget</w:t>
-            </w:r>
-          </w:p>
-        </w:tc>
-        <w:tc>
-          <w:tcPr>
-            <w:tcW w:w="1999" w:type="dxa"/>
-            <w:tcBorders>
-              <w:top w:val="single" w:sz="4" w:space="0" w:color="auto"/>
-              <w:bottom w:val="single" w:sz="4" w:space="0" w:color="auto"/>
-            </w:tcBorders>
-            <w:tcMar>
-              <w:top w:w="55" w:type="dxa"/>
-              <w:left w:w="65" w:type="dxa"/>
-              <w:bottom w:w="55" w:type="dxa"/>
-              <w:right w:w="65" w:type="dxa"/>
-            </w:tcMar>
-            <w:vAlign w:val="center"/>
-          </w:tcPr>
-          <w:p>
-            <w:pPr>
-              <w:jc w:val="center"/>
-              <w:rPr>
-                <w:szCs w:val="28"/>
-              </w:rPr>
-            </w:pPr>
-            <w:r>
-              <w:rPr>
-                <w:b/>
-                <w:color w:val="17232D"/>
-                <w:szCs w:val="28"/>
-              </w:rPr>
-              <w:t>Hybrid Group Mean</w:t>
-            </w:r>
-          </w:p>
-        </w:tc>
-        <w:tc>
-          <w:tcPr>
-            <w:tcW w:w="1999" w:type="dxa"/>
-            <w:tcBorders>
-              <w:top w:val="single" w:sz="4" w:space="0" w:color="auto"/>
-              <w:bottom w:val="single" w:sz="4" w:space="0" w:color="auto"/>
-            </w:tcBorders>
-            <w:tcMar>
-              <w:top w:w="55" w:type="dxa"/>
-              <w:left w:w="65" w:type="dxa"/>
-              <w:bottom w:w="55" w:type="dxa"/>
-              <w:right w:w="65" w:type="dxa"/>
-            </w:tcMar>
-            <w:vAlign w:val="center"/>
-          </w:tcPr>
-          <w:p>
-            <w:pPr>
-              <w:jc w:val="center"/>
-              <w:rPr>
-                <w:szCs w:val="28"/>
-              </w:rPr>
-            </w:pPr>
-            <w:r>
-              <w:rPr>
-                <w:b/>
-                <w:color w:val="17232D"/>
-                <w:szCs w:val="28"/>
-              </w:rPr>
-              <w:t>Static Feature-PCA, q=16</w:t>
-            </w:r>
-          </w:p>
-        </w:tc>
-        <w:tc>
-          <w:tcPr>
-            <w:tcW w:w="1999" w:type="dxa"/>
-            <w:tcBorders>
-              <w:top w:val="single" w:sz="4" w:space="0" w:color="auto"/>
-              <w:bottom w:val="single" w:sz="4" w:space="0" w:color="auto"/>
-            </w:tcBorders>
-            <w:tcMar>
-              <w:top w:w="55" w:type="dxa"/>
-              <w:left w:w="65" w:type="dxa"/>
-              <w:bottom w:w="55" w:type="dxa"/>
-              <w:right w:w="65" w:type="dxa"/>
-            </w:tcMar>
-            <w:vAlign w:val="center"/>
-          </w:tcPr>
-          <w:p>
-            <w:pPr>
-              <w:jc w:val="center"/>
-              <w:rPr>
-                <w:szCs w:val="28"/>
-              </w:rPr>
-            </w:pPr>
-            <w:r>
-              <w:rPr>
-                <w:b/>
-                <w:color w:val="17232D"/>
-                <w:szCs w:val="28"/>
-              </w:rPr>
-              <w:t>Static Feature-PCA, q=32</w:t>
-            </w:r>
-          </w:p>
-        </w:tc>
-      </w:tr>
-      <w:tr>
-        <w:tc>
-          <w:tcPr>
-            <w:tcW w:w="1999" w:type="dxa"/>
-            <w:tcBorders>
-              <w:top w:val="single" w:sz="4" w:space="0" w:color="auto"/>
-            </w:tcBorders>
-            <w:tcMar>
-              <w:top w:w="55" w:type="dxa"/>
-              <w:left w:w="65" w:type="dxa"/>
-              <w:bottom w:w="55" w:type="dxa"/>
-              <w:right w:w="65" w:type="dxa"/>
-            </w:tcMar>
-            <w:vAlign w:val="center"/>
-          </w:tcPr>
-          <w:p>
-            <w:pPr>
-              <w:rPr>
-                <w:szCs w:val="28"/>
-              </w:rPr>
-            </w:pPr>
-            <w:r>
-              <w:rPr>
-                <w:szCs w:val="28"/>
-              </w:rPr>
-              <w:t>DeiT-Small</w:t>
-            </w:r>
-          </w:p>
-        </w:tc>
-        <w:tc>
-          <w:tcPr>
-            <w:tcW w:w="1999" w:type="dxa"/>
-            <w:tcBorders>
-              <w:top w:val="single" w:sz="4" w:space="0" w:color="auto"/>
-            </w:tcBorders>
-            <w:tcMar>
-              <w:top w:w="55" w:type="dxa"/>
-              <w:left w:w="65" w:type="dxa"/>
-              <w:bottom w:w="55" w:type="dxa"/>
-              <w:right w:w="65" w:type="dxa"/>
-            </w:tcMar>
-            <w:vAlign w:val="center"/>
-          </w:tcPr>
-          <w:p>
-            <w:pPr>
-              <w:jc w:val="center"/>
-              <w:rPr>
-                <w:szCs w:val="28"/>
-              </w:rPr>
-            </w:pPr>
-            <w:r>
-              <w:rPr>
-                <w:szCs w:val="28"/>
-              </w:rPr>
-              <w:t>98</w:t>
-            </w:r>
-          </w:p>
-        </w:tc>
-        <w:tc>
-          <w:tcPr>
-            <w:tcW w:w="1999" w:type="dxa"/>
-            <w:tcBorders>
-              <w:top w:val="single" w:sz="4" w:space="0" w:color="auto"/>
-            </w:tcBorders>
-            <w:tcMar>
-              <w:top w:w="55" w:type="dxa"/>
-              <w:left w:w="65" w:type="dxa"/>
-              <w:bottom w:w="55" w:type="dxa"/>
-              <w:right w:w="65" w:type="dxa"/>
-            </w:tcMar>
-            <w:vAlign w:val="center"/>
-          </w:tcPr>
-          <w:p>
-            <w:pPr>
-              <w:jc w:val="center"/>
-              <w:rPr>
-                <w:szCs w:val="28"/>
-              </w:rPr>
-            </w:pPr>
-            <w:r>
-              <w:rPr>
-                <w:szCs w:val="28"/>
-              </w:rPr>
-              <w:t>764/1,000 (76.4%)</w:t>
-            </w:r>
-          </w:p>
-        </w:tc>
-        <w:tc>
-          <w:tcPr>
-            <w:tcW w:w="1999" w:type="dxa"/>
-            <w:tcBorders>
-              <w:top w:val="single" w:sz="4" w:space="0" w:color="auto"/>
-            </w:tcBorders>
-            <w:tcMar>
-              <w:top w:w="55" w:type="dxa"/>
-              <w:left w:w="65" w:type="dxa"/>
-              <w:bottom w:w="55" w:type="dxa"/>
-              <w:right w:w="65" w:type="dxa"/>
-            </w:tcMar>
-            <w:vAlign w:val="center"/>
-          </w:tcPr>
-          <w:p>
-            <w:pPr>
-              <w:jc w:val="center"/>
-              <w:rPr>
-                <w:szCs w:val="28"/>
-              </w:rPr>
-            </w:pPr>
-            <w:r>
-              <w:rPr>
-                <w:szCs w:val="28"/>
-              </w:rPr>
-              <w:t xml:space="preserve">763/1,000 </w:t>
-            </w:r>
-          </w:p>
-          <w:p>
-            <w:pPr>
-              <w:jc w:val="center"/>
-              <w:rPr>
-                <w:szCs w:val="28"/>
-              </w:rPr>
-            </w:pPr>
-            <w:r>
-              <w:rPr>
-                <w:szCs w:val="28"/>
-              </w:rPr>
-              <w:t>(76.3%; −0.1 pp)</w:t>
-            </w:r>
-          </w:p>
-        </w:tc>
-        <w:tc>
-          <w:tcPr>
-            <w:tcW w:w="1999" w:type="dxa"/>
-            <w:tcBorders>
-              <w:top w:val="single" w:sz="4" w:space="0" w:color="auto"/>
-            </w:tcBorders>
-            <w:tcMar>
-              <w:top w:w="55" w:type="dxa"/>
-              <w:left w:w="65" w:type="dxa"/>
-              <w:bottom w:w="55" w:type="dxa"/>
-              <w:right w:w="65" w:type="dxa"/>
-            </w:tcMar>
-            <w:vAlign w:val="center"/>
-          </w:tcPr>
-          <w:p>
-            <w:pPr>
-              <w:jc w:val="center"/>
-              <w:rPr>
-                <w:szCs w:val="28"/>
-              </w:rPr>
-            </w:pPr>
-            <w:r>
-              <w:rPr>
-                <w:szCs w:val="28"/>
-              </w:rPr>
-              <w:t xml:space="preserve">760/1,000 </w:t>
-            </w:r>
-          </w:p>
-          <w:p>
-            <w:pPr>
-              <w:jc w:val="center"/>
-              <w:rPr>
-                <w:szCs w:val="28"/>
-              </w:rPr>
-            </w:pPr>
-            <w:r>
-              <w:rPr>
-                <w:szCs w:val="28"/>
-              </w:rPr>
-              <w:t>(76.0%; −0.4 pp)</w:t>
-            </w:r>
-          </w:p>
-        </w:tc>
-      </w:tr>
-      <w:tr>
-        <w:tc>
-          <w:tcPr>
-            <w:tcW w:w="1999" w:type="dxa"/>
-            <w:tcMar>
-              <w:top w:w="55" w:type="dxa"/>
-              <w:left w:w="65" w:type="dxa"/>
-              <w:bottom w:w="55" w:type="dxa"/>
-              <w:right w:w="65" w:type="dxa"/>
-            </w:tcMar>
-            <w:vAlign w:val="center"/>
-          </w:tcPr>
-          <w:p>
-            <w:pPr>
-              <w:rPr>
-                <w:szCs w:val="28"/>
-              </w:rPr>
-            </w:pPr>
-            <w:r>
-              <w:rPr>
-                <w:szCs w:val="28"/>
-              </w:rPr>
-              <w:t>DeiT-Small</w:t>
-            </w:r>
-          </w:p>
-        </w:tc>
-        <w:tc>
-          <w:tcPr>
-            <w:tcW w:w="1999" w:type="dxa"/>
-            <w:tcMar>
-              <w:top w:w="55" w:type="dxa"/>
-              <w:left w:w="65" w:type="dxa"/>
-              <w:bottom w:w="55" w:type="dxa"/>
-              <w:right w:w="65" w:type="dxa"/>
-            </w:tcMar>
-            <w:vAlign w:val="center"/>
-          </w:tcPr>
-          <w:p>
-            <w:pPr>
-              <w:jc w:val="center"/>
-              <w:rPr>
-                <w:szCs w:val="28"/>
-              </w:rPr>
-            </w:pPr>
-            <w:r>
-              <w:rPr>
-                <w:szCs w:val="28"/>
-              </w:rPr>
-              <w:t>49</w:t>
-            </w:r>
-          </w:p>
-        </w:tc>
-        <w:tc>
-          <w:tcPr>
-            <w:tcW w:w="1999" w:type="dxa"/>
-            <w:tcMar>
-              <w:top w:w="55" w:type="dxa"/>
-              <w:left w:w="65" w:type="dxa"/>
-              <w:bottom w:w="55" w:type="dxa"/>
-              <w:right w:w="65" w:type="dxa"/>
-            </w:tcMar>
-            <w:vAlign w:val="center"/>
-          </w:tcPr>
-          <w:p>
-            <w:pPr>
-              <w:jc w:val="center"/>
-              <w:rPr>
-                <w:szCs w:val="28"/>
-              </w:rPr>
-            </w:pPr>
-            <w:r>
-              <w:rPr>
-                <w:szCs w:val="28"/>
-              </w:rPr>
-              <w:t>755/1,000 (75.5%)</w:t>
-            </w:r>
-          </w:p>
-        </w:tc>
-        <w:tc>
-          <w:tcPr>
-            <w:tcW w:w="1999" w:type="dxa"/>
-            <w:tcMar>
-              <w:top w:w="55" w:type="dxa"/>
-              <w:left w:w="65" w:type="dxa"/>
-              <w:bottom w:w="55" w:type="dxa"/>
-              <w:right w:w="65" w:type="dxa"/>
-            </w:tcMar>
-            <w:vAlign w:val="center"/>
-          </w:tcPr>
-          <w:p>
-            <w:pPr>
-              <w:jc w:val="center"/>
-              <w:rPr>
-                <w:szCs w:val="28"/>
-              </w:rPr>
-            </w:pPr>
-            <w:r>
-              <w:rPr>
-                <w:szCs w:val="28"/>
-              </w:rPr>
-              <w:t xml:space="preserve">740/1,000 </w:t>
-            </w:r>
-          </w:p>
-          <w:p>
-            <w:pPr>
-              <w:jc w:val="center"/>
-              <w:rPr>
-                <w:szCs w:val="28"/>
-              </w:rPr>
-            </w:pPr>
-            <w:r>
-              <w:rPr>
-                <w:szCs w:val="28"/>
-              </w:rPr>
-              <w:t>(74.0%; −1.5 pp)</w:t>
-            </w:r>
-          </w:p>
-        </w:tc>
-        <w:tc>
-          <w:tcPr>
-            <w:tcW w:w="1999" w:type="dxa"/>
-            <w:tcMar>
-              <w:top w:w="55" w:type="dxa"/>
-              <w:left w:w="65" w:type="dxa"/>
-              <w:bottom w:w="55" w:type="dxa"/>
-              <w:right w:w="65" w:type="dxa"/>
-            </w:tcMar>
-            <w:vAlign w:val="center"/>
-          </w:tcPr>
-          <w:p>
-            <w:pPr>
-              <w:jc w:val="center"/>
-              <w:rPr>
-                <w:szCs w:val="28"/>
-              </w:rPr>
-            </w:pPr>
-            <w:r>
-              <w:rPr>
-                <w:szCs w:val="28"/>
-              </w:rPr>
-              <w:t xml:space="preserve">740/1,000 </w:t>
-            </w:r>
-          </w:p>
-          <w:p>
-            <w:pPr>
-              <w:jc w:val="center"/>
-              <w:rPr>
-                <w:szCs w:val="28"/>
-              </w:rPr>
-            </w:pPr>
-            <w:r>
-              <w:rPr>
-                <w:szCs w:val="28"/>
-              </w:rPr>
-              <w:t>(74.0%; −1.5 pp)</w:t>
-            </w:r>
-          </w:p>
-        </w:tc>
-      </w:tr>
-      <w:tr>
-        <w:tc>
-          <w:tcPr>
-            <w:tcW w:w="1999" w:type="dxa"/>
-            <w:tcMar>
-              <w:top w:w="55" w:type="dxa"/>
-              <w:left w:w="65" w:type="dxa"/>
-              <w:bottom w:w="55" w:type="dxa"/>
-              <w:right w:w="65" w:type="dxa"/>
-            </w:tcMar>
-            <w:vAlign w:val="center"/>
-          </w:tcPr>
-          <w:p>
-            <w:pPr>
-              <w:rPr>
-                <w:szCs w:val="28"/>
-              </w:rPr>
-            </w:pPr>
-            <w:r>
-              <w:rPr>
-                <w:szCs w:val="28"/>
-              </w:rPr>
-              <w:t>DINOv2 ViT-S/14</w:t>
-            </w:r>
-          </w:p>
-        </w:tc>
-        <w:tc>
-          <w:tcPr>
-            <w:tcW w:w="1999" w:type="dxa"/>
-            <w:tcMar>
-              <w:top w:w="55" w:type="dxa"/>
-              <w:left w:w="65" w:type="dxa"/>
-              <w:bottom w:w="55" w:type="dxa"/>
-              <w:right w:w="65" w:type="dxa"/>
-            </w:tcMar>
-            <w:vAlign w:val="center"/>
-          </w:tcPr>
-          <w:p>
-            <w:pPr>
-              <w:jc w:val="center"/>
-              <w:rPr>
-                <w:szCs w:val="28"/>
-              </w:rPr>
-            </w:pPr>
-            <w:r>
-              <w:rPr>
-                <w:szCs w:val="28"/>
-              </w:rPr>
-              <w:t>42</w:t>
-            </w:r>
-          </w:p>
-        </w:tc>
-        <w:tc>
-          <w:tcPr>
-            <w:tcW w:w="1999" w:type="dxa"/>
-            <w:tcMar>
-              <w:top w:w="55" w:type="dxa"/>
-              <w:left w:w="65" w:type="dxa"/>
-              <w:bottom w:w="55" w:type="dxa"/>
-              <w:right w:w="65" w:type="dxa"/>
-            </w:tcMar>
-            <w:vAlign w:val="center"/>
-          </w:tcPr>
-          <w:p>
-            <w:pPr>
-              <w:jc w:val="center"/>
-              <w:rPr>
-                <w:szCs w:val="28"/>
-              </w:rPr>
-            </w:pPr>
-            <w:r>
-              <w:rPr>
-                <w:szCs w:val="28"/>
-              </w:rPr>
-              <w:t>613/1,000 (61.3%)</w:t>
-            </w:r>
-          </w:p>
-        </w:tc>
-        <w:tc>
-          <w:tcPr>
-            <w:tcW w:w="1999" w:type="dxa"/>
-            <w:tcMar>
-              <w:top w:w="55" w:type="dxa"/>
-              <w:left w:w="65" w:type="dxa"/>
-              <w:bottom w:w="55" w:type="dxa"/>
-              <w:right w:w="65" w:type="dxa"/>
-            </w:tcMar>
-            <w:vAlign w:val="center"/>
-          </w:tcPr>
-          <w:p>
-            <w:pPr>
-              <w:jc w:val="center"/>
-              <w:rPr>
-                <w:szCs w:val="28"/>
-              </w:rPr>
-            </w:pPr>
-            <w:r>
-              <w:rPr>
-                <w:szCs w:val="28"/>
-              </w:rPr>
-              <w:t xml:space="preserve">568/1,000 </w:t>
-            </w:r>
-          </w:p>
-          <w:p>
-            <w:pPr>
-              <w:jc w:val="center"/>
-              <w:rPr>
-                <w:szCs w:val="28"/>
-              </w:rPr>
-            </w:pPr>
-            <w:r>
-              <w:rPr>
-                <w:szCs w:val="28"/>
-              </w:rPr>
-              <w:t>(56.8%; −4.5 pp)</w:t>
-            </w:r>
-          </w:p>
-        </w:tc>
-        <w:tc>
-          <w:tcPr>
-            <w:tcW w:w="1999" w:type="dxa"/>
-            <w:tcMar>
-              <w:top w:w="55" w:type="dxa"/>
-              <w:left w:w="65" w:type="dxa"/>
-              <w:bottom w:w="55" w:type="dxa"/>
-              <w:right w:w="65" w:type="dxa"/>
-            </w:tcMar>
-            <w:vAlign w:val="center"/>
-          </w:tcPr>
-          <w:p>
-            <w:pPr>
-              <w:jc w:val="center"/>
-              <w:rPr>
-                <w:szCs w:val="28"/>
-              </w:rPr>
-            </w:pPr>
-            <w:r>
-              <w:rPr>
-                <w:szCs w:val="28"/>
-              </w:rPr>
-              <w:t xml:space="preserve">570/1,000 </w:t>
-            </w:r>
-          </w:p>
-          <w:p>
-            <w:pPr>
-              <w:jc w:val="center"/>
-              <w:rPr>
-                <w:szCs w:val="28"/>
-              </w:rPr>
-            </w:pPr>
-            <w:r>
-              <w:rPr>
-                <w:szCs w:val="28"/>
-              </w:rPr>
-              <w:t>(57.0%; −4.3 pp)</w:t>
-            </w:r>
-          </w:p>
-        </w:tc>
-      </w:tr>
-      <w:tr>
-        <w:tc>
-          <w:tcPr>
-            <w:tcW w:w="1999" w:type="dxa"/>
-            <w:tcBorders>
-              <w:bottom w:val="single" w:sz="4" w:space="0" w:color="auto"/>
-            </w:tcBorders>
-            <w:tcMar>
-              <w:top w:w="55" w:type="dxa"/>
-              <w:left w:w="65" w:type="dxa"/>
-              <w:bottom w:w="55" w:type="dxa"/>
-              <w:right w:w="65" w:type="dxa"/>
-            </w:tcMar>
-            <w:vAlign w:val="center"/>
-          </w:tcPr>
-          <w:p>
-            <w:pPr>
-              <w:rPr>
-                <w:szCs w:val="28"/>
-              </w:rPr>
-            </w:pPr>
-            <w:r>
-              <w:rPr>
-                <w:szCs w:val="28"/>
-              </w:rPr>
-              <w:lastRenderedPageBreak/>
-              <w:t>ViT-B/16 AugReg</w:t>
-            </w:r>
-          </w:p>
-        </w:tc>
-        <w:tc>
-          <w:tcPr>
-            <w:tcW w:w="1999" w:type="dxa"/>
-            <w:tcBorders>
-              <w:bottom w:val="single" w:sz="4" w:space="0" w:color="auto"/>
-            </w:tcBorders>
-            <w:tcMar>
-              <w:top w:w="55" w:type="dxa"/>
-              <w:left w:w="65" w:type="dxa"/>
-              <w:bottom w:w="55" w:type="dxa"/>
-              <w:right w:w="65" w:type="dxa"/>
-            </w:tcMar>
-            <w:vAlign w:val="center"/>
-          </w:tcPr>
-          <w:p>
-            <w:pPr>
-              <w:jc w:val="center"/>
-              <w:rPr>
-                <w:szCs w:val="28"/>
-              </w:rPr>
-            </w:pPr>
-            <w:r>
-              <w:rPr>
-                <w:szCs w:val="28"/>
-              </w:rPr>
-              <w:t>49</w:t>
-            </w:r>
-          </w:p>
-        </w:tc>
-        <w:tc>
-          <w:tcPr>
-            <w:tcW w:w="1999" w:type="dxa"/>
-            <w:tcBorders>
-              <w:bottom w:val="single" w:sz="4" w:space="0" w:color="auto"/>
-            </w:tcBorders>
-            <w:tcMar>
-              <w:top w:w="55" w:type="dxa"/>
-              <w:left w:w="65" w:type="dxa"/>
-              <w:bottom w:w="55" w:type="dxa"/>
-              <w:right w:w="65" w:type="dxa"/>
-            </w:tcMar>
-            <w:vAlign w:val="center"/>
-          </w:tcPr>
-          <w:p>
-            <w:pPr>
-              <w:jc w:val="center"/>
-              <w:rPr>
-                <w:szCs w:val="28"/>
-              </w:rPr>
-            </w:pPr>
-            <w:r>
-              <w:rPr>
-                <w:szCs w:val="28"/>
-              </w:rPr>
-              <w:t>712/1,000 (71.2%)</w:t>
-            </w:r>
-          </w:p>
-        </w:tc>
-        <w:tc>
-          <w:tcPr>
-            <w:tcW w:w="1999" w:type="dxa"/>
-            <w:tcBorders>
-              <w:bottom w:val="single" w:sz="4" w:space="0" w:color="auto"/>
-            </w:tcBorders>
-            <w:tcMar>
-              <w:top w:w="55" w:type="dxa"/>
-              <w:left w:w="65" w:type="dxa"/>
-              <w:bottom w:w="55" w:type="dxa"/>
-              <w:right w:w="65" w:type="dxa"/>
-            </w:tcMar>
-            <w:vAlign w:val="center"/>
-          </w:tcPr>
-          <w:p>
-            <w:pPr>
-              <w:jc w:val="center"/>
-              <w:rPr>
-                <w:szCs w:val="28"/>
-              </w:rPr>
-            </w:pPr>
-            <w:r>
-              <w:rPr>
-                <w:szCs w:val="28"/>
-              </w:rPr>
-              <w:t xml:space="preserve">719/1,000 </w:t>
-            </w:r>
-          </w:p>
-          <w:p>
-            <w:pPr>
-              <w:jc w:val="center"/>
-              <w:rPr>
-                <w:szCs w:val="28"/>
-              </w:rPr>
-            </w:pPr>
-            <w:r>
-              <w:rPr>
-                <w:szCs w:val="28"/>
-              </w:rPr>
-              <w:t>(71.9%; +0.7 pp)</w:t>
-            </w:r>
-          </w:p>
-        </w:tc>
-        <w:tc>
-          <w:tcPr>
-            <w:tcW w:w="1999" w:type="dxa"/>
-            <w:tcBorders>
-              <w:bottom w:val="single" w:sz="4" w:space="0" w:color="auto"/>
-            </w:tcBorders>
-            <w:tcMar>
-              <w:top w:w="55" w:type="dxa"/>
-              <w:left w:w="65" w:type="dxa"/>
-              <w:bottom w:w="55" w:type="dxa"/>
-              <w:right w:w="65" w:type="dxa"/>
-            </w:tcMar>
-            <w:vAlign w:val="center"/>
-          </w:tcPr>
-          <w:p>
-            <w:pPr>
-              <w:jc w:val="center"/>
-              <w:rPr>
-                <w:szCs w:val="28"/>
-              </w:rPr>
-            </w:pPr>
-            <w:r>
-              <w:rPr>
-                <w:szCs w:val="28"/>
-              </w:rPr>
-              <w:t xml:space="preserve">716/1,000 </w:t>
-            </w:r>
-          </w:p>
-          <w:p>
-            <w:pPr>
-              <w:jc w:val="center"/>
-              <w:rPr>
-                <w:szCs w:val="28"/>
-              </w:rPr>
-            </w:pPr>
-            <w:r>
-              <w:rPr>
-                <w:szCs w:val="28"/>
-              </w:rPr>
-              <w:t>(71.6%; +0.4 pp)</w:t>
-            </w:r>
-          </w:p>
-        </w:tc>
-      </w:tr>
-    </w:tbl>
-    <w:p>
-      <w:pPr>
-        <w:spacing w:after="20"/>
-      </w:pPr>
-    </w:p>
-    <w:p>
-      <w:pPr>
-        <w:spacing w:after="100" w:line="259" w:lineRule="auto"/>
-      </w:pPr>
-      <w:r>
-        <w:t>Throughput was measured separately with the actual full-model call at batch size 64; it is not inferred from operator-space residuals. Supplementary Figure S13 shows the measured accuracy–throughput boundary: q=16 contributes a narrow ViT-B/16 AugReg point at some batch sizes, while q=32 and selective q=16 do not establish a general frontier improvement. For example, at B=98 and batch size 64, ViT-B q=16 is 73.7% Top-1 at 263 images/s versus 73.6% at 297 images/s for Hybrid Group Mean. The tested result is a small accuracy–throughput tradeoff on one architecture, not a general efficiency gain.</w:t>
-      </w:r>
-    </w:p>
-    <w:p>
-      <w:pPr>
-        <w:spacing w:after="100" w:line="259" w:lineRule="auto"/>
-      </w:pPr>
-      <w:r>
-        <w:t>Calibration-frozen selective gating is not consistently beneficial: at DeiT-Small B=98 it reaches 75.8% versus 76.4% for Hybrid Group Mean, and at DINOv2 B=42 it reaches 58.5% versus 61.3%. The exploratory operator-space gate has area under the receiver operating characteristic curve (AUROC) 0.784, which does not establish classification gains. A separate sequence-collapse experiment (Supplementary Section S8) found that shorter sequences reduced measured latency, while random pruning and an unweighted centroid matched or outperformed the tested multiplicity-aware carrier in accuracy. Those latency results come from a different protocol and do not measure Static Feature-PCA; other S8 variants likewise show no general classifier or throughput gains.</w:t>
-      </w:r>
-    </w:p>
-    <w:p>
-      <w:pPr>
-        <w:pStyle w:val="Heading2"/>
-        <w:keepNext/>
-      </w:pPr>
-      <w:r>
-        <w:rPr>
-          <w:rFonts w:ascii="Times New Roman" w:hAnsi="Times New Roman"/>
-          <w:b/>
-          <w:color w:val="000000"/>
-          <w:sz w:val="23"/>
-        </w:rPr>
-        <w:t>7.3 The Oracle-to-Deployment Gap</w:t>
-      </w:r>
-    </w:p>
-    <w:p>
-      <w:pPr>
-        <w:spacing w:after="100" w:line="259" w:lineRule="auto"/>
-      </w:pPr>
-      <w:r>
-        <w:rPr>
-          <w:rFonts w:ascii="Times New Roman" w:hAnsi="Times New Roman"/>
-          <w:i w:val="0"/>
-          <w:color w:val="202A32"/>
-          <w:sz w:val="20"/>
-        </w:rPr>
-        <w:t>The results separate three levels of evidence. First, operator-aware optimization can reduce a linearized downstream residual: Full-J is the per-image oracle, and the calibration-average q=16 correction retains part of the restricted-oracle gain in the operator-space cohort. Second, nonlinear classification is not determined by that residual: the held-out carrier results are mixed, with clear losses in some architecture–budget settings. Third, the measured accuracy–throughput frontier improves only narrowly, with no general advantage established for the tested lower-cost carrier approximations. A local first-order approximation, the difference between a fixed calibration correction and an image-conditioned optimum, and nonlinear downstream interactions are plausible explanations for this gap; the experiments do not identify a definitive cause of Static Feature-PCA’s classification limitations. PCF therefore establishes a mechanistic account and oracle-level opportunities, while the tested practical carrier approximations do not establish a general deployment advantage.</w:t>
-      </w:r>
-    </w:p>
-    <w:p>
-      <w:pPr>
-        <w:pStyle w:val="Heading1"/>
-      </w:pPr>
-      <w:r>
-        <w:rPr>
-          <w:rFonts w:ascii="Times New Roman" w:hAnsi="Times New Roman"/>
-        </w:rPr>
-        <w:t>8. Limitations</w:t>
-      </w:r>
-    </w:p>
-    <w:p>
-      <w:pPr>
-        <w:spacing w:after="100" w:line="259" w:lineRule="auto"/>
-      </w:pPr>
-      <w:r>
-        <w:t>Mechanistic evidence comes from the finite, protocol-specific cohorts in Table I and four pretrained ViT families evaluated on one ImageNet validation subset; broader model and task coverage remains untested. The exploratory joint-stream grid reuses its N=100 images for direction estimation and response measurement, so it is descriptive rather than held out. The margin-gradient and readout-Jacobian analyses characterize local, first-order behavior, and a threshold-defined near-null fraction does not establish exact nonlinear invariance. Full-J requires a per-image Jacobian and is an offline oracle. The classifier-carrier and operator-space studies use separate cohorts and endpoints; their results cannot be merged into a single accuracy or residual estimate. Measured full-model runtime is specific to the tested hardware, batch sizes, and implementations. The data show that lowering linearized error alone does not guarantee better nonlinear classification or a better measured accuracy–throughput frontier, and do not identify the cause of the practical carrier’s limitations.</w:t>
-      </w:r>
-    </w:p>
-    <w:p>
-      <w:pPr>
-        <w:pStyle w:val="Heading1"/>
-      </w:pPr>
-      <w:r>
-        <w:rPr>
-          <w:rFonts w:ascii="Times New Roman" w:hAnsi="Times New Roman"/>
-        </w:rPr>
-        <w:t>9. Conclusion</w:t>
-      </w:r>
-    </w:p>
-    <w:p>
-      <w:pPr>
-        <w:spacing w:after="100" w:line="259" w:lineRule="auto"/>
-      </w:pPr>
-      <w:r>
-        <w:t>Across four tested ViT families, late-layer patch content is conditionally replaceable under feature-geometry and token-position-diversity constraints. The mechanistic evidence links this fixed-slot intervention to architecture-dependent functional sensitivity, coherent Value-path accumulation and cancellation, and depth-varying effective rank. End-to-end Jacobian predictions are more strongly associated with measured damage than single-block predictions under the tested mixture of 100 perturbation vectors per model. In the separate confirmatory compression benchmark, operator-aware variants exceed the strongest pruning baselines by 4.2–12.0 percentage points at the most aggressive tested budgets, but ToMe remains competitive, Group Mean is not uniformly worse, and rank-restricted outcomes vary across architectures. The per-image Full-J Jacobian is an offline oracle. Calibration-frozen carrier corrections yield mixed nonlinear classification results and only a narrow measured accuracy–throughput frontier point. Thus, PCF provides a mechanistic account of patch-content fungibility and an operator-aware compression opportunity, but the tested practical approximations do not establish a general deployment advantage.</w:t>
+        <w:t>Across four tested ViT families, late-layer patch content is conditionally replaceable under feature-geometry and token-position-diversity constraints. The mechanistic evidence links this fixed-slot intervention to architecture-dependent functional sensitivity, coherent Value-path accumulation and cancellation, and depth-varying effective rank. End-to-end Jacobian predictions are more strongly associated with measured damage than single-block predictions under the tested mixture of 100 perturbation vectors per model. In the separate confirmatory compression benchmark, operator-aware variants exceed the strongest pruning baselines by 4.2–12.0 percentage points at the most aggressive tested budgets, but ToMe remains competitive, Group Mean is not uniformly worse, and rank-restricted outcomes vary across architectures. The bounded compression result uses an offline, image-conditioned Full-J oracle; practical carrier evidence is summarized in Supplementary Section S13, and the available measurements do not establish a general deployment advantage.</w:t>
       </w:r>
     </w:p>
     <w:p>

</xml_diff>

<commit_message>
Reconcile manuscript claims and add main evidence tables
</commit_message>
<xml_diff>
--- a/docs/PAPER_DRAFT_v5.docx
+++ b/docs/PAPER_DRAFT_v5.docx
@@ -47,7 +47,7 @@
         <w:spacing w:after="100" w:line="259" w:lineRule="auto"/>
       </w:pPr>
       <w:r>
-        <w:t>Vision transformers represent images as fixed sequences of patch slots, yet the role of each slot’s image-specific content in late layers remains unclear. We causally replace selected late-layer patch activations with class-agnostic calibration surrogates while preserving token positions, sequence length, model weights, and all subsequent computation. Across four tested vision-transformer families, this fixed-slot intervention reveals conditional patch-content fungibility bounded by feature geometry and token-position diversity. Mechanistic analyses associate replaceability with anisotropic functional sensitivity, coherent accumulation and sign-dependent cancellation along the attention Value path, and declining normalized effective rank; near-null expansion at the primary threshold is evident in three models but small in DINOv2. As a bounded application, we evaluate operator-aware compression using an offline, per-image downstream-Jacobian oracle on 1,000 held-out images per architecture. At the most aggressive tested budgets, operator-aware variants improve Top-1 by 4.2–12.0 percentage points over the strongest pruning baseline, but ToMe remains competitive and Full-J is not uniformly better than Group Mean or ToMe. The evidence supports Patch-Content Fungibility as a mechanistic account and an oracle-level compression opportunity, but does not establish a general deployment advantage.</w:t>
+        <w:t>Vision transformers represent images as fixed sequences of patch slots, yet the role of each slot’s image-specific content in late layers remains unclear. We causally replace selected late-layer patch activations with class-agnostic calibration surrogates while preserving token positions, sequence length, model weights, and all subsequent computation. Across four tested vision-transformer families, this fixed-slot intervention reveals conditional patch-content fungibility bounded by feature geometry and token-position diversity. Mechanistic analyses associate replaceability with anisotropic functional sensitivity, coherent accumulation and sign-dependent cancellation along the attention Value path, and declining normalized effective rank; near-null expansion at the primary threshold is evident in three models but small in DINOv2. As a bounded application, we evaluate operator-aware compression using an offline, per-image downstream-Jacobian oracle on 1,000 held-out images per architecture. At the most aggressive tested budgets, operator-aware variants improve Top-1 by 4.2–12.0 percentage points over the strongest pruning baseline, but ToMe remains competitive and Full-J is not uniformly better than Group Mean or ToMe. The evidence supports Patch-Content Fungibility as a mechanistic account of the tested interventions and an oracle-level compression opportunity, but does not establish a general deployment advantage.</w:t>
       </w:r>
     </w:p>
     <w:p>
@@ -146,7 +146,7 @@
         <w:spacing w:after="100" w:line="259" w:lineRule="auto"/>
       </w:pPr>
       <w:r>
-        <w:t>This leads to three linked questions: whether a late patch slot needs its image-specific activation or can carry a class-agnostic surrogate; how feature geometry, token-position coherence, and downstream transmission jointly bound replacement tolerance; and whether those mechanisms can inform operator-aware compression, including where the translation fails. We study these questions as a ViT-specific account of Patch-Content Fungibility (PCF). The argument proceeds from fixed-slot causal replacement, through geometric and functional mechanisms, to compression as a bounded application whose nonlinear classification and measured throughput must be assessed separately.</w:t>
+        <w:t>This leads to three linked questions: whether a late patch slot needs its image-specific activation or can carry a class-agnostic surrogate; how feature geometry, token-position coherence, and downstream transmission shape observed replacement tolerance; and whether those mechanisms can inform operator-aware compression, including where the translation fails. We study these questions as a ViT-specific account of Patch-Content Fungibility (PCF). The argument proceeds from fixed-slot causal replacement, through geometric and functional mechanisms, to compression as a bounded application whose nonlinear classification and measured throughput must be assessed separately.</w:t>
       </w:r>
     </w:p>
     <w:p>
@@ -165,7 +165,7 @@
         <w:spacing w:after="100" w:line="259" w:lineRule="auto"/>
       </w:pPr>
       <w:r>
-        <w:t>Token-reduction methods such as DynamicViT, EViT, and Token Merging (ToMe) select, reorganize, merge, or otherwise shorten the sequence processed by a ViT [11]–[13]. Diversity-aware pruning also predates PCF: Long et al. jointly preserve attentive tokens and increase global semantic diversity by merging similar inattentive tokens and matching homogeneous attentive tokens [14]. Related work also learns or pools tokens and adapts token computation [15]–[18]; samples, prunes, squeezes, or exits early [19]–[25]; and explores dynamic, structured, or sparse token/activation schemes [26]–[33]. Parameter pruning, pruning of large language models (LLMs), and singular value decomposition (SVD)-based dimension compression form a related efficiency lineage [34]–[41]. PCF's primary causal intervention instead substitutes ordinary spatial patch-token content while preserving token positions, sequence length, model weights, and downstream computation. Under complete class-agnostic patch-content replacement, it controls token-position diversity separately from feature-space direction; token diversity itself is not claimed as a new concept. The later compression application is distinct: it groups patches into B carriers and shortens the sequence for subsequent computation.</w:t>
+        <w:t>Token-reduction methods such as DynamicViT, EViT, and Token Merging (ToMe) select, reorganize, merge, or otherwise shorten the sequence processed by a ViT [11]–[13]. Diversity-aware pruning also predates PCF: Long et al. jointly preserve attentive tokens and increase global semantic diversity by merging similar inattentive tokens and matching homogeneous attentive tokens [14]. Related work also learns or pools tokens and adapts token computation [15]–[18]; samples, prunes, squeezes, or exits early [19]–[25]; and explores dynamic, structured, or sparse token/activation schemes [26]–[33]. Parameter pruning, pruning of large language models (LLMs), and singular value decomposition (SVD)-based dimension compression form a related efficiency lineage [34]–[41]. PCF's primary causal intervention instead substitutes ordinary spatial patch-token content while preserving token positions, sequence length, model weights, and downstream computation. Under complete class-agnostic patch-content replacement, it controls token-position diversity separately from feature-space direction; token diversity itself is not claimed as a new concept. The later compression application is distinct: it optimizes grouped carrier content under a fixed assignment S and shortens the sequence for subsequent computation.</w:t>
       </w:r>
     </w:p>
     <w:p>
@@ -173,7 +173,47 @@
         <w:spacing w:after="100" w:line="259" w:lineRule="auto"/>
       </w:pPr>
       <w:r>
-        <w:t>Surrogate substitution also has a close methodological precedent. Parodi et al. study mean, noise, and cross-image register-shuffling substitutions for specialized DINO register-token content. PCF examines ordinary spatial patch-token activations across depth and replacement fractions, and separates feature geometry from token-position diversity; it does not claim to introduce surrogate replacement [42].</w:t>
+        <w:rPr>
+          <w:rFonts w:ascii="Times New Roman" w:hAnsi="Times New Roman"/>
+          <w:i w:val="0"/>
+          <w:color w:val="202A32"/>
+          <w:sz w:val="20"/>
+        </w:rPr>
+        <w:t xml:space="preserve">Jacobian-sensitive geometry and task-aware token compression also have direct ViT precedents. Bond et al. define a task-induced pullback metric on ViT feature spaces, analyze its spectral and low-rank structure, and use task-sensitive geometry for token pruning and soft merging </w:t>
+      </w:r>
+      <w:r>
+        <w:rPr>
+          <w:rFonts w:ascii="Times New Roman" w:hAnsi="Times New Roman"/>
+          <w:color w:val="202A32"/>
+          <w:sz w:val="20"/>
+        </w:rPr>
+        <w:t>[42]</w:t>
+      </w:r>
+      <w:r>
+        <w:rPr>
+          <w:rFonts w:ascii="Times New Roman" w:hAnsi="Times New Roman"/>
+          <w:i w:val="0"/>
+          <w:color w:val="202A32"/>
+          <w:sz w:val="20"/>
+        </w:rPr>
+        <w:t xml:space="preserve">. Liu et al. study approximate nullspace perturbations in nonlinear ViT blocks and nullspace-noise augmentation for fine-tuning robustness </w:t>
+      </w:r>
+      <w:r>
+        <w:rPr>
+          <w:rFonts w:ascii="Times New Roman" w:hAnsi="Times New Roman"/>
+          <w:color w:val="202A32"/>
+          <w:sz w:val="20"/>
+        </w:rPr>
+        <w:t>[43]</w:t>
+      </w:r>
+      <w:r>
+        <w:rPr>
+          <w:rFonts w:ascii="Times New Roman" w:hAnsi="Times New Roman"/>
+          <w:i w:val="0"/>
+          <w:color w:val="202A32"/>
+          <w:sz w:val="20"/>
+        </w:rPr>
+        <w:t>. These works establish prior art for downstream-Jacobian geometry, task-aware compression, and approximate-nullspace analysis. PCF asks how much original image-specific content is needed at an ordinary spatial patch slot under fixed-slot interventions; its compression application optimizes grouped carrier content under a fixed assignment S, rather than recasting importance scoring or token-pair selection as the same optimization problem.</w:t>
       </w:r>
     </w:p>
     <w:p>
@@ -181,7 +221,7 @@
         <w:spacing w:after="100" w:line="259" w:lineRule="auto"/>
       </w:pPr>
       <w:r>
-        <w:t>Sensitivity-weighted objectives and Jacobian-based measures of downstream effect are established tools, not a new mathematical Jacobian or general theory introduced here [43], [44]. A recent public preprint, Output-aware Residual Stream Pruning, couples activation statistics with output sensitivity to prune LLM residual-stream dimensions [45]. That work supports the broader precedent for output-aware compression but studies a different model family and dimension-pruning intervention. PCF's bounded contribution is the combination of ViT patch-content interventions, functional-transmission analysis, and an operator-aware carrier update evaluated at controlled token budgets. Its fixed-slot causal studies preserve sequence length; the carrier-compression application reduces the sequence for subsequent computation.</w:t>
+        <w:t>Surrogate substitution also has a close methodological precedent. Parodi et al. study mean, noise, and cross-image register-shuffling substitutions for specialized DINO register-token content. PCF examines ordinary spatial patch-token activations across depth and replacement fractions, and separates feature geometry from token-position diversity; it does not claim to introduce surrogate replacement [44].</w:t>
       </w:r>
     </w:p>
     <w:p>
@@ -189,8 +229,16 @@
         <w:spacing w:after="100" w:line="259" w:lineRule="auto"/>
       </w:pPr>
       <w:r>
+        <w:t>Sensitivity-weighted objectives and Jacobian-based measures of downstream effect are established tools, not a new mathematical Jacobian or general theory introduced here [45], [46]. A recent public preprint, Output-aware Residual Stream Pruning, couples activation statistics with output sensitivity to prune LLM residual-stream dimensions [47]. That work supports the broader precedent for output-aware compression but studies a different model family and dimension-pruning intervention. PCF's bounded contribution is the combination of ViT patch-content interventions, functional-transmission analysis, and an operator-aware carrier update evaluated at controlled token budgets. Its fixed-slot causal studies preserve sequence length; the carrier-compression application reduces the sequence for subsequent computation.</w:t>
+      </w:r>
+    </w:p>
+    <w:p>
+      <w:pPr>
+        <w:spacing w:after="100" w:line="259" w:lineRule="auto"/>
+      </w:pPr>
+      <w:r>
         <w:lastRenderedPageBreak/>
-        <w:t>Interpretability research cautions that attention weights alone need not explain a model's decision. Controlled studies examine whether attention is explanation and how explanation changes under interventions [46]–[48]. Attention flow, Integrated Gradients, saliency-map sanity checks, and transformer-specific relevance propagation provide complementary methods for tracing or attributing model behavior [49]–[52]. Causal abstraction offers a framework for connecting interventions to model-level causal structure [53]. Our evidence uses direct activation interventions and held-out prediction of perturbation damage; it is bounded to the tested models, readouts, and cohorts.</w:t>
+        <w:t>Interpretability research cautions that attention weights alone need not explain a model's decision. Controlled studies examine whether attention is explanation and how explanation changes under interventions [48]–[50]. Attention flow, Integrated Gradients, saliency-map sanity checks, and transformer-specific relevance propagation provide complementary methods for tracing or attributing model behavior [51]–[54]. Causal abstraction offers a framework for connecting interventions to model-level causal structure [55]. Our evidence uses direct activation interventions and held-out prediction of perturbation damage; it is bounded to the tested models, readouts, and cohorts.</w:t>
       </w:r>
     </w:p>
     <w:p>
@@ -1880,6 +1928,826 @@
       </w:r>
       <w:r>
         <w:t xml:space="preserve"> Under complete replacement at Block 8, calibration-derived PC1 outperforms an energy-matched random one-dimensional direction in the tested settings with measurable Top-1 (Figure 3(c)): 18.64% versus 10.80% for DeiT-Tiny and 28.08% versus 20.78% for DeiT-Small (five seeds each), and 40.10% versus 6.70% for ViT-B/16 AugReg (three seeds). Figure 3(b) varies diversity across token positions by changing K, the number of distinct surrogate vectors; Figure 3(c) holds the variation one-dimensional and tests its feature-space direction. In both PC1 and random-direction conditions, independently sampled scalar coefficients allow variation across token positions. DINOv2 remains near the Top-1 floor (0.17% versus 0.00%), with mean true-class margins of −8.438 for PC1 and −8.654 for the random direction. PC1 is the leading eigenvector of centered calibration-activation covariance, not a learned model parameter. These results show that feature-space direction and token-position diversity are distinct constraints; they do not establish rank-1 sufficiency or full accuracy recovery. Together, the controls motivate the directional functional-sensitivity analysis in Section 5.1.</w:t>
+      </w:r>
+    </w:p>
+    <w:p>
+      <w:pPr>
+        <w:spacing w:after="100" w:line="259" w:lineRule="auto"/>
+      </w:pPr>
+      <w:r>
+        <w:rPr>
+          <w:rFonts w:ascii="Times New Roman" w:hAnsi="Times New Roman"/>
+          <w:i w:val="0"/>
+          <w:color w:val="202A32"/>
+          <w:sz w:val="20"/>
+        </w:rPr>
+        <w:t>The controlled endpoint differences are summarized in Table II.</w:t>
+      </w:r>
+    </w:p>
+    <w:p>
+      <w:pPr>
+        <w:spacing w:after="100" w:line="259" w:lineRule="auto"/>
+      </w:pPr>
+      <w:r>
+        <w:rPr>
+          <w:rFonts w:ascii="Times New Roman" w:hAnsi="Times New Roman"/>
+          <w:i w:val="0"/>
+          <w:color w:val="202A32"/>
+          <w:sz w:val="20"/>
+        </w:rPr>
+        <w:t>TABLE II</w:t>
+      </w:r>
+    </w:p>
+    <w:p>
+      <w:pPr>
+        <w:spacing w:after="100" w:line="259" w:lineRule="auto"/>
+      </w:pPr>
+      <w:r>
+        <w:rPr>
+          <w:rFonts w:ascii="Times New Roman" w:hAnsi="Times New Roman"/>
+          <w:i w:val="0"/>
+          <w:color w:val="202A32"/>
+          <w:sz w:val="20"/>
+        </w:rPr>
+        <w:t>CONTROLLED PATCH-CONTENT REPLACEMENT EFFECTS ACROSS ARCHITECTURES</w:t>
+      </w:r>
+    </w:p>
+    <w:p>
+      <w:pPr>
+        <w:keepNext/>
+        <w:spacing w:after="100" w:line="259" w:lineRule="auto"/>
+      </w:pPr>
+      <w:r>
+        <w:rPr>
+          <w:rFonts w:ascii="Times New Roman" w:hAnsi="Times New Roman"/>
+          <w:i w:val="0"/>
+          <w:color w:val="202A32"/>
+          <w:sz w:val="20"/>
+        </w:rPr>
+        <w:t>Top-1 differences in percentage points; each contrast is first condition minus second condition. Positive values favor the first condition. Columns summarize distinct protocols, not a common treatment effect.</w:t>
+      </w:r>
+    </w:p>
+    <w:tbl>
+      <w:tblPr>
+        <w:tblStyle w:val="TableGrid"/>
+        <w:tblW w:type="auto" w:w="0"/>
+        <w:jc w:val="center"/>
+        <w:tblLayout w:type="fixed"/>
+        <w:tblLook w:firstColumn="1" w:firstRow="1" w:lastColumn="0" w:lastRow="0" w:noHBand="0" w:noVBand="1" w:val="04A0"/>
+        <w:tblLayout w:type="fixed"/>
+      </w:tblPr>
+      <w:tblGrid>
+        <w:gridCol w:w="1757"/>
+        <w:gridCol w:w="1930"/>
+        <w:gridCol w:w="1930"/>
+        <w:gridCol w:w="2218"/>
+        <w:gridCol w:w="1886"/>
+      </w:tblGrid>
+      <w:tr>
+        <w:trPr>
+          <w:cantSplit/>
+          <w:tblHeader w:val="true"/>
+        </w:trPr>
+        <w:tc>
+          <w:tcPr>
+            <w:tcW w:type="dxa" w:w="1757"/>
+            <w:vAlign w:val="center"/>
+            <w:tcMar>
+              <w:top w:w="55" w:type="dxa"/>
+              <w:start w:w="65" w:type="dxa"/>
+              <w:bottom w:w="55" w:type="dxa"/>
+              <w:end w:w="65" w:type="dxa"/>
+            </w:tcMar>
+            <w:shd w:fill="DCEBF2"/>
+          </w:tcPr>
+          <w:p>
+            <w:pPr>
+              <w:spacing w:after="0" w:line="240" w:lineRule="auto"/>
+              <w:jc w:val="center"/>
+            </w:pPr>
+            <w:r/>
+            <w:r>
+              <w:rPr>
+                <w:rFonts w:ascii="Times New Roman" w:hAnsi="Times New Roman"/>
+                <w:b/>
+                <w:color w:val="17232D"/>
+                <w:sz w:val="14"/>
+              </w:rPr>
+              <w:t>Architecture</w:t>
+            </w:r>
+          </w:p>
+        </w:tc>
+        <w:tc>
+          <w:tcPr>
+            <w:tcW w:type="dxa" w:w="1930"/>
+            <w:vAlign w:val="center"/>
+            <w:tcMar>
+              <w:top w:w="55" w:type="dxa"/>
+              <w:start w:w="65" w:type="dxa"/>
+              <w:bottom w:w="55" w:type="dxa"/>
+              <w:end w:w="65" w:type="dxa"/>
+            </w:tcMar>
+            <w:shd w:fill="DCEBF2"/>
+          </w:tcPr>
+          <w:p>
+            <w:pPr>
+              <w:spacing w:after="0" w:line="240" w:lineRule="auto"/>
+              <w:jc w:val="center"/>
+            </w:pPr>
+            <w:r/>
+            <w:r>
+              <w:rPr>
+                <w:rFonts w:ascii="Times New Roman" w:hAnsi="Times New Roman"/>
+                <w:b/>
+                <w:color w:val="17232D"/>
+                <w:sz w:val="14"/>
+              </w:rPr>
+              <w:t>Centroid − coordinate-permuted (50%)</w:t>
+            </w:r>
+          </w:p>
+        </w:tc>
+        <w:tc>
+          <w:tcPr>
+            <w:tcW w:type="dxa" w:w="1930"/>
+            <w:vAlign w:val="center"/>
+            <w:tcMar>
+              <w:top w:w="55" w:type="dxa"/>
+              <w:start w:w="65" w:type="dxa"/>
+              <w:bottom w:w="55" w:type="dxa"/>
+              <w:end w:w="65" w:type="dxa"/>
+            </w:tcMar>
+            <w:shd w:fill="DCEBF2"/>
+          </w:tcPr>
+          <w:p>
+            <w:pPr>
+              <w:spacing w:after="0" w:line="240" w:lineRule="auto"/>
+              <w:jc w:val="center"/>
+            </w:pPr>
+            <w:r/>
+            <w:r>
+              <w:rPr>
+                <w:rFonts w:ascii="Times New Roman" w:hAnsi="Times New Roman"/>
+                <w:b/>
+                <w:color w:val="17232D"/>
+                <w:sz w:val="14"/>
+              </w:rPr>
+              <w:t>Centroid − sign-inverted (50%)</w:t>
+            </w:r>
+          </w:p>
+        </w:tc>
+        <w:tc>
+          <w:tcPr>
+            <w:tcW w:type="dxa" w:w="2218"/>
+            <w:vAlign w:val="center"/>
+            <w:tcMar>
+              <w:top w:w="55" w:type="dxa"/>
+              <w:start w:w="65" w:type="dxa"/>
+              <w:bottom w:w="55" w:type="dxa"/>
+              <w:end w:w="65" w:type="dxa"/>
+            </w:tcMar>
+            <w:shd w:fill="DCEBF2"/>
+          </w:tcPr>
+          <w:p>
+            <w:pPr>
+              <w:spacing w:after="0" w:line="240" w:lineRule="auto"/>
+              <w:jc w:val="center"/>
+            </w:pPr>
+            <w:r/>
+            <w:r>
+              <w:rPr>
+                <w:rFonts w:ascii="Times New Roman" w:hAnsi="Times New Roman"/>
+                <w:b/>
+                <w:color w:val="17232D"/>
+                <w:sz w:val="14"/>
+              </w:rPr>
+              <w:t>Grouped Kmax − K1</w:t>
+            </w:r>
+          </w:p>
+        </w:tc>
+        <w:tc>
+          <w:tcPr>
+            <w:tcW w:type="dxa" w:w="1886"/>
+            <w:vAlign w:val="center"/>
+            <w:tcMar>
+              <w:top w:w="55" w:type="dxa"/>
+              <w:start w:w="65" w:type="dxa"/>
+              <w:bottom w:w="55" w:type="dxa"/>
+              <w:end w:w="65" w:type="dxa"/>
+            </w:tcMar>
+            <w:shd w:fill="DCEBF2"/>
+          </w:tcPr>
+          <w:p>
+            <w:pPr>
+              <w:spacing w:after="0" w:line="240" w:lineRule="auto"/>
+              <w:jc w:val="center"/>
+            </w:pPr>
+            <w:r/>
+            <w:r>
+              <w:rPr>
+                <w:rFonts w:ascii="Times New Roman" w:hAnsi="Times New Roman"/>
+                <w:b/>
+                <w:color w:val="17232D"/>
+                <w:sz w:val="14"/>
+              </w:rPr>
+              <w:t>PC1 − random 1D (100%)</w:t>
+            </w:r>
+          </w:p>
+        </w:tc>
+      </w:tr>
+      <w:tr>
+        <w:trPr>
+          <w:cantSplit/>
+        </w:trPr>
+        <w:tc>
+          <w:tcPr>
+            <w:tcW w:type="dxa" w:w="1757"/>
+            <w:vAlign w:val="center"/>
+            <w:tcMar>
+              <w:top w:w="55" w:type="dxa"/>
+              <w:start w:w="65" w:type="dxa"/>
+              <w:bottom w:w="55" w:type="dxa"/>
+              <w:end w:w="65" w:type="dxa"/>
+            </w:tcMar>
+          </w:tcPr>
+          <w:p>
+            <w:pPr>
+              <w:spacing w:after="0" w:line="240" w:lineRule="auto"/>
+            </w:pPr>
+            <w:r/>
+            <w:r>
+              <w:rPr>
+                <w:rFonts w:ascii="Times New Roman" w:hAnsi="Times New Roman"/>
+                <w:b w:val="0"/>
+                <w:color w:val="202A32"/>
+                <w:sz w:val="14"/>
+              </w:rPr>
+              <w:t>DeiT-Tiny</w:t>
+            </w:r>
+          </w:p>
+        </w:tc>
+        <w:tc>
+          <w:tcPr>
+            <w:tcW w:type="dxa" w:w="1930"/>
+            <w:vAlign w:val="center"/>
+            <w:tcMar>
+              <w:top w:w="55" w:type="dxa"/>
+              <w:start w:w="65" w:type="dxa"/>
+              <w:bottom w:w="55" w:type="dxa"/>
+              <w:end w:w="65" w:type="dxa"/>
+            </w:tcMar>
+          </w:tcPr>
+          <w:p>
+            <w:pPr>
+              <w:spacing w:after="0" w:line="240" w:lineRule="auto"/>
+              <w:jc w:val="center"/>
+            </w:pPr>
+            <w:r/>
+            <w:r>
+              <w:rPr>
+                <w:rFonts w:ascii="Times New Roman" w:hAnsi="Times New Roman"/>
+                <w:b w:val="0"/>
+                <w:color w:val="202A32"/>
+                <w:sz w:val="14"/>
+              </w:rPr>
+              <w:t>+16.2</w:t>
+            </w:r>
+          </w:p>
+        </w:tc>
+        <w:tc>
+          <w:tcPr>
+            <w:tcW w:type="dxa" w:w="1930"/>
+            <w:vAlign w:val="center"/>
+            <w:tcMar>
+              <w:top w:w="55" w:type="dxa"/>
+              <w:start w:w="65" w:type="dxa"/>
+              <w:bottom w:w="55" w:type="dxa"/>
+              <w:end w:w="65" w:type="dxa"/>
+            </w:tcMar>
+          </w:tcPr>
+          <w:p>
+            <w:pPr>
+              <w:spacing w:after="0" w:line="240" w:lineRule="auto"/>
+              <w:jc w:val="center"/>
+            </w:pPr>
+            <w:r/>
+            <w:r>
+              <w:rPr>
+                <w:rFonts w:ascii="Times New Roman" w:hAnsi="Times New Roman"/>
+                <w:b w:val="0"/>
+                <w:color w:val="202A32"/>
+                <w:sz w:val="14"/>
+              </w:rPr>
+              <w:t>+65.6</w:t>
+            </w:r>
+          </w:p>
+        </w:tc>
+        <w:tc>
+          <w:tcPr>
+            <w:tcW w:type="dxa" w:w="2218"/>
+            <w:vAlign w:val="center"/>
+            <w:tcMar>
+              <w:top w:w="55" w:type="dxa"/>
+              <w:start w:w="65" w:type="dxa"/>
+              <w:bottom w:w="55" w:type="dxa"/>
+              <w:end w:w="65" w:type="dxa"/>
+            </w:tcMar>
+          </w:tcPr>
+          <w:p>
+            <w:pPr>
+              <w:spacing w:after="0" w:line="240" w:lineRule="auto"/>
+              <w:jc w:val="center"/>
+            </w:pPr>
+            <w:r/>
+            <w:r>
+              <w:rPr>
+                <w:rFonts w:ascii="Times New Roman" w:hAnsi="Times New Roman"/>
+                <w:b w:val="0"/>
+                <w:color w:val="202A32"/>
+                <w:sz w:val="14"/>
+              </w:rPr>
+              <w:t>+25.2</w:t>
+            </w:r>
+          </w:p>
+        </w:tc>
+        <w:tc>
+          <w:tcPr>
+            <w:tcW w:type="dxa" w:w="1886"/>
+            <w:vAlign w:val="center"/>
+            <w:tcMar>
+              <w:top w:w="55" w:type="dxa"/>
+              <w:start w:w="65" w:type="dxa"/>
+              <w:bottom w:w="55" w:type="dxa"/>
+              <w:end w:w="65" w:type="dxa"/>
+            </w:tcMar>
+          </w:tcPr>
+          <w:p>
+            <w:pPr>
+              <w:spacing w:after="0" w:line="240" w:lineRule="auto"/>
+              <w:jc w:val="center"/>
+            </w:pPr>
+            <w:r/>
+            <w:r>
+              <w:rPr>
+                <w:rFonts w:ascii="Times New Roman" w:hAnsi="Times New Roman"/>
+                <w:b w:val="0"/>
+                <w:color w:val="202A32"/>
+                <w:sz w:val="14"/>
+              </w:rPr>
+              <w:t>+7.84</w:t>
+            </w:r>
+          </w:p>
+        </w:tc>
+      </w:tr>
+      <w:tr>
+        <w:trPr>
+          <w:cantSplit/>
+        </w:trPr>
+        <w:tc>
+          <w:tcPr>
+            <w:tcW w:type="dxa" w:w="1757"/>
+            <w:vAlign w:val="center"/>
+            <w:tcMar>
+              <w:top w:w="55" w:type="dxa"/>
+              <w:start w:w="65" w:type="dxa"/>
+              <w:bottom w:w="55" w:type="dxa"/>
+              <w:end w:w="65" w:type="dxa"/>
+            </w:tcMar>
+          </w:tcPr>
+          <w:p>
+            <w:pPr>
+              <w:spacing w:after="0" w:line="240" w:lineRule="auto"/>
+            </w:pPr>
+            <w:r/>
+            <w:r>
+              <w:rPr>
+                <w:rFonts w:ascii="Times New Roman" w:hAnsi="Times New Roman"/>
+                <w:b w:val="0"/>
+                <w:color w:val="202A32"/>
+                <w:sz w:val="14"/>
+              </w:rPr>
+              <w:t>DeiT-Small</w:t>
+            </w:r>
+          </w:p>
+        </w:tc>
+        <w:tc>
+          <w:tcPr>
+            <w:tcW w:type="dxa" w:w="1930"/>
+            <w:vAlign w:val="center"/>
+            <w:tcMar>
+              <w:top w:w="55" w:type="dxa"/>
+              <w:start w:w="65" w:type="dxa"/>
+              <w:bottom w:w="55" w:type="dxa"/>
+              <w:end w:w="65" w:type="dxa"/>
+            </w:tcMar>
+          </w:tcPr>
+          <w:p>
+            <w:pPr>
+              <w:spacing w:after="0" w:line="240" w:lineRule="auto"/>
+              <w:jc w:val="center"/>
+            </w:pPr>
+            <w:r/>
+            <w:r>
+              <w:rPr>
+                <w:rFonts w:ascii="Times New Roman" w:hAnsi="Times New Roman"/>
+                <w:b w:val="0"/>
+                <w:color w:val="202A32"/>
+                <w:sz w:val="14"/>
+              </w:rPr>
+              <w:t>+18.0</w:t>
+            </w:r>
+          </w:p>
+        </w:tc>
+        <w:tc>
+          <w:tcPr>
+            <w:tcW w:type="dxa" w:w="1930"/>
+            <w:vAlign w:val="center"/>
+            <w:tcMar>
+              <w:top w:w="55" w:type="dxa"/>
+              <w:start w:w="65" w:type="dxa"/>
+              <w:bottom w:w="55" w:type="dxa"/>
+              <w:end w:w="65" w:type="dxa"/>
+            </w:tcMar>
+          </w:tcPr>
+          <w:p>
+            <w:pPr>
+              <w:spacing w:after="0" w:line="240" w:lineRule="auto"/>
+              <w:jc w:val="center"/>
+            </w:pPr>
+            <w:r/>
+            <w:r>
+              <w:rPr>
+                <w:rFonts w:ascii="Times New Roman" w:hAnsi="Times New Roman"/>
+                <w:b w:val="0"/>
+                <w:color w:val="202A32"/>
+                <w:sz w:val="14"/>
+              </w:rPr>
+              <w:t>+65.1</w:t>
+            </w:r>
+          </w:p>
+        </w:tc>
+        <w:tc>
+          <w:tcPr>
+            <w:tcW w:type="dxa" w:w="2218"/>
+            <w:vAlign w:val="center"/>
+            <w:tcMar>
+              <w:top w:w="55" w:type="dxa"/>
+              <w:start w:w="65" w:type="dxa"/>
+              <w:bottom w:w="55" w:type="dxa"/>
+              <w:end w:w="65" w:type="dxa"/>
+            </w:tcMar>
+          </w:tcPr>
+          <w:p>
+            <w:pPr>
+              <w:spacing w:after="0" w:line="240" w:lineRule="auto"/>
+              <w:jc w:val="center"/>
+            </w:pPr>
+            <w:r/>
+            <w:r>
+              <w:rPr>
+                <w:rFonts w:ascii="Times New Roman" w:hAnsi="Times New Roman"/>
+                <w:b w:val="0"/>
+                <w:color w:val="202A32"/>
+                <w:sz w:val="14"/>
+              </w:rPr>
+              <w:t>+36.1</w:t>
+            </w:r>
+          </w:p>
+        </w:tc>
+        <w:tc>
+          <w:tcPr>
+            <w:tcW w:type="dxa" w:w="1886"/>
+            <w:vAlign w:val="center"/>
+            <w:tcMar>
+              <w:top w:w="55" w:type="dxa"/>
+              <w:start w:w="65" w:type="dxa"/>
+              <w:bottom w:w="55" w:type="dxa"/>
+              <w:end w:w="65" w:type="dxa"/>
+            </w:tcMar>
+          </w:tcPr>
+          <w:p>
+            <w:pPr>
+              <w:spacing w:after="0" w:line="240" w:lineRule="auto"/>
+              <w:jc w:val="center"/>
+            </w:pPr>
+            <w:r/>
+            <w:r>
+              <w:rPr>
+                <w:rFonts w:ascii="Times New Roman" w:hAnsi="Times New Roman"/>
+                <w:b w:val="0"/>
+                <w:color w:val="202A32"/>
+                <w:sz w:val="14"/>
+              </w:rPr>
+              <w:t>+7.30</w:t>
+            </w:r>
+          </w:p>
+        </w:tc>
+      </w:tr>
+      <w:tr>
+        <w:trPr>
+          <w:cantSplit/>
+        </w:trPr>
+        <w:tc>
+          <w:tcPr>
+            <w:tcW w:type="dxa" w:w="1757"/>
+            <w:vAlign w:val="center"/>
+            <w:tcMar>
+              <w:top w:w="55" w:type="dxa"/>
+              <w:start w:w="65" w:type="dxa"/>
+              <w:bottom w:w="55" w:type="dxa"/>
+              <w:end w:w="65" w:type="dxa"/>
+            </w:tcMar>
+          </w:tcPr>
+          <w:p>
+            <w:pPr>
+              <w:spacing w:after="0" w:line="240" w:lineRule="auto"/>
+            </w:pPr>
+            <w:r/>
+            <w:r>
+              <w:rPr>
+                <w:rFonts w:ascii="Times New Roman" w:hAnsi="Times New Roman"/>
+                <w:b w:val="0"/>
+                <w:color w:val="202A32"/>
+                <w:sz w:val="14"/>
+              </w:rPr>
+              <w:t>ViT-B/16 AugReg</w:t>
+            </w:r>
+          </w:p>
+        </w:tc>
+        <w:tc>
+          <w:tcPr>
+            <w:tcW w:type="dxa" w:w="1930"/>
+            <w:vAlign w:val="center"/>
+            <w:tcMar>
+              <w:top w:w="55" w:type="dxa"/>
+              <w:start w:w="65" w:type="dxa"/>
+              <w:bottom w:w="55" w:type="dxa"/>
+              <w:end w:w="65" w:type="dxa"/>
+            </w:tcMar>
+          </w:tcPr>
+          <w:p>
+            <w:pPr>
+              <w:spacing w:after="0" w:line="240" w:lineRule="auto"/>
+              <w:jc w:val="center"/>
+            </w:pPr>
+            <w:r/>
+            <w:r>
+              <w:rPr>
+                <w:rFonts w:ascii="Times New Roman" w:hAnsi="Times New Roman"/>
+                <w:b w:val="0"/>
+                <w:color w:val="202A32"/>
+                <w:sz w:val="14"/>
+              </w:rPr>
+              <w:t>+6.5</w:t>
+            </w:r>
+          </w:p>
+        </w:tc>
+        <w:tc>
+          <w:tcPr>
+            <w:tcW w:type="dxa" w:w="1930"/>
+            <w:vAlign w:val="center"/>
+            <w:tcMar>
+              <w:top w:w="55" w:type="dxa"/>
+              <w:start w:w="65" w:type="dxa"/>
+              <w:bottom w:w="55" w:type="dxa"/>
+              <w:end w:w="65" w:type="dxa"/>
+            </w:tcMar>
+          </w:tcPr>
+          <w:p>
+            <w:pPr>
+              <w:spacing w:after="0" w:line="240" w:lineRule="auto"/>
+              <w:jc w:val="center"/>
+            </w:pPr>
+            <w:r/>
+            <w:r>
+              <w:rPr>
+                <w:rFonts w:ascii="Times New Roman" w:hAnsi="Times New Roman"/>
+                <w:b w:val="0"/>
+                <w:color w:val="202A32"/>
+                <w:sz w:val="14"/>
+              </w:rPr>
+              <w:t>+5.7</w:t>
+            </w:r>
+          </w:p>
+        </w:tc>
+        <w:tc>
+          <w:tcPr>
+            <w:tcW w:type="dxa" w:w="2218"/>
+            <w:vAlign w:val="center"/>
+            <w:tcMar>
+              <w:top w:w="55" w:type="dxa"/>
+              <w:start w:w="65" w:type="dxa"/>
+              <w:bottom w:w="55" w:type="dxa"/>
+              <w:end w:w="65" w:type="dxa"/>
+            </w:tcMar>
+          </w:tcPr>
+          <w:p>
+            <w:pPr>
+              <w:spacing w:after="0" w:line="240" w:lineRule="auto"/>
+              <w:jc w:val="center"/>
+            </w:pPr>
+            <w:r/>
+            <w:r>
+              <w:rPr>
+                <w:rFonts w:ascii="Times New Roman" w:hAnsi="Times New Roman"/>
+                <w:b w:val="0"/>
+                <w:color w:val="202A32"/>
+                <w:sz w:val="14"/>
+              </w:rPr>
+              <w:t>+11.34</w:t>
+            </w:r>
+          </w:p>
+        </w:tc>
+        <w:tc>
+          <w:tcPr>
+            <w:tcW w:type="dxa" w:w="1886"/>
+            <w:vAlign w:val="center"/>
+            <w:tcMar>
+              <w:top w:w="55" w:type="dxa"/>
+              <w:start w:w="65" w:type="dxa"/>
+              <w:bottom w:w="55" w:type="dxa"/>
+              <w:end w:w="65" w:type="dxa"/>
+            </w:tcMar>
+          </w:tcPr>
+          <w:p>
+            <w:pPr>
+              <w:spacing w:after="0" w:line="240" w:lineRule="auto"/>
+              <w:jc w:val="center"/>
+            </w:pPr>
+            <w:r/>
+            <w:r>
+              <w:rPr>
+                <w:rFonts w:ascii="Times New Roman" w:hAnsi="Times New Roman"/>
+                <w:b w:val="0"/>
+                <w:color w:val="202A32"/>
+                <w:sz w:val="14"/>
+              </w:rPr>
+              <w:t>+33.40</w:t>
+            </w:r>
+          </w:p>
+        </w:tc>
+      </w:tr>
+      <w:tr>
+        <w:trPr>
+          <w:cantSplit/>
+        </w:trPr>
+        <w:tc>
+          <w:tcPr>
+            <w:tcW w:type="dxa" w:w="1757"/>
+            <w:vAlign w:val="center"/>
+            <w:tcMar>
+              <w:top w:w="55" w:type="dxa"/>
+              <w:start w:w="65" w:type="dxa"/>
+              <w:bottom w:w="55" w:type="dxa"/>
+              <w:end w:w="65" w:type="dxa"/>
+            </w:tcMar>
+          </w:tcPr>
+          <w:p>
+            <w:pPr>
+              <w:spacing w:after="0" w:line="240" w:lineRule="auto"/>
+            </w:pPr>
+            <w:r/>
+            <w:r>
+              <w:rPr>
+                <w:rFonts w:ascii="Times New Roman" w:hAnsi="Times New Roman"/>
+                <w:b w:val="0"/>
+                <w:color w:val="202A32"/>
+                <w:sz w:val="14"/>
+              </w:rPr>
+              <w:t>DINOv2 ViT-S/14</w:t>
+            </w:r>
+          </w:p>
+        </w:tc>
+        <w:tc>
+          <w:tcPr>
+            <w:tcW w:type="dxa" w:w="1930"/>
+            <w:vAlign w:val="center"/>
+            <w:tcMar>
+              <w:top w:w="55" w:type="dxa"/>
+              <w:start w:w="65" w:type="dxa"/>
+              <w:bottom w:w="55" w:type="dxa"/>
+              <w:end w:w="65" w:type="dxa"/>
+            </w:tcMar>
+          </w:tcPr>
+          <w:p>
+            <w:pPr>
+              <w:spacing w:after="0" w:line="240" w:lineRule="auto"/>
+              <w:jc w:val="center"/>
+            </w:pPr>
+            <w:r/>
+            <w:r>
+              <w:rPr>
+                <w:rFonts w:ascii="Times New Roman" w:hAnsi="Times New Roman"/>
+                <w:b w:val="0"/>
+                <w:color w:val="202A32"/>
+                <w:sz w:val="14"/>
+              </w:rPr>
+              <w:t>+47.8</w:t>
+            </w:r>
+          </w:p>
+        </w:tc>
+        <w:tc>
+          <w:tcPr>
+            <w:tcW w:type="dxa" w:w="1930"/>
+            <w:vAlign w:val="center"/>
+            <w:tcMar>
+              <w:top w:w="55" w:type="dxa"/>
+              <w:start w:w="65" w:type="dxa"/>
+              <w:bottom w:w="55" w:type="dxa"/>
+              <w:end w:w="65" w:type="dxa"/>
+            </w:tcMar>
+          </w:tcPr>
+          <w:p>
+            <w:pPr>
+              <w:spacing w:after="0" w:line="240" w:lineRule="auto"/>
+              <w:jc w:val="center"/>
+            </w:pPr>
+            <w:r/>
+            <w:r>
+              <w:rPr>
+                <w:rFonts w:ascii="Times New Roman" w:hAnsi="Times New Roman"/>
+                <w:b w:val="0"/>
+                <w:color w:val="202A32"/>
+                <w:sz w:val="14"/>
+              </w:rPr>
+              <w:t>+55.4</w:t>
+            </w:r>
+          </w:p>
+        </w:tc>
+        <w:tc>
+          <w:tcPr>
+            <w:tcW w:type="dxa" w:w="2218"/>
+            <w:vAlign w:val="center"/>
+            <w:tcMar>
+              <w:top w:w="55" w:type="dxa"/>
+              <w:start w:w="65" w:type="dxa"/>
+              <w:bottom w:w="55" w:type="dxa"/>
+              <w:end w:w="65" w:type="dxa"/>
+            </w:tcMar>
+          </w:tcPr>
+          <w:p>
+            <w:pPr>
+              <w:spacing w:after="0" w:line="240" w:lineRule="auto"/>
+              <w:jc w:val="center"/>
+            </w:pPr>
+            <w:r/>
+            <w:r>
+              <w:rPr>
+                <w:rFonts w:ascii="Times New Roman" w:hAnsi="Times New Roman"/>
+                <w:b w:val="0"/>
+                <w:color w:val="202A32"/>
+                <w:sz w:val="14"/>
+              </w:rPr>
+              <w:t>−0.02</w:t>
+            </w:r>
+          </w:p>
+        </w:tc>
+        <w:tc>
+          <w:tcPr>
+            <w:tcW w:type="dxa" w:w="1886"/>
+            <w:vAlign w:val="center"/>
+            <w:tcMar>
+              <w:top w:w="55" w:type="dxa"/>
+              <w:start w:w="65" w:type="dxa"/>
+              <w:bottom w:w="55" w:type="dxa"/>
+              <w:end w:w="65" w:type="dxa"/>
+            </w:tcMar>
+          </w:tcPr>
+          <w:p>
+            <w:pPr>
+              <w:spacing w:after="0" w:line="240" w:lineRule="auto"/>
+              <w:jc w:val="center"/>
+            </w:pPr>
+            <w:r/>
+            <w:r>
+              <w:rPr>
+                <w:rFonts w:ascii="Times New Roman" w:hAnsi="Times New Roman"/>
+                <w:b w:val="0"/>
+                <w:color w:val="202A32"/>
+                <w:sz w:val="14"/>
+              </w:rPr>
+              <w:t>+0.17</w:t>
+            </w:r>
+          </w:p>
+        </w:tc>
+      </w:tr>
+    </w:tbl>
+    <w:p>
+      <w:pPr>
+        <w:spacing w:after="20"/>
+      </w:pPr>
+    </w:p>
+    <w:p>
+      <w:pPr>
+        <w:spacing w:after="100" w:line="259" w:lineRule="auto"/>
+      </w:pPr>
+      <w:r>
+        <w:rPr>
+          <w:rFonts w:ascii="Times New Roman" w:hAnsi="Times New Roman"/>
+          <w:i w:val="0"/>
+          <w:color w:val="202A32"/>
+          <w:sz w:val="20"/>
+        </w:rPr>
+        <w:t>Note (Table II). All interventions are at Block 8. Geometry contrasts replace 50% of spatial patches; coordinate-permutation values are three-seed means, while centroid and sign-inversion endpoints are single runs. Grouped-K and PC1/random contrasts replace all spatial patches; Kmax is 196 for DeiT/ViT-B and 256 for DINOv2. Grouped-K uses three seeds for DeiT and five for ViT-B/DINOv2; PC1/random uses five seeds for DeiT and three for ViT-B/DINOv2. Each architecture uses N=1,000 held-out images and a disjoint N=1,000 calibration cohort. DINOv2 remains near the Top-1 floor for both complete-replacement contrasts; its +0.17 pp PC1 contrast is not meaningful accuracy recovery. See Figure 3 and the source-linked calculations in the validation script for protocol-level values.</w:t>
       </w:r>
     </w:p>
     <w:p>
@@ -3279,43 +4147,51 @@
         <w:spacing w:after="100" w:line="259" w:lineRule="auto"/>
       </w:pPr>
       <w:r>
-        <w:t xml:space="preserve">At depth 8, the corrected PC1-to-lowest-variance-PC sensitivity ratios are 0.089 for DeiT-Tiny, 0.041 for DeiT-Small, 65.2 for ViT-B/16 AugReg, and 0.199 for DINOv2 ViT-S/14. PC1 is less sensitive than the selected lowest-variance direction in three models but more sensitive in ViT-B. The ViT-B lowest-variance covariance eigengap is only </w:t>
+        <w:rPr>
+          <w:rFonts w:ascii="Times New Roman" w:hAnsi="Times New Roman"/>
+          <w:i w:val="0"/>
+          <w:color w:val="202A32"/>
+          <w:sz w:val="20"/>
+        </w:rPr>
+        <w:t xml:space="preserve">At depth 8, the ViT-B PCbottom direction is especially uncertain because its covariance eigengap is only </w:t>
       </w:r>
       <m:oMath>
         <m:r>
-          <w:rPr>
-            <w:rFonts w:ascii="Cambria Math" w:hAnsi="Cambria Math"/>
-          </w:rPr>
-          <m:t>1.53×</m:t>
+          <m:t xml:space="preserve">1</m:t>
+        </m:r>
+        <m:r>
+          <m:t xml:space="preserve">.</m:t>
+        </m:r>
+        <m:r>
+          <m:t xml:space="preserve">53</m:t>
+        </m:r>
+        <m:r>
+          <m:t xml:space="preserve">×</m:t>
         </m:r>
         <m:sSup>
-          <m:sSupPr>
-            <m:ctrlPr>
-              <w:rPr>
-                <w:rFonts w:ascii="Cambria Math" w:hAnsi="Cambria Math"/>
-              </w:rPr>
-            </m:ctrlPr>
-          </m:sSupPr>
           <m:e>
             <m:r>
-              <w:rPr>
-                <w:rFonts w:ascii="Cambria Math" w:hAnsi="Cambria Math"/>
-              </w:rPr>
-              <m:t>10</m:t>
+              <m:t xml:space="preserve">10</m:t>
             </m:r>
           </m:e>
           <m:sup>
             <m:r>
-              <w:rPr>
-                <w:rFonts w:ascii="Cambria Math" w:hAnsi="Cambria Math"/>
-              </w:rPr>
-              <m:t>-5</m:t>
+              <m:t xml:space="preserve">-</m:t>
+            </m:r>
+            <m:r>
+              <m:t xml:space="preserve">5</m:t>
             </m:r>
           </m:sup>
         </m:sSup>
       </m:oMath>
       <w:r>
-        <w:t xml:space="preserve"> of the largest covariance eigenvalue, so its large ratio describes sensitivity along the selected sample eigenvector rather than a stable ranking of the full low-variance subspace. Activation variance therefore does not provide a model-independent proxy for margin sensitivity.</w:t>
+        <w:rPr>
+          <w:rFonts w:ascii="Times New Roman" w:hAnsi="Times New Roman"/>
+          <w:i w:val="0"/>
+          <w:color w:val="202A32"/>
+          <w:sz w:val="20"/>
+        </w:rPr>
+        <w:t xml:space="preserve"> of the largest eigenvalue. Its large sensitivity ratio therefore describes the selected sample eigenvector, not a stable ranking of the low-variance subspace. Activation variance does not provide a model-independent proxy for margin sensitivity.</w:t>
       </w:r>
     </w:p>
     <w:p>
@@ -3367,7 +4243,7 @@
         </m:r>
       </m:oMath>
       <w:r>
-        <w:t xml:space="preserve">, declines from depth 5 to depth 10 in all four architectures: 0.541 to 0.125 for DeiT-Tiny, 0.467 to 0.114 for DeiT-Small, 0.383 to 0.140 for ViT-B, and 0.453 to 0.323 for DINOv2. At the operational cutoff </w:t>
+        <w:t xml:space="preserve">, is compared across depths 5–10 in Table III. At the operational near-null cutoff </w:t>
       </w:r>
       <m:oMath>
         <m:sSub>
@@ -3453,7 +4329,7 @@
         </m:sSub>
       </m:oMath>
       <w:r>
-        <w:t xml:space="preserve">, the near-null fraction rises from 0.52% to 31.77% in DeiT-Tiny, 0.26% to 57.03% in DeiT-Small, and 0.26% to 49.61% in ViT-B. DINOv2 changes only from 0.26% to 1.56% at this cutoff. Its depth-10 fraction is 64.84% at the looser </w:t>
+        <w:t xml:space="preserve">, the primary-threshold fractions are summarized there; DINOv2 reaches 64.84% at the looser </w:t>
       </w:r>
       <m:oMath>
         <m:sSup>
@@ -3508,7 +4384,711 @@
         </m:sSub>
       </m:oMath>
       <w:r>
-        <w:t xml:space="preserve"> cutoff, showing that this threshold summary is particularly cutoff-sensitive for DINOv2. The effective-rank decline is shared across models, while threshold-defined near-null expansion is architecture-dependent. These depth-wise associations are consistent with increasing late-layer fungibility in several models but do not establish an exact nonlinear invariance subspace or a causal explanation.</w:t>
+        <w:t xml:space="preserve"> cutoff, illustrating threshold sensitivity.</w:t>
+      </w:r>
+    </w:p>
+    <w:p>
+      <w:pPr>
+        <w:spacing w:after="100" w:line="259" w:lineRule="auto"/>
+      </w:pPr>
+      <w:r>
+        <w:rPr>
+          <w:rFonts w:ascii="Times New Roman" w:hAnsi="Times New Roman"/>
+          <w:i w:val="0"/>
+          <w:color w:val="202A32"/>
+          <w:sz w:val="20"/>
+        </w:rPr>
+        <w:t>Near-null expansion at the primary cutoff is architecture-dependent and small for DINOv2. The ViT-B PCbottom ratio depends on a direction with a small covariance eigengap. These depth-wise associations are consistent with increasing late-layer fungibility in several models but do not establish an exact nonlinear invariance subspace or a causal explanation.</w:t>
+      </w:r>
+    </w:p>
+    <w:p>
+      <w:pPr>
+        <w:spacing w:after="100" w:line="259" w:lineRule="auto"/>
+      </w:pPr>
+      <w:r>
+        <w:rPr>
+          <w:rFonts w:ascii="Times New Roman" w:hAnsi="Times New Roman"/>
+          <w:i w:val="0"/>
+          <w:color w:val="202A32"/>
+          <w:sz w:val="20"/>
+        </w:rPr>
+        <w:t>TABLE III</w:t>
+      </w:r>
+    </w:p>
+    <w:p>
+      <w:pPr>
+        <w:spacing w:after="100" w:line="259" w:lineRule="auto"/>
+      </w:pPr>
+      <w:r>
+        <w:rPr>
+          <w:rFonts w:ascii="Times New Roman" w:hAnsi="Times New Roman"/>
+          <w:i w:val="0"/>
+          <w:color w:val="202A32"/>
+          <w:sz w:val="20"/>
+        </w:rPr>
+        <w:t>DEPTH EVOLUTION OF FUNCTIONAL SENSITIVITY ACROSS ARCHITECTURES</w:t>
+      </w:r>
+    </w:p>
+    <w:p>
+      <w:pPr>
+        <w:keepNext/>
+        <w:spacing w:after="100" w:line="259" w:lineRule="auto"/>
+      </w:pPr>
+      <w:r>
+        <w:rPr>
+          <w:rFonts w:ascii="Times New Roman" w:hAnsi="Times New Roman"/>
+          <w:i w:val="0"/>
+          <w:color w:val="202A32"/>
+          <w:sz w:val="20"/>
+        </w:rPr>
+        <w:t xml:space="preserve">The empirical margin-gradient metric Mℓ and its depth-dependent spectrum. Normalized effective rank is dimensionless; near-null eigenvalues satisfy λk ≤ </w:t>
+      </w:r>
+      <m:oMath>
+        <m:sSup>
+          <m:e>
+            <m:r>
+              <m:t xml:space="preserve">10</m:t>
+            </m:r>
+          </m:e>
+          <m:sup>
+            <m:r>
+              <m:t xml:space="preserve">-</m:t>
+            </m:r>
+            <m:r>
+              <m:t xml:space="preserve">3</m:t>
+            </m:r>
+          </m:sup>
+        </m:sSup>
+      </m:oMath>
+      <w:r>
+        <w:rPr>
+          <w:rFonts w:ascii="Times New Roman" w:hAnsi="Times New Roman"/>
+          <w:i w:val="0"/>
+          <w:color w:val="202A32"/>
+          <w:sz w:val="20"/>
+        </w:rPr>
+        <w:t xml:space="preserve"> λmax, an operational cutoff rather than an exact nonlinear nullspace criterion.</w:t>
+      </w:r>
+    </w:p>
+    <w:tbl>
+      <w:tblPr>
+        <w:tblStyle w:val="TableGrid"/>
+        <w:tblW w:type="auto" w:w="0"/>
+        <w:jc w:val="center"/>
+        <w:tblLayout w:type="fixed"/>
+        <w:tblLook w:firstColumn="1" w:firstRow="1" w:lastColumn="0" w:lastRow="0" w:noHBand="0" w:noVBand="1" w:val="04A0"/>
+        <w:tblLayout w:type="fixed"/>
+      </w:tblPr>
+      <w:tblGrid>
+        <w:gridCol w:w="1800"/>
+        <w:gridCol w:w="2477"/>
+        <w:gridCol w:w="2448"/>
+        <w:gridCol w:w="2995"/>
+      </w:tblGrid>
+      <w:tr>
+        <w:trPr>
+          <w:cantSplit/>
+          <w:tblHeader w:val="true"/>
+        </w:trPr>
+        <w:tc>
+          <w:tcPr>
+            <w:tcW w:type="dxa" w:w="1800"/>
+            <w:vAlign w:val="center"/>
+            <w:tcMar>
+              <w:top w:w="55" w:type="dxa"/>
+              <w:start w:w="65" w:type="dxa"/>
+              <w:bottom w:w="55" w:type="dxa"/>
+              <w:end w:w="65" w:type="dxa"/>
+            </w:tcMar>
+            <w:shd w:fill="DCEBF2"/>
+          </w:tcPr>
+          <w:p>
+            <w:pPr>
+              <w:spacing w:after="0" w:line="240" w:lineRule="auto"/>
+              <w:jc w:val="center"/>
+            </w:pPr>
+            <w:r/>
+            <w:r>
+              <w:rPr>
+                <w:rFonts w:ascii="Times New Roman" w:hAnsi="Times New Roman"/>
+                <w:b/>
+                <w:color w:val="17232D"/>
+                <w:sz w:val="15"/>
+              </w:rPr>
+              <w:t>Architecture</w:t>
+            </w:r>
+          </w:p>
+        </w:tc>
+        <w:tc>
+          <w:tcPr>
+            <w:tcW w:type="dxa" w:w="2477"/>
+            <w:vAlign w:val="center"/>
+            <w:tcMar>
+              <w:top w:w="55" w:type="dxa"/>
+              <w:start w:w="65" w:type="dxa"/>
+              <w:bottom w:w="55" w:type="dxa"/>
+              <w:end w:w="65" w:type="dxa"/>
+            </w:tcMar>
+            <w:shd w:fill="DCEBF2"/>
+          </w:tcPr>
+          <w:p>
+            <w:pPr>
+              <w:spacing w:after="0" w:line="240" w:lineRule="auto"/>
+              <w:jc w:val="center"/>
+            </w:pPr>
+            <w:r/>
+            <w:r>
+              <w:rPr>
+                <w:rFonts w:ascii="Times New Roman" w:hAnsi="Times New Roman"/>
+                <w:b/>
+                <w:color w:val="17232D"/>
+                <w:sz w:val="15"/>
+              </w:rPr>
+              <w:t>Normalized effective rank, d5 → d10</w:t>
+            </w:r>
+          </w:p>
+        </w:tc>
+        <w:tc>
+          <w:tcPr>
+            <w:tcW w:type="dxa" w:w="2448"/>
+            <w:vAlign w:val="center"/>
+            <w:tcMar>
+              <w:top w:w="55" w:type="dxa"/>
+              <w:start w:w="65" w:type="dxa"/>
+              <w:bottom w:w="55" w:type="dxa"/>
+              <w:end w:w="65" w:type="dxa"/>
+            </w:tcMar>
+            <w:shd w:fill="DCEBF2"/>
+          </w:tcPr>
+          <w:p>
+            <w:pPr>
+              <w:spacing w:after="0" w:line="240" w:lineRule="auto"/>
+              <w:jc w:val="center"/>
+            </w:pPr>
+            <w:r/>
+            <w:r>
+              <w:rPr>
+                <w:rFonts w:ascii="Times New Roman" w:hAnsi="Times New Roman"/>
+                <w:b/>
+                <w:color w:val="17232D"/>
+                <w:sz w:val="15"/>
+              </w:rPr>
+              <w:t>Near-null fraction, d5 → d10</w:t>
+            </w:r>
+          </w:p>
+        </w:tc>
+        <w:tc>
+          <w:tcPr>
+            <w:tcW w:type="dxa" w:w="2995"/>
+            <w:vAlign w:val="center"/>
+            <w:tcMar>
+              <w:top w:w="55" w:type="dxa"/>
+              <w:start w:w="65" w:type="dxa"/>
+              <w:bottom w:w="55" w:type="dxa"/>
+              <w:end w:w="65" w:type="dxa"/>
+            </w:tcMar>
+            <w:shd w:fill="DCEBF2"/>
+          </w:tcPr>
+          <w:p>
+            <w:pPr>
+              <w:spacing w:after="0" w:line="240" w:lineRule="auto"/>
+              <w:jc w:val="center"/>
+            </w:pPr>
+            <w:r/>
+            <w:r>
+              <w:rPr>
+                <w:rFonts w:ascii="Times New Roman" w:hAnsi="Times New Roman"/>
+                <w:b/>
+                <w:color w:val="17232D"/>
+                <w:sz w:val="15"/>
+              </w:rPr>
+              <w:t>PC1 / PCbottom sensitivity ratio, d8</w:t>
+            </w:r>
+          </w:p>
+        </w:tc>
+      </w:tr>
+      <w:tr>
+        <w:trPr>
+          <w:cantSplit/>
+        </w:trPr>
+        <w:tc>
+          <w:tcPr>
+            <w:tcW w:type="dxa" w:w="1800"/>
+            <w:vAlign w:val="center"/>
+            <w:tcMar>
+              <w:top w:w="55" w:type="dxa"/>
+              <w:start w:w="65" w:type="dxa"/>
+              <w:bottom w:w="55" w:type="dxa"/>
+              <w:end w:w="65" w:type="dxa"/>
+            </w:tcMar>
+          </w:tcPr>
+          <w:p>
+            <w:pPr>
+              <w:spacing w:after="0" w:line="240" w:lineRule="auto"/>
+            </w:pPr>
+            <w:r/>
+            <w:r>
+              <w:rPr>
+                <w:rFonts w:ascii="Times New Roman" w:hAnsi="Times New Roman"/>
+                <w:b w:val="0"/>
+                <w:color w:val="202A32"/>
+                <w:sz w:val="15"/>
+              </w:rPr>
+              <w:t>DeiT-Tiny</w:t>
+            </w:r>
+          </w:p>
+        </w:tc>
+        <w:tc>
+          <w:tcPr>
+            <w:tcW w:type="dxa" w:w="2477"/>
+            <w:vAlign w:val="center"/>
+            <w:tcMar>
+              <w:top w:w="55" w:type="dxa"/>
+              <w:start w:w="65" w:type="dxa"/>
+              <w:bottom w:w="55" w:type="dxa"/>
+              <w:end w:w="65" w:type="dxa"/>
+            </w:tcMar>
+          </w:tcPr>
+          <w:p>
+            <w:pPr>
+              <w:spacing w:after="0" w:line="240" w:lineRule="auto"/>
+              <w:jc w:val="center"/>
+            </w:pPr>
+            <w:r/>
+            <w:r>
+              <w:rPr>
+                <w:rFonts w:ascii="Times New Roman" w:hAnsi="Times New Roman"/>
+                <w:b w:val="0"/>
+                <w:color w:val="202A32"/>
+                <w:sz w:val="15"/>
+              </w:rPr>
+              <w:t>0.541 → 0.125</w:t>
+            </w:r>
+          </w:p>
+        </w:tc>
+        <w:tc>
+          <w:tcPr>
+            <w:tcW w:type="dxa" w:w="2448"/>
+            <w:vAlign w:val="center"/>
+            <w:tcMar>
+              <w:top w:w="55" w:type="dxa"/>
+              <w:start w:w="65" w:type="dxa"/>
+              <w:bottom w:w="55" w:type="dxa"/>
+              <w:end w:w="65" w:type="dxa"/>
+            </w:tcMar>
+          </w:tcPr>
+          <w:p>
+            <w:pPr>
+              <w:spacing w:after="0" w:line="240" w:lineRule="auto"/>
+              <w:jc w:val="center"/>
+            </w:pPr>
+            <w:r/>
+            <w:r>
+              <w:rPr>
+                <w:rFonts w:ascii="Times New Roman" w:hAnsi="Times New Roman"/>
+                <w:b w:val="0"/>
+                <w:color w:val="202A32"/>
+                <w:sz w:val="15"/>
+              </w:rPr>
+              <w:t>0.52% → 31.77%</w:t>
+            </w:r>
+          </w:p>
+        </w:tc>
+        <w:tc>
+          <w:tcPr>
+            <w:tcW w:type="dxa" w:w="2995"/>
+            <w:vAlign w:val="center"/>
+            <w:tcMar>
+              <w:top w:w="55" w:type="dxa"/>
+              <w:start w:w="65" w:type="dxa"/>
+              <w:bottom w:w="55" w:type="dxa"/>
+              <w:end w:w="65" w:type="dxa"/>
+            </w:tcMar>
+          </w:tcPr>
+          <w:p>
+            <w:pPr>
+              <w:spacing w:after="0" w:line="240" w:lineRule="auto"/>
+              <w:jc w:val="center"/>
+            </w:pPr>
+            <w:r/>
+            <w:r>
+              <w:rPr>
+                <w:rFonts w:ascii="Times New Roman" w:hAnsi="Times New Roman"/>
+                <w:b w:val="0"/>
+                <w:color w:val="202A32"/>
+                <w:sz w:val="15"/>
+              </w:rPr>
+              <w:t>0.089</w:t>
+            </w:r>
+          </w:p>
+        </w:tc>
+      </w:tr>
+      <w:tr>
+        <w:trPr>
+          <w:cantSplit/>
+        </w:trPr>
+        <w:tc>
+          <w:tcPr>
+            <w:tcW w:type="dxa" w:w="1800"/>
+            <w:vAlign w:val="center"/>
+            <w:tcMar>
+              <w:top w:w="55" w:type="dxa"/>
+              <w:start w:w="65" w:type="dxa"/>
+              <w:bottom w:w="55" w:type="dxa"/>
+              <w:end w:w="65" w:type="dxa"/>
+            </w:tcMar>
+          </w:tcPr>
+          <w:p>
+            <w:pPr>
+              <w:spacing w:after="0" w:line="240" w:lineRule="auto"/>
+            </w:pPr>
+            <w:r/>
+            <w:r>
+              <w:rPr>
+                <w:rFonts w:ascii="Times New Roman" w:hAnsi="Times New Roman"/>
+                <w:b w:val="0"/>
+                <w:color w:val="202A32"/>
+                <w:sz w:val="15"/>
+              </w:rPr>
+              <w:t>DeiT-Small</w:t>
+            </w:r>
+          </w:p>
+        </w:tc>
+        <w:tc>
+          <w:tcPr>
+            <w:tcW w:type="dxa" w:w="2477"/>
+            <w:vAlign w:val="center"/>
+            <w:tcMar>
+              <w:top w:w="55" w:type="dxa"/>
+              <w:start w:w="65" w:type="dxa"/>
+              <w:bottom w:w="55" w:type="dxa"/>
+              <w:end w:w="65" w:type="dxa"/>
+            </w:tcMar>
+          </w:tcPr>
+          <w:p>
+            <w:pPr>
+              <w:spacing w:after="0" w:line="240" w:lineRule="auto"/>
+              <w:jc w:val="center"/>
+            </w:pPr>
+            <w:r/>
+            <w:r>
+              <w:rPr>
+                <w:rFonts w:ascii="Times New Roman" w:hAnsi="Times New Roman"/>
+                <w:b w:val="0"/>
+                <w:color w:val="202A32"/>
+                <w:sz w:val="15"/>
+              </w:rPr>
+              <w:t>0.467 → 0.114</w:t>
+            </w:r>
+          </w:p>
+        </w:tc>
+        <w:tc>
+          <w:tcPr>
+            <w:tcW w:type="dxa" w:w="2448"/>
+            <w:vAlign w:val="center"/>
+            <w:tcMar>
+              <w:top w:w="55" w:type="dxa"/>
+              <w:start w:w="65" w:type="dxa"/>
+              <w:bottom w:w="55" w:type="dxa"/>
+              <w:end w:w="65" w:type="dxa"/>
+            </w:tcMar>
+          </w:tcPr>
+          <w:p>
+            <w:pPr>
+              <w:spacing w:after="0" w:line="240" w:lineRule="auto"/>
+              <w:jc w:val="center"/>
+            </w:pPr>
+            <w:r/>
+            <w:r>
+              <w:rPr>
+                <w:rFonts w:ascii="Times New Roman" w:hAnsi="Times New Roman"/>
+                <w:b w:val="0"/>
+                <w:color w:val="202A32"/>
+                <w:sz w:val="15"/>
+              </w:rPr>
+              <w:t>0.26% → 57.03%</w:t>
+            </w:r>
+          </w:p>
+        </w:tc>
+        <w:tc>
+          <w:tcPr>
+            <w:tcW w:type="dxa" w:w="2995"/>
+            <w:vAlign w:val="center"/>
+            <w:tcMar>
+              <w:top w:w="55" w:type="dxa"/>
+              <w:start w:w="65" w:type="dxa"/>
+              <w:bottom w:w="55" w:type="dxa"/>
+              <w:end w:w="65" w:type="dxa"/>
+            </w:tcMar>
+          </w:tcPr>
+          <w:p>
+            <w:pPr>
+              <w:spacing w:after="0" w:line="240" w:lineRule="auto"/>
+              <w:jc w:val="center"/>
+            </w:pPr>
+            <w:r/>
+            <w:r>
+              <w:rPr>
+                <w:rFonts w:ascii="Times New Roman" w:hAnsi="Times New Roman"/>
+                <w:b w:val="0"/>
+                <w:color w:val="202A32"/>
+                <w:sz w:val="15"/>
+              </w:rPr>
+              <w:t>0.041</w:t>
+            </w:r>
+          </w:p>
+        </w:tc>
+      </w:tr>
+      <w:tr>
+        <w:trPr>
+          <w:cantSplit/>
+        </w:trPr>
+        <w:tc>
+          <w:tcPr>
+            <w:tcW w:type="dxa" w:w="1800"/>
+            <w:vAlign w:val="center"/>
+            <w:tcMar>
+              <w:top w:w="55" w:type="dxa"/>
+              <w:start w:w="65" w:type="dxa"/>
+              <w:bottom w:w="55" w:type="dxa"/>
+              <w:end w:w="65" w:type="dxa"/>
+            </w:tcMar>
+          </w:tcPr>
+          <w:p>
+            <w:pPr>
+              <w:spacing w:after="0" w:line="240" w:lineRule="auto"/>
+            </w:pPr>
+            <w:r/>
+            <w:r>
+              <w:rPr>
+                <w:rFonts w:ascii="Times New Roman" w:hAnsi="Times New Roman"/>
+                <w:b w:val="0"/>
+                <w:color w:val="202A32"/>
+                <w:sz w:val="15"/>
+              </w:rPr>
+              <w:t>ViT-B/16 AugReg</w:t>
+            </w:r>
+          </w:p>
+        </w:tc>
+        <w:tc>
+          <w:tcPr>
+            <w:tcW w:type="dxa" w:w="2477"/>
+            <w:vAlign w:val="center"/>
+            <w:tcMar>
+              <w:top w:w="55" w:type="dxa"/>
+              <w:start w:w="65" w:type="dxa"/>
+              <w:bottom w:w="55" w:type="dxa"/>
+              <w:end w:w="65" w:type="dxa"/>
+            </w:tcMar>
+          </w:tcPr>
+          <w:p>
+            <w:pPr>
+              <w:spacing w:after="0" w:line="240" w:lineRule="auto"/>
+              <w:jc w:val="center"/>
+            </w:pPr>
+            <w:r/>
+            <w:r>
+              <w:rPr>
+                <w:rFonts w:ascii="Times New Roman" w:hAnsi="Times New Roman"/>
+                <w:b w:val="0"/>
+                <w:color w:val="202A32"/>
+                <w:sz w:val="15"/>
+              </w:rPr>
+              <w:t>0.383 → 0.140</w:t>
+            </w:r>
+          </w:p>
+        </w:tc>
+        <w:tc>
+          <w:tcPr>
+            <w:tcW w:type="dxa" w:w="2448"/>
+            <w:vAlign w:val="center"/>
+            <w:tcMar>
+              <w:top w:w="55" w:type="dxa"/>
+              <w:start w:w="65" w:type="dxa"/>
+              <w:bottom w:w="55" w:type="dxa"/>
+              <w:end w:w="65" w:type="dxa"/>
+            </w:tcMar>
+          </w:tcPr>
+          <w:p>
+            <w:pPr>
+              <w:spacing w:after="0" w:line="240" w:lineRule="auto"/>
+              <w:jc w:val="center"/>
+            </w:pPr>
+            <w:r/>
+            <w:r>
+              <w:rPr>
+                <w:rFonts w:ascii="Times New Roman" w:hAnsi="Times New Roman"/>
+                <w:b w:val="0"/>
+                <w:color w:val="202A32"/>
+                <w:sz w:val="15"/>
+              </w:rPr>
+              <w:t>0.26% → 49.61%</w:t>
+            </w:r>
+          </w:p>
+        </w:tc>
+        <w:tc>
+          <w:tcPr>
+            <w:tcW w:type="dxa" w:w="2995"/>
+            <w:vAlign w:val="center"/>
+            <w:tcMar>
+              <w:top w:w="55" w:type="dxa"/>
+              <w:start w:w="65" w:type="dxa"/>
+              <w:bottom w:w="55" w:type="dxa"/>
+              <w:end w:w="65" w:type="dxa"/>
+            </w:tcMar>
+          </w:tcPr>
+          <w:p>
+            <w:pPr>
+              <w:spacing w:after="0" w:line="240" w:lineRule="auto"/>
+              <w:jc w:val="center"/>
+            </w:pPr>
+            <w:r/>
+            <w:r>
+              <w:rPr>
+                <w:rFonts w:ascii="Times New Roman" w:hAnsi="Times New Roman"/>
+                <w:b w:val="0"/>
+                <w:color w:val="202A32"/>
+                <w:sz w:val="15"/>
+              </w:rPr>
+              <w:t>65.2†</w:t>
+            </w:r>
+          </w:p>
+        </w:tc>
+      </w:tr>
+      <w:tr>
+        <w:trPr>
+          <w:cantSplit/>
+        </w:trPr>
+        <w:tc>
+          <w:tcPr>
+            <w:tcW w:type="dxa" w:w="1800"/>
+            <w:vAlign w:val="center"/>
+            <w:tcMar>
+              <w:top w:w="55" w:type="dxa"/>
+              <w:start w:w="65" w:type="dxa"/>
+              <w:bottom w:w="55" w:type="dxa"/>
+              <w:end w:w="65" w:type="dxa"/>
+            </w:tcMar>
+          </w:tcPr>
+          <w:p>
+            <w:pPr>
+              <w:spacing w:after="0" w:line="240" w:lineRule="auto"/>
+            </w:pPr>
+            <w:r/>
+            <w:r>
+              <w:rPr>
+                <w:rFonts w:ascii="Times New Roman" w:hAnsi="Times New Roman"/>
+                <w:b w:val="0"/>
+                <w:color w:val="202A32"/>
+                <w:sz w:val="15"/>
+              </w:rPr>
+              <w:t>DINOv2 ViT-S/14</w:t>
+            </w:r>
+          </w:p>
+        </w:tc>
+        <w:tc>
+          <w:tcPr>
+            <w:tcW w:type="dxa" w:w="2477"/>
+            <w:vAlign w:val="center"/>
+            <w:tcMar>
+              <w:top w:w="55" w:type="dxa"/>
+              <w:start w:w="65" w:type="dxa"/>
+              <w:bottom w:w="55" w:type="dxa"/>
+              <w:end w:w="65" w:type="dxa"/>
+            </w:tcMar>
+          </w:tcPr>
+          <w:p>
+            <w:pPr>
+              <w:spacing w:after="0" w:line="240" w:lineRule="auto"/>
+              <w:jc w:val="center"/>
+            </w:pPr>
+            <w:r/>
+            <w:r>
+              <w:rPr>
+                <w:rFonts w:ascii="Times New Roman" w:hAnsi="Times New Roman"/>
+                <w:b w:val="0"/>
+                <w:color w:val="202A32"/>
+                <w:sz w:val="15"/>
+              </w:rPr>
+              <w:t>0.453 → 0.323</w:t>
+            </w:r>
+          </w:p>
+        </w:tc>
+        <w:tc>
+          <w:tcPr>
+            <w:tcW w:type="dxa" w:w="2448"/>
+            <w:vAlign w:val="center"/>
+            <w:tcMar>
+              <w:top w:w="55" w:type="dxa"/>
+              <w:start w:w="65" w:type="dxa"/>
+              <w:bottom w:w="55" w:type="dxa"/>
+              <w:end w:w="65" w:type="dxa"/>
+            </w:tcMar>
+          </w:tcPr>
+          <w:p>
+            <w:pPr>
+              <w:spacing w:after="0" w:line="240" w:lineRule="auto"/>
+              <w:jc w:val="center"/>
+            </w:pPr>
+            <w:r/>
+            <w:r>
+              <w:rPr>
+                <w:rFonts w:ascii="Times New Roman" w:hAnsi="Times New Roman"/>
+                <w:b w:val="0"/>
+                <w:color w:val="202A32"/>
+                <w:sz w:val="15"/>
+              </w:rPr>
+              <w:t>0.26% → 1.56%</w:t>
+            </w:r>
+          </w:p>
+        </w:tc>
+        <w:tc>
+          <w:tcPr>
+            <w:tcW w:type="dxa" w:w="2995"/>
+            <w:vAlign w:val="center"/>
+            <w:tcMar>
+              <w:top w:w="55" w:type="dxa"/>
+              <w:start w:w="65" w:type="dxa"/>
+              <w:bottom w:w="55" w:type="dxa"/>
+              <w:end w:w="65" w:type="dxa"/>
+            </w:tcMar>
+          </w:tcPr>
+          <w:p>
+            <w:pPr>
+              <w:spacing w:after="0" w:line="240" w:lineRule="auto"/>
+              <w:jc w:val="center"/>
+            </w:pPr>
+            <w:r/>
+            <w:r>
+              <w:rPr>
+                <w:rFonts w:ascii="Times New Roman" w:hAnsi="Times New Roman"/>
+                <w:b w:val="0"/>
+                <w:color w:val="202A32"/>
+                <w:sz w:val="15"/>
+              </w:rPr>
+              <w:t>0.199</w:t>
+            </w:r>
+          </w:p>
+        </w:tc>
+      </w:tr>
+    </w:tbl>
+    <w:p>
+      <w:pPr>
+        <w:spacing w:after="20"/>
+      </w:pPr>
+    </w:p>
+    <w:p>
+      <w:pPr>
+        <w:spacing w:after="100" w:line="259" w:lineRule="auto"/>
+      </w:pPr>
+      <w:r>
+        <w:rPr>
+          <w:rFonts w:ascii="Times New Roman" w:hAnsi="Times New Roman"/>
+          <w:i w:val="0"/>
+          <w:color w:val="202A32"/>
+          <w:sz w:val="20"/>
+        </w:rPr>
+        <w:t>Mℓ is the empirical uncentered second moment of clean predicted-class margin gradients over patch positions and N=100 calibration images/model; positions are aggregated within images. Normalized effective rank divides the entropy-based effective rank by feature dimension D, so it is dimensionless. Mℓ is distinct from the full token-by-feature downstream readout Jacobian Gram matrix. DINOv2 near-null growth is small at the primary threshold. †The ViT-B PCbottom-based ratio is sensitive to a small depth-8 activation-covariance eigengap. Ratios describe the selected sample directions and are not a universal ranking of PCA directions.</w:t>
       </w:r>
     </w:p>
     <w:p>
@@ -9949,7 +11529,7 @@
         <w:spacing w:after="100" w:line="259" w:lineRule="auto"/>
       </w:pPr>
       <w:r>
-        <w:t>At each architecture’s most aggressive tested token budget, Table II compares the strongest of the tested conventional pruning baselines with Group Mean, ToMe, the per-image Full-J oracle, and rank-16 and rank-32 operator-aware variants. Operator-aware variants exceed the strongest pruning result by 4.2–12.0 percentage points in these rows. The margin is smaller against Group Mean and ToMe: Full-J ranges from 0.6 points below Group Mean for DeiT-Small to 1.3 points above it for DINOv2, and is 0.6 points below ToMe for DeiT-Small while exceeding it in the other three rows. The rank-restricted results also vary by architecture. These comparisons therefore do not show universal dominance over the stronger merging baselines. Full-J requires an image-specific downstream Jacobian and is an offline oracle, not a practical inference method. The budgets differ by architecture (32 retained tokens for DeiT-Tiny, DeiT-Small, and ViT-B/16 AugReg; 42 for DINOv2 ViT-S/14), so rows are within-architecture comparisons rather than a matched token-count experiment. Figure 8 presents the full accuracy-token curves.</w:t>
+        <w:t>At each architecture’s most aggressive tested token budget, Table IV compares the strongest of the tested conventional pruning baselines with Group Mean, ToMe, the per-image Full-J oracle, and rank-16 and rank-32 operator-aware variants. Operator-aware variants exceed the strongest pruning result by 4.2–12.0 percentage points in these rows. The margin is smaller against Group Mean and ToMe: Full-J ranges from 0.6 points below Group Mean for DeiT-Small to 1.3 points above it for DINOv2, and is 0.6 points below ToMe for DeiT-Small while exceeding it in the other three rows. The rank-restricted results also vary by architecture. These comparisons therefore do not show universal dominance over the stronger merging baselines. Full-J requires an image-specific downstream Jacobian and is an offline oracle, not a practical inference method. The budgets differ by architecture (32 retained tokens for DeiT-Tiny, DeiT-Small, and ViT-B/16 AugReg; 42 for DINOv2 ViT-S/14), so rows are within-architecture comparisons rather than a matched token-count experiment. Figure 8 presents the full accuracy-token curves.</w:t>
       </w:r>
     </w:p>
     <w:p>
@@ -9957,7 +11537,7 @@
         <w:spacing w:after="100" w:line="259" w:lineRule="auto"/>
       </w:pPr>
       <w:r>
-        <w:t>TABLE II</w:t>
+        <w:t>TABLE IV</w:t>
       </w:r>
     </w:p>
     <w:p>
@@ -11156,7 +12736,7 @@
         <w:spacing w:after="100" w:line="259" w:lineRule="auto"/>
       </w:pPr>
       <w:r>
-        <w:t>A same-group control compares Group Mean and Operator-Aware carriers on the same image, at the same token budget, with identical assignments S. For primary feature-similarity grouping, the same-image, same-budget difference in linearized operator residual (Group Mean minus Operator-Aware) is positive on all 20,000 image-by-budget rows; averaging equally over five budgets and 1,000 held-out images per architecture gives mean Δ of 1.27 (DeiT-Tiny), 1.48 (DeiT-Small), 2.53 (ViT-B/16 AugReg), and 7.20 (DINOv2 ViT-S/14). These are descriptive operator-residual contrasts with images reused across budgets, not a significance test or evidence that Top-1 or nonlinear final-logit damage must improve. The accuracy comparisons in Table II remain architecture- and budget-dependent: for example, Group Mean and ToMe tie for DeiT-Small at the most aggressive budget, while their ordering differs elsewhere. Across the evaluated method, budget, and seed conditions, operator residual ‖J E‖ is associated with measured logit-L2 distortion: per-architecture Pearson r ranges from 0.739 to 0.866, and Spearman ρ ranges from 0.792 to 0.916. Because the same held-out cohort is reused across conditions, this is a condition-level association rather than an image-level generalization estimate. Rank-16 and rank-32 outcomes vary by architecture and budget; the confirmatory data do not support a universal recovery fraction. Figure 8 reports the measured accuracy-token curves, while Table II lists rank-16 and rank-32 Top-1 at each architecture's most aggressive tested budget.</w:t>
+        <w:t>A same-group control compares Group Mean and Operator-Aware carriers on the same image, at the same token budget, with identical assignments S. For primary feature-similarity grouping, the same-image, same-budget difference in linearized operator residual (Group Mean minus Operator-Aware) is positive on all 20,000 image-by-budget rows; averaging equally over five budgets and 1,000 held-out images per architecture gives mean Δ of 1.27 (DeiT-Tiny), 1.48 (DeiT-Small), 2.53 (ViT-B/16 AugReg), and 7.20 (DINOv2 ViT-S/14). These are descriptive operator-residual contrasts with images reused across budgets, not a significance test or evidence that Top-1 or nonlinear final-logit damage must improve. The accuracy comparisons in Table IV remain architecture- and budget-dependent: for example, Group Mean and ToMe tie for DeiT-Small at the most aggressive budget, while their ordering differs elsewhere. Across the evaluated method, budget, and seed conditions, operator residual ‖J E‖ is associated with measured logit-L2 distortion: per-architecture Pearson r ranges from 0.739 to 0.866, and Spearman ρ ranges from 0.792 to 0.916. Because the same held-out cohort is reused across conditions, this is a condition-level association rather than an image-level generalization estimate. Rank-16 and rank-32 outcomes vary by architecture and budget; the confirmatory data do not support a universal recovery fraction. Figure 8 reports the measured accuracy-token curves, while Table IV lists rank-16 and rank-32 Top-1 at each architecture's most aggressive tested budget.</w:t>
       </w:r>
     </w:p>
     <w:p>
@@ -11220,7 +12800,7 @@
           <w:color w:val="4C5963"/>
           <w:sz w:val="17"/>
         </w:rPr>
-        <w:t>Figure 8. Confirmatory Top-1 accuracy versus retained patch-token fraction for four architectures. Curves show pruning, Group Mean, ToMe, the full-J oracle, and rank-32; rank-16 Top-1 is listed in Table II at the most aggressive tested budget. Each architecture uses N=1,000 held-out images.</w:t>
+        <w:t>Figure 8. Confirmatory Top-1 accuracy versus retained patch-token fraction for four architectures. Curves show pruning, Group Mean, ToMe, the full-J oracle, and rank-32; rank-16 Top-1 is listed in Table IV at the most aggressive tested budget. Each architecture uses N=1,000 held-out images.</w:t>
       </w:r>
     </w:p>
     <w:p>
@@ -11838,10 +13418,11 @@
       </w:pPr>
       <w:r>
         <w:rPr>
+          <w:rFonts w:ascii="Times New Roman" w:hAnsi="Times New Roman"/>
           <w:color w:val="26343D"/>
           <w:sz w:val="17"/>
         </w:rPr>
-        <w:t>[42] F. Parodi, J. K. Matelsky, M. Segado, “Zero-Ablation Overstates Register Content Dependence in DINO Vision Transformers,” in Proc. IEEE/CVF Conf. Comput. Vis. Pattern Recognit. (CVPR) Workshops, pp. 4164–4170, 2026. Available: https://openaccess.thecvf.com/content/CVPR2026W/HOW/html/Parodi_Zero-Ablation_Overstates_Register_Content_Dependence_in_DINO_Vision_Transformers_CVPRW_2026_paper.html.</w:t>
+        <w:t>[42] A. Bond, E. E. Özlü, T. Çimen, I. U. Melanlioglu, T. Birdal, E. Erdem, et al., “Task-Induced Riemannian Metrics for Vision Transformer Feature Spaces,” arXiv preprint arXiv:2609.27988 [cs.CV], 2026. Available: https://arxiv.org/abs/2609.27988.</w:t>
       </w:r>
     </w:p>
     <w:p>
@@ -11851,10 +13432,11 @@
       </w:pPr>
       <w:r>
         <w:rPr>
+          <w:rFonts w:ascii="Times New Roman" w:hAnsi="Times New Roman"/>
           <w:color w:val="26343D"/>
           <w:sz w:val="17"/>
         </w:rPr>
-        <w:t>[43] Y. LeCun, J. S. Denker, S. A. Solla, “Optimal Brain Damage,” in Advances in Neural Information Processing Systems, vol. 2, pp. 598–605, 1989. Available: https://proceedings.neurips.cc/paper/1989/hash/6c9882bbac1c7093bd25041881277658-Abstract.html.</w:t>
+        <w:t>[43] H. Liu, A. Singh, Y. Li, H. Wang, “Approximate Nullspace Augmented Finetuning for Robust Vision Transformers,” in Conference on Parsimony and Learning, vol. 280, pp. 1–23, 2025. Available: https://proceedings.mlr.press/v280/liu25a.html.</w:t>
       </w:r>
     </w:p>
     <w:p>
@@ -11867,7 +13449,7 @@
           <w:color w:val="26343D"/>
           <w:sz w:val="17"/>
         </w:rPr>
-        <w:t>[44] B. Hassibi, D. G. Stork, “Optimal Brain Surgeon and general network pruning,” in Proceedings of the IEEE Proc. IEEE Int. Conf. Neural Netw., vol. 1, pp. 293–299, 1993. DOI: 10.1109/ICNN.1993.298572.</w:t>
+        <w:t>[44] F. Parodi, J. K. Matelsky, M. Segado, “Zero-Ablation Overstates Register Content Dependence in DINO Vision Transformers,” in Proc. IEEE/CVF Conf. Comput. Vis. Pattern Recognit. (CVPR) Workshops, pp. 4164–4170, 2026. Available: https://openaccess.thecvf.com/content/CVPR2026W/HOW/html/Parodi_Zero-Ablation_Overstates_Register_Content_Dependence_in_DINO_Vision_Transformers_CVPRW_2026_paper.html.</w:t>
       </w:r>
     </w:p>
     <w:p>
@@ -11880,7 +13462,7 @@
           <w:color w:val="26343D"/>
           <w:sz w:val="17"/>
         </w:rPr>
-        <w:t>[45] C. Thrash, K. Chen, S. Kolouri, “Output-aware Residual Stream Pruning for Large Language Models,” in arXiv preprint arXiv:2609.35579, 2026. DOI: 10.48550/arXiv.2609.35579.</w:t>
+        <w:t>[45] Y. LeCun, J. S. Denker, S. A. Solla, “Optimal Brain Damage,” in Advances in Neural Information Processing Systems, vol. 2, pp. 598–605, 1989. Available: https://proceedings.neurips.cc/paper/1989/hash/6c9882bbac1c7093bd25041881277658-Abstract.html.</w:t>
       </w:r>
     </w:p>
     <w:p>
@@ -11893,7 +13475,7 @@
           <w:color w:val="26343D"/>
           <w:sz w:val="17"/>
         </w:rPr>
-        <w:t>[46] S. Jain, B. C. Wallace, “Attention Is Not Explanation,” in Proceedings of the 2019 Conference of the North American Chapter of the Association for Computational Linguistics: Human Language Technologies, pp. 3543–3556, 2019. DOI: 10.18653/v1/N19-1357.</w:t>
+        <w:t>[46] B. Hassibi, D. G. Stork, “Optimal Brain Surgeon and general network pruning,” in Proceedings of the IEEE Proc. IEEE Int. Conf. Neural Netw., vol. 1, pp. 293–299, 1993. DOI: 10.1109/ICNN.1993.298572.</w:t>
       </w:r>
     </w:p>
     <w:p>
@@ -11906,7 +13488,7 @@
           <w:color w:val="26343D"/>
           <w:sz w:val="17"/>
         </w:rPr>
-        <w:t>[47] S. Serrano, N. A. Smith, “Is Attention Interpretable?,” in Proceedings of the 57th Annual Meeting of the Association for Computational Linguistics, pp. 2931–2951, 2019. DOI: 10.18653/v1/P19-1282.</w:t>
+        <w:t>[47] C. Thrash, K. Chen, S. Kolouri, “Output-aware Residual Stream Pruning for Large Language Models,” in arXiv preprint arXiv:2609.35579, 2026. DOI: 10.48550/arXiv.2609.35579.</w:t>
       </w:r>
     </w:p>
     <w:p>
@@ -11919,7 +13501,7 @@
           <w:color w:val="26343D"/>
           <w:sz w:val="17"/>
         </w:rPr>
-        <w:t>[48] S. Wiegreffe, Y. Pinter, “Attention Is Not Not Explanation,” in Proceedings of the 2019 Conference on Empirical Methods in Natural Language Processing and the 9th International Joint Conference on Natural Language Processing, pp. 11–20, 2019. DOI: 10.18653/v1/D19-1002.</w:t>
+        <w:t>[48] S. Jain, B. C. Wallace, “Attention Is Not Explanation,” in Proceedings of the 2019 Conference of the North American Chapter of the Association for Computational Linguistics: Human Language Technologies, pp. 3543–3556, 2019. DOI: 10.18653/v1/N19-1357.</w:t>
       </w:r>
     </w:p>
     <w:p>
@@ -11932,7 +13514,7 @@
           <w:color w:val="26343D"/>
           <w:sz w:val="17"/>
         </w:rPr>
-        <w:t>[49] S. Abnar, W. Zuidema, “Quantifying Attention Flow in Transformers,” in Proceedings of the 58th Annual Meeting of the Association for Computational Linguistics, pp. 4190–4197, 2020. DOI: 10.18653/v1/2020.acl-main.385.</w:t>
+        <w:t>[49] S. Serrano, N. A. Smith, “Is Attention Interpretable?,” in Proceedings of the 57th Annual Meeting of the Association for Computational Linguistics, pp. 2931–2951, 2019. DOI: 10.18653/v1/P19-1282.</w:t>
       </w:r>
     </w:p>
     <w:p>
@@ -11945,7 +13527,7 @@
           <w:color w:val="26343D"/>
           <w:sz w:val="17"/>
         </w:rPr>
-        <w:t>[50] M. Sundararajan, A. Taly, Q. Yan, “Axiomatic Attribution for Deep Networks,” in Proc. 34th Int. Conf. Mach. Learn., vol. 70, pp. 3319–3328, 2017. Available: https://proceedings.mlr.press/v70/sundararajan17a.html.</w:t>
+        <w:t>[50] S. Wiegreffe, Y. Pinter, “Attention Is Not Not Explanation,” in Proceedings of the 2019 Conference on Empirical Methods in Natural Language Processing and the 9th International Joint Conference on Natural Language Processing, pp. 11–20, 2019. DOI: 10.18653/v1/D19-1002.</w:t>
       </w:r>
     </w:p>
     <w:p>
@@ -11958,7 +13540,7 @@
           <w:color w:val="26343D"/>
           <w:sz w:val="17"/>
         </w:rPr>
-        <w:t>[51] J. Adebayo, J. Gilmer, M. Muelly, I. Goodfellow, M. Hardt, B. Kim, “Sanity Checks for Saliency Maps,” in Advances in Neural Information Processing Systems, vol. 31, pp. 9505–9515, 2018. Available: https://proceedings.neurips.cc/paper/2018/hash/294a8ed24b1ad22ec2e7efea049b8737-Abstract.html.</w:t>
+        <w:t>[51] S. Abnar, W. Zuidema, “Quantifying Attention Flow in Transformers,” in Proceedings of the 58th Annual Meeting of the Association for Computational Linguistics, pp. 4190–4197, 2020. DOI: 10.18653/v1/2020.acl-main.385.</w:t>
       </w:r>
     </w:p>
     <w:p>
@@ -11971,7 +13553,7 @@
           <w:color w:val="26343D"/>
           <w:sz w:val="17"/>
         </w:rPr>
-        <w:t>[52] H. Chefer, S. Gur, L. Wolf, “Transformer Interpretability Beyond Attention Visualization,” in Proc. IEEE/CVF Conf. Comput. Vis. Pattern Recognit., pp. 782–791, 2021. DOI: 10.1109/CVPR46437.2021.00084.</w:t>
+        <w:t>[52] M. Sundararajan, A. Taly, Q. Yan, “Axiomatic Attribution for Deep Networks,” in Proc. 34th Int. Conf. Mach. Learn., vol. 70, pp. 3319–3328, 2017. Available: https://proceedings.mlr.press/v70/sundararajan17a.html.</w:t>
       </w:r>
     </w:p>
     <w:p>
@@ -11984,7 +13566,33 @@
           <w:color w:val="26343D"/>
           <w:sz w:val="17"/>
         </w:rPr>
-        <w:t>[53] A. Geiger, Z. Wu, C. Potts, T. Icard, N. Goodman, “Inducing Causal Structure for Interpretable Neural Networks,” in Proc. 39th Int. Conf. Mach. Learn., vol. 162, pp. 7324–7338, 2022. Available: https://proceedings.mlr.press/v162/geiger22a.html.</w:t>
+        <w:t>[53] J. Adebayo, J. Gilmer, M. Muelly, I. Goodfellow, M. Hardt, B. Kim, “Sanity Checks for Saliency Maps,” in Advances in Neural Information Processing Systems, vol. 31, pp. 9505–9515, 2018. Available: https://proceedings.neurips.cc/paper/2018/hash/294a8ed24b1ad22ec2e7efea049b8737-Abstract.html.</w:t>
+      </w:r>
+    </w:p>
+    <w:p>
+      <w:pPr>
+        <w:spacing w:after="80" w:line="240" w:lineRule="auto"/>
+        <w:ind w:left="403" w:hanging="403"/>
+      </w:pPr>
+      <w:r>
+        <w:rPr>
+          <w:color w:val="26343D"/>
+          <w:sz w:val="17"/>
+        </w:rPr>
+        <w:t>[54] H. Chefer, S. Gur, L. Wolf, “Transformer Interpretability Beyond Attention Visualization,” in Proc. IEEE/CVF Conf. Comput. Vis. Pattern Recognit., pp. 782–791, 2021. DOI: 10.1109/CVPR46437.2021.00084.</w:t>
+      </w:r>
+    </w:p>
+    <w:p>
+      <w:pPr>
+        <w:spacing w:after="80" w:line="240" w:lineRule="auto"/>
+        <w:ind w:left="403" w:hanging="403"/>
+      </w:pPr>
+      <w:r>
+        <w:rPr>
+          <w:color w:val="26343D"/>
+          <w:sz w:val="17"/>
+        </w:rPr>
+        <w:t>[55] A. Geiger, Z. Wu, C. Potts, T. Icard, N. Goodman, “Inducing Causal Structure for Interpretable Neural Networks,” in Proc. 39th Int. Conf. Mach. Learn., vol. 162, pp. 7324–7338, 2022. Available: https://proceedings.mlr.press/v162/geiger22a.html.</w:t>
       </w:r>
     </w:p>
     <w:sectPr>

</xml_diff>

<commit_message>
Finalize manuscript pre-submission cleanup
</commit_message>
<xml_diff>
--- a/docs/PAPER_DRAFT_v5.docx
+++ b/docs/PAPER_DRAFT_v5.docx
@@ -18,17 +18,17 @@
     <w:p>
       <w:pPr>
         <w:spacing w:after="100" w:line="259" w:lineRule="auto"/>
+        <w:rPr>
+          <w:i/>
+          <w:iCs/>
+        </w:rPr>
       </w:pPr>
       <w:r>
-        <w:t>Anonymous Authors</w:t>
-      </w:r>
-    </w:p>
-    <w:p>
-      <w:pPr>
-        <w:spacing w:after="100" w:line="259" w:lineRule="auto"/>
-      </w:pPr>
-      <w:r>
-        <w:t>Under review</w:t>
+        <w:rPr>
+          <w:i/>
+          <w:iCs/>
+        </w:rPr>
+        <w:t>Nghiem Nhat Minh, Dang Tri Dung, Do Tri Cuong</w:t>
       </w:r>
     </w:p>
     <w:p>
@@ -173,47 +173,7 @@
         <w:spacing w:after="100" w:line="259" w:lineRule="auto"/>
       </w:pPr>
       <w:r>
-        <w:rPr>
-          <w:rFonts w:ascii="Times New Roman" w:hAnsi="Times New Roman"/>
-          <w:i w:val="0"/>
-          <w:color w:val="202A32"/>
-          <w:sz w:val="20"/>
-        </w:rPr>
-        <w:t xml:space="preserve">Jacobian-sensitive geometry and task-aware token compression also have direct ViT precedents. Bond et al. define a task-induced pullback metric on ViT feature spaces, analyze its spectral and low-rank structure, and use task-sensitive geometry for token pruning and soft merging </w:t>
-      </w:r>
-      <w:r>
-        <w:rPr>
-          <w:rFonts w:ascii="Times New Roman" w:hAnsi="Times New Roman"/>
-          <w:color w:val="202A32"/>
-          <w:sz w:val="20"/>
-        </w:rPr>
-        <w:t>[42]</w:t>
-      </w:r>
-      <w:r>
-        <w:rPr>
-          <w:rFonts w:ascii="Times New Roman" w:hAnsi="Times New Roman"/>
-          <w:i w:val="0"/>
-          <w:color w:val="202A32"/>
-          <w:sz w:val="20"/>
-        </w:rPr>
-        <w:t xml:space="preserve">. Liu et al. study approximate nullspace perturbations in nonlinear ViT blocks and nullspace-noise augmentation for fine-tuning robustness </w:t>
-      </w:r>
-      <w:r>
-        <w:rPr>
-          <w:rFonts w:ascii="Times New Roman" w:hAnsi="Times New Roman"/>
-          <w:color w:val="202A32"/>
-          <w:sz w:val="20"/>
-        </w:rPr>
-        <w:t>[43]</w:t>
-      </w:r>
-      <w:r>
-        <w:rPr>
-          <w:rFonts w:ascii="Times New Roman" w:hAnsi="Times New Roman"/>
-          <w:i w:val="0"/>
-          <w:color w:val="202A32"/>
-          <w:sz w:val="20"/>
-        </w:rPr>
-        <w:t>. These works establish prior art for downstream-Jacobian geometry, task-aware compression, and approximate-nullspace analysis. PCF asks how much original image-specific content is needed at an ordinary spatial patch slot under fixed-slot interventions; its compression application optimizes grouped carrier content under a fixed assignment S, rather than recasting importance scoring or token-pair selection as the same optimization problem.</w:t>
+        <w:t>Jacobian-sensitive geometry and task-aware token compression also have direct ViT precedents. Bond et al. define a task-induced pullback metric on ViT feature spaces, analyze its spectral and low-rank structure, and use task-sensitive geometry for token pruning and soft merging [42]. Liu et al. study approximate nullspace perturbations in nonlinear ViT blocks and nullspace-noise augmentation for fine-tuning robustness [43]. These works establish prior art for downstream-Jacobian geometry, task-aware compression, and approximate-nullspace analysis. PCF asks how much original image-specific content is needed at an ordinary spatial patch slot under fixed-slot interventions; its compression application optimizes grouped carrier content under a fixed assignment S, rather than recasting importance scoring or token-pair selection as the same optimization problem.</w:t>
       </w:r>
     </w:p>
     <w:p>
@@ -221,7 +181,11 @@
         <w:spacing w:after="100" w:line="259" w:lineRule="auto"/>
       </w:pPr>
       <w:r>
-        <w:t>Surrogate substitution also has a close methodological precedent. Parodi et al. study mean, noise, and cross-image register-shuffling substitutions for specialized DINO register-token content. PCF examines ordinary spatial patch-token activations across depth and replacement fractions, and separates feature geometry from token-position diversity; it does not claim to introduce surrogate replacement [44].</w:t>
+        <w:t xml:space="preserve">Surrogate substitution also has a close methodological precedent. Parodi et al. study mean, noise, and cross-image register-shuffling substitutions for specialized DINO register-token content. PCF examines ordinary spatial patch-token activations </w:t>
+      </w:r>
+      <w:r>
+        <w:lastRenderedPageBreak/>
+        <w:t>across depth and replacement fractions, and separates feature geometry from token-position diversity; it does not claim to introduce surrogate replacement [44].</w:t>
       </w:r>
     </w:p>
     <w:p>
@@ -237,7 +201,6 @@
         <w:spacing w:after="100" w:line="259" w:lineRule="auto"/>
       </w:pPr>
       <w:r>
-        <w:lastRenderedPageBreak/>
         <w:t>Interpretability research cautions that attention weights alone need not explain a model's decision. Controlled studies examine whether attention is explanation and how explanation changes under interventions [48]–[50]. Attention flow, Integrated Gradients, saliency-map sanity checks, and transformer-specific relevance propagation provide complementary methods for tracing or attributing model behavior [51]–[54]. Causal abstraction offers a framework for connecting interventions to model-level causal structure [55]. Our evidence uses direct activation interventions and held-out prediction of perturbation damage; it is bounded to the tested models, readouts, and cohorts.</w:t>
       </w:r>
     </w:p>
@@ -786,6 +749,7 @@
               <w:rPr>
                 <w:szCs w:val="28"/>
               </w:rPr>
+              <w:lastRenderedPageBreak/>
               <w:t>Multi-block operator prediction</w:t>
             </w:r>
           </w:p>
@@ -972,14 +936,7 @@
               <w:rPr>
                 <w:szCs w:val="28"/>
               </w:rPr>
-              <w:t xml:space="preserve">At the most aggressive tested budgets, operator-aware methods beat the strongest </w:t>
-            </w:r>
-            <w:r>
-              <w:rPr>
-                <w:szCs w:val="28"/>
-              </w:rPr>
-              <w:lastRenderedPageBreak/>
-              <w:t>pruning baselines by 4.2–12.0 pp; ToMe remains competitive.</w:t>
+              <w:t>At the most aggressive tested budgets, operator-aware methods beat the strongest pruning baselines by 4.2–12.0 pp; ToMe remains competitive.</w:t>
             </w:r>
           </w:p>
         </w:tc>
@@ -1727,11 +1684,7 @@
         <w:spacing w:after="100" w:line="259" w:lineRule="auto"/>
       </w:pPr>
       <w:r>
-        <w:t>Figure 2 shows a pronounced distinction between zeroing patch activations and replacing their image-specific content with calibration-derived surrogates. On DINOv2 ViT-S/14, zero replacement reduces accuracy to 60.2% at depth 5 and 4.5% at depth 9, whereas centroid replacement retains 73.2% and 74.1%, respectively. The contrast also appears at depth 8 in DeiT-</w:t>
-      </w:r>
-      <w:r>
-        <w:lastRenderedPageBreak/>
-        <w:t>Tiny (59.1% vs. 67.2%) and DeiT-Small (69.6% vs. 76.1%), and at depth 7 in ViT-B/16 AugReg (70.4% vs. 74.5%). Gaussian replacement exhibits similar preservation in several settings, achieving 75.3% accuracy on DeiT-Small at depth 8.</w:t>
+        <w:t>Figure 2 shows a pronounced distinction between zeroing patch activations and replacing their image-specific content with calibration-derived surrogates. On DINOv2 ViT-S/14, zero replacement reduces accuracy to 60.2% at depth 5 and 4.5% at depth 9, whereas centroid replacement retains 73.2% and 74.1%, respectively. The contrast also appears at depth 8 in DeiT-Tiny (59.1% vs. 67.2%) and DeiT-Small (69.6% vs. 76.1%), and at depth 7 in ViT-B/16 AugReg (70.4% vs. 74.5%). Gaussian replacement exhibits similar preservation in several settings, achieving 75.3% accuracy on DeiT-Small at depth 8.</w:t>
       </w:r>
     </w:p>
     <w:p>
@@ -1739,6 +1692,7 @@
         <w:spacing w:after="100" w:line="259" w:lineRule="auto"/>
       </w:pPr>
       <w:r>
+        <w:lastRenderedPageBreak/>
         <w:t>Together, these results distinguish the functional consequences of removing patch activations from those of replacing image-specific content with compatible surrogate representations. The magnitude and depth profile of this distinction vary across architectures, with no common transition depth or uniformly monotonic trend across the tested models. Thus, sensitivity to zero ablation does not necessarily imply that downstream classification requires the original image-specific patch content.</w:t>
       </w:r>
     </w:p>
@@ -1935,12 +1889,6 @@
         <w:spacing w:after="100" w:line="259" w:lineRule="auto"/>
       </w:pPr>
       <w:r>
-        <w:rPr>
-          <w:rFonts w:ascii="Times New Roman" w:hAnsi="Times New Roman"/>
-          <w:i w:val="0"/>
-          <w:color w:val="202A32"/>
-          <w:sz w:val="20"/>
-        </w:rPr>
         <w:t>The controlled endpoint differences are summarized in Table II.</w:t>
       </w:r>
     </w:p>
@@ -1949,12 +1897,6 @@
         <w:spacing w:after="100" w:line="259" w:lineRule="auto"/>
       </w:pPr>
       <w:r>
-        <w:rPr>
-          <w:rFonts w:ascii="Times New Roman" w:hAnsi="Times New Roman"/>
-          <w:i w:val="0"/>
-          <w:color w:val="202A32"/>
-          <w:sz w:val="20"/>
-        </w:rPr>
         <w:t>TABLE II</w:t>
       </w:r>
     </w:p>
@@ -1963,12 +1905,6 @@
         <w:spacing w:after="100" w:line="259" w:lineRule="auto"/>
       </w:pPr>
       <w:r>
-        <w:rPr>
-          <w:rFonts w:ascii="Times New Roman" w:hAnsi="Times New Roman"/>
-          <w:i w:val="0"/>
-          <w:color w:val="202A32"/>
-          <w:sz w:val="20"/>
-        </w:rPr>
         <w:t>CONTROLLED PATCH-CONTENT REPLACEMENT EFFECTS ACROSS ARCHITECTURES</w:t>
       </w:r>
     </w:p>
@@ -1978,23 +1914,24 @@
         <w:spacing w:after="100" w:line="259" w:lineRule="auto"/>
       </w:pPr>
       <w:r>
-        <w:rPr>
-          <w:rFonts w:ascii="Times New Roman" w:hAnsi="Times New Roman"/>
-          <w:i w:val="0"/>
-          <w:color w:val="202A32"/>
-          <w:sz w:val="20"/>
-        </w:rPr>
         <w:t>Top-1 differences in percentage points; each contrast is first condition minus second condition. Positive values favor the first condition. Columns summarize distinct protocols, not a common treatment effect.</w:t>
       </w:r>
     </w:p>
     <w:tbl>
       <w:tblPr>
         <w:tblStyle w:val="TableGrid"/>
-        <w:tblW w:type="auto" w:w="0"/>
+        <w:tblW w:w="0" w:type="auto"/>
         <w:jc w:val="center"/>
+        <w:tblBorders>
+          <w:top w:val="none" w:sz="0" w:space="0" w:color="auto"/>
+          <w:left w:val="none" w:sz="0" w:space="0" w:color="auto"/>
+          <w:bottom w:val="none" w:sz="0" w:space="0" w:color="auto"/>
+          <w:right w:val="none" w:sz="0" w:space="0" w:color="auto"/>
+          <w:insideH w:val="none" w:sz="0" w:space="0" w:color="auto"/>
+          <w:insideV w:val="none" w:sz="0" w:space="0" w:color="auto"/>
+        </w:tblBorders>
         <w:tblLayout w:type="fixed"/>
-        <w:tblLook w:firstColumn="1" w:firstRow="1" w:lastColumn="0" w:lastRow="0" w:noHBand="0" w:noVBand="1" w:val="04A0"/>
-        <w:tblLayout w:type="fixed"/>
+        <w:tblLook w:val="04A0" w:firstRow="1" w:lastRow="0" w:firstColumn="1" w:lastColumn="0" w:noHBand="0" w:noVBand="1"/>
       </w:tblPr>
       <w:tblGrid>
         <w:gridCol w:w="1757"/>
@@ -2006,32 +1943,36 @@
       <w:tr>
         <w:trPr>
           <w:cantSplit/>
-          <w:tblHeader w:val="true"/>
+          <w:tblHeader/>
+          <w:jc w:val="center"/>
         </w:trPr>
         <w:tc>
           <w:tcPr>
-            <w:tcW w:type="dxa" w:w="1757"/>
-            <w:vAlign w:val="center"/>
+            <w:tcW w:w="1757" w:type="dxa"/>
+            <w:tcBorders>
+              <w:top w:val="single" w:sz="4" w:space="0" w:color="auto"/>
+              <w:bottom w:val="single" w:sz="4" w:space="0" w:color="auto"/>
+            </w:tcBorders>
             <w:tcMar>
               <w:top w:w="55" w:type="dxa"/>
-              <w:start w:w="65" w:type="dxa"/>
+              <w:left w:w="65" w:type="dxa"/>
               <w:bottom w:w="55" w:type="dxa"/>
-              <w:end w:w="65" w:type="dxa"/>
+              <w:right w:w="65" w:type="dxa"/>
             </w:tcMar>
-            <w:shd w:fill="DCEBF2"/>
+            <w:vAlign w:val="center"/>
           </w:tcPr>
           <w:p>
             <w:pPr>
-              <w:spacing w:after="0" w:line="240" w:lineRule="auto"/>
               <w:jc w:val="center"/>
+              <w:rPr>
+                <w:szCs w:val="32"/>
+              </w:rPr>
             </w:pPr>
-            <w:r/>
             <w:r>
               <w:rPr>
-                <w:rFonts w:ascii="Times New Roman" w:hAnsi="Times New Roman"/>
                 <w:b/>
                 <w:color w:val="17232D"/>
-                <w:sz w:val="14"/>
+                <w:szCs w:val="32"/>
               </w:rPr>
               <w:t>Architecture</w:t>
             </w:r>
@@ -2039,28 +1980,31 @@
         </w:tc>
         <w:tc>
           <w:tcPr>
-            <w:tcW w:type="dxa" w:w="1930"/>
-            <w:vAlign w:val="center"/>
+            <w:tcW w:w="1930" w:type="dxa"/>
+            <w:tcBorders>
+              <w:top w:val="single" w:sz="4" w:space="0" w:color="auto"/>
+              <w:bottom w:val="single" w:sz="4" w:space="0" w:color="auto"/>
+            </w:tcBorders>
             <w:tcMar>
               <w:top w:w="55" w:type="dxa"/>
-              <w:start w:w="65" w:type="dxa"/>
+              <w:left w:w="65" w:type="dxa"/>
               <w:bottom w:w="55" w:type="dxa"/>
-              <w:end w:w="65" w:type="dxa"/>
+              <w:right w:w="65" w:type="dxa"/>
             </w:tcMar>
-            <w:shd w:fill="DCEBF2"/>
+            <w:vAlign w:val="center"/>
           </w:tcPr>
           <w:p>
             <w:pPr>
-              <w:spacing w:after="0" w:line="240" w:lineRule="auto"/>
               <w:jc w:val="center"/>
+              <w:rPr>
+                <w:szCs w:val="32"/>
+              </w:rPr>
             </w:pPr>
-            <w:r/>
             <w:r>
               <w:rPr>
-                <w:rFonts w:ascii="Times New Roman" w:hAnsi="Times New Roman"/>
                 <w:b/>
                 <w:color w:val="17232D"/>
-                <w:sz w:val="14"/>
+                <w:szCs w:val="32"/>
               </w:rPr>
               <w:t>Centroid − coordinate-permuted (50%)</w:t>
             </w:r>
@@ -2068,28 +2012,31 @@
         </w:tc>
         <w:tc>
           <w:tcPr>
-            <w:tcW w:type="dxa" w:w="1930"/>
-            <w:vAlign w:val="center"/>
+            <w:tcW w:w="1930" w:type="dxa"/>
+            <w:tcBorders>
+              <w:top w:val="single" w:sz="4" w:space="0" w:color="auto"/>
+              <w:bottom w:val="single" w:sz="4" w:space="0" w:color="auto"/>
+            </w:tcBorders>
             <w:tcMar>
               <w:top w:w="55" w:type="dxa"/>
-              <w:start w:w="65" w:type="dxa"/>
+              <w:left w:w="65" w:type="dxa"/>
               <w:bottom w:w="55" w:type="dxa"/>
-              <w:end w:w="65" w:type="dxa"/>
+              <w:right w:w="65" w:type="dxa"/>
             </w:tcMar>
-            <w:shd w:fill="DCEBF2"/>
+            <w:vAlign w:val="center"/>
           </w:tcPr>
           <w:p>
             <w:pPr>
-              <w:spacing w:after="0" w:line="240" w:lineRule="auto"/>
               <w:jc w:val="center"/>
+              <w:rPr>
+                <w:szCs w:val="32"/>
+              </w:rPr>
             </w:pPr>
-            <w:r/>
             <w:r>
               <w:rPr>
-                <w:rFonts w:ascii="Times New Roman" w:hAnsi="Times New Roman"/>
                 <w:b/>
                 <w:color w:val="17232D"/>
-                <w:sz w:val="14"/>
+                <w:szCs w:val="32"/>
               </w:rPr>
               <w:t>Centroid − sign-inverted (50%)</w:t>
             </w:r>
@@ -2097,28 +2044,31 @@
         </w:tc>
         <w:tc>
           <w:tcPr>
-            <w:tcW w:type="dxa" w:w="2218"/>
-            <w:vAlign w:val="center"/>
+            <w:tcW w:w="2218" w:type="dxa"/>
+            <w:tcBorders>
+              <w:top w:val="single" w:sz="4" w:space="0" w:color="auto"/>
+              <w:bottom w:val="single" w:sz="4" w:space="0" w:color="auto"/>
+            </w:tcBorders>
             <w:tcMar>
               <w:top w:w="55" w:type="dxa"/>
-              <w:start w:w="65" w:type="dxa"/>
+              <w:left w:w="65" w:type="dxa"/>
               <w:bottom w:w="55" w:type="dxa"/>
-              <w:end w:w="65" w:type="dxa"/>
+              <w:right w:w="65" w:type="dxa"/>
             </w:tcMar>
-            <w:shd w:fill="DCEBF2"/>
+            <w:vAlign w:val="center"/>
           </w:tcPr>
           <w:p>
             <w:pPr>
-              <w:spacing w:after="0" w:line="240" w:lineRule="auto"/>
               <w:jc w:val="center"/>
+              <w:rPr>
+                <w:szCs w:val="32"/>
+              </w:rPr>
             </w:pPr>
-            <w:r/>
             <w:r>
               <w:rPr>
-                <w:rFonts w:ascii="Times New Roman" w:hAnsi="Times New Roman"/>
                 <w:b/>
                 <w:color w:val="17232D"/>
-                <w:sz w:val="14"/>
+                <w:szCs w:val="32"/>
               </w:rPr>
               <w:t>Grouped Kmax − K1</w:t>
             </w:r>
@@ -2126,28 +2076,31 @@
         </w:tc>
         <w:tc>
           <w:tcPr>
-            <w:tcW w:type="dxa" w:w="1886"/>
-            <w:vAlign w:val="center"/>
+            <w:tcW w:w="1886" w:type="dxa"/>
+            <w:tcBorders>
+              <w:top w:val="single" w:sz="4" w:space="0" w:color="auto"/>
+              <w:bottom w:val="single" w:sz="4" w:space="0" w:color="auto"/>
+            </w:tcBorders>
             <w:tcMar>
               <w:top w:w="55" w:type="dxa"/>
-              <w:start w:w="65" w:type="dxa"/>
+              <w:left w:w="65" w:type="dxa"/>
               <w:bottom w:w="55" w:type="dxa"/>
-              <w:end w:w="65" w:type="dxa"/>
+              <w:right w:w="65" w:type="dxa"/>
             </w:tcMar>
-            <w:shd w:fill="DCEBF2"/>
+            <w:vAlign w:val="center"/>
           </w:tcPr>
           <w:p>
             <w:pPr>
-              <w:spacing w:after="0" w:line="240" w:lineRule="auto"/>
               <w:jc w:val="center"/>
+              <w:rPr>
+                <w:szCs w:val="32"/>
+              </w:rPr>
             </w:pPr>
-            <w:r/>
             <w:r>
               <w:rPr>
-                <w:rFonts w:ascii="Times New Roman" w:hAnsi="Times New Roman"/>
                 <w:b/>
                 <w:color w:val="17232D"/>
-                <w:sz w:val="14"/>
+                <w:szCs w:val="32"/>
               </w:rPr>
               <w:t>PC1 − random 1D (100%)</w:t>
             </w:r>
@@ -2157,29 +2110,31 @@
       <w:tr>
         <w:trPr>
           <w:cantSplit/>
+          <w:jc w:val="center"/>
         </w:trPr>
         <w:tc>
           <w:tcPr>
-            <w:tcW w:type="dxa" w:w="1757"/>
-            <w:vAlign w:val="center"/>
+            <w:tcW w:w="1757" w:type="dxa"/>
+            <w:tcBorders>
+              <w:top w:val="single" w:sz="4" w:space="0" w:color="auto"/>
+            </w:tcBorders>
             <w:tcMar>
               <w:top w:w="55" w:type="dxa"/>
-              <w:start w:w="65" w:type="dxa"/>
+              <w:left w:w="65" w:type="dxa"/>
               <w:bottom w:w="55" w:type="dxa"/>
-              <w:end w:w="65" w:type="dxa"/>
+              <w:right w:w="65" w:type="dxa"/>
             </w:tcMar>
+            <w:vAlign w:val="center"/>
           </w:tcPr>
           <w:p>
             <w:pPr>
-              <w:spacing w:after="0" w:line="240" w:lineRule="auto"/>
+              <w:rPr>
+                <w:szCs w:val="32"/>
+              </w:rPr>
             </w:pPr>
-            <w:r/>
             <w:r>
               <w:rPr>
-                <w:rFonts w:ascii="Times New Roman" w:hAnsi="Times New Roman"/>
-                <w:b w:val="0"/>
-                <w:color w:val="202A32"/>
-                <w:sz w:val="14"/>
+                <w:szCs w:val="32"/>
               </w:rPr>
               <w:t>DeiT-Tiny</w:t>
             </w:r>
@@ -2187,27 +2142,28 @@
         </w:tc>
         <w:tc>
           <w:tcPr>
-            <w:tcW w:type="dxa" w:w="1930"/>
-            <w:vAlign w:val="center"/>
+            <w:tcW w:w="1930" w:type="dxa"/>
+            <w:tcBorders>
+              <w:top w:val="single" w:sz="4" w:space="0" w:color="auto"/>
+            </w:tcBorders>
             <w:tcMar>
               <w:top w:w="55" w:type="dxa"/>
-              <w:start w:w="65" w:type="dxa"/>
+              <w:left w:w="65" w:type="dxa"/>
               <w:bottom w:w="55" w:type="dxa"/>
-              <w:end w:w="65" w:type="dxa"/>
+              <w:right w:w="65" w:type="dxa"/>
             </w:tcMar>
+            <w:vAlign w:val="center"/>
           </w:tcPr>
           <w:p>
             <w:pPr>
-              <w:spacing w:after="0" w:line="240" w:lineRule="auto"/>
               <w:jc w:val="center"/>
+              <w:rPr>
+                <w:szCs w:val="32"/>
+              </w:rPr>
             </w:pPr>
-            <w:r/>
             <w:r>
               <w:rPr>
-                <w:rFonts w:ascii="Times New Roman" w:hAnsi="Times New Roman"/>
-                <w:b w:val="0"/>
-                <w:color w:val="202A32"/>
-                <w:sz w:val="14"/>
+                <w:szCs w:val="32"/>
               </w:rPr>
               <w:t>+16.2</w:t>
             </w:r>
@@ -2215,27 +2171,28 @@
         </w:tc>
         <w:tc>
           <w:tcPr>
-            <w:tcW w:type="dxa" w:w="1930"/>
-            <w:vAlign w:val="center"/>
+            <w:tcW w:w="1930" w:type="dxa"/>
+            <w:tcBorders>
+              <w:top w:val="single" w:sz="4" w:space="0" w:color="auto"/>
+            </w:tcBorders>
             <w:tcMar>
               <w:top w:w="55" w:type="dxa"/>
-              <w:start w:w="65" w:type="dxa"/>
+              <w:left w:w="65" w:type="dxa"/>
               <w:bottom w:w="55" w:type="dxa"/>
-              <w:end w:w="65" w:type="dxa"/>
+              <w:right w:w="65" w:type="dxa"/>
             </w:tcMar>
+            <w:vAlign w:val="center"/>
           </w:tcPr>
           <w:p>
             <w:pPr>
-              <w:spacing w:after="0" w:line="240" w:lineRule="auto"/>
               <w:jc w:val="center"/>
+              <w:rPr>
+                <w:szCs w:val="32"/>
+              </w:rPr>
             </w:pPr>
-            <w:r/>
             <w:r>
               <w:rPr>
-                <w:rFonts w:ascii="Times New Roman" w:hAnsi="Times New Roman"/>
-                <w:b w:val="0"/>
-                <w:color w:val="202A32"/>
-                <w:sz w:val="14"/>
+                <w:szCs w:val="32"/>
               </w:rPr>
               <w:t>+65.6</w:t>
             </w:r>
@@ -2243,27 +2200,28 @@
         </w:tc>
         <w:tc>
           <w:tcPr>
-            <w:tcW w:type="dxa" w:w="2218"/>
-            <w:vAlign w:val="center"/>
+            <w:tcW w:w="2218" w:type="dxa"/>
+            <w:tcBorders>
+              <w:top w:val="single" w:sz="4" w:space="0" w:color="auto"/>
+            </w:tcBorders>
             <w:tcMar>
               <w:top w:w="55" w:type="dxa"/>
-              <w:start w:w="65" w:type="dxa"/>
+              <w:left w:w="65" w:type="dxa"/>
               <w:bottom w:w="55" w:type="dxa"/>
-              <w:end w:w="65" w:type="dxa"/>
+              <w:right w:w="65" w:type="dxa"/>
             </w:tcMar>
+            <w:vAlign w:val="center"/>
           </w:tcPr>
           <w:p>
             <w:pPr>
-              <w:spacing w:after="0" w:line="240" w:lineRule="auto"/>
               <w:jc w:val="center"/>
+              <w:rPr>
+                <w:szCs w:val="32"/>
+              </w:rPr>
             </w:pPr>
-            <w:r/>
             <w:r>
               <w:rPr>
-                <w:rFonts w:ascii="Times New Roman" w:hAnsi="Times New Roman"/>
-                <w:b w:val="0"/>
-                <w:color w:val="202A32"/>
-                <w:sz w:val="14"/>
+                <w:szCs w:val="32"/>
               </w:rPr>
               <w:t>+25.2</w:t>
             </w:r>
@@ -2271,27 +2229,28 @@
         </w:tc>
         <w:tc>
           <w:tcPr>
-            <w:tcW w:type="dxa" w:w="1886"/>
-            <w:vAlign w:val="center"/>
+            <w:tcW w:w="1886" w:type="dxa"/>
+            <w:tcBorders>
+              <w:top w:val="single" w:sz="4" w:space="0" w:color="auto"/>
+            </w:tcBorders>
             <w:tcMar>
               <w:top w:w="55" w:type="dxa"/>
-              <w:start w:w="65" w:type="dxa"/>
+              <w:left w:w="65" w:type="dxa"/>
               <w:bottom w:w="55" w:type="dxa"/>
-              <w:end w:w="65" w:type="dxa"/>
+              <w:right w:w="65" w:type="dxa"/>
             </w:tcMar>
+            <w:vAlign w:val="center"/>
           </w:tcPr>
           <w:p>
             <w:pPr>
-              <w:spacing w:after="0" w:line="240" w:lineRule="auto"/>
               <w:jc w:val="center"/>
+              <w:rPr>
+                <w:szCs w:val="32"/>
+              </w:rPr>
             </w:pPr>
-            <w:r/>
             <w:r>
               <w:rPr>
-                <w:rFonts w:ascii="Times New Roman" w:hAnsi="Times New Roman"/>
-                <w:b w:val="0"/>
-                <w:color w:val="202A32"/>
-                <w:sz w:val="14"/>
+                <w:szCs w:val="32"/>
               </w:rPr>
               <w:t>+7.84</w:t>
             </w:r>
@@ -2301,29 +2260,28 @@
       <w:tr>
         <w:trPr>
           <w:cantSplit/>
+          <w:jc w:val="center"/>
         </w:trPr>
         <w:tc>
           <w:tcPr>
-            <w:tcW w:type="dxa" w:w="1757"/>
-            <w:vAlign w:val="center"/>
+            <w:tcW w:w="1757" w:type="dxa"/>
             <w:tcMar>
               <w:top w:w="55" w:type="dxa"/>
-              <w:start w:w="65" w:type="dxa"/>
+              <w:left w:w="65" w:type="dxa"/>
               <w:bottom w:w="55" w:type="dxa"/>
-              <w:end w:w="65" w:type="dxa"/>
+              <w:right w:w="65" w:type="dxa"/>
             </w:tcMar>
+            <w:vAlign w:val="center"/>
           </w:tcPr>
           <w:p>
             <w:pPr>
-              <w:spacing w:after="0" w:line="240" w:lineRule="auto"/>
+              <w:rPr>
+                <w:szCs w:val="32"/>
+              </w:rPr>
             </w:pPr>
-            <w:r/>
             <w:r>
               <w:rPr>
-                <w:rFonts w:ascii="Times New Roman" w:hAnsi="Times New Roman"/>
-                <w:b w:val="0"/>
-                <w:color w:val="202A32"/>
-                <w:sz w:val="14"/>
+                <w:szCs w:val="32"/>
               </w:rPr>
               <w:t>DeiT-Small</w:t>
             </w:r>
@@ -2331,27 +2289,25 @@
         </w:tc>
         <w:tc>
           <w:tcPr>
-            <w:tcW w:type="dxa" w:w="1930"/>
-            <w:vAlign w:val="center"/>
+            <w:tcW w:w="1930" w:type="dxa"/>
             <w:tcMar>
               <w:top w:w="55" w:type="dxa"/>
-              <w:start w:w="65" w:type="dxa"/>
+              <w:left w:w="65" w:type="dxa"/>
               <w:bottom w:w="55" w:type="dxa"/>
-              <w:end w:w="65" w:type="dxa"/>
+              <w:right w:w="65" w:type="dxa"/>
             </w:tcMar>
+            <w:vAlign w:val="center"/>
           </w:tcPr>
           <w:p>
             <w:pPr>
-              <w:spacing w:after="0" w:line="240" w:lineRule="auto"/>
               <w:jc w:val="center"/>
+              <w:rPr>
+                <w:szCs w:val="32"/>
+              </w:rPr>
             </w:pPr>
-            <w:r/>
             <w:r>
               <w:rPr>
-                <w:rFonts w:ascii="Times New Roman" w:hAnsi="Times New Roman"/>
-                <w:b w:val="0"/>
-                <w:color w:val="202A32"/>
-                <w:sz w:val="14"/>
+                <w:szCs w:val="32"/>
               </w:rPr>
               <w:t>+18.0</w:t>
             </w:r>
@@ -2359,27 +2315,25 @@
         </w:tc>
         <w:tc>
           <w:tcPr>
-            <w:tcW w:type="dxa" w:w="1930"/>
-            <w:vAlign w:val="center"/>
+            <w:tcW w:w="1930" w:type="dxa"/>
             <w:tcMar>
               <w:top w:w="55" w:type="dxa"/>
-              <w:start w:w="65" w:type="dxa"/>
+              <w:left w:w="65" w:type="dxa"/>
               <w:bottom w:w="55" w:type="dxa"/>
-              <w:end w:w="65" w:type="dxa"/>
+              <w:right w:w="65" w:type="dxa"/>
             </w:tcMar>
+            <w:vAlign w:val="center"/>
           </w:tcPr>
           <w:p>
             <w:pPr>
-              <w:spacing w:after="0" w:line="240" w:lineRule="auto"/>
               <w:jc w:val="center"/>
+              <w:rPr>
+                <w:szCs w:val="32"/>
+              </w:rPr>
             </w:pPr>
-            <w:r/>
             <w:r>
               <w:rPr>
-                <w:rFonts w:ascii="Times New Roman" w:hAnsi="Times New Roman"/>
-                <w:b w:val="0"/>
-                <w:color w:val="202A32"/>
-                <w:sz w:val="14"/>
+                <w:szCs w:val="32"/>
               </w:rPr>
               <w:t>+65.1</w:t>
             </w:r>
@@ -2387,27 +2341,25 @@
         </w:tc>
         <w:tc>
           <w:tcPr>
-            <w:tcW w:type="dxa" w:w="2218"/>
-            <w:vAlign w:val="center"/>
+            <w:tcW w:w="2218" w:type="dxa"/>
             <w:tcMar>
               <w:top w:w="55" w:type="dxa"/>
-              <w:start w:w="65" w:type="dxa"/>
+              <w:left w:w="65" w:type="dxa"/>
               <w:bottom w:w="55" w:type="dxa"/>
-              <w:end w:w="65" w:type="dxa"/>
+              <w:right w:w="65" w:type="dxa"/>
             </w:tcMar>
+            <w:vAlign w:val="center"/>
           </w:tcPr>
           <w:p>
             <w:pPr>
-              <w:spacing w:after="0" w:line="240" w:lineRule="auto"/>
               <w:jc w:val="center"/>
+              <w:rPr>
+                <w:szCs w:val="32"/>
+              </w:rPr>
             </w:pPr>
-            <w:r/>
             <w:r>
               <w:rPr>
-                <w:rFonts w:ascii="Times New Roman" w:hAnsi="Times New Roman"/>
-                <w:b w:val="0"/>
-                <w:color w:val="202A32"/>
-                <w:sz w:val="14"/>
+                <w:szCs w:val="32"/>
               </w:rPr>
               <w:t>+36.1</w:t>
             </w:r>
@@ -2415,27 +2367,25 @@
         </w:tc>
         <w:tc>
           <w:tcPr>
-            <w:tcW w:type="dxa" w:w="1886"/>
-            <w:vAlign w:val="center"/>
+            <w:tcW w:w="1886" w:type="dxa"/>
             <w:tcMar>
               <w:top w:w="55" w:type="dxa"/>
-              <w:start w:w="65" w:type="dxa"/>
+              <w:left w:w="65" w:type="dxa"/>
               <w:bottom w:w="55" w:type="dxa"/>
-              <w:end w:w="65" w:type="dxa"/>
+              <w:right w:w="65" w:type="dxa"/>
             </w:tcMar>
+            <w:vAlign w:val="center"/>
           </w:tcPr>
           <w:p>
             <w:pPr>
-              <w:spacing w:after="0" w:line="240" w:lineRule="auto"/>
               <w:jc w:val="center"/>
+              <w:rPr>
+                <w:szCs w:val="32"/>
+              </w:rPr>
             </w:pPr>
-            <w:r/>
             <w:r>
               <w:rPr>
-                <w:rFonts w:ascii="Times New Roman" w:hAnsi="Times New Roman"/>
-                <w:b w:val="0"/>
-                <w:color w:val="202A32"/>
-                <w:sz w:val="14"/>
+                <w:szCs w:val="32"/>
               </w:rPr>
               <w:t>+7.30</w:t>
             </w:r>
@@ -2445,57 +2395,55 @@
       <w:tr>
         <w:trPr>
           <w:cantSplit/>
+          <w:jc w:val="center"/>
         </w:trPr>
         <w:tc>
           <w:tcPr>
-            <w:tcW w:type="dxa" w:w="1757"/>
-            <w:vAlign w:val="center"/>
+            <w:tcW w:w="1757" w:type="dxa"/>
             <w:tcMar>
               <w:top w:w="55" w:type="dxa"/>
-              <w:start w:w="65" w:type="dxa"/>
+              <w:left w:w="65" w:type="dxa"/>
               <w:bottom w:w="55" w:type="dxa"/>
-              <w:end w:w="65" w:type="dxa"/>
+              <w:right w:w="65" w:type="dxa"/>
             </w:tcMar>
+            <w:vAlign w:val="center"/>
           </w:tcPr>
           <w:p>
             <w:pPr>
-              <w:spacing w:after="0" w:line="240" w:lineRule="auto"/>
+              <w:rPr>
+                <w:szCs w:val="32"/>
+              </w:rPr>
             </w:pPr>
-            <w:r/>
             <w:r>
               <w:rPr>
-                <w:rFonts w:ascii="Times New Roman" w:hAnsi="Times New Roman"/>
-                <w:b w:val="0"/>
-                <w:color w:val="202A32"/>
-                <w:sz w:val="14"/>
-              </w:rPr>
+                <w:szCs w:val="32"/>
+              </w:rPr>
+              <w:lastRenderedPageBreak/>
               <w:t>ViT-B/16 AugReg</w:t>
             </w:r>
           </w:p>
         </w:tc>
         <w:tc>
           <w:tcPr>
-            <w:tcW w:type="dxa" w:w="1930"/>
-            <w:vAlign w:val="center"/>
+            <w:tcW w:w="1930" w:type="dxa"/>
             <w:tcMar>
               <w:top w:w="55" w:type="dxa"/>
-              <w:start w:w="65" w:type="dxa"/>
+              <w:left w:w="65" w:type="dxa"/>
               <w:bottom w:w="55" w:type="dxa"/>
-              <w:end w:w="65" w:type="dxa"/>
+              <w:right w:w="65" w:type="dxa"/>
             </w:tcMar>
+            <w:vAlign w:val="center"/>
           </w:tcPr>
           <w:p>
             <w:pPr>
-              <w:spacing w:after="0" w:line="240" w:lineRule="auto"/>
               <w:jc w:val="center"/>
+              <w:rPr>
+                <w:szCs w:val="32"/>
+              </w:rPr>
             </w:pPr>
-            <w:r/>
             <w:r>
               <w:rPr>
-                <w:rFonts w:ascii="Times New Roman" w:hAnsi="Times New Roman"/>
-                <w:b w:val="0"/>
-                <w:color w:val="202A32"/>
-                <w:sz w:val="14"/>
+                <w:szCs w:val="32"/>
               </w:rPr>
               <w:t>+6.5</w:t>
             </w:r>
@@ -2503,27 +2451,25 @@
         </w:tc>
         <w:tc>
           <w:tcPr>
-            <w:tcW w:type="dxa" w:w="1930"/>
-            <w:vAlign w:val="center"/>
+            <w:tcW w:w="1930" w:type="dxa"/>
             <w:tcMar>
               <w:top w:w="55" w:type="dxa"/>
-              <w:start w:w="65" w:type="dxa"/>
+              <w:left w:w="65" w:type="dxa"/>
               <w:bottom w:w="55" w:type="dxa"/>
-              <w:end w:w="65" w:type="dxa"/>
+              <w:right w:w="65" w:type="dxa"/>
             </w:tcMar>
+            <w:vAlign w:val="center"/>
           </w:tcPr>
           <w:p>
             <w:pPr>
-              <w:spacing w:after="0" w:line="240" w:lineRule="auto"/>
               <w:jc w:val="center"/>
+              <w:rPr>
+                <w:szCs w:val="32"/>
+              </w:rPr>
             </w:pPr>
-            <w:r/>
             <w:r>
               <w:rPr>
-                <w:rFonts w:ascii="Times New Roman" w:hAnsi="Times New Roman"/>
-                <w:b w:val="0"/>
-                <w:color w:val="202A32"/>
-                <w:sz w:val="14"/>
+                <w:szCs w:val="32"/>
               </w:rPr>
               <w:t>+5.7</w:t>
             </w:r>
@@ -2531,27 +2477,25 @@
         </w:tc>
         <w:tc>
           <w:tcPr>
-            <w:tcW w:type="dxa" w:w="2218"/>
-            <w:vAlign w:val="center"/>
+            <w:tcW w:w="2218" w:type="dxa"/>
             <w:tcMar>
               <w:top w:w="55" w:type="dxa"/>
-              <w:start w:w="65" w:type="dxa"/>
+              <w:left w:w="65" w:type="dxa"/>
               <w:bottom w:w="55" w:type="dxa"/>
-              <w:end w:w="65" w:type="dxa"/>
+              <w:right w:w="65" w:type="dxa"/>
             </w:tcMar>
+            <w:vAlign w:val="center"/>
           </w:tcPr>
           <w:p>
             <w:pPr>
-              <w:spacing w:after="0" w:line="240" w:lineRule="auto"/>
               <w:jc w:val="center"/>
+              <w:rPr>
+                <w:szCs w:val="32"/>
+              </w:rPr>
             </w:pPr>
-            <w:r/>
             <w:r>
               <w:rPr>
-                <w:rFonts w:ascii="Times New Roman" w:hAnsi="Times New Roman"/>
-                <w:b w:val="0"/>
-                <w:color w:val="202A32"/>
-                <w:sz w:val="14"/>
+                <w:szCs w:val="32"/>
               </w:rPr>
               <w:t>+11.34</w:t>
             </w:r>
@@ -2559,27 +2503,25 @@
         </w:tc>
         <w:tc>
           <w:tcPr>
-            <w:tcW w:type="dxa" w:w="1886"/>
-            <w:vAlign w:val="center"/>
+            <w:tcW w:w="1886" w:type="dxa"/>
             <w:tcMar>
               <w:top w:w="55" w:type="dxa"/>
-              <w:start w:w="65" w:type="dxa"/>
+              <w:left w:w="65" w:type="dxa"/>
               <w:bottom w:w="55" w:type="dxa"/>
-              <w:end w:w="65" w:type="dxa"/>
+              <w:right w:w="65" w:type="dxa"/>
             </w:tcMar>
+            <w:vAlign w:val="center"/>
           </w:tcPr>
           <w:p>
             <w:pPr>
-              <w:spacing w:after="0" w:line="240" w:lineRule="auto"/>
               <w:jc w:val="center"/>
+              <w:rPr>
+                <w:szCs w:val="32"/>
+              </w:rPr>
             </w:pPr>
-            <w:r/>
             <w:r>
               <w:rPr>
-                <w:rFonts w:ascii="Times New Roman" w:hAnsi="Times New Roman"/>
-                <w:b w:val="0"/>
-                <w:color w:val="202A32"/>
-                <w:sz w:val="14"/>
+                <w:szCs w:val="32"/>
               </w:rPr>
               <w:t>+33.40</w:t>
             </w:r>
@@ -2589,29 +2531,31 @@
       <w:tr>
         <w:trPr>
           <w:cantSplit/>
+          <w:jc w:val="center"/>
         </w:trPr>
         <w:tc>
           <w:tcPr>
-            <w:tcW w:type="dxa" w:w="1757"/>
-            <w:vAlign w:val="center"/>
+            <w:tcW w:w="1757" w:type="dxa"/>
+            <w:tcBorders>
+              <w:bottom w:val="single" w:sz="4" w:space="0" w:color="auto"/>
+            </w:tcBorders>
             <w:tcMar>
               <w:top w:w="55" w:type="dxa"/>
-              <w:start w:w="65" w:type="dxa"/>
+              <w:left w:w="65" w:type="dxa"/>
               <w:bottom w:w="55" w:type="dxa"/>
-              <w:end w:w="65" w:type="dxa"/>
+              <w:right w:w="65" w:type="dxa"/>
             </w:tcMar>
+            <w:vAlign w:val="center"/>
           </w:tcPr>
           <w:p>
             <w:pPr>
-              <w:spacing w:after="0" w:line="240" w:lineRule="auto"/>
+              <w:rPr>
+                <w:szCs w:val="32"/>
+              </w:rPr>
             </w:pPr>
-            <w:r/>
             <w:r>
               <w:rPr>
-                <w:rFonts w:ascii="Times New Roman" w:hAnsi="Times New Roman"/>
-                <w:b w:val="0"/>
-                <w:color w:val="202A32"/>
-                <w:sz w:val="14"/>
+                <w:szCs w:val="32"/>
               </w:rPr>
               <w:t>DINOv2 ViT-S/14</w:t>
             </w:r>
@@ -2619,27 +2563,28 @@
         </w:tc>
         <w:tc>
           <w:tcPr>
-            <w:tcW w:type="dxa" w:w="1930"/>
-            <w:vAlign w:val="center"/>
+            <w:tcW w:w="1930" w:type="dxa"/>
+            <w:tcBorders>
+              <w:bottom w:val="single" w:sz="4" w:space="0" w:color="auto"/>
+            </w:tcBorders>
             <w:tcMar>
               <w:top w:w="55" w:type="dxa"/>
-              <w:start w:w="65" w:type="dxa"/>
+              <w:left w:w="65" w:type="dxa"/>
               <w:bottom w:w="55" w:type="dxa"/>
-              <w:end w:w="65" w:type="dxa"/>
+              <w:right w:w="65" w:type="dxa"/>
             </w:tcMar>
+            <w:vAlign w:val="center"/>
           </w:tcPr>
           <w:p>
             <w:pPr>
-              <w:spacing w:after="0" w:line="240" w:lineRule="auto"/>
               <w:jc w:val="center"/>
+              <w:rPr>
+                <w:szCs w:val="32"/>
+              </w:rPr>
             </w:pPr>
-            <w:r/>
             <w:r>
               <w:rPr>
-                <w:rFonts w:ascii="Times New Roman" w:hAnsi="Times New Roman"/>
-                <w:b w:val="0"/>
-                <w:color w:val="202A32"/>
-                <w:sz w:val="14"/>
+                <w:szCs w:val="32"/>
               </w:rPr>
               <w:t>+47.8</w:t>
             </w:r>
@@ -2647,27 +2592,28 @@
         </w:tc>
         <w:tc>
           <w:tcPr>
-            <w:tcW w:type="dxa" w:w="1930"/>
-            <w:vAlign w:val="center"/>
+            <w:tcW w:w="1930" w:type="dxa"/>
+            <w:tcBorders>
+              <w:bottom w:val="single" w:sz="4" w:space="0" w:color="auto"/>
+            </w:tcBorders>
             <w:tcMar>
               <w:top w:w="55" w:type="dxa"/>
-              <w:start w:w="65" w:type="dxa"/>
+              <w:left w:w="65" w:type="dxa"/>
               <w:bottom w:w="55" w:type="dxa"/>
-              <w:end w:w="65" w:type="dxa"/>
+              <w:right w:w="65" w:type="dxa"/>
             </w:tcMar>
+            <w:vAlign w:val="center"/>
           </w:tcPr>
           <w:p>
             <w:pPr>
-              <w:spacing w:after="0" w:line="240" w:lineRule="auto"/>
               <w:jc w:val="center"/>
+              <w:rPr>
+                <w:szCs w:val="32"/>
+              </w:rPr>
             </w:pPr>
-            <w:r/>
             <w:r>
               <w:rPr>
-                <w:rFonts w:ascii="Times New Roman" w:hAnsi="Times New Roman"/>
-                <w:b w:val="0"/>
-                <w:color w:val="202A32"/>
-                <w:sz w:val="14"/>
+                <w:szCs w:val="32"/>
               </w:rPr>
               <w:t>+55.4</w:t>
             </w:r>
@@ -2675,27 +2621,28 @@
         </w:tc>
         <w:tc>
           <w:tcPr>
-            <w:tcW w:type="dxa" w:w="2218"/>
-            <w:vAlign w:val="center"/>
+            <w:tcW w:w="2218" w:type="dxa"/>
+            <w:tcBorders>
+              <w:bottom w:val="single" w:sz="4" w:space="0" w:color="auto"/>
+            </w:tcBorders>
             <w:tcMar>
               <w:top w:w="55" w:type="dxa"/>
-              <w:start w:w="65" w:type="dxa"/>
+              <w:left w:w="65" w:type="dxa"/>
               <w:bottom w:w="55" w:type="dxa"/>
-              <w:end w:w="65" w:type="dxa"/>
+              <w:right w:w="65" w:type="dxa"/>
             </w:tcMar>
+            <w:vAlign w:val="center"/>
           </w:tcPr>
           <w:p>
             <w:pPr>
-              <w:spacing w:after="0" w:line="240" w:lineRule="auto"/>
               <w:jc w:val="center"/>
+              <w:rPr>
+                <w:szCs w:val="32"/>
+              </w:rPr>
             </w:pPr>
-            <w:r/>
             <w:r>
               <w:rPr>
-                <w:rFonts w:ascii="Times New Roman" w:hAnsi="Times New Roman"/>
-                <w:b w:val="0"/>
-                <w:color w:val="202A32"/>
-                <w:sz w:val="14"/>
+                <w:szCs w:val="32"/>
               </w:rPr>
               <w:t>−0.02</w:t>
             </w:r>
@@ -2703,27 +2650,28 @@
         </w:tc>
         <w:tc>
           <w:tcPr>
-            <w:tcW w:type="dxa" w:w="1886"/>
-            <w:vAlign w:val="center"/>
+            <w:tcW w:w="1886" w:type="dxa"/>
+            <w:tcBorders>
+              <w:bottom w:val="single" w:sz="4" w:space="0" w:color="auto"/>
+            </w:tcBorders>
             <w:tcMar>
               <w:top w:w="55" w:type="dxa"/>
-              <w:start w:w="65" w:type="dxa"/>
+              <w:left w:w="65" w:type="dxa"/>
               <w:bottom w:w="55" w:type="dxa"/>
-              <w:end w:w="65" w:type="dxa"/>
+              <w:right w:w="65" w:type="dxa"/>
             </w:tcMar>
+            <w:vAlign w:val="center"/>
           </w:tcPr>
           <w:p>
             <w:pPr>
-              <w:spacing w:after="0" w:line="240" w:lineRule="auto"/>
               <w:jc w:val="center"/>
+              <w:rPr>
+                <w:szCs w:val="32"/>
+              </w:rPr>
             </w:pPr>
-            <w:r/>
             <w:r>
               <w:rPr>
-                <w:rFonts w:ascii="Times New Roman" w:hAnsi="Times New Roman"/>
-                <w:b w:val="0"/>
-                <w:color w:val="202A32"/>
-                <w:sz w:val="14"/>
+                <w:szCs w:val="32"/>
               </w:rPr>
               <w:t>+0.17</w:t>
             </w:r>
@@ -2741,12 +2689,6 @@
         <w:spacing w:after="100" w:line="259" w:lineRule="auto"/>
       </w:pPr>
       <w:r>
-        <w:rPr>
-          <w:rFonts w:ascii="Times New Roman" w:hAnsi="Times New Roman"/>
-          <w:i w:val="0"/>
-          <w:color w:val="202A32"/>
-          <w:sz w:val="20"/>
-        </w:rPr>
         <w:t>Note (Table II). All interventions are at Block 8. Geometry contrasts replace 50% of spatial patches; coordinate-permutation values are three-seed means, while centroid and sign-inversion endpoints are single runs. Grouped-K and PC1/random contrasts replace all spatial patches; Kmax is 196 for DeiT/ViT-B and 256 for DINOv2. Grouped-K uses three seeds for DeiT and five for ViT-B/DINOv2; PC1/random uses five seeds for DeiT and three for ViT-B/DINOv2. Each architecture uses N=1,000 held-out images and a disjoint N=1,000 calibration cohort. DINOv2 remains near the Top-1 floor for both complete-replacement contrasts; its +0.17 pp PC1 contrast is not meaningful accuracy recovery. See Figure 3 and the source-linked calculations in the validation script for protocol-level values.</w:t>
       </w:r>
     </w:p>
@@ -3587,7 +3529,6 @@
         <w:spacing w:after="100" w:line="259" w:lineRule="auto"/>
       </w:pPr>
       <w:r>
-        <w:lastRenderedPageBreak/>
         <w:t>As defined in Section 3, N</w:t>
       </w:r>
       <w:r>
@@ -4147,50 +4088,43 @@
         <w:spacing w:after="100" w:line="259" w:lineRule="auto"/>
       </w:pPr>
       <w:r>
-        <w:rPr>
-          <w:rFonts w:ascii="Times New Roman" w:hAnsi="Times New Roman"/>
-          <w:i w:val="0"/>
-          <w:color w:val="202A32"/>
-          <w:sz w:val="20"/>
-        </w:rPr>
+        <w:lastRenderedPageBreak/>
         <w:t xml:space="preserve">At depth 8, the ViT-B PCbottom direction is especially uncertain because its covariance eigengap is only </w:t>
       </w:r>
       <m:oMath>
         <m:r>
-          <m:t xml:space="preserve">1</m:t>
-        </m:r>
-        <m:r>
-          <m:t xml:space="preserve">.</m:t>
-        </m:r>
-        <m:r>
-          <m:t xml:space="preserve">53</m:t>
-        </m:r>
-        <m:r>
-          <m:t xml:space="preserve">×</m:t>
+          <w:rPr>
+            <w:rFonts w:ascii="Cambria Math" w:hAnsi="Cambria Math"/>
+          </w:rPr>
+          <m:t>1.53×</m:t>
         </m:r>
         <m:sSup>
+          <m:sSupPr>
+            <m:ctrlPr>
+              <w:rPr>
+                <w:rFonts w:ascii="Cambria Math" w:hAnsi="Cambria Math"/>
+              </w:rPr>
+            </m:ctrlPr>
+          </m:sSupPr>
           <m:e>
             <m:r>
-              <m:t xml:space="preserve">10</m:t>
+              <w:rPr>
+                <w:rFonts w:ascii="Cambria Math" w:hAnsi="Cambria Math"/>
+              </w:rPr>
+              <m:t>10</m:t>
             </m:r>
           </m:e>
           <m:sup>
             <m:r>
-              <m:t xml:space="preserve">-</m:t>
-            </m:r>
-            <m:r>
-              <m:t xml:space="preserve">5</m:t>
+              <w:rPr>
+                <w:rFonts w:ascii="Cambria Math" w:hAnsi="Cambria Math"/>
+              </w:rPr>
+              <m:t>-5</m:t>
             </m:r>
           </m:sup>
         </m:sSup>
       </m:oMath>
       <w:r>
-        <w:rPr>
-          <w:rFonts w:ascii="Times New Roman" w:hAnsi="Times New Roman"/>
-          <w:i w:val="0"/>
-          <w:color w:val="202A32"/>
-          <w:sz w:val="20"/>
-        </w:rPr>
         <w:t xml:space="preserve"> of the largest eigenvalue. Its large sensitivity ratio therefore describes the selected sample eigenvector, not a stable ranking of the low-variance subspace. Activation variance does not provide a model-independent proxy for margin sensitivity.</w:t>
       </w:r>
     </w:p>
@@ -4392,12 +4326,6 @@
         <w:spacing w:after="100" w:line="259" w:lineRule="auto"/>
       </w:pPr>
       <w:r>
-        <w:rPr>
-          <w:rFonts w:ascii="Times New Roman" w:hAnsi="Times New Roman"/>
-          <w:i w:val="0"/>
-          <w:color w:val="202A32"/>
-          <w:sz w:val="20"/>
-        </w:rPr>
         <w:t>Near-null expansion at the primary cutoff is architecture-dependent and small for DINOv2. The ViT-B PCbottom ratio depends on a direction with a small covariance eigengap. These depth-wise associations are consistent with increasing late-layer fungibility in several models but do not establish an exact nonlinear invariance subspace or a causal explanation.</w:t>
       </w:r>
     </w:p>
@@ -4406,12 +4334,6 @@
         <w:spacing w:after="100" w:line="259" w:lineRule="auto"/>
       </w:pPr>
       <w:r>
-        <w:rPr>
-          <w:rFonts w:ascii="Times New Roman" w:hAnsi="Times New Roman"/>
-          <w:i w:val="0"/>
-          <w:color w:val="202A32"/>
-          <w:sz w:val="20"/>
-        </w:rPr>
         <w:t>TABLE III</w:t>
       </w:r>
     </w:p>
@@ -4420,12 +4342,6 @@
         <w:spacing w:after="100" w:line="259" w:lineRule="auto"/>
       </w:pPr>
       <w:r>
-        <w:rPr>
-          <w:rFonts w:ascii="Times New Roman" w:hAnsi="Times New Roman"/>
-          <w:i w:val="0"/>
-          <w:color w:val="202A32"/>
-          <w:sz w:val="20"/>
-        </w:rPr>
         <w:t>DEPTH EVOLUTION OF FUNCTIONAL SENSITIVITY ACROSS ARCHITECTURES</w:t>
       </w:r>
     </w:p>
@@ -4435,49 +4351,54 @@
         <w:spacing w:after="100" w:line="259" w:lineRule="auto"/>
       </w:pPr>
       <w:r>
-        <w:rPr>
-          <w:rFonts w:ascii="Times New Roman" w:hAnsi="Times New Roman"/>
-          <w:i w:val="0"/>
-          <w:color w:val="202A32"/>
-          <w:sz w:val="20"/>
-        </w:rPr>
         <w:t xml:space="preserve">The empirical margin-gradient metric Mℓ and its depth-dependent spectrum. Normalized effective rank is dimensionless; near-null eigenvalues satisfy λk ≤ </w:t>
       </w:r>
       <m:oMath>
         <m:sSup>
+          <m:sSupPr>
+            <m:ctrlPr>
+              <w:rPr>
+                <w:rFonts w:ascii="Cambria Math" w:hAnsi="Cambria Math"/>
+              </w:rPr>
+            </m:ctrlPr>
+          </m:sSupPr>
           <m:e>
             <m:r>
-              <m:t xml:space="preserve">10</m:t>
+              <w:rPr>
+                <w:rFonts w:ascii="Cambria Math" w:hAnsi="Cambria Math"/>
+              </w:rPr>
+              <m:t>10</m:t>
             </m:r>
           </m:e>
           <m:sup>
             <m:r>
-              <m:t xml:space="preserve">-</m:t>
-            </m:r>
-            <m:r>
-              <m:t xml:space="preserve">3</m:t>
+              <w:rPr>
+                <w:rFonts w:ascii="Cambria Math" w:hAnsi="Cambria Math"/>
+              </w:rPr>
+              <m:t>-3</m:t>
             </m:r>
           </m:sup>
         </m:sSup>
       </m:oMath>
       <w:r>
-        <w:rPr>
-          <w:rFonts w:ascii="Times New Roman" w:hAnsi="Times New Roman"/>
-          <w:i w:val="0"/>
-          <w:color w:val="202A32"/>
-          <w:sz w:val="20"/>
-        </w:rPr>
         <w:t xml:space="preserve"> λmax, an operational cutoff rather than an exact nonlinear nullspace criterion.</w:t>
       </w:r>
     </w:p>
     <w:tbl>
       <w:tblPr>
         <w:tblStyle w:val="TableGrid"/>
-        <w:tblW w:type="auto" w:w="0"/>
+        <w:tblW w:w="0" w:type="auto"/>
         <w:jc w:val="center"/>
+        <w:tblBorders>
+          <w:top w:val="none" w:sz="0" w:space="0" w:color="auto"/>
+          <w:left w:val="none" w:sz="0" w:space="0" w:color="auto"/>
+          <w:bottom w:val="none" w:sz="0" w:space="0" w:color="auto"/>
+          <w:right w:val="none" w:sz="0" w:space="0" w:color="auto"/>
+          <w:insideH w:val="none" w:sz="0" w:space="0" w:color="auto"/>
+          <w:insideV w:val="none" w:sz="0" w:space="0" w:color="auto"/>
+        </w:tblBorders>
         <w:tblLayout w:type="fixed"/>
-        <w:tblLook w:firstColumn="1" w:firstRow="1" w:lastColumn="0" w:lastRow="0" w:noHBand="0" w:noVBand="1" w:val="04A0"/>
-        <w:tblLayout w:type="fixed"/>
+        <w:tblLook w:val="04A0" w:firstRow="1" w:lastRow="0" w:firstColumn="1" w:lastColumn="0" w:noHBand="0" w:noVBand="1"/>
       </w:tblPr>
       <w:tblGrid>
         <w:gridCol w:w="1800"/>
@@ -4488,32 +4409,36 @@
       <w:tr>
         <w:trPr>
           <w:cantSplit/>
-          <w:tblHeader w:val="true"/>
+          <w:tblHeader/>
+          <w:jc w:val="center"/>
         </w:trPr>
         <w:tc>
           <w:tcPr>
-            <w:tcW w:type="dxa" w:w="1800"/>
-            <w:vAlign w:val="center"/>
+            <w:tcW w:w="1800" w:type="dxa"/>
+            <w:tcBorders>
+              <w:top w:val="single" w:sz="4" w:space="0" w:color="auto"/>
+              <w:bottom w:val="single" w:sz="4" w:space="0" w:color="auto"/>
+            </w:tcBorders>
             <w:tcMar>
               <w:top w:w="55" w:type="dxa"/>
-              <w:start w:w="65" w:type="dxa"/>
+              <w:left w:w="65" w:type="dxa"/>
               <w:bottom w:w="55" w:type="dxa"/>
-              <w:end w:w="65" w:type="dxa"/>
+              <w:right w:w="65" w:type="dxa"/>
             </w:tcMar>
-            <w:shd w:fill="DCEBF2"/>
+            <w:vAlign w:val="center"/>
           </w:tcPr>
           <w:p>
             <w:pPr>
-              <w:spacing w:after="0" w:line="240" w:lineRule="auto"/>
               <w:jc w:val="center"/>
+              <w:rPr>
+                <w:szCs w:val="32"/>
+              </w:rPr>
             </w:pPr>
-            <w:r/>
             <w:r>
               <w:rPr>
-                <w:rFonts w:ascii="Times New Roman" w:hAnsi="Times New Roman"/>
                 <w:b/>
                 <w:color w:val="17232D"/>
-                <w:sz w:val="15"/>
+                <w:szCs w:val="32"/>
               </w:rPr>
               <w:t>Architecture</w:t>
             </w:r>
@@ -4521,28 +4446,31 @@
         </w:tc>
         <w:tc>
           <w:tcPr>
-            <w:tcW w:type="dxa" w:w="2477"/>
-            <w:vAlign w:val="center"/>
+            <w:tcW w:w="2477" w:type="dxa"/>
+            <w:tcBorders>
+              <w:top w:val="single" w:sz="4" w:space="0" w:color="auto"/>
+              <w:bottom w:val="single" w:sz="4" w:space="0" w:color="auto"/>
+            </w:tcBorders>
             <w:tcMar>
               <w:top w:w="55" w:type="dxa"/>
-              <w:start w:w="65" w:type="dxa"/>
+              <w:left w:w="65" w:type="dxa"/>
               <w:bottom w:w="55" w:type="dxa"/>
-              <w:end w:w="65" w:type="dxa"/>
+              <w:right w:w="65" w:type="dxa"/>
             </w:tcMar>
-            <w:shd w:fill="DCEBF2"/>
+            <w:vAlign w:val="center"/>
           </w:tcPr>
           <w:p>
             <w:pPr>
-              <w:spacing w:after="0" w:line="240" w:lineRule="auto"/>
               <w:jc w:val="center"/>
+              <w:rPr>
+                <w:szCs w:val="32"/>
+              </w:rPr>
             </w:pPr>
-            <w:r/>
             <w:r>
               <w:rPr>
-                <w:rFonts w:ascii="Times New Roman" w:hAnsi="Times New Roman"/>
                 <w:b/>
                 <w:color w:val="17232D"/>
-                <w:sz w:val="15"/>
+                <w:szCs w:val="32"/>
               </w:rPr>
               <w:t>Normalized effective rank, d5 → d10</w:t>
             </w:r>
@@ -4550,28 +4478,31 @@
         </w:tc>
         <w:tc>
           <w:tcPr>
-            <w:tcW w:type="dxa" w:w="2448"/>
-            <w:vAlign w:val="center"/>
+            <w:tcW w:w="2448" w:type="dxa"/>
+            <w:tcBorders>
+              <w:top w:val="single" w:sz="4" w:space="0" w:color="auto"/>
+              <w:bottom w:val="single" w:sz="4" w:space="0" w:color="auto"/>
+            </w:tcBorders>
             <w:tcMar>
               <w:top w:w="55" w:type="dxa"/>
-              <w:start w:w="65" w:type="dxa"/>
+              <w:left w:w="65" w:type="dxa"/>
               <w:bottom w:w="55" w:type="dxa"/>
-              <w:end w:w="65" w:type="dxa"/>
+              <w:right w:w="65" w:type="dxa"/>
             </w:tcMar>
-            <w:shd w:fill="DCEBF2"/>
+            <w:vAlign w:val="center"/>
           </w:tcPr>
           <w:p>
             <w:pPr>
-              <w:spacing w:after="0" w:line="240" w:lineRule="auto"/>
               <w:jc w:val="center"/>
+              <w:rPr>
+                <w:szCs w:val="32"/>
+              </w:rPr>
             </w:pPr>
-            <w:r/>
             <w:r>
               <w:rPr>
-                <w:rFonts w:ascii="Times New Roman" w:hAnsi="Times New Roman"/>
                 <w:b/>
                 <w:color w:val="17232D"/>
-                <w:sz w:val="15"/>
+                <w:szCs w:val="32"/>
               </w:rPr>
               <w:t>Near-null fraction, d5 → d10</w:t>
             </w:r>
@@ -4579,28 +4510,31 @@
         </w:tc>
         <w:tc>
           <w:tcPr>
-            <w:tcW w:type="dxa" w:w="2995"/>
-            <w:vAlign w:val="center"/>
+            <w:tcW w:w="2995" w:type="dxa"/>
+            <w:tcBorders>
+              <w:top w:val="single" w:sz="4" w:space="0" w:color="auto"/>
+              <w:bottom w:val="single" w:sz="4" w:space="0" w:color="auto"/>
+            </w:tcBorders>
             <w:tcMar>
               <w:top w:w="55" w:type="dxa"/>
-              <w:start w:w="65" w:type="dxa"/>
+              <w:left w:w="65" w:type="dxa"/>
               <w:bottom w:w="55" w:type="dxa"/>
-              <w:end w:w="65" w:type="dxa"/>
+              <w:right w:w="65" w:type="dxa"/>
             </w:tcMar>
-            <w:shd w:fill="DCEBF2"/>
+            <w:vAlign w:val="center"/>
           </w:tcPr>
           <w:p>
             <w:pPr>
-              <w:spacing w:after="0" w:line="240" w:lineRule="auto"/>
               <w:jc w:val="center"/>
+              <w:rPr>
+                <w:szCs w:val="32"/>
+              </w:rPr>
             </w:pPr>
-            <w:r/>
             <w:r>
               <w:rPr>
-                <w:rFonts w:ascii="Times New Roman" w:hAnsi="Times New Roman"/>
                 <w:b/>
                 <w:color w:val="17232D"/>
-                <w:sz w:val="15"/>
+                <w:szCs w:val="32"/>
               </w:rPr>
               <w:t>PC1 / PCbottom sensitivity ratio, d8</w:t>
             </w:r>
@@ -4610,29 +4544,31 @@
       <w:tr>
         <w:trPr>
           <w:cantSplit/>
+          <w:jc w:val="center"/>
         </w:trPr>
         <w:tc>
           <w:tcPr>
-            <w:tcW w:type="dxa" w:w="1800"/>
-            <w:vAlign w:val="center"/>
+            <w:tcW w:w="1800" w:type="dxa"/>
+            <w:tcBorders>
+              <w:top w:val="single" w:sz="4" w:space="0" w:color="auto"/>
+            </w:tcBorders>
             <w:tcMar>
               <w:top w:w="55" w:type="dxa"/>
-              <w:start w:w="65" w:type="dxa"/>
+              <w:left w:w="65" w:type="dxa"/>
               <w:bottom w:w="55" w:type="dxa"/>
-              <w:end w:w="65" w:type="dxa"/>
+              <w:right w:w="65" w:type="dxa"/>
             </w:tcMar>
+            <w:vAlign w:val="center"/>
           </w:tcPr>
           <w:p>
             <w:pPr>
-              <w:spacing w:after="0" w:line="240" w:lineRule="auto"/>
+              <w:rPr>
+                <w:szCs w:val="32"/>
+              </w:rPr>
             </w:pPr>
-            <w:r/>
             <w:r>
               <w:rPr>
-                <w:rFonts w:ascii="Times New Roman" w:hAnsi="Times New Roman"/>
-                <w:b w:val="0"/>
-                <w:color w:val="202A32"/>
-                <w:sz w:val="15"/>
+                <w:szCs w:val="32"/>
               </w:rPr>
               <w:t>DeiT-Tiny</w:t>
             </w:r>
@@ -4640,27 +4576,28 @@
         </w:tc>
         <w:tc>
           <w:tcPr>
-            <w:tcW w:type="dxa" w:w="2477"/>
-            <w:vAlign w:val="center"/>
+            <w:tcW w:w="2477" w:type="dxa"/>
+            <w:tcBorders>
+              <w:top w:val="single" w:sz="4" w:space="0" w:color="auto"/>
+            </w:tcBorders>
             <w:tcMar>
               <w:top w:w="55" w:type="dxa"/>
-              <w:start w:w="65" w:type="dxa"/>
+              <w:left w:w="65" w:type="dxa"/>
               <w:bottom w:w="55" w:type="dxa"/>
-              <w:end w:w="65" w:type="dxa"/>
+              <w:right w:w="65" w:type="dxa"/>
             </w:tcMar>
+            <w:vAlign w:val="center"/>
           </w:tcPr>
           <w:p>
             <w:pPr>
-              <w:spacing w:after="0" w:line="240" w:lineRule="auto"/>
               <w:jc w:val="center"/>
+              <w:rPr>
+                <w:szCs w:val="32"/>
+              </w:rPr>
             </w:pPr>
-            <w:r/>
             <w:r>
               <w:rPr>
-                <w:rFonts w:ascii="Times New Roman" w:hAnsi="Times New Roman"/>
-                <w:b w:val="0"/>
-                <w:color w:val="202A32"/>
-                <w:sz w:val="15"/>
+                <w:szCs w:val="32"/>
               </w:rPr>
               <w:t>0.541 → 0.125</w:t>
             </w:r>
@@ -4668,27 +4605,28 @@
         </w:tc>
         <w:tc>
           <w:tcPr>
-            <w:tcW w:type="dxa" w:w="2448"/>
-            <w:vAlign w:val="center"/>
+            <w:tcW w:w="2448" w:type="dxa"/>
+            <w:tcBorders>
+              <w:top w:val="single" w:sz="4" w:space="0" w:color="auto"/>
+            </w:tcBorders>
             <w:tcMar>
               <w:top w:w="55" w:type="dxa"/>
-              <w:start w:w="65" w:type="dxa"/>
+              <w:left w:w="65" w:type="dxa"/>
               <w:bottom w:w="55" w:type="dxa"/>
-              <w:end w:w="65" w:type="dxa"/>
+              <w:right w:w="65" w:type="dxa"/>
             </w:tcMar>
+            <w:vAlign w:val="center"/>
           </w:tcPr>
           <w:p>
             <w:pPr>
-              <w:spacing w:after="0" w:line="240" w:lineRule="auto"/>
               <w:jc w:val="center"/>
+              <w:rPr>
+                <w:szCs w:val="32"/>
+              </w:rPr>
             </w:pPr>
-            <w:r/>
             <w:r>
               <w:rPr>
-                <w:rFonts w:ascii="Times New Roman" w:hAnsi="Times New Roman"/>
-                <w:b w:val="0"/>
-                <w:color w:val="202A32"/>
-                <w:sz w:val="15"/>
+                <w:szCs w:val="32"/>
               </w:rPr>
               <w:t>0.52% → 31.77%</w:t>
             </w:r>
@@ -4696,27 +4634,28 @@
         </w:tc>
         <w:tc>
           <w:tcPr>
-            <w:tcW w:type="dxa" w:w="2995"/>
-            <w:vAlign w:val="center"/>
+            <w:tcW w:w="2995" w:type="dxa"/>
+            <w:tcBorders>
+              <w:top w:val="single" w:sz="4" w:space="0" w:color="auto"/>
+            </w:tcBorders>
             <w:tcMar>
               <w:top w:w="55" w:type="dxa"/>
-              <w:start w:w="65" w:type="dxa"/>
+              <w:left w:w="65" w:type="dxa"/>
               <w:bottom w:w="55" w:type="dxa"/>
-              <w:end w:w="65" w:type="dxa"/>
+              <w:right w:w="65" w:type="dxa"/>
             </w:tcMar>
+            <w:vAlign w:val="center"/>
           </w:tcPr>
           <w:p>
             <w:pPr>
-              <w:spacing w:after="0" w:line="240" w:lineRule="auto"/>
               <w:jc w:val="center"/>
+              <w:rPr>
+                <w:szCs w:val="32"/>
+              </w:rPr>
             </w:pPr>
-            <w:r/>
             <w:r>
               <w:rPr>
-                <w:rFonts w:ascii="Times New Roman" w:hAnsi="Times New Roman"/>
-                <w:b w:val="0"/>
-                <w:color w:val="202A32"/>
-                <w:sz w:val="15"/>
+                <w:szCs w:val="32"/>
               </w:rPr>
               <w:t>0.089</w:t>
             </w:r>
@@ -4726,29 +4665,28 @@
       <w:tr>
         <w:trPr>
           <w:cantSplit/>
+          <w:jc w:val="center"/>
         </w:trPr>
         <w:tc>
           <w:tcPr>
-            <w:tcW w:type="dxa" w:w="1800"/>
-            <w:vAlign w:val="center"/>
+            <w:tcW w:w="1800" w:type="dxa"/>
             <w:tcMar>
               <w:top w:w="55" w:type="dxa"/>
-              <w:start w:w="65" w:type="dxa"/>
+              <w:left w:w="65" w:type="dxa"/>
               <w:bottom w:w="55" w:type="dxa"/>
-              <w:end w:w="65" w:type="dxa"/>
+              <w:right w:w="65" w:type="dxa"/>
             </w:tcMar>
+            <w:vAlign w:val="center"/>
           </w:tcPr>
           <w:p>
             <w:pPr>
-              <w:spacing w:after="0" w:line="240" w:lineRule="auto"/>
+              <w:rPr>
+                <w:szCs w:val="32"/>
+              </w:rPr>
             </w:pPr>
-            <w:r/>
             <w:r>
               <w:rPr>
-                <w:rFonts w:ascii="Times New Roman" w:hAnsi="Times New Roman"/>
-                <w:b w:val="0"/>
-                <w:color w:val="202A32"/>
-                <w:sz w:val="15"/>
+                <w:szCs w:val="32"/>
               </w:rPr>
               <w:t>DeiT-Small</w:t>
             </w:r>
@@ -4756,27 +4694,25 @@
         </w:tc>
         <w:tc>
           <w:tcPr>
-            <w:tcW w:type="dxa" w:w="2477"/>
-            <w:vAlign w:val="center"/>
+            <w:tcW w:w="2477" w:type="dxa"/>
             <w:tcMar>
               <w:top w:w="55" w:type="dxa"/>
-              <w:start w:w="65" w:type="dxa"/>
+              <w:left w:w="65" w:type="dxa"/>
               <w:bottom w:w="55" w:type="dxa"/>
-              <w:end w:w="65" w:type="dxa"/>
+              <w:right w:w="65" w:type="dxa"/>
             </w:tcMar>
+            <w:vAlign w:val="center"/>
           </w:tcPr>
           <w:p>
             <w:pPr>
-              <w:spacing w:after="0" w:line="240" w:lineRule="auto"/>
               <w:jc w:val="center"/>
+              <w:rPr>
+                <w:szCs w:val="32"/>
+              </w:rPr>
             </w:pPr>
-            <w:r/>
             <w:r>
               <w:rPr>
-                <w:rFonts w:ascii="Times New Roman" w:hAnsi="Times New Roman"/>
-                <w:b w:val="0"/>
-                <w:color w:val="202A32"/>
-                <w:sz w:val="15"/>
+                <w:szCs w:val="32"/>
               </w:rPr>
               <w:t>0.467 → 0.114</w:t>
             </w:r>
@@ -4784,27 +4720,25 @@
         </w:tc>
         <w:tc>
           <w:tcPr>
-            <w:tcW w:type="dxa" w:w="2448"/>
-            <w:vAlign w:val="center"/>
+            <w:tcW w:w="2448" w:type="dxa"/>
             <w:tcMar>
               <w:top w:w="55" w:type="dxa"/>
-              <w:start w:w="65" w:type="dxa"/>
+              <w:left w:w="65" w:type="dxa"/>
               <w:bottom w:w="55" w:type="dxa"/>
-              <w:end w:w="65" w:type="dxa"/>
+              <w:right w:w="65" w:type="dxa"/>
             </w:tcMar>
+            <w:vAlign w:val="center"/>
           </w:tcPr>
           <w:p>
             <w:pPr>
-              <w:spacing w:after="0" w:line="240" w:lineRule="auto"/>
               <w:jc w:val="center"/>
+              <w:rPr>
+                <w:szCs w:val="32"/>
+              </w:rPr>
             </w:pPr>
-            <w:r/>
             <w:r>
               <w:rPr>
-                <w:rFonts w:ascii="Times New Roman" w:hAnsi="Times New Roman"/>
-                <w:b w:val="0"/>
-                <w:color w:val="202A32"/>
-                <w:sz w:val="15"/>
+                <w:szCs w:val="32"/>
               </w:rPr>
               <w:t>0.26% → 57.03%</w:t>
             </w:r>
@@ -4812,27 +4746,25 @@
         </w:tc>
         <w:tc>
           <w:tcPr>
-            <w:tcW w:type="dxa" w:w="2995"/>
-            <w:vAlign w:val="center"/>
+            <w:tcW w:w="2995" w:type="dxa"/>
             <w:tcMar>
               <w:top w:w="55" w:type="dxa"/>
-              <w:start w:w="65" w:type="dxa"/>
+              <w:left w:w="65" w:type="dxa"/>
               <w:bottom w:w="55" w:type="dxa"/>
-              <w:end w:w="65" w:type="dxa"/>
+              <w:right w:w="65" w:type="dxa"/>
             </w:tcMar>
+            <w:vAlign w:val="center"/>
           </w:tcPr>
           <w:p>
             <w:pPr>
-              <w:spacing w:after="0" w:line="240" w:lineRule="auto"/>
               <w:jc w:val="center"/>
+              <w:rPr>
+                <w:szCs w:val="32"/>
+              </w:rPr>
             </w:pPr>
-            <w:r/>
             <w:r>
               <w:rPr>
-                <w:rFonts w:ascii="Times New Roman" w:hAnsi="Times New Roman"/>
-                <w:b w:val="0"/>
-                <w:color w:val="202A32"/>
-                <w:sz w:val="15"/>
+                <w:szCs w:val="32"/>
               </w:rPr>
               <w:t>0.041</w:t>
             </w:r>
@@ -4842,29 +4774,28 @@
       <w:tr>
         <w:trPr>
           <w:cantSplit/>
+          <w:jc w:val="center"/>
         </w:trPr>
         <w:tc>
           <w:tcPr>
-            <w:tcW w:type="dxa" w:w="1800"/>
-            <w:vAlign w:val="center"/>
+            <w:tcW w:w="1800" w:type="dxa"/>
             <w:tcMar>
               <w:top w:w="55" w:type="dxa"/>
-              <w:start w:w="65" w:type="dxa"/>
+              <w:left w:w="65" w:type="dxa"/>
               <w:bottom w:w="55" w:type="dxa"/>
-              <w:end w:w="65" w:type="dxa"/>
+              <w:right w:w="65" w:type="dxa"/>
             </w:tcMar>
+            <w:vAlign w:val="center"/>
           </w:tcPr>
           <w:p>
             <w:pPr>
-              <w:spacing w:after="0" w:line="240" w:lineRule="auto"/>
+              <w:rPr>
+                <w:szCs w:val="32"/>
+              </w:rPr>
             </w:pPr>
-            <w:r/>
             <w:r>
               <w:rPr>
-                <w:rFonts w:ascii="Times New Roman" w:hAnsi="Times New Roman"/>
-                <w:b w:val="0"/>
-                <w:color w:val="202A32"/>
-                <w:sz w:val="15"/>
+                <w:szCs w:val="32"/>
               </w:rPr>
               <w:t>ViT-B/16 AugReg</w:t>
             </w:r>
@@ -4872,27 +4803,25 @@
         </w:tc>
         <w:tc>
           <w:tcPr>
-            <w:tcW w:type="dxa" w:w="2477"/>
-            <w:vAlign w:val="center"/>
+            <w:tcW w:w="2477" w:type="dxa"/>
             <w:tcMar>
               <w:top w:w="55" w:type="dxa"/>
-              <w:start w:w="65" w:type="dxa"/>
+              <w:left w:w="65" w:type="dxa"/>
               <w:bottom w:w="55" w:type="dxa"/>
-              <w:end w:w="65" w:type="dxa"/>
+              <w:right w:w="65" w:type="dxa"/>
             </w:tcMar>
+            <w:vAlign w:val="center"/>
           </w:tcPr>
           <w:p>
             <w:pPr>
-              <w:spacing w:after="0" w:line="240" w:lineRule="auto"/>
               <w:jc w:val="center"/>
+              <w:rPr>
+                <w:szCs w:val="32"/>
+              </w:rPr>
             </w:pPr>
-            <w:r/>
             <w:r>
               <w:rPr>
-                <w:rFonts w:ascii="Times New Roman" w:hAnsi="Times New Roman"/>
-                <w:b w:val="0"/>
-                <w:color w:val="202A32"/>
-                <w:sz w:val="15"/>
+                <w:szCs w:val="32"/>
               </w:rPr>
               <w:t>0.383 → 0.140</w:t>
             </w:r>
@@ -4900,27 +4829,25 @@
         </w:tc>
         <w:tc>
           <w:tcPr>
-            <w:tcW w:type="dxa" w:w="2448"/>
-            <w:vAlign w:val="center"/>
+            <w:tcW w:w="2448" w:type="dxa"/>
             <w:tcMar>
               <w:top w:w="55" w:type="dxa"/>
-              <w:start w:w="65" w:type="dxa"/>
+              <w:left w:w="65" w:type="dxa"/>
               <w:bottom w:w="55" w:type="dxa"/>
-              <w:end w:w="65" w:type="dxa"/>
+              <w:right w:w="65" w:type="dxa"/>
             </w:tcMar>
+            <w:vAlign w:val="center"/>
           </w:tcPr>
           <w:p>
             <w:pPr>
-              <w:spacing w:after="0" w:line="240" w:lineRule="auto"/>
               <w:jc w:val="center"/>
+              <w:rPr>
+                <w:szCs w:val="32"/>
+              </w:rPr>
             </w:pPr>
-            <w:r/>
             <w:r>
               <w:rPr>
-                <w:rFonts w:ascii="Times New Roman" w:hAnsi="Times New Roman"/>
-                <w:b w:val="0"/>
-                <w:color w:val="202A32"/>
-                <w:sz w:val="15"/>
+                <w:szCs w:val="32"/>
               </w:rPr>
               <w:t>0.26% → 49.61%</w:t>
             </w:r>
@@ -4928,27 +4855,25 @@
         </w:tc>
         <w:tc>
           <w:tcPr>
-            <w:tcW w:type="dxa" w:w="2995"/>
-            <w:vAlign w:val="center"/>
+            <w:tcW w:w="2995" w:type="dxa"/>
             <w:tcMar>
               <w:top w:w="55" w:type="dxa"/>
-              <w:start w:w="65" w:type="dxa"/>
+              <w:left w:w="65" w:type="dxa"/>
               <w:bottom w:w="55" w:type="dxa"/>
-              <w:end w:w="65" w:type="dxa"/>
+              <w:right w:w="65" w:type="dxa"/>
             </w:tcMar>
+            <w:vAlign w:val="center"/>
           </w:tcPr>
           <w:p>
             <w:pPr>
-              <w:spacing w:after="0" w:line="240" w:lineRule="auto"/>
               <w:jc w:val="center"/>
+              <w:rPr>
+                <w:szCs w:val="32"/>
+              </w:rPr>
             </w:pPr>
-            <w:r/>
             <w:r>
               <w:rPr>
-                <w:rFonts w:ascii="Times New Roman" w:hAnsi="Times New Roman"/>
-                <w:b w:val="0"/>
-                <w:color w:val="202A32"/>
-                <w:sz w:val="15"/>
+                <w:szCs w:val="32"/>
               </w:rPr>
               <w:t>65.2†</w:t>
             </w:r>
@@ -4958,29 +4883,31 @@
       <w:tr>
         <w:trPr>
           <w:cantSplit/>
+          <w:jc w:val="center"/>
         </w:trPr>
         <w:tc>
           <w:tcPr>
-            <w:tcW w:type="dxa" w:w="1800"/>
-            <w:vAlign w:val="center"/>
+            <w:tcW w:w="1800" w:type="dxa"/>
+            <w:tcBorders>
+              <w:bottom w:val="single" w:sz="4" w:space="0" w:color="auto"/>
+            </w:tcBorders>
             <w:tcMar>
               <w:top w:w="55" w:type="dxa"/>
-              <w:start w:w="65" w:type="dxa"/>
+              <w:left w:w="65" w:type="dxa"/>
               <w:bottom w:w="55" w:type="dxa"/>
-              <w:end w:w="65" w:type="dxa"/>
+              <w:right w:w="65" w:type="dxa"/>
             </w:tcMar>
+            <w:vAlign w:val="center"/>
           </w:tcPr>
           <w:p>
             <w:pPr>
-              <w:spacing w:after="0" w:line="240" w:lineRule="auto"/>
+              <w:rPr>
+                <w:szCs w:val="32"/>
+              </w:rPr>
             </w:pPr>
-            <w:r/>
             <w:r>
               <w:rPr>
-                <w:rFonts w:ascii="Times New Roman" w:hAnsi="Times New Roman"/>
-                <w:b w:val="0"/>
-                <w:color w:val="202A32"/>
-                <w:sz w:val="15"/>
+                <w:szCs w:val="32"/>
               </w:rPr>
               <w:t>DINOv2 ViT-S/14</w:t>
             </w:r>
@@ -4988,27 +4915,28 @@
         </w:tc>
         <w:tc>
           <w:tcPr>
-            <w:tcW w:type="dxa" w:w="2477"/>
-            <w:vAlign w:val="center"/>
+            <w:tcW w:w="2477" w:type="dxa"/>
+            <w:tcBorders>
+              <w:bottom w:val="single" w:sz="4" w:space="0" w:color="auto"/>
+            </w:tcBorders>
             <w:tcMar>
               <w:top w:w="55" w:type="dxa"/>
-              <w:start w:w="65" w:type="dxa"/>
+              <w:left w:w="65" w:type="dxa"/>
               <w:bottom w:w="55" w:type="dxa"/>
-              <w:end w:w="65" w:type="dxa"/>
+              <w:right w:w="65" w:type="dxa"/>
             </w:tcMar>
+            <w:vAlign w:val="center"/>
           </w:tcPr>
           <w:p>
             <w:pPr>
-              <w:spacing w:after="0" w:line="240" w:lineRule="auto"/>
               <w:jc w:val="center"/>
+              <w:rPr>
+                <w:szCs w:val="32"/>
+              </w:rPr>
             </w:pPr>
-            <w:r/>
             <w:r>
               <w:rPr>
-                <w:rFonts w:ascii="Times New Roman" w:hAnsi="Times New Roman"/>
-                <w:b w:val="0"/>
-                <w:color w:val="202A32"/>
-                <w:sz w:val="15"/>
+                <w:szCs w:val="32"/>
               </w:rPr>
               <w:t>0.453 → 0.323</w:t>
             </w:r>
@@ -5016,27 +4944,28 @@
         </w:tc>
         <w:tc>
           <w:tcPr>
-            <w:tcW w:type="dxa" w:w="2448"/>
-            <w:vAlign w:val="center"/>
+            <w:tcW w:w="2448" w:type="dxa"/>
+            <w:tcBorders>
+              <w:bottom w:val="single" w:sz="4" w:space="0" w:color="auto"/>
+            </w:tcBorders>
             <w:tcMar>
               <w:top w:w="55" w:type="dxa"/>
-              <w:start w:w="65" w:type="dxa"/>
+              <w:left w:w="65" w:type="dxa"/>
               <w:bottom w:w="55" w:type="dxa"/>
-              <w:end w:w="65" w:type="dxa"/>
+              <w:right w:w="65" w:type="dxa"/>
             </w:tcMar>
+            <w:vAlign w:val="center"/>
           </w:tcPr>
           <w:p>
             <w:pPr>
-              <w:spacing w:after="0" w:line="240" w:lineRule="auto"/>
               <w:jc w:val="center"/>
+              <w:rPr>
+                <w:szCs w:val="32"/>
+              </w:rPr>
             </w:pPr>
-            <w:r/>
             <w:r>
               <w:rPr>
-                <w:rFonts w:ascii="Times New Roman" w:hAnsi="Times New Roman"/>
-                <w:b w:val="0"/>
-                <w:color w:val="202A32"/>
-                <w:sz w:val="15"/>
+                <w:szCs w:val="32"/>
               </w:rPr>
               <w:t>0.26% → 1.56%</w:t>
             </w:r>
@@ -5044,27 +4973,28 @@
         </w:tc>
         <w:tc>
           <w:tcPr>
-            <w:tcW w:type="dxa" w:w="2995"/>
-            <w:vAlign w:val="center"/>
+            <w:tcW w:w="2995" w:type="dxa"/>
+            <w:tcBorders>
+              <w:bottom w:val="single" w:sz="4" w:space="0" w:color="auto"/>
+            </w:tcBorders>
             <w:tcMar>
               <w:top w:w="55" w:type="dxa"/>
-              <w:start w:w="65" w:type="dxa"/>
+              <w:left w:w="65" w:type="dxa"/>
               <w:bottom w:w="55" w:type="dxa"/>
-              <w:end w:w="65" w:type="dxa"/>
+              <w:right w:w="65" w:type="dxa"/>
             </w:tcMar>
+            <w:vAlign w:val="center"/>
           </w:tcPr>
           <w:p>
             <w:pPr>
-              <w:spacing w:after="0" w:line="240" w:lineRule="auto"/>
               <w:jc w:val="center"/>
+              <w:rPr>
+                <w:szCs w:val="32"/>
+              </w:rPr>
             </w:pPr>
-            <w:r/>
             <w:r>
               <w:rPr>
-                <w:rFonts w:ascii="Times New Roman" w:hAnsi="Times New Roman"/>
-                <w:b w:val="0"/>
-                <w:color w:val="202A32"/>
-                <w:sz w:val="15"/>
+                <w:szCs w:val="32"/>
               </w:rPr>
               <w:t>0.199</w:t>
             </w:r>
@@ -5082,12 +5012,6 @@
         <w:spacing w:after="100" w:line="259" w:lineRule="auto"/>
       </w:pPr>
       <w:r>
-        <w:rPr>
-          <w:rFonts w:ascii="Times New Roman" w:hAnsi="Times New Roman"/>
-          <w:i w:val="0"/>
-          <w:color w:val="202A32"/>
-          <w:sz w:val="20"/>
-        </w:rPr>
         <w:t>Mℓ is the empirical uncentered second moment of clean predicted-class margin gradients over patch positions and N=100 calibration images/model; positions are aggregated within images. Normalized effective rank divides the entropy-based effective rank by feature dimension D, so it is dimensionless. Mℓ is distinct from the full token-by-feature downstream readout Jacobian Gram matrix. DINOv2 near-null growth is small at the primary threshold. †The ViT-B PCbottom-based ratio is sensitive to a small depth-8 activation-covariance eigengap. Ratios describe the selected sample directions and are not a universal ranking of PCA directions.</w:t>
       </w:r>
     </w:p>
@@ -5222,7 +5146,6 @@
         <w:spacing w:after="100" w:line="259" w:lineRule="auto"/>
       </w:pPr>
       <w:r>
-        <w:lastRenderedPageBreak/>
         <w:t xml:space="preserve">The primary projection-path audit remains limited to DeiT-Small and ViT-B/16 AugReg and is reported separately in Supplementary Figure S12. With the residual stream clean, the V-only immediate-readout norm is 97.4% and 99.4% of the corresponding </w:t>
       </w:r>
       <m:oMath>
@@ -5259,6 +5182,7 @@
         <w:rPr>
           <w:noProof/>
         </w:rPr>
+        <w:lastRenderedPageBreak/>
         <w:drawing>
           <wp:inline distT="0" distB="0" distL="0" distR="0" wp14:anchorId="21C71948" wp14:editId="6E21B0E7">
             <wp:extent cx="6172200" cy="4375764"/>
@@ -6045,7 +5969,6 @@
         <w:rPr>
           <w:rFonts w:ascii="Times New Roman" w:hAnsi="Times New Roman"/>
         </w:rPr>
-        <w:lastRenderedPageBreak/>
         <w:t>5.3 End-to-End Functional Transmission</w:t>
       </w:r>
     </w:p>
@@ -6607,7 +6530,11 @@
         </m:sSub>
       </m:oMath>
       <w:r>
-        <w:t xml:space="preserve"> is the sample covariance of all patch activations pooled across calibration images and spatial positions and centered by their pooled feature mean (with denominator </w:t>
+        <w:t xml:space="preserve"> is the sample covariance of all patch activations pooled across </w:t>
+      </w:r>
+      <w:r>
+        <w:lastRenderedPageBreak/>
+        <w:t xml:space="preserve">calibration images and spatial positions and centered by their pooled feature mean (with denominator </w:t>
       </w:r>
       <m:oMath>
         <m:sSub>
@@ -7711,7 +7638,11 @@
         </m:r>
       </m:oMath>
       <w:r>
-        <w:t xml:space="preserve">. The Jacobian is defined through the pre-classifier readout, excluding the linear classification head; measured Top-1 and logit damage use the complete downstream model and classifier. The Jacobian is evaluated at the unperturbed activation, so its product is a local first-order readout prediction rather than an exact finite-perturbation identity. Unlike the feature-space margin metric </w:t>
+        <w:t xml:space="preserve">. The Jacobian is defined through the pre-classifier readout, excluding the linear classification head; measured Top-1 and logit damage use the complete downstream model and classifier. The Jacobian is evaluated at the unperturbed </w:t>
+      </w:r>
+      <w:r>
+        <w:lastRenderedPageBreak/>
+        <w:t xml:space="preserve">activation, so its product is a local first-order readout prediction rather than an exact finite-perturbation identity. Unlike the feature-space margin metric </w:t>
       </w:r>
       <m:oMath>
         <m:sSub>
@@ -8448,11 +8379,7 @@
         </m:sSub>
       </m:oMath>
       <w:r>
-        <w:t xml:space="preserve"> captures downstream multi-block transmission to the pre-classifier readout. Together, they show that feature direction, token </w:t>
-      </w:r>
-      <w:r>
-        <w:lastRenderedPageBreak/>
-        <w:t>coherence, and downstream transmission jointly constrain perturbation damage in the tested settings, motivating the operator-aware compression analysis in Section 6.</w:t>
+        <w:t xml:space="preserve"> captures downstream multi-block transmission to the pre-classifier readout. Together, they show that feature direction, token coherence, and downstream transmission jointly constrain perturbation damage in the tested settings, motivating the operator-aware compression analysis in Section 6.</w:t>
       </w:r>
     </w:p>
     <w:p>
@@ -8463,6 +8390,7 @@
         <w:rPr>
           <w:rFonts w:ascii="Times New Roman" w:hAnsi="Times New Roman"/>
         </w:rPr>
+        <w:lastRenderedPageBreak/>
         <w:t>6. Operator-Aware Token Compression</w:t>
       </w:r>
     </w:p>
@@ -11314,13 +11242,7 @@
                   <w:rPr>
                     <w:rFonts w:ascii="Cambria Math" w:hAnsi="Cambria Math"/>
                   </w:rPr>
-                  <m:t xml:space="preserve">=1, </m:t>
-                </m:r>
-                <m:r>
-                  <w:rPr>
-                    <w:rFonts w:ascii="Cambria Math" w:hAnsi="Cambria Math"/>
-                  </w:rPr>
-                  <m:t xml:space="preserve"> </m:t>
+                  <m:t xml:space="preserve">=1,  </m:t>
                 </m:r>
                 <m:sSub>
                   <m:sSubPr>
@@ -11420,6 +11342,7 @@
         <w:spacing w:after="100" w:line="259" w:lineRule="auto"/>
       </w:pPr>
       <w:r>
+        <w:lastRenderedPageBreak/>
         <w:t xml:space="preserve">The vector s includes multiplicity one for the class token and </w:t>
       </w:r>
       <m:oMath>
@@ -12857,6 +12780,7 @@
         <w:rPr>
           <w:rFonts w:ascii="Times New Roman" w:hAnsi="Times New Roman"/>
         </w:rPr>
+        <w:lastRenderedPageBreak/>
         <w:t>Reproducibility and Evidence</w:t>
       </w:r>
     </w:p>
@@ -12912,7 +12836,6 @@
           <w:color w:val="26343D"/>
           <w:sz w:val="17"/>
         </w:rPr>
-        <w:lastRenderedPageBreak/>
         <w:t>[3] H. Touvron, M. Cord, M. Douze, F. Massa, A. Sablayrolles, H. Jégou, “Training data-efficient image transformers &amp; distillation through attention,” in Proc. 38th Int. Conf. Mach. Learn., vol. 139, pp. 10347–10357, 2021. Available: https://proceedings.mlr.press/v139/touvron21a.html.</w:t>
       </w:r>
     </w:p>
@@ -13186,6 +13109,7 @@
           <w:color w:val="26343D"/>
           <w:sz w:val="17"/>
         </w:rPr>
+        <w:lastRenderedPageBreak/>
         <w:t>[24] S. Wei, T. Ye, S. Zhang, Y. Tang, J. Liang, “Joint Token Pruning and Squeezing Towards More Aggressive Compression of Vision Transformers,” in Proc. IEEE/CVF Conf. Comput. Vis. Pattern Recognit., pp. 2092–2101, 2023. DOI: 10.1109/CVPR52729.2023.00208.</w:t>
       </w:r>
     </w:p>
@@ -13251,7 +13175,6 @@
           <w:color w:val="26343D"/>
           <w:sz w:val="17"/>
         </w:rPr>
-        <w:lastRenderedPageBreak/>
         <w:t>[29] Y. Tang, K. Han, Y. Wang, C. Xu, J. Guo, C. Xu, et al., “Patch Slimming for Efficient Vision Transformers,” in Proc. IEEE/CVF Conf. Comput. Vis. Pattern Recognit., pp. 12165–12174, 2022. DOI: 10.1109/CVPR52688.2022.01185.</w:t>
       </w:r>
     </w:p>
@@ -13418,7 +13341,6 @@
       </w:pPr>
       <w:r>
         <w:rPr>
-          <w:rFonts w:ascii="Times New Roman" w:hAnsi="Times New Roman"/>
           <w:color w:val="26343D"/>
           <w:sz w:val="17"/>
         </w:rPr>
@@ -13432,7 +13354,6 @@
       </w:pPr>
       <w:r>
         <w:rPr>
-          <w:rFonts w:ascii="Times New Roman" w:hAnsi="Times New Roman"/>
           <w:color w:val="26343D"/>
           <w:sz w:val="17"/>
         </w:rPr>
@@ -13527,6 +13448,7 @@
           <w:color w:val="26343D"/>
           <w:sz w:val="17"/>
         </w:rPr>
+        <w:lastRenderedPageBreak/>
         <w:t>[50] S. Wiegreffe, Y. Pinter, “Attention Is Not Not Explanation,” in Proceedings of the 2019 Conference on Empirical Methods in Natural Language Processing and the 9th International Joint Conference on Natural Language Processing, pp. 11–20, 2019. DOI: 10.18653/v1/D19-1002.</w:t>
       </w:r>
     </w:p>

</xml_diff>

<commit_message>
docs: add CLS-patch stream asymmetry evidence
</commit_message>
<xml_diff>
--- a/docs/PAPER_DRAFT_v5.docx
+++ b/docs/PAPER_DRAFT_v5.docx
@@ -1889,11 +1889,26 @@
         <w:spacing w:after="100" w:line="259" w:lineRule="auto"/>
       </w:pPr>
       <w:r>
-        <w:t>The controlled endpoint differences are summarized in Table II.</w:t>
+        <w:rPr>
+          <w:b/>
+        </w:rPr>
+        <w:t xml:space="preserve">CLS–Patch Stream Asymmetry. </w:t>
+      </w:r>
+      <w:r>
+        <w:t xml:space="preserve">An exploratory Block-8 control examines CLS replacement with the patch stream preserved. Replacing CLS with its calibration-set mean while retaining all 196 original patches yields 66.4% Top-1 for DeiT-Tiny and 74.8% for DeiT-Small, versus clean accuracies of 67.9% and 76.1%. Retaining original CLS while replacing all patches with identical copies of the calibration-derived global patch centroid yields 10.2% and 17.0%. Thus, substantial accuracy can persist after CLS replacement when original patches remain, while intact CLS does not ensure robustness to the collapsed patch stream. The interventions are unmatched—one CLS token versus 196 patches—and identical-centroid replacement also removes token-position diversity. Its accuracy decrease therefore combines loss of image-specific patch content with representational collapse. Alongside the geometry and diversity controls, this two-model Block-8 evidence is consistent with CLS as a possible contributor. It does not demonstrate information movement or CLS sufficiency and does not generalize beyond DeiT-Tiny and DeiT-Small.</w:t>
       </w:r>
     </w:p>
     <w:p>
       <w:pPr>
+        <w:spacing w:after="100" w:line="259" w:lineRule="auto"/>
+      </w:pPr>
+      <w:r>
+        <w:t>The controlled endpoint differences are summarized in Table II.</w:t>
+      </w:r>
+    </w:p>
+    <w:p>
+      <w:pPr>
+        <w:keepNext/>
         <w:spacing w:after="100" w:line="259" w:lineRule="auto"/>
       </w:pPr>
       <w:r>

</xml_diff>

<commit_message>
Refine CLS-patch asymmetry evidence
</commit_message>
<xml_diff>
--- a/docs/PAPER_DRAFT_v5.docx
+++ b/docs/PAPER_DRAFT_v5.docx
@@ -1892,10 +1892,10 @@
         <w:rPr>
           <w:b/>
         </w:rPr>
-        <w:t xml:space="preserve">CLS–Patch Stream Asymmetry. </w:t>
-      </w:r>
-      <w:r>
-        <w:t xml:space="preserve">An exploratory Block-8 control examines CLS replacement with the patch stream preserved. Replacing CLS with its calibration-set mean while retaining all 196 original patches yields 66.4% Top-1 for DeiT-Tiny and 74.8% for DeiT-Small, versus clean accuracies of 67.9% and 76.1%. Retaining original CLS while replacing all patches with identical copies of the calibration-derived global patch centroid yields 10.2% and 17.0%. Thus, substantial accuracy can persist after CLS replacement when original patches remain, while intact CLS does not ensure robustness to the collapsed patch stream. The interventions are unmatched—one CLS token versus 196 patches—and identical-centroid replacement also removes token-position diversity. Its accuracy decrease therefore combines loss of image-specific patch content with representational collapse. Alongside the geometry and diversity controls, this two-model Block-8 evidence is consistent with CLS as a possible contributor. It does not demonstrate information movement or CLS sufficiency and does not generalize beyond DeiT-Tiny and DeiT-Small.</w:t>
+        <w:t xml:space="preserve">CLS–patch stream asymmetry. </w:t>
+      </w:r>
+      <w:r>
+        <w:t xml:space="preserve">We tested a complementary Block-8 control in DeiT-Tiny and DeiT-Small (1,000 held-out images per model). Replacing the CLS activation with its calibration mean, while leaving all 196 spatial patches unchanged, retained 66.4% and 74.8% Top-1 accuracy, compared with clean baselines of 67.9% and 76.1%. Conversely, retaining the original CLS while replacing every patch with an identical calibration centroid reduced accuracy to 10.2% and 17.0%. Thus, the original image-specific CLS activation is not required for near-baseline classification when the patch stream remains intact, whereas preserving CLS does not prevent degradation under this complete patch intervention. These interventions differ in scale (one versus 196 tokens), and identical-centroid replacement also eliminates patch-token diversity. Consequently, this exploratory comparison does not isolate information transfer to CLS or establish CLS sufficiency as an explanation for patch-content fungibility (Supplementary Section S4).</w:t>
       </w:r>
     </w:p>
     <w:p>
@@ -1917,6 +1917,7 @@
     </w:p>
     <w:p>
       <w:pPr>
+        <w:keepNext/>
         <w:spacing w:after="100" w:line="259" w:lineRule="auto"/>
       </w:pPr>
       <w:r>

</xml_diff>

<commit_message>
Update manuscript DOCX and supplementary figure layouts
</commit_message>
<xml_diff>
--- a/docs/PAPER_DRAFT_v5.docx
+++ b/docs/PAPER_DRAFT_v5.docx
@@ -6,6 +6,7 @@
       <w:pPr>
         <w:pStyle w:val="Title"/>
         <w:spacing w:after="160"/>
+        <w:jc w:val="center"/>
       </w:pPr>
       <w:r>
         <w:rPr>
@@ -45,9 +46,10 @@
     <w:p>
       <w:pPr>
         <w:spacing w:after="100" w:line="259" w:lineRule="auto"/>
-      </w:pPr>
-      <w:r>
-        <w:t>Vision transformers represent images as fixed sequences of patch slots, yet the role of each slot’s image-specific content in late layers remains unclear. We causally replace selected late-layer patch activations with class-agnostic calibration surrogates while preserving token positions, sequence length, model weights, and all subsequent computation. Across four tested vision-transformer families, this fixed-slot intervention reveals conditional patch-content fungibility bounded by feature geometry and token-position diversity. Mechanistic analyses associate replaceability with anisotropic functional sensitivity, coherent accumulation and sign-dependent cancellation along the attention Value path, and declining normalized effective rank; near-null expansion at the primary threshold is evident in three models but small in DINOv2. As a bounded application, we evaluate operator-aware compression using an offline, per-image downstream-Jacobian oracle on 1,000 held-out images per architecture. At the most aggressive tested budgets, operator-aware variants improve Top-1 by 4.2–12.0 percentage points over the strongest pruning baseline, but ToMe remains competitive and Full-J is not uniformly better than Group Mean or ToMe. The evidence supports Patch-Content Fungibility as a mechanistic account of the tested interventions and an oracle-level compression opportunity, but does not establish a general deployment advantage.</w:t>
+        <w:jc w:val="both"/>
+      </w:pPr>
+      <w:r>
+        <w:t>Vision transformers represent images as fixed sequences of patch slots, yet the role of each slot’s image-specific content in late layers remains unclear. We causally replace selected late-layer patch activations with class-agnostic calibration surrogates while preserving token positions, sequence length, model weights, and all subsequent computation. Across four tested vision-transformer families, this fixed-slot intervention reveals conditional patch-content fungibility bounded by feature geometry and token-position diversity. Mechanistic analyses associate replaceability with anisotropic functional sensitivity, coherent accumulation and sign-dependent cancellation along the attention Value path, and declining normalized effective rank across all four models, while the near-null fraction increases substantially in most models at a fixed relative spectral threshold. As a downstream application, we evaluate operator-aware token compression using an offline, per-image downstream-Jacobian oracle on held-out ImageNet-1k data across four architectures. At the most aggressive tested budgets, operator-aware variants outperform the strongest pruning baseline by 4.2–12.0 percentage points in Top-1 accuracy across the four architectures. However, Full-J does not consistently outperform Group Mean or ToMe, and the offline oracle setting does not establish a general deployment advantage. Together, these findings link the observed functional geometry to a potential strategy for token compression.</w:t>
       </w:r>
     </w:p>
     <w:p>
@@ -64,6 +66,7 @@
     <w:p>
       <w:pPr>
         <w:spacing w:after="100" w:line="259" w:lineRule="auto"/>
+        <w:jc w:val="both"/>
       </w:pPr>
       <w:r>
         <w:t>Transformers use self-attention to mix token representations [1], while vision transformers (ViTs) represent an image as a sequence of patch embeddings [2]. Published ViT families include data-efficient supervised training [3], self-supervised representations [4], [5], hierarchical attention [6], masked pretraining [7], scaling [8], training regularization [9], and register tokens [10]. Token-reduction methods lower computation by changing which tokens are processed or how they are combined. We ask a different question: when does the remaining network require the image-specific content carried by a late patch slot?</w:t>
@@ -72,6 +75,7 @@
     <w:p>
       <w:pPr>
         <w:spacing w:after="100" w:line="259" w:lineRule="auto"/>
+        <w:jc w:val="both"/>
       </w:pPr>
       <w:r>
         <w:t>We answer with a controlled content intervention. At a selected late layer, image-specific patch activations are causally removed and replaced with class-agnostic calibration surrogates while token slots, sequence length, model weights, and all downstream computation are held fixed. The intervention isolates content dependence while preserving the structure of the sequence received by later layers. Replaceability is conditional on feature geometry and token diversity; the intervention tests content substitution with fixed token slots rather than token deletion. Figure 1 summarizes the fixed-slot intervention, geometric and diversity constraints, and selective transmission through anisotropic sensitivity and Value-path cancellation.</w:t>
@@ -130,23 +134,67 @@
       <w:pPr>
         <w:keepLines/>
         <w:spacing w:after="80"/>
-        <w:jc w:val="center"/>
-      </w:pPr>
-      <w:r>
+        <w:jc w:val="both"/>
         <w:rPr>
-          <w:i/>
-          <w:color w:val="4C5963"/>
-          <w:sz w:val="17"/>
+          <w:iCs/>
+          <w:color w:val="auto"/>
+          <w:sz w:val="18"/>
+          <w:szCs w:val="24"/>
         </w:rPr>
-        <w:t>Figure 1. Fixed-slot late-layer patch-content substitution (a), geometric and diversity constraints (b), and anisotropic sensitivity with Value-path cancellation (c).</w:t>
+      </w:pPr>
+      <w:r>
+        <w:rPr>
+          <w:b/>
+          <w:bCs/>
+          <w:iCs/>
+          <w:color w:val="auto"/>
+          <w:sz w:val="18"/>
+          <w:szCs w:val="24"/>
+        </w:rPr>
+        <w:t>Figure 1.</w:t>
+      </w:r>
+      <w:r>
+        <w:rPr>
+          <w:iCs/>
+          <w:color w:val="auto"/>
+          <w:sz w:val="18"/>
+          <w:szCs w:val="24"/>
+        </w:rPr>
+        <w:t xml:space="preserve"> Fixed-slot </w:t>
+      </w:r>
+      <w:r>
+        <w:rPr>
+          <w:iCs/>
+          <w:color w:val="auto"/>
+          <w:sz w:val="18"/>
+          <w:szCs w:val="24"/>
+        </w:rPr>
+        <w:t>late-layer patch-content substitution (a), geometric and diversity constraints (b), and anisotropic sensitivity with Value-path cancellation (c).</w:t>
       </w:r>
     </w:p>
     <w:p>
       <w:pPr>
+        <w:keepLines/>
+        <w:spacing w:after="80"/>
+        <w:jc w:val="both"/>
+        <w:rPr>
+          <w:iCs/>
+        </w:rPr>
+      </w:pPr>
+    </w:p>
+    <w:p>
+      <w:pPr>
         <w:spacing w:after="100" w:line="259" w:lineRule="auto"/>
-      </w:pPr>
-      <w:r>
-        <w:t>This leads to three linked questions: whether a late patch slot needs its image-specific activation or can carry a class-agnostic surrogate; how feature geometry, token-position coherence, and downstream transmission shape observed replacement tolerance; and whether those mechanisms can inform operator-aware compression, including where the translation fails. We study these questions as a ViT-specific account of Patch-Content Fungibility (PCF). The argument proceeds from fixed-slot causal replacement, through geometric and functional mechanisms, to compression as a bounded application whose nonlinear classification and measured throughput must be assessed separately.</w:t>
+        <w:jc w:val="both"/>
+      </w:pPr>
+      <w:r>
+        <w:t>This leads to three linked questions: whether a late patch slot needs its image-specific activation or can carry a class-agnostic surrogate; how feature geometry, token-position coherence, and downstream transmission shape observed replacement tolerance; and whether downstream functional sensitivity can guide operator-aware token compression, and how its benefits compare with pruning and merging baselines.</w:t>
+      </w:r>
+      <w:r>
+        <w:t xml:space="preserve"> We study these questions as a ViT-specific account of Patch-Content Fungibility (PCF). </w:t>
+      </w:r>
+      <w:r>
+        <w:t>The paper connects fixed-slot replacement experiments with geometric and functional analyses, followed by an evaluation of operator-aware token compression.</w:t>
       </w:r>
     </w:p>
     <w:p>
@@ -163,14 +211,28 @@
     <w:p>
       <w:pPr>
         <w:spacing w:after="100" w:line="259" w:lineRule="auto"/>
-      </w:pPr>
-      <w:r>
-        <w:t>Token-reduction methods such as DynamicViT, EViT, and Token Merging (ToMe) select, reorganize, merge, or otherwise shorten the sequence processed by a ViT [11]–[13]. Diversity-aware pruning also predates PCF: Long et al. jointly preserve attentive tokens and increase global semantic diversity by merging similar inattentive tokens and matching homogeneous attentive tokens [14]. Related work also learns or pools tokens and adapts token computation [15]–[18]; samples, prunes, squeezes, or exits early [19]–[25]; and explores dynamic, structured, or sparse token/activation schemes [26]–[33]. Parameter pruning, pruning of large language models (LLMs), and singular value decomposition (SVD)-based dimension compression form a related efficiency lineage [34]–[41]. PCF's primary causal intervention instead substitutes ordinary spatial patch-token content while preserving token positions, sequence length, model weights, and downstream computation. Under complete class-agnostic patch-content replacement, it controls token-position diversity separately from feature-space direction; token diversity itself is not claimed as a new concept. The later compression application is distinct: it optimizes grouped carrier content under a fixed assignment S and shortens the sequence for subsequent computation.</w:t>
+        <w:jc w:val="both"/>
+      </w:pPr>
+      <w:r>
+        <w:t>Token-reduction methods such as DynamicViT, EViT, and Token Merging (ToMe) select, reorganize, merge, or otherwise shorten the sequence processed by a ViT [11]–[13]. Diversity-aware pruning also predates PCF: Long et al. jointly preserve attentive tokens and increase global semantic diversity by merging similar inattentive tokens and matching homogeneous attentive tokens [14]. Related work also learns or pools tokens and adapts token computation [15]–[18]; samples, prunes, squeezes, or exits early [19]–[25]; and explores dynamic, structured, or sparse token/activation schemes [26]–[33]. Parameter pruning, pruning of large language models (LLMs), and singular value decomposition (SVD)-based dimension compression form a related efficiency lineage [34]–[41]. PCF's primary causal intervention instead substitutes ordinary spatial patch-token content while preserving token positions, sequence length, model weights, and downstream computation. Under complete class-agnostic patch-content replacement, it controls token-position diversity separately from feature-space direction</w:t>
+      </w:r>
+      <w:r>
+        <w:t>.</w:t>
+      </w:r>
+      <w:r>
+        <w:t xml:space="preserve"> </w:t>
+      </w:r>
+      <w:r>
+        <w:t>This design isolates how token-position diversity affects content replacement</w:t>
+      </w:r>
+      <w:r>
+        <w:t>. The later compression application is distinct: it optimizes grouped carrier content under a fixed assignment S and shortens the sequence for subsequent computation.</w:t>
       </w:r>
     </w:p>
     <w:p>
       <w:pPr>
         <w:spacing w:after="100" w:line="259" w:lineRule="auto"/>
+        <w:jc w:val="both"/>
       </w:pPr>
       <w:r>
         <w:t>Jacobian-sensitive geometry and task-aware token compression also have direct ViT precedents. Bond et al. define a task-induced pullback metric on ViT feature spaces, analyze its spectral and low-rank structure, and use task-sensitive geometry for token pruning and soft merging [42]. Liu et al. study approximate nullspace perturbations in nonlinear ViT blocks and nullspace-noise augmentation for fine-tuning robustness [43]. These works establish prior art for downstream-Jacobian geometry, task-aware compression, and approximate-nullspace analysis. PCF asks how much original image-specific content is needed at an ordinary spatial patch slot under fixed-slot interventions; its compression application optimizes grouped carrier content under a fixed assignment S, rather than recasting importance scoring or token-pair selection as the same optimization problem.</w:t>
@@ -179,29 +241,53 @@
     <w:p>
       <w:pPr>
         <w:spacing w:after="100" w:line="259" w:lineRule="auto"/>
-      </w:pPr>
-      <w:r>
-        <w:t xml:space="preserve">Surrogate substitution also has a close methodological precedent. Parodi et al. study mean, noise, and cross-image register-shuffling substitutions for specialized DINO register-token content. PCF examines ordinary spatial patch-token activations </w:t>
-      </w:r>
+        <w:jc w:val="both"/>
+      </w:pPr>
       <w:r>
         <w:lastRenderedPageBreak/>
-        <w:t>across depth and replacement fractions, and separates feature geometry from token-position diversity; it does not claim to introduce surrogate replacement [44].</w:t>
+        <w:t xml:space="preserve">Surrogate substitution also has a close methodological precedent. Parodi et al. study mean, noise, and cross-image register-shuffling substitutions for specialized DINO register-token content. PCF examines ordinary spatial patch-token activations across depth and replacement fractions, and separates feature geometry from token-position diversity; </w:t>
+      </w:r>
+      <w:r>
+        <w:t xml:space="preserve">thereby extending surrogate-intervention analysis to ordinary spatial patch tokens </w:t>
+      </w:r>
+      <w:r>
+        <w:t>[44].</w:t>
       </w:r>
     </w:p>
     <w:p>
       <w:pPr>
         <w:spacing w:after="100" w:line="259" w:lineRule="auto"/>
-      </w:pPr>
-      <w:r>
-        <w:t>Sensitivity-weighted objectives and Jacobian-based measures of downstream effect are established tools, not a new mathematical Jacobian or general theory introduced here [45], [46]. A recent public preprint, Output-aware Residual Stream Pruning, couples activation statistics with output sensitivity to prune LLM residual-stream dimensions [47]. That work supports the broader precedent for output-aware compression but studies a different model family and dimension-pruning intervention. PCF's bounded contribution is the combination of ViT patch-content interventions, functional-transmission analysis, and an operator-aware carrier update evaluated at controlled token budgets. Its fixed-slot causal studies preserve sequence length; the carrier-compression application reduces the sequence for subsequent computation.</w:t>
+        <w:jc w:val="both"/>
+      </w:pPr>
+      <w:r>
+        <w:t>Sensitivity-weighted objectives and Jacobian-based measures provide established foundations for analyzing downstream functional effects</w:t>
+      </w:r>
+      <w:r>
+        <w:t xml:space="preserve"> [45], [46]. A recent public preprint, Output-aware Residual Stream Pruning, couples activation statistics with output sensitivity to prune LLM residual-stream dimensions [47]. That work supports the broader precedent for output-aware compression but studies a different model family and dimension-pruning intervention.</w:t>
+      </w:r>
+      <w:r>
+        <w:t xml:space="preserve"> PCF</w:t>
+      </w:r>
+      <w:r>
+        <w:t xml:space="preserve"> </w:t>
+      </w:r>
+      <w:r>
+        <w:t>combines</w:t>
+      </w:r>
+      <w:r>
+        <w:t xml:space="preserve"> ViT patch-content interventions, functional-transmission analysis, and an operator-aware carrier update evaluated at controlled token budgets. Its fixed-slot causal studies preserve sequence length; the carrier-compression application reduces the sequence for subsequent computation.</w:t>
       </w:r>
     </w:p>
     <w:p>
       <w:pPr>
         <w:spacing w:after="100" w:line="259" w:lineRule="auto"/>
-      </w:pPr>
-      <w:r>
-        <w:t>Interpretability research cautions that attention weights alone need not explain a model's decision. Controlled studies examine whether attention is explanation and how explanation changes under interventions [48]–[50]. Attention flow, Integrated Gradients, saliency-map sanity checks, and transformer-specific relevance propagation provide complementary methods for tracing or attributing model behavior [51]–[54]. Causal abstraction offers a framework for connecting interventions to model-level causal structure [55]. Our evidence uses direct activation interventions and held-out prediction of perturbation damage; it is bounded to the tested models, readouts, and cohorts.</w:t>
+        <w:jc w:val="both"/>
+      </w:pPr>
+      <w:r>
+        <w:t xml:space="preserve">Interpretability research cautions that attention weights alone need not explain a model's decision. Controlled studies examine whether attention is explanation and how explanation changes under interventions [48]–[50]. Attention flow, Integrated Gradients, saliency-map sanity checks, and transformer-specific relevance propagation provide complementary methods for tracing or attributing model behavior [51]–[54]. Causal abstraction offers a framework for connecting interventions to model-level causal structure [55]. Our evidence uses </w:t>
+      </w:r>
+      <w:r>
+        <w:t>controlled activation interventions and held-out perturbation-damage prediction to investigate functional dependence in pretrained ViTs.</w:t>
       </w:r>
     </w:p>
     <w:p>
@@ -218,32 +304,56 @@
     <w:p>
       <w:pPr>
         <w:spacing w:after="100" w:line="259" w:lineRule="auto"/>
-      </w:pPr>
-      <w:r>
-        <w:t>Image-based studies use frozen pretrained models on ImageNet-1k validation data. The principal replacement studies and strict confirmatory compression use disjoint calibration and evaluation cohorts, with calibration-derived quantities estimated from calibration images only. The confirmatory compression protocol freezes a 1,000-image calibration set (seed 9101) and evaluates 1,000 held-out images per architecture, one per class (seed 9201); no tuning uses held-out images. Exploratory mechanistic audits follow protocol-specific cohorts rather than one shared N=100 set. In particular, joint-stream geometry estimates feature directions and measures downstream responses on the same 100 images per model, so those outcomes are within-cohort descriptive results, not held-out estimates. N denotes the sampling unit shown in Table I; image and perturbation cohorts remain distinct. Supplementary Section S13 describes the separate practical-carrier cohorts and operator-space endpoints.</w:t>
+        <w:jc w:val="both"/>
+      </w:pPr>
+      <w:r>
+        <w:t>All experiments use frozen pretrained vision transformers evaluated on ImageNet-1k validation data. The primary replacement studies and confirmatory compression benchmark use disjoint calibration and evaluation sets, each containing 1,000 images (one per class). Calibration statistics are estimated exclusively from the calibration data, while evaluation results are reported on held-out images.</w:t>
       </w:r>
     </w:p>
     <w:p>
       <w:pPr>
         <w:spacing w:after="100" w:line="259" w:lineRule="auto"/>
-      </w:pPr>
-      <w:r>
-        <w:t>TABLE I</w:t>
+        <w:jc w:val="both"/>
+      </w:pPr>
+      <w:r>
+        <w:t xml:space="preserve">Exploratory mechanistic analyses follow study-specific protocols and sample sizes, as summarized in Table </w:t>
+      </w:r>
+      <w:r>
+        <w:t>1</w:t>
+      </w:r>
+      <w:r>
+        <w:t>. Notably, the joint-stream geometry analysis uses the same 100 images per model for feature-direction estimation and perturbation evaluation; its findings are therefore descriptive rather than independently validated. Image-level and perturbation-level results are treated as distinct evaluation units. Additional protocols for practical-carrier and operator-space evaluations are provided in Supplementary Section S13.</w:t>
       </w:r>
     </w:p>
     <w:p>
       <w:pPr>
         <w:spacing w:after="100" w:line="259" w:lineRule="auto"/>
-      </w:pPr>
-      <w:r>
-        <w:t>PRIMARY RESULTS AND EVIDENCE SCOPE</w:t>
+        <w:rPr>
+          <w:b/>
+          <w:bCs/>
+        </w:rPr>
+      </w:pPr>
+      <w:r>
+        <w:rPr>
+          <w:b/>
+          <w:bCs/>
+        </w:rPr>
+        <w:t>Table 1</w:t>
       </w:r>
     </w:p>
     <w:p>
       <w:pPr>
         <w:spacing w:after="100" w:line="259" w:lineRule="auto"/>
-      </w:pPr>
-      <w:r>
+        <w:rPr>
+          <w:sz w:val="18"/>
+          <w:szCs w:val="20"/>
+        </w:rPr>
+      </w:pPr>
+      <w:r>
+        <w:rPr>
+          <w:sz w:val="18"/>
+          <w:szCs w:val="20"/>
+        </w:rPr>
         <w:t>Summary of the primary study families, evaluation units, controls, and main findings. The multi-block unit counts held-out perturbations; cohort and endpoint details remain protocol-specific.</w:t>
       </w:r>
     </w:p>
@@ -722,7 +832,14 @@
               <w:rPr>
                 <w:szCs w:val="28"/>
               </w:rPr>
-              <w:t>Coherent Value contributions accumulate; sign-varying contributions partially cancel.</w:t>
+              <w:t xml:space="preserve">Coherent Value contributions accumulate; sign-varying contributions partially </w:t>
+            </w:r>
+            <w:r>
+              <w:rPr>
+                <w:szCs w:val="28"/>
+              </w:rPr>
+              <w:lastRenderedPageBreak/>
+              <w:t>cancel.</w:t>
             </w:r>
           </w:p>
         </w:tc>
@@ -950,6 +1067,7 @@
     <w:p>
       <w:pPr>
         <w:spacing w:after="100" w:line="259" w:lineRule="auto"/>
+        <w:jc w:val="both"/>
       </w:pPr>
       <w:r>
         <w:rPr>
@@ -958,21 +1076,16 @@
         <w:t>Statistical reporting.</w:t>
       </w:r>
       <w:r>
-        <w:t xml:space="preserve"> Where conditions share a cohort, paired image-level comparisons use the same image under each condition. Seeded results are summarized at the run level; means and sample standard deviations are reported across runs where shown, and seed–image rows are not treated as independent images. For the grouped-diversity extension, each image’s outcome is first averaged across five seeds, then paired t and Wilcoxon tests are applied. Where specified by protocol, Top-1 differences use exact McNemar tests; margin contrasts use paired Student’s t and Wilcoxon tests, with study-specific bootstrap or t-based intervals and Cohen’s d</w:t>
-      </w:r>
-      <w:r>
-        <w:rPr>
-          <w:vertAlign w:val="subscript"/>
-        </w:rPr>
-        <w:t>z</w:t>
-      </w:r>
-      <w:r>
-        <w:t xml:space="preserve"> where reported. Benjamini–Hochberg correction is applied only within protocol-defined comparison families. Multi-block analyses use perturbations as the sample unit, and operator-space outcomes remain distinct from classifier-image outcomes; Supplementary Section S10 gives the study-specific procedures and seed IDs.</w:t>
+        <w:t xml:space="preserve"> </w:t>
+      </w:r>
+      <w:r>
+        <w:t>We use paired comparisons when interventions are evaluated on the same images, without treating repeated observations across random seeds as independent samples. For the grouped-diversity analysis, outcomes are averaged across five seeds per image before statistical testing. Paired Top-1 outcomes are assessed using McNemar's test, while margin differences are evaluated using paired t-tests or Wilcoxon signed-rank tests, as specified by each protocol. Multiple-comparison corrections are applied within predefined comparison families. Study-specific sampling units, confidence intervals, and testing procedures are detailed in Supplementary Section S10.</w:t>
       </w:r>
     </w:p>
     <w:p>
       <w:pPr>
         <w:spacing w:after="100" w:line="259" w:lineRule="auto"/>
+        <w:jc w:val="both"/>
       </w:pPr>
       <w:r>
         <w:t>In the equations, N</w:t>
@@ -1014,7 +1127,13 @@
         </m:sSub>
       </m:oMath>
       <w:r>
-        <w:t xml:space="preserve"> the number of spatial patch slots, and D the feature dimension; Table I reports N alongside each study's sampling unit. For the fixed-slot intervention, let </w:t>
+        <w:t xml:space="preserve"> the number of spatial patch slots, and D the feature dimension; Table </w:t>
+      </w:r>
+      <w:r>
+        <w:t>1</w:t>
+      </w:r>
+      <w:r>
+        <w:t xml:space="preserve"> reports N alongside each study's sampling unit. For the fixed-slot intervention, let </w:t>
       </w:r>
       <m:oMath>
         <m:sSub>
@@ -1568,6 +1687,7 @@
     <w:p>
       <w:pPr>
         <w:spacing w:after="100" w:line="259" w:lineRule="auto"/>
+        <w:jc w:val="both"/>
       </w:pPr>
       <w:r>
         <w:t xml:space="preserve">Thus, when </w:t>
@@ -1636,6 +1756,7 @@
     <w:p>
       <w:pPr>
         <w:spacing w:after="100" w:line="259" w:lineRule="auto"/>
+        <w:jc w:val="both"/>
       </w:pPr>
       <w:r>
         <w:t>Surrogate values and replacement masks are protocol-specific: audited controls include calibration centroids, diagonal-Gaussian samples, and geometry or PCA-aligned variants. The mask identifies the selected patch positions and replacement fraction; calibration-derived quantities are estimated only from calibration data. Section 4 reports the layer, fraction, and control used in each replacement study.</w:t>
@@ -1644,14 +1765,16 @@
     <w:p>
       <w:pPr>
         <w:spacing w:after="100" w:line="259" w:lineRule="auto"/>
-      </w:pPr>
-      <w:r>
-        <w:t>For compression, the end-to-end Jacobian maps a patch-matrix perturbation at layer ℓ to the pre-classifier readout u defined in Section 6, not directly to Top-1 accuracy. Evaluated at the unperturbed activation, its product with a flattened perturbation predicts the readout change to first order; classification outcomes are measured by applying the actual classifier to the compressed model output. The full-J oracle uses a per-image Jacobian as an offline reference, not a deployable inference procedure. Section 6 defines the operator objective and grouping variables.</w:t>
+        <w:jc w:val="both"/>
+      </w:pPr>
+      <w:r>
+        <w:t>For compression, we use the end-to-end Jacobian to characterize how patch-matrix perturbations affect the pre-classifier readout defined in Section 6. The Jacobian provides a first-order prediction of readout changes, while classification performance is measured using the actual compressed model outputs. Section 6 introduces the per-image Full-J oracle and the corresponding carrier-optimization objective.</w:t>
       </w:r>
     </w:p>
     <w:p>
       <w:pPr>
         <w:spacing w:after="100" w:line="259" w:lineRule="auto"/>
+        <w:jc w:val="both"/>
       </w:pPr>
       <w:r>
         <w:t>Practical-carrier classifier, operator-space, and throughput procedures are described separately in Supplementary Section S13.</w:t>
@@ -1682,6 +1805,7 @@
     <w:p>
       <w:pPr>
         <w:spacing w:after="100" w:line="259" w:lineRule="auto"/>
+        <w:jc w:val="both"/>
       </w:pPr>
       <w:r>
         <w:t>Figure 2 shows a pronounced distinction between zeroing patch activations and replacing their image-specific content with calibration-derived surrogates. On DINOv2 ViT-S/14, zero replacement reduces accuracy to 60.2% at depth 5 and 4.5% at depth 9, whereas centroid replacement retains 73.2% and 74.1%, respectively. The contrast also appears at depth 8 in DeiT-Tiny (59.1% vs. 67.2%) and DeiT-Small (69.6% vs. 76.1%), and at depth 7 in ViT-B/16 AugReg (70.4% vs. 74.5%). Gaussian replacement exhibits similar preservation in several settings, achieving 75.3% accuracy on DeiT-Small at depth 8.</w:t>
@@ -1690,10 +1814,23 @@
     <w:p>
       <w:pPr>
         <w:spacing w:after="100" w:line="259" w:lineRule="auto"/>
-      </w:pPr>
+        <w:jc w:val="both"/>
+      </w:pPr>
+      <w:r>
+        <w:t xml:space="preserve">Together, these results distinguish the functional consequences of removing patch activations from those of replacing image-specific content with compatible surrogate representations. The magnitude and depth profile of this distinction vary </w:t>
+      </w:r>
       <w:r>
         <w:lastRenderedPageBreak/>
-        <w:t>Together, these results distinguish the functional consequences of removing patch activations from those of replacing image-specific content with compatible surrogate representations. The magnitude and depth profile of this distinction vary across architectures, with no common transition depth or uniformly monotonic trend across the tested models. Thus, sensitivity to zero ablation does not necessarily imply that downstream classification requires the original image-specific patch content.</w:t>
+        <w:t xml:space="preserve">across architectures, </w:t>
+      </w:r>
+      <w:r>
+        <w:t>revealing architecture-specific depth profiles</w:t>
+      </w:r>
+      <w:r>
+        <w:t xml:space="preserve">. </w:t>
+      </w:r>
+      <w:r>
+        <w:t>This contrast demonstrates that sensitivity to activation removal and dependence on original image-specific content are different properties.</w:t>
       </w:r>
     </w:p>
     <w:p>
@@ -1748,16 +1885,44 @@
       <w:pPr>
         <w:keepLines/>
         <w:spacing w:after="80"/>
-        <w:jc w:val="center"/>
-      </w:pPr>
-      <w:r>
+        <w:jc w:val="both"/>
         <w:rPr>
-          <w:i/>
+          <w:iCs/>
           <w:color w:val="4C5963"/>
-          <w:sz w:val="17"/>
+          <w:sz w:val="18"/>
+          <w:szCs w:val="24"/>
         </w:rPr>
-        <w:t>Figure 2. Depth-wise Top-1 accuracy under 25% spatial-patch replacement across four architectures. Each model uses 1,000 held-out evaluation images and a disjoint 1,000-image calibration set. Panels (a,b) show DeiT-Tiny and DeiT-Small, with calibration-derived global-mean centroids and Gaussian results averaged over five seeds. Panels (c,d) show ViT-B/16 AugReg and DINOv2 ViT-S/14, including a post hoc depth-6 follow-up, with Gaussian results averaged over three seeds. Error bars indicate sample standard deviation across Gaussian seeds; gray dashed lines indicate clean accuracy.</w:t>
-      </w:r>
+      </w:pPr>
+      <w:r>
+        <w:rPr>
+          <w:b/>
+          <w:bCs/>
+          <w:iCs/>
+          <w:color w:val="4C5963"/>
+          <w:sz w:val="18"/>
+          <w:szCs w:val="24"/>
+        </w:rPr>
+        <w:t>Figure 2.</w:t>
+      </w:r>
+      <w:r>
+        <w:rPr>
+          <w:iCs/>
+          <w:color w:val="4C5963"/>
+          <w:sz w:val="18"/>
+          <w:szCs w:val="24"/>
+        </w:rPr>
+        <w:t xml:space="preserve"> Depth-wise Top-1 accuracy under 25% spatial-patch replacement across four architectures. Each model uses 1,000 held-out evaluation images and a disjoint 1,000-image calibration set. </w:t>
+      </w:r>
+    </w:p>
+    <w:p>
+      <w:pPr>
+        <w:keepLines/>
+        <w:spacing w:after="80"/>
+        <w:jc w:val="both"/>
+        <w:rPr>
+          <w:iCs/>
+        </w:rPr>
+      </w:pPr>
     </w:p>
     <w:p>
       <w:pPr>
@@ -1773,6 +1938,7 @@
     <w:p>
       <w:pPr>
         <w:spacing w:after="100" w:line="259" w:lineRule="auto"/>
+        <w:jc w:val="both"/>
       </w:pPr>
       <w:r>
         <w:rPr>
@@ -1787,6 +1953,7 @@
     <w:p>
       <w:pPr>
         <w:spacing w:after="100" w:line="259" w:lineRule="auto"/>
+        <w:jc w:val="both"/>
       </w:pPr>
       <w:r>
         <w:rPr>
@@ -1795,16 +1962,34 @@
         <w:t>Token diversity.</w:t>
       </w:r>
       <w:r>
-        <w:t xml:space="preserve"> Under complete grouped-Gaussian replacement at Block 8, mean Top-1 rises at every tested K for DeiT-Tiny, DeiT-Small, and ViT-B/16 AugReg (Figure 3(b)). From K=1 to K=196, accuracy increases from 1.2% to 26.4%, 10.4% to 46.5%, and 3.24% to 14.58%, respectively. For ViT-B, the paired image-level endpoint gain is 11.34 percentage points (95% CI 9.55–13.13; N=1,000 paired images). This graded pattern appears in three architectures; it does not imply that every adjacent K increment is significant. K counts distinct surrogate vectors across token positions, not feature-space dimensionality.</w:t>
+        <w:t xml:space="preserve"> Under complete grouped-Gaussian replacement at Block 8, mean Top-1 rises at every tested K for DeiT-Tiny, DeiT-Small, and ViT-B/16 AugReg (Figure 3(b)). From K=1 to K=196, accuracy increases from 1.2% to 26.4%, 10.4% to 46.5%, and 3.24% to 14.58%, respectively. For ViT-B, the paired image-level endpoint gain is 11.34 percentage points (95% CI 9.55–13.13; N=1,000 paired images). </w:t>
+      </w:r>
+      <w:r>
+        <w:t>The graded response is evident across these three architectures.</w:t>
+      </w:r>
+      <w:r>
+        <w:t xml:space="preserve"> K counts distinct surrogate vectors across token positions, not feature-space dimensionality.</w:t>
       </w:r>
     </w:p>
     <w:p>
       <w:pPr>
         <w:spacing w:after="100" w:line="259" w:lineRule="auto"/>
-      </w:pPr>
-      <w:r>
-        <w:t>DINOv2 ViT-S/14 differs: Top-1 remains between 0.06% and 0.18% across K, with a paired K=1-to-256 change of −0.02 percentage points (95% CI −0.16 to 0.12; N=1,000). Its official readout includes a mean normalized-patch representation, so we report the true-class margin alongside accuracy. The mean margin changes from −9.233 to −7.982 (paired change +1.250, 95% CI 1.091–1.410; Supplementary Figure S10); this margin shift is not Top-1 recovery.</w:t>
-      </w:r>
+        <w:jc w:val="both"/>
+      </w:pPr>
+      <w:r>
+        <w:t>DINOv2 ViT-S/14 differs: Top-1 remains between 0.06% and 0.18% across K, with a paired K=1-to-256 change of −0.02 percentage points (95% CI −0.16 to 0.12; N=1,000). Its official readout includes a mean normalized-patch representation, so we report the true-class margin alongside accuracy. The mean margin changes from −9.233 to −7.982 (paired change +1.250, 95% CI 1.091–1.410; Supplementary Figure S10)</w:t>
+      </w:r>
+      <w:r>
+        <w:t xml:space="preserve">. </w:t>
+      </w:r>
+      <w:r>
+        <w:t>The improvement is evident in the margin despite Top-1 accuracy remaining near its floor.</w:t>
+      </w:r>
+    </w:p>
+    <w:p>
+      <w:pPr>
+        <w:spacing w:after="100" w:line="259" w:lineRule="auto"/>
+      </w:pPr>
     </w:p>
     <w:p>
       <w:pPr>
@@ -1859,20 +2044,64 @@
       <w:pPr>
         <w:keepLines/>
         <w:spacing w:after="80"/>
-        <w:jc w:val="center"/>
-      </w:pPr>
-      <w:r>
+        <w:jc w:val="both"/>
         <w:rPr>
-          <w:i/>
-          <w:color w:val="4C5963"/>
-          <w:sz w:val="17"/>
+          <w:b/>
+          <w:bCs/>
+          <w:iCs/>
+          <w:color w:val="auto"/>
+          <w:sz w:val="18"/>
+          <w:szCs w:val="24"/>
         </w:rPr>
-        <w:t>Figure 3. (a) Top-1 accuracy for centroid, coordinate-permuted, and sign-inverted replacement at Block 8 (50% of spatial patches) across four architectures. Coordinate-permutation bars show three-seed means ± sample SD with individual outcomes; centroid and sign-inversion are single runs. Gray dashed lines mark clean accuracy. (b) Top-1 accuracy under complete grouped-Gaussian replacement as K distinct surrogate vectors across token positions varies (196 positions for DeiT/ViT-B; 256 for DINOv2). Points show seed means ± sample SD (three seeds for DeiT; five for ViT-B/DINOv2); dashed lines mark clean accuracy. (c) Top-1 accuracy under complete replacement at Block 8 for calibration-derived PC1 and an energy-matched random one-dimensional direction. Bars show seed means with individual outcomes (five seeds for DeiT; three for ViT-B/DINOv2). DINOv2 remains near the accuracy floor (0.17% vs. 0.00%). All panels use 1,000 held-out images and disjoint 1,000-image calibration sets per architecture.</w:t>
+      </w:pPr>
+      <w:r>
+        <w:rPr>
+          <w:b/>
+          <w:bCs/>
+          <w:iCs/>
+          <w:color w:val="auto"/>
+          <w:sz w:val="18"/>
+          <w:szCs w:val="24"/>
+        </w:rPr>
+        <w:t xml:space="preserve">Figure 3. </w:t>
+      </w:r>
+      <w:r>
+        <w:rPr>
+          <w:iCs/>
+          <w:color w:val="auto"/>
+          <w:sz w:val="18"/>
+          <w:szCs w:val="24"/>
+        </w:rPr>
+        <w:t>Geometric and diversity constraints on patch-content replacement. (a) Top-1 accuracy under centroid, coordinate-permuted, and sign-inverted replacement at Block 8 (50% of patches). (b) Top-1 accuracy under complete grouped-Gaussian replacement as the number of distinct surrogate vectors K varies. (c) Top-1 accuracy under complete replacement using calibration-derived PC1 versus an energy-matched random direction. Bars and points show seed means or single-run results, with individual outcomes and sample standard deviations where displayed. Dashed lines indicate clean accuracy. All panels use 1,000 held-out images per architecture.</w:t>
       </w:r>
     </w:p>
     <w:p>
       <w:pPr>
+        <w:keepLines/>
+        <w:spacing w:after="80"/>
+        <w:jc w:val="both"/>
+        <w:rPr>
+          <w:iCs/>
+          <w:color w:val="auto"/>
+          <w:sz w:val="18"/>
+          <w:szCs w:val="24"/>
+        </w:rPr>
+      </w:pPr>
+    </w:p>
+    <w:p>
+      <w:pPr>
+        <w:keepLines/>
+        <w:spacing w:after="80"/>
+        <w:jc w:val="both"/>
+        <w:rPr>
+          <w:iCs/>
+        </w:rPr>
+      </w:pPr>
+    </w:p>
+    <w:p>
+      <w:pPr>
         <w:spacing w:after="100" w:line="259" w:lineRule="auto"/>
+        <w:jc w:val="both"/>
       </w:pPr>
       <w:r>
         <w:rPr>
@@ -1881,15 +2110,40 @@
         <w:t>PCA-aligned variation.</w:t>
       </w:r>
       <w:r>
-        <w:t xml:space="preserve"> Under complete replacement at Block 8, calibration-derived PC1 outperforms an energy-matched random one-dimensional direction in the tested settings with measurable Top-1 (Figure 3(c)): 18.64% versus 10.80% for DeiT-Tiny and 28.08% versus 20.78% for DeiT-Small (five seeds each), and 40.10% versus 6.70% for ViT-B/16 AugReg (three seeds). Figure 3(b) varies diversity across token positions by changing K, the number of distinct surrogate vectors; Figure 3(c) holds the variation one-dimensional and tests its feature-space direction. In both PC1 and random-direction conditions, independently sampled scalar coefficients allow variation across token positions. DINOv2 remains near the Top-1 floor (0.17% versus 0.00%), with mean true-class margins of −8.438 for PC1 and −8.654 for the random direction. PC1 is the leading eigenvector of centered calibration-activation covariance, not a learned model parameter. These results show that feature-space direction and token-position diversity are distinct constraints; they do not establish rank-1 sufficiency or full accuracy recovery. Together, the controls motivate the directional functional-sensitivity analysis in Section 5.1.</w:t>
+        <w:t xml:space="preserve"> Under complete replacement at Block 8, calibration-derived PC1 outperforms an energy-matched random one-dimensional direction in the tested settings with measurable Top-1 (Figure 3(c)): 18.64% versus 10.80% for DeiT-Tiny and 28.08% versus 20.78% for DeiT-Small (five seeds each), and 40.10% versus 6.70% for ViT-B/16 AugReg (three seeds). Figure 3(b) varies diversity across token positions by changing K, the number of distinct surrogate vectors; Figure 3(c) holds the variation one-dimensional and tests its feature-space direction. In both PC1 and random-direction conditions, independently sampled scalar coefficients allow variation across token positions. DINOv2 remains near the Top-1 floor (0.17% versus 0.00%), with mean true-class margins of −8.438 for PC1 and −8.654 for the random direction. PC1 is the leading eigenvector of centered calibration-activation covariance, not a learned model parameter. These results show that feature-space direction and token-position diversity are distinct constraints</w:t>
+      </w:r>
+      <w:r>
+        <w:t xml:space="preserve">. </w:t>
+      </w:r>
+      <w:r>
+        <w:t>The one-dimensional replacements nevertheless yield only partial accuracy recovery in the models with measurable Top-1 performance.</w:t>
+      </w:r>
+      <w:r>
+        <w:t xml:space="preserve"> Together, the controls motivate the directional functional-sensitivity analysis in Section 5.1.</w:t>
       </w:r>
     </w:p>
     <w:p>
       <w:pPr>
         <w:spacing w:after="100" w:line="259" w:lineRule="auto"/>
-      </w:pPr>
-      <w:r>
-        <w:t>The controlled endpoint differences are summarized in Table II.</w:t>
+        <w:jc w:val="both"/>
+      </w:pPr>
+      <w:r>
+        <w:rPr>
+          <w:b/>
+        </w:rPr>
+        <w:t xml:space="preserve">CLS–patch stream asymmetry. </w:t>
+      </w:r>
+      <w:r>
+        <w:t xml:space="preserve">We tested a complementary Block-8 control in DeiT-Tiny and DeiT-Small (1,000 held-out images per model). Replacing the CLS activation with its calibration mean, while leaving all 196 spatial patches unchanged, retained 66.4% and 74.8% Top-1 accuracy, compared with clean baselines of 67.9% and 76.1%. Conversely, retaining the original CLS while replacing every patch with an identical calibration centroid reduced accuracy to 10.2% and 17.0%. Thus, the original image-specific CLS activation is not required for near-baseline classification when the patch stream remains intact, whereas preserving CLS does not prevent degradation under this complete patch intervention. These interventions differ in scale (one versus 196 tokens), and identical-centroid replacement also eliminates patch-token diversity. </w:t>
+      </w:r>
+      <w:r>
+        <w:t>This exploratory comparison characterizes conditional CLS–patch asymmetry, while the role of information transfer and CLS sufficiency remains unresolved</w:t>
+      </w:r>
+      <w:r>
+        <w:t xml:space="preserve"> </w:t>
+      </w:r>
+      <w:r>
+        <w:t>(Supplementary Section S4).</w:t>
       </w:r>
     </w:p>
     <w:p>
@@ -1897,23 +2151,47 @@
         <w:spacing w:after="100" w:line="259" w:lineRule="auto"/>
       </w:pPr>
       <w:r>
-        <w:t>TABLE II</w:t>
+        <w:t xml:space="preserve">The controlled endpoint differences are summarized in Table </w:t>
+      </w:r>
+      <w:r>
+        <w:t>2</w:t>
+      </w:r>
+      <w:r>
+        <w:t>.</w:t>
       </w:r>
     </w:p>
     <w:p>
       <w:pPr>
+        <w:keepNext/>
         <w:spacing w:after="100" w:line="259" w:lineRule="auto"/>
-      </w:pPr>
-      <w:r>
-        <w:t>CONTROLLED PATCH-CONTENT REPLACEMENT EFFECTS ACROSS ARCHITECTURES</w:t>
+        <w:rPr>
+          <w:b/>
+          <w:bCs/>
+        </w:rPr>
+      </w:pPr>
+      <w:r>
+        <w:rPr>
+          <w:b/>
+          <w:bCs/>
+        </w:rPr>
+        <w:lastRenderedPageBreak/>
+        <w:t>Table 2.</w:t>
       </w:r>
     </w:p>
     <w:p>
       <w:pPr>
         <w:keepNext/>
         <w:spacing w:after="100" w:line="259" w:lineRule="auto"/>
-      </w:pPr>
-      <w:r>
+        <w:rPr>
+          <w:sz w:val="18"/>
+          <w:szCs w:val="20"/>
+        </w:rPr>
+      </w:pPr>
+      <w:r>
+        <w:rPr>
+          <w:sz w:val="18"/>
+          <w:szCs w:val="20"/>
+        </w:rPr>
         <w:t>Top-1 differences in percentage points; each contrast is first condition minus second condition. Positive values favor the first condition. Columns summarize distinct protocols, not a common treatment effect.</w:t>
       </w:r>
     </w:p>
@@ -2418,7 +2696,6 @@
               <w:rPr>
                 <w:szCs w:val="32"/>
               </w:rPr>
-              <w:lastRenderedPageBreak/>
               <w:t>ViT-B/16 AugReg</w:t>
             </w:r>
           </w:p>
@@ -2681,15 +2958,33 @@
     </w:tbl>
     <w:p>
       <w:pPr>
-        <w:spacing w:after="20"/>
-      </w:pPr>
-    </w:p>
-    <w:p>
-      <w:pPr>
         <w:spacing w:after="100" w:line="259" w:lineRule="auto"/>
-      </w:pPr>
-      <w:r>
-        <w:t>Note (Table II). All interventions are at Block 8. Geometry contrasts replace 50% of spatial patches; coordinate-permutation values are three-seed means, while centroid and sign-inversion endpoints are single runs. Grouped-K and PC1/random contrasts replace all spatial patches; Kmax is 196 for DeiT/ViT-B and 256 for DINOv2. Grouped-K uses three seeds for DeiT and five for ViT-B/DINOv2; PC1/random uses five seeds for DeiT and three for ViT-B/DINOv2. Each architecture uses N=1,000 held-out images and a disjoint N=1,000 calibration cohort. DINOv2 remains near the Top-1 floor for both complete-replacement contrasts; its +0.17 pp PC1 contrast is not meaningful accuracy recovery. See Figure 3 and the source-linked calculations in the validation script for protocol-level values.</w:t>
+        <w:jc w:val="both"/>
+        <w:rPr>
+          <w:sz w:val="18"/>
+          <w:szCs w:val="20"/>
+        </w:rPr>
+      </w:pPr>
+      <w:r>
+        <w:rPr>
+          <w:sz w:val="18"/>
+          <w:szCs w:val="20"/>
+        </w:rPr>
+        <w:t>Not</w:t>
+      </w:r>
+      <w:r>
+        <w:rPr>
+          <w:sz w:val="18"/>
+          <w:szCs w:val="20"/>
+        </w:rPr>
+        <w:t>e:</w:t>
+      </w:r>
+      <w:r>
+        <w:rPr>
+          <w:sz w:val="18"/>
+          <w:szCs w:val="20"/>
+        </w:rPr>
+        <w:t xml:space="preserve"> All interventions are at Block 8. Geometry contrasts replace 50% of spatial patches; coordinate-permutation values are three-seed means, while centroid and sign-inversion endpoints are single runs. Grouped-K and PC1/random contrasts replace all spatial patches; Kmax is 196 for DeiT/ViT-B and 256 for DINOv2. Grouped-K uses three seeds for DeiT and five for ViT-B/DINOv2; PC1/random uses five seeds for DeiT and three for ViT-B/DINOv2. Each architecture uses N=1,000 held-out images and a disjoint N=1,000 calibration cohort. DINOv2 remains near the Top-1 floor for both complete-replacement contrasts; its +0.17 pp PC1 contrast is not meaningful accuracy recovery. See Figure 3 and the source-linked calculations in the validation script for protocol-level values.</w:t>
       </w:r>
     </w:p>
     <w:p>
@@ -2717,6 +3012,7 @@
     <w:p>
       <w:pPr>
         <w:spacing w:after="100" w:line="259" w:lineRule="auto"/>
+        <w:jc w:val="both"/>
       </w:pPr>
       <w:r>
         <w:t xml:space="preserve">Equal-norm feature perturbations can have different functional effects because margin sensitivity depends on direction. For image </w:t>
@@ -3527,6 +3823,7 @@
       <w:pPr>
         <w:keepLines/>
         <w:spacing w:after="100" w:line="259" w:lineRule="auto"/>
+        <w:jc w:val="both"/>
       </w:pPr>
       <w:r>
         <w:t>As defined in Section 3, N</w:t>
@@ -3958,137 +4255,75 @@
       <w:pPr>
         <w:keepLines/>
         <w:spacing w:after="80"/>
-        <w:jc w:val="center"/>
-      </w:pPr>
-      <w:r>
+        <w:jc w:val="both"/>
         <w:rPr>
-          <w:i/>
-          <w:color w:val="4C5963"/>
-          <w:sz w:val="17"/>
+          <w:iCs/>
+          <w:color w:val="auto"/>
+          <w:sz w:val="18"/>
+          <w:szCs w:val="18"/>
         </w:rPr>
-        <w:t xml:space="preserve">Figure 4. (a) Ratio of squared-margin sensitivity along the leading-variance PC to that along the lowest-variance PC at depths 5, 7, 8, and 10; color encodes the ratio on a log scale, with values above 1 indicating greater sensitivity along PC1. PCs come from centered calibration-activation covariance. (b) Fraction of </w:t>
-      </w:r>
-      <m:oMath>
-        <m:sSub>
-          <m:sSubPr>
-            <m:ctrlPr>
-              <w:rPr>
-                <w:rFonts w:ascii="Cambria Math" w:hAnsi="Cambria Math"/>
-              </w:rPr>
-            </m:ctrlPr>
-          </m:sSubPr>
-          <m:e>
-            <m:r>
-              <w:rPr>
-                <w:rFonts w:ascii="Cambria Math" w:hAnsi="Cambria Math"/>
-              </w:rPr>
-              <m:t>M</m:t>
-            </m:r>
-          </m:e>
-          <m:sub>
-            <m:r>
-              <m:rPr>
-                <m:scr m:val="script"/>
-              </m:rPr>
-              <w:rPr>
-                <w:rFonts w:ascii="Cambria Math" w:hAnsi="Cambria Math"/>
-              </w:rPr>
-              <m:t>l</m:t>
-            </m:r>
-          </m:sub>
-        </m:sSub>
-      </m:oMath>
+      </w:pPr>
       <w:r>
         <w:rPr>
-          <w:i/>
-          <w:color w:val="4C5963"/>
-          <w:sz w:val="17"/>
+          <w:b/>
+          <w:bCs/>
+          <w:iCs/>
+          <w:color w:val="auto"/>
+          <w:sz w:val="18"/>
+          <w:szCs w:val="18"/>
         </w:rPr>
-        <w:t xml:space="preserve"> eigenvalues at or below </w:t>
-      </w:r>
-      <m:oMath>
-        <m:sSup>
-          <m:sSupPr>
-            <m:ctrlPr>
-              <w:rPr>
-                <w:rFonts w:ascii="Cambria Math" w:hAnsi="Cambria Math"/>
-              </w:rPr>
-            </m:ctrlPr>
-          </m:sSupPr>
-          <m:e>
-            <m:r>
-              <w:rPr>
-                <w:rFonts w:ascii="Cambria Math" w:hAnsi="Cambria Math"/>
-              </w:rPr>
-              <m:t>10</m:t>
-            </m:r>
-          </m:e>
-          <m:sup>
-            <m:r>
-              <w:rPr>
-                <w:rFonts w:ascii="Cambria Math" w:hAnsi="Cambria Math"/>
-              </w:rPr>
-              <m:t>-3</m:t>
-            </m:r>
-          </m:sup>
-        </m:sSup>
-        <m:sSub>
-          <m:sSubPr>
-            <m:ctrlPr>
-              <w:rPr>
-                <w:rFonts w:ascii="Cambria Math" w:hAnsi="Cambria Math"/>
-              </w:rPr>
-            </m:ctrlPr>
-          </m:sSubPr>
-          <m:e>
-            <m:r>
-              <w:rPr>
-                <w:rFonts w:ascii="Cambria Math" w:hAnsi="Cambria Math"/>
-              </w:rPr>
-              <m:t>λ</m:t>
-            </m:r>
-          </m:e>
-          <m:sub>
-            <m:r>
-              <w:rPr>
-                <w:rFonts w:ascii="Cambria Math" w:hAnsi="Cambria Math"/>
-              </w:rPr>
-              <m:t>max</m:t>
-            </m:r>
-          </m:sub>
-        </m:sSub>
-      </m:oMath>
+        <w:t>Figure 4.</w:t>
+      </w:r>
       <w:r>
         <w:rPr>
-          <w:i/>
-          <w:color w:val="4C5963"/>
-          <w:sz w:val="17"/>
+          <w:iCs/>
+          <w:color w:val="auto"/>
+          <w:sz w:val="18"/>
+          <w:szCs w:val="18"/>
         </w:rPr>
-        <w:t xml:space="preserve"> across depth. Each architecture uses the same </w:t>
-      </w:r>
-      <m:oMath>
-        <m:r>
-          <w:rPr>
-            <w:rFonts w:ascii="Cambria Math" w:hAnsi="Cambria Math"/>
-          </w:rPr>
-          <m:t>N=100</m:t>
-        </m:r>
-      </m:oMath>
+        <w:t xml:space="preserve"> </w:t>
+      </w:r>
       <w:r>
         <w:rPr>
-          <w:i/>
-          <w:color w:val="4C5963"/>
-          <w:sz w:val="17"/>
+          <w:iCs/>
+          <w:color w:val="auto"/>
+          <w:sz w:val="18"/>
+          <w:szCs w:val="18"/>
         </w:rPr>
-        <w:t>-image calibration cohort. DINOv2 sensitivities use its official linear classifier on the concatenated normalized CLS and mean-patch readout. The lowest-variance covariance direction is weakly separated in ViT-B, so its ratio is a cohort-level directional estimate.</w:t>
+        <w:t>Depth-dependent functional sensitivity and near-null structure. (a) Ratio of squared-margin sensitivity along the highest- and lowest-variance principal components across depths 5, 7, 8, and 10. Values above 1 indicate greater sensitivity along PC1. (b) Fraction of eigenvalues of Mℓ below the relative threshold 10⁻³λmax across depth. Results use 100 calibration images per architecture.</w:t>
       </w:r>
     </w:p>
     <w:p>
       <w:pPr>
+        <w:keepLines/>
+        <w:spacing w:after="80"/>
+        <w:jc w:val="both"/>
+        <w:rPr>
+          <w:iCs/>
+          <w:color w:val="auto"/>
+          <w:sz w:val="18"/>
+          <w:szCs w:val="18"/>
+        </w:rPr>
+      </w:pPr>
+    </w:p>
+    <w:p>
+      <w:pPr>
+        <w:keepLines/>
+        <w:spacing w:after="80"/>
+        <w:jc w:val="both"/>
+        <w:rPr>
+          <w:iCs/>
+          <w:color w:val="auto"/>
+          <w:szCs w:val="20"/>
+        </w:rPr>
+      </w:pPr>
+    </w:p>
+    <w:p>
+      <w:pPr>
         <w:spacing w:after="100" w:line="259" w:lineRule="auto"/>
-      </w:pPr>
-      <w:r>
-        <w:lastRenderedPageBreak/>
+        <w:jc w:val="both"/>
+      </w:pPr>
+      <w:r>
         <w:t xml:space="preserve">At depth 8, the ViT-B PCbottom direction is especially uncertain because its covariance eigengap is only </w:t>
       </w:r>
       <m:oMath>
@@ -4131,6 +4366,7 @@
     <w:p>
       <w:pPr>
         <w:spacing w:after="100" w:line="259" w:lineRule="auto"/>
+        <w:jc w:val="both"/>
       </w:pPr>
       <w:r>
         <w:t xml:space="preserve">The entropy-based effective rank of </w:t>
@@ -4177,7 +4413,13 @@
         </m:r>
       </m:oMath>
       <w:r>
-        <w:t xml:space="preserve">, is compared across depths 5–10 in Table III. At the operational near-null cutoff </w:t>
+        <w:t xml:space="preserve">, is compared across depths 5–10 in Table </w:t>
+      </w:r>
+      <w:r>
+        <w:t>3</w:t>
+      </w:r>
+      <w:r>
+        <w:t xml:space="preserve">. At the operational near-null cutoff </w:t>
       </w:r>
       <m:oMath>
         <m:sSub>
@@ -4324,33 +4566,57 @@
     <w:p>
       <w:pPr>
         <w:spacing w:after="100" w:line="259" w:lineRule="auto"/>
-      </w:pPr>
-      <w:r>
-        <w:t>Near-null expansion at the primary cutoff is architecture-dependent and small for DINOv2. The ViT-B PCbottom ratio depends on a direction with a small covariance eigengap. These depth-wise associations are consistent with increasing late-layer fungibility in several models but do not establish an exact nonlinear invariance subspace or a causal explanation.</w:t>
+        <w:jc w:val="both"/>
+      </w:pPr>
+      <w:r>
+        <w:t xml:space="preserve">Near-null expansion at the primary cutoff is architecture-dependent and small for DINOv2. The ViT-B PCbottom ratio depends on a direction with a small covariance eigengap. </w:t>
+      </w:r>
+      <w:r>
+        <w:t>These depth-wise associations connect late-layer fungibility with changes in local functional sensitivity, motivating the transmission analyses that follow.</w:t>
       </w:r>
     </w:p>
     <w:p>
       <w:pPr>
         <w:spacing w:after="100" w:line="259" w:lineRule="auto"/>
       </w:pPr>
-      <w:r>
-        <w:t>TABLE III</w:t>
-      </w:r>
     </w:p>
     <w:p>
       <w:pPr>
         <w:spacing w:after="100" w:line="259" w:lineRule="auto"/>
-      </w:pPr>
-      <w:r>
-        <w:t>DEPTH EVOLUTION OF FUNCTIONAL SENSITIVITY ACROSS ARCHITECTURES</w:t>
+        <w:rPr>
+          <w:b/>
+          <w:bCs/>
+        </w:rPr>
+      </w:pPr>
+      <w:r>
+        <w:rPr>
+          <w:b/>
+          <w:bCs/>
+        </w:rPr>
+        <w:t>T</w:t>
+      </w:r>
+      <w:r>
+        <w:rPr>
+          <w:b/>
+          <w:bCs/>
+        </w:rPr>
+        <w:t>able 3</w:t>
       </w:r>
     </w:p>
     <w:p>
       <w:pPr>
         <w:keepNext/>
         <w:spacing w:after="100" w:line="259" w:lineRule="auto"/>
-      </w:pPr>
-      <w:r>
+        <w:rPr>
+          <w:sz w:val="18"/>
+          <w:szCs w:val="20"/>
+        </w:rPr>
+      </w:pPr>
+      <w:r>
+        <w:rPr>
+          <w:sz w:val="18"/>
+          <w:szCs w:val="20"/>
+        </w:rPr>
         <w:t xml:space="preserve">The empirical margin-gradient metric Mℓ and its depth-dependent spectrum. Normalized effective rank is dimensionless; near-null eigenvalues satisfy λk ≤ </w:t>
       </w:r>
       <m:oMath>
@@ -4359,6 +4625,8 @@
             <m:ctrlPr>
               <w:rPr>
                 <w:rFonts w:ascii="Cambria Math" w:hAnsi="Cambria Math"/>
+                <w:sz w:val="18"/>
+                <w:szCs w:val="20"/>
               </w:rPr>
             </m:ctrlPr>
           </m:sSupPr>
@@ -4366,6 +4634,8 @@
             <m:r>
               <w:rPr>
                 <w:rFonts w:ascii="Cambria Math" w:hAnsi="Cambria Math"/>
+                <w:sz w:val="18"/>
+                <w:szCs w:val="20"/>
               </w:rPr>
               <m:t>10</m:t>
             </m:r>
@@ -4374,6 +4644,8 @@
             <m:r>
               <w:rPr>
                 <w:rFonts w:ascii="Cambria Math" w:hAnsi="Cambria Math"/>
+                <w:sz w:val="18"/>
+                <w:szCs w:val="20"/>
               </w:rPr>
               <m:t>-3</m:t>
             </m:r>
@@ -4381,6 +4653,10 @@
         </m:sSup>
       </m:oMath>
       <w:r>
+        <w:rPr>
+          <w:sz w:val="18"/>
+          <w:szCs w:val="20"/>
+        </w:rPr>
         <w:t xml:space="preserve"> λmax, an operational cutoff rather than an exact nonlinear nullspace criterion.</w:t>
       </w:r>
     </w:p>
@@ -5011,13 +5287,20 @@
       <w:pPr>
         <w:spacing w:after="100" w:line="259" w:lineRule="auto"/>
       </w:pPr>
-      <w:r>
-        <w:t>Mℓ is the empirical uncentered second moment of clean predicted-class margin gradients over patch positions and N=100 calibration images/model; positions are aggregated within images. Normalized effective rank divides the entropy-based effective rank by feature dimension D, so it is dimensionless. Mℓ is distinct from the full token-by-feature downstream readout Jacobian Gram matrix. DINOv2 near-null growth is small at the primary threshold. †The ViT-B PCbottom-based ratio is sensitive to a small depth-8 activation-covariance eigengap. Ratios describe the selected sample directions and are not a universal ranking of PCA directions.</w:t>
-      </w:r>
     </w:p>
     <w:p>
       <w:pPr>
         <w:spacing w:after="100" w:line="259" w:lineRule="auto"/>
+        <w:jc w:val="both"/>
+      </w:pPr>
+      <w:r>
+        <w:t>Mℓ is the empirical uncentered second moment of clean predicted-class margin gradients over patch positions and N=100 calibration images/model; positions are aggregated within images. Normalized effective rank divides the entropy-based effective rank by feature dimension D, so it is dimensionless. Mℓ is distinct from the full token-by-feature downstream readout Jacobian Gram matrix. DINOv2 near-null growth is small at the primary threshold. The ViT-B PCbottom-based ratio is sensitive to a small depth-8 activation-covariance eigengap. Ratios describe the selected sample directions and are not a universal ranking of PCA directions.</w:t>
+      </w:r>
+    </w:p>
+    <w:p>
+      <w:pPr>
+        <w:spacing w:after="100" w:line="259" w:lineRule="auto"/>
+        <w:jc w:val="both"/>
       </w:pPr>
       <w:r>
         <w:t xml:space="preserve">The spectra, cutoff sensitivity, directional sensitivities, normalized effective ranks, and positive-semidefinite checks are reported in Supplementary Table S2. Because </w:t>
@@ -5070,6 +5353,7 @@
     <w:p>
       <w:pPr>
         <w:spacing w:after="100" w:line="259" w:lineRule="auto"/>
+        <w:jc w:val="both"/>
       </w:pPr>
       <w:r>
         <w:t xml:space="preserve">Across the four architectures, the frozen-attention condition reproduces nearly all of the full-perturbation immediate readout-change magnitude for coherent perturbations: frozen/full ratios are 97.4% for DeiT-Small (Block 8), 99.4% for ViT-B/16 AugReg (Block 7), 100.1% for DeiT-Tiny (Block 8), and 100.8% for DINOv2 ViT-S/14 (Block 8). Random-sign and checkerboard patterns produce smaller absolute changes in both conditions, although their relative agreement varies by model; for example, the frozen/full ratio is 98.3% for DINOv2 random-sign perturbations but 70.7% for its checkerboard pattern, and 48.1% for DeiT-Tiny checkerboard. Full perturbation changes </w:t>
@@ -5138,12 +5422,16 @@
         </m:r>
       </m:oMath>
       <w:r>
-        <w:t xml:space="preserve"> and the residual, so its difference from the full condition is not a pure Value-only causal effect or an additive attribution.</w:t>
+        <w:t xml:space="preserve"> and the residual, </w:t>
+      </w:r>
+      <w:r>
+        <w:t>making the contrast a measure of joint Value-and-residual transmission under frozen attention.</w:t>
       </w:r>
     </w:p>
     <w:p>
       <w:pPr>
         <w:spacing w:after="100" w:line="259" w:lineRule="auto"/>
+        <w:jc w:val="both"/>
       </w:pPr>
       <w:r>
         <w:t xml:space="preserve">The primary projection-path audit remains limited to DeiT-Small and ViT-B/16 AugReg and is reported separately in Supplementary Figure S12. With the residual stream clean, the V-only immediate-readout norm is 97.4% and 99.4% of the corresponding </w:t>
@@ -5168,7 +5456,17 @@
         </m:r>
       </m:oMath>
       <w:r>
-        <w:t xml:space="preserve"> is the denominator, distinct from the full-perturbation denominator above. A separate signed true-class logit-drop contrast ratio, computed as the coherent-minus-random-sign contrast under frozen-attention V-only with the residual perturbed divided by the corresponding full-perturbation contrast, is 70.8% for DeiT-Small and 102.2% for ViT-B/16 AugReg (Supplementary Table S4). These ratios compare separately defined interventions and are not additive causal shares. Signed-logit outcomes for the reduced DeiT-Tiny and DINOv2 replications are reported separately in Supplementary Figure S11; Figure 5 uses the immediate-readout norm for every architecture.</w:t>
+        <w:t xml:space="preserve"> is the denominator, distinct from the full-perturbation denominator above. A separate signed true-class logit-drop contrast ratio, computed as the coherent-minus-random-sign contrast under frozen-attention V-only with the residual perturbed divided by the corresponding full-perturbation contrast, is 70.8% for DeiT-Small and 102.2% for ViT-B/16 AugReg (Supplementary Table S4). </w:t>
+      </w:r>
+      <w:r>
+        <w:t>These ratios quantify contrasts between separately defined interventions and are interpreted as comparative transmission measurements.</w:t>
+      </w:r>
+      <w:r>
+        <w:t xml:space="preserve"> Signed-logit outcomes for </w:t>
+      </w:r>
+      <w:r>
+        <w:lastRenderedPageBreak/>
+        <w:t>the reduced DeiT-Tiny and DINOv2 replications are reported separately in Supplementary Figure S11; Figure 5 uses the immediate-readout norm for every architecture.</w:t>
       </w:r>
     </w:p>
     <w:p>
@@ -5182,7 +5480,6 @@
         <w:rPr>
           <w:noProof/>
         </w:rPr>
-        <w:lastRenderedPageBreak/>
         <w:drawing>
           <wp:inline distT="0" distB="0" distL="0" distR="0" wp14:anchorId="21C71948" wp14:editId="6E21B0E7">
             <wp:extent cx="6172200" cy="4375764"/>
@@ -5224,119 +5521,65 @@
       <w:pPr>
         <w:keepLines/>
         <w:spacing w:after="80"/>
-        <w:jc w:val="center"/>
-      </w:pPr>
-      <w:r>
+        <w:jc w:val="both"/>
         <w:rPr>
-          <w:i/>
-          <w:color w:val="4C5963"/>
-          <w:sz w:val="17"/>
+          <w:iCs/>
+          <w:color w:val="auto"/>
+          <w:sz w:val="18"/>
+          <w:szCs w:val="18"/>
         </w:rPr>
-        <w:t xml:space="preserve">Figure 5. Mean per-image Euclidean </w:t>
-      </w:r>
-      <m:oMath>
-        <m:sSub>
-          <m:sSubPr>
-            <m:ctrlPr>
-              <w:rPr>
-                <w:rFonts w:ascii="Cambria Math" w:hAnsi="Cambria Math"/>
-              </w:rPr>
-            </m:ctrlPr>
-          </m:sSubPr>
-          <m:e>
-            <m:r>
-              <w:rPr>
-                <w:rFonts w:ascii="Cambria Math" w:hAnsi="Cambria Math"/>
-              </w:rPr>
-              <m:t>L</m:t>
-            </m:r>
-          </m:e>
-          <m:sub>
-            <m:r>
-              <w:rPr>
-                <w:rFonts w:ascii="Cambria Math" w:hAnsi="Cambria Math"/>
-              </w:rPr>
-              <m:t>2</m:t>
-            </m:r>
-          </m:sub>
-        </m:sSub>
-      </m:oMath>
+      </w:pPr>
       <w:r>
         <w:rPr>
-          <w:i/>
-          <w:color w:val="4C5963"/>
-          <w:sz w:val="17"/>
+          <w:b/>
+          <w:bCs/>
+          <w:iCs/>
+          <w:color w:val="auto"/>
+          <w:sz w:val="18"/>
+          <w:szCs w:val="18"/>
         </w:rPr>
-        <w:t xml:space="preserve"> change in the immediate readout under full perturbation and frozen-attention V-only with perturbed residual: (a) DeiT-Small, Block 8; (b) ViT-B/16 AugReg, Block 7; (c) DeiT-Tiny, Block 8; and (d) DINOv2 ViT-S/14, Block 8. Each panel shows coherent, random-sign, and checkerboard patterns in that order and uses its own y-axis scale. Full perturbation changes </w:t>
-      </w:r>
-      <m:oMath>
-        <m:r>
-          <w:rPr>
-            <w:rFonts w:ascii="Cambria Math" w:hAnsi="Cambria Math"/>
-          </w:rPr>
-          <m:t>Q,K,V</m:t>
-        </m:r>
-      </m:oMath>
+        <w:t xml:space="preserve">Figure 5. </w:t>
+      </w:r>
       <w:r>
         <w:rPr>
-          <w:i/>
-          <w:color w:val="4C5963"/>
-          <w:sz w:val="17"/>
+          <w:iCs/>
+          <w:color w:val="auto"/>
+          <w:sz w:val="18"/>
+          <w:szCs w:val="18"/>
         </w:rPr>
-        <w:t xml:space="preserve"> and the residual and recomputes attention; frozen attention keeps clean </w:t>
-      </w:r>
-      <m:oMath>
-        <m:r>
-          <w:rPr>
-            <w:rFonts w:ascii="Cambria Math" w:hAnsi="Cambria Math"/>
-          </w:rPr>
-          <m:t>Q,K,A</m:t>
-        </m:r>
-      </m:oMath>
-      <w:r>
-        <w:rPr>
-          <w:i/>
-          <w:color w:val="4C5963"/>
-          <w:sz w:val="17"/>
-        </w:rPr>
-        <w:t xml:space="preserve"> and perturbs </w:t>
-      </w:r>
-      <m:oMath>
-        <m:r>
-          <w:rPr>
-            <w:rFonts w:ascii="Cambria Math" w:hAnsi="Cambria Math"/>
-          </w:rPr>
-          <m:t>V</m:t>
-        </m:r>
-      </m:oMath>
-      <w:r>
-        <w:rPr>
-          <w:i/>
-          <w:color w:val="4C5963"/>
-          <w:sz w:val="17"/>
-        </w:rPr>
-        <w:t xml:space="preserve"> and the residual. Bars are means over </w:t>
-      </w:r>
-      <m:oMath>
-        <m:r>
-          <w:rPr>
-            <w:rFonts w:ascii="Cambria Math" w:hAnsi="Cambria Math"/>
-          </w:rPr>
-          <m:t>N=100</m:t>
-        </m:r>
-      </m:oMath>
-      <w:r>
-        <w:rPr>
-          <w:i/>
-          <w:color w:val="4C5963"/>
-          <w:sz w:val="17"/>
-        </w:rPr>
-        <w:t xml:space="preserve"> outcome images. Panels (c,d) are reduced replications, not full Q/K/V decompositions. DINOv2’s immediate-readout vector concatenates the CLS and mean-patch representations; the other models use the CLS representation.</w:t>
+        <w:t>Coherent accumulation and sign-dependent cancellation under attention perturbations. Mean immediate-readout L₂ change for coherent, random-sign, and checkerboard perturbations under full perturbation versus frozen attention with perturbed Value projections and residual stream. (a) DeiT-Small, Block 8; (b) ViT-B/16 AugReg, Block 7; (c) DeiT-Tiny, Block 8; (d) DINOv2 ViT-S/14, Block 8. Each panel uses 100 images and its own vertical scale. Panels (c,d) are reduced replications.</w:t>
       </w:r>
     </w:p>
     <w:p>
       <w:pPr>
+        <w:keepLines/>
+        <w:spacing w:after="80"/>
+        <w:jc w:val="both"/>
+        <w:rPr>
+          <w:iCs/>
+          <w:color w:val="auto"/>
+          <w:sz w:val="18"/>
+          <w:szCs w:val="18"/>
+        </w:rPr>
+      </w:pPr>
+    </w:p>
+    <w:p>
+      <w:pPr>
+        <w:keepLines/>
+        <w:spacing w:after="80"/>
+        <w:jc w:val="both"/>
+        <w:rPr>
+          <w:iCs/>
+          <w:color w:val="auto"/>
+          <w:sz w:val="18"/>
+          <w:szCs w:val="18"/>
+        </w:rPr>
+      </w:pPr>
+    </w:p>
+    <w:p>
+      <w:pPr>
         <w:spacing w:after="100" w:line="259" w:lineRule="auto"/>
+        <w:jc w:val="both"/>
       </w:pPr>
       <w:r>
         <w:t xml:space="preserve">For one image, let </w:t>
@@ -5873,6 +6116,7 @@
     <w:p>
       <w:pPr>
         <w:spacing w:after="100" w:line="259" w:lineRule="auto"/>
+        <w:jc w:val="both"/>
       </w:pPr>
       <w:r>
         <w:t xml:space="preserve">Here </w:t>
@@ -5975,6 +6219,7 @@
     <w:p>
       <w:pPr>
         <w:spacing w:after="100" w:line="259" w:lineRule="auto"/>
+        <w:jc w:val="both"/>
       </w:pPr>
       <w:r>
         <w:rPr>
@@ -6405,6 +6650,7 @@
     <w:p>
       <w:pPr>
         <w:spacing w:after="100" w:line="259" w:lineRule="auto"/>
+        <w:jc w:val="both"/>
       </w:pPr>
       <w:r>
         <w:t xml:space="preserve">Here </w:t>
@@ -6530,11 +6776,7 @@
         </m:sSub>
       </m:oMath>
       <w:r>
-        <w:t xml:space="preserve"> is the sample covariance of all patch activations pooled across </w:t>
-      </w:r>
-      <w:r>
-        <w:lastRenderedPageBreak/>
-        <w:t xml:space="preserve">calibration images and spatial positions and centered by their pooled feature mean (with denominator </w:t>
+        <w:t xml:space="preserve"> is the sample covariance of all patch activations pooled across calibration images and spatial positions and centered by their pooled feature mean (with denominator </w:t>
       </w:r>
       <m:oMath>
         <m:sSub>
@@ -6645,6 +6887,7 @@
     <w:p>
       <w:pPr>
         <w:spacing w:after="100" w:line="259" w:lineRule="auto"/>
+        <w:jc w:val="both"/>
       </w:pPr>
       <w:r>
         <w:t xml:space="preserve">Sections 5.1 and 5.2 establish complementary feature-direction and token-coherence effects; Equation (4) combines these factors under a matched Frobenius perturbation norm. Figure 6 displays the mean per-image final-logit </w:t>
@@ -6694,91 +6937,20 @@
     <w:p>
       <w:pPr>
         <w:spacing w:after="100" w:line="259" w:lineRule="auto"/>
+        <w:jc w:val="both"/>
       </w:pPr>
       <w:r>
         <w:t xml:space="preserve">The </w:t>
       </w:r>
-      <m:oMath>
-        <m:r>
-          <w:rPr>
-            <w:rFonts w:ascii="Cambria Math" w:hAnsi="Cambria Math"/>
-          </w:rPr>
-          <m:t>texttt{jac</m:t>
-        </m:r>
-        <m:sSub>
-          <m:sSubPr>
-            <m:ctrlPr>
-              <w:rPr>
-                <w:rFonts w:ascii="Cambria Math" w:hAnsi="Cambria Math"/>
-              </w:rPr>
-            </m:ctrlPr>
-          </m:sSubPr>
-          <m:e>
-            <m:r>
-              <w:rPr>
-                <w:rFonts w:ascii="Cambria Math" w:hAnsi="Cambria Math"/>
-              </w:rPr>
-              <m:t>\</m:t>
-            </m:r>
-          </m:e>
-          <m:sub>
-            <m:r>
-              <w:rPr>
-                <w:rFonts w:ascii="Cambria Math" w:hAnsi="Cambria Math"/>
-              </w:rPr>
-              <m:t>t</m:t>
-            </m:r>
-          </m:sub>
-        </m:sSub>
-        <m:r>
-          <w:rPr>
-            <w:rFonts w:ascii="Cambria Math" w:hAnsi="Cambria Math"/>
-          </w:rPr>
-          <m:t xml:space="preserve"> op}</m:t>
-        </m:r>
-      </m:oMath>
+      <w:r>
+        <w:t>jac_top</w:t>
+      </w:r>
       <w:r>
         <w:t xml:space="preserve"> and </w:t>
       </w:r>
-      <m:oMath>
-        <m:r>
-          <w:rPr>
-            <w:rFonts w:ascii="Cambria Math" w:hAnsi="Cambria Math"/>
-          </w:rPr>
-          <m:t>texttt{jac</m:t>
-        </m:r>
-        <m:sSub>
-          <m:sSubPr>
-            <m:ctrlPr>
-              <w:rPr>
-                <w:rFonts w:ascii="Cambria Math" w:hAnsi="Cambria Math"/>
-              </w:rPr>
-            </m:ctrlPr>
-          </m:sSubPr>
-          <m:e>
-            <m:r>
-              <w:rPr>
-                <w:rFonts w:ascii="Cambria Math" w:hAnsi="Cambria Math"/>
-              </w:rPr>
-              <m:t>\</m:t>
-            </m:r>
-          </m:e>
-          <m:sub>
-            <m:r>
-              <w:rPr>
-                <w:rFonts w:ascii="Cambria Math" w:hAnsi="Cambria Math"/>
-              </w:rPr>
-              <m:t>n</m:t>
-            </m:r>
-          </m:sub>
-        </m:sSub>
-        <m:r>
-          <w:rPr>
-            <w:rFonts w:ascii="Cambria Math" w:hAnsi="Cambria Math"/>
-          </w:rPr>
-          <m:t xml:space="preserve"> ull}</m:t>
-        </m:r>
-      </m:oMath>
+      <w:r>
+        <w:t>jac_null</w:t>
+      </w:r>
       <w:r>
         <w:t xml:space="preserve"> directions are selected using the joint-stream protocol’s mean per-image patch-margin-gradient second-moment matrix. They are protocol-specific local feature directions: this estimate is distinct from </w:t>
       </w:r>
@@ -6863,7 +7035,13 @@
         </m:r>
       </m:oMath>
       <w:r>
-        <w:t xml:space="preserve"> calibration images are used to estimate the directions and score outcomes, so the heatmaps are descriptive within-cohort summaries, not held-out generalization estimates. Responses vary across both pattern and direction, but the full direction-by-pattern regression is saturated and has no residual degrees of freedom; it therefore supports no inferential significance claim.</w:t>
+        <w:t xml:space="preserve"> calibration images are used to estimate the directions and score outcomes, </w:t>
+      </w:r>
+      <w:r>
+        <w:t>yielding descriptive within-cohort estimates of the pattern–direction response.</w:t>
+      </w:r>
+      <w:r>
+        <w:t xml:space="preserve"> Responses vary across both pattern and direction, but the full direction-by-pattern regression is saturated and has no residual degrees of freedom; it therefore supports no inferential significance claim.</w:t>
       </w:r>
     </w:p>
     <w:p>
@@ -6918,131 +7096,61 @@
       <w:pPr>
         <w:keepLines/>
         <w:spacing w:after="80"/>
-        <w:jc w:val="center"/>
-      </w:pPr>
-      <w:r>
+        <w:jc w:val="both"/>
         <w:rPr>
-          <w:i/>
-          <w:color w:val="4C5963"/>
-          <w:sz w:val="17"/>
+          <w:iCs/>
+          <w:color w:val="auto"/>
+          <w:sz w:val="18"/>
+          <w:szCs w:val="18"/>
         </w:rPr>
-        <w:t xml:space="preserve">Figure 6. Mean per-image Euclidean final-logit </w:t>
-      </w:r>
-      <m:oMath>
-        <m:sSub>
-          <m:sSubPr>
-            <m:ctrlPr>
-              <w:rPr>
-                <w:rFonts w:ascii="Cambria Math" w:hAnsi="Cambria Math"/>
-              </w:rPr>
-            </m:ctrlPr>
-          </m:sSubPr>
-          <m:e>
-            <m:r>
-              <w:rPr>
-                <w:rFonts w:ascii="Cambria Math" w:hAnsi="Cambria Math"/>
-              </w:rPr>
-              <m:t>L</m:t>
-            </m:r>
-          </m:e>
-          <m:sub>
-            <m:r>
-              <w:rPr>
-                <w:rFonts w:ascii="Cambria Math" w:hAnsi="Cambria Math"/>
-              </w:rPr>
-              <m:t>2</m:t>
-            </m:r>
-          </m:sub>
-        </m:sSub>
-      </m:oMath>
+      </w:pPr>
       <w:r>
         <w:rPr>
-          <w:i/>
-          <w:color w:val="4C5963"/>
-          <w:sz w:val="17"/>
+          <w:b/>
+          <w:bCs/>
+          <w:iCs/>
+          <w:color w:val="auto"/>
+          <w:sz w:val="18"/>
+          <w:szCs w:val="18"/>
         </w:rPr>
-        <w:t xml:space="preserve"> change under the rank-one joint perturbation in Equation (4), at </w:t>
-      </w:r>
-      <m:oMath>
-        <m:r>
-          <w:rPr>
-            <w:rFonts w:ascii="Cambria Math" w:hAnsi="Cambria Math"/>
-          </w:rPr>
-          <m:t>s=1.0</m:t>
-        </m:r>
-      </m:oMath>
+        <w:t>Figure 6.</w:t>
+      </w:r>
       <w:r>
         <w:rPr>
-          <w:i/>
-          <w:color w:val="4C5963"/>
-          <w:sz w:val="17"/>
+          <w:iCs/>
+          <w:color w:val="auto"/>
+          <w:sz w:val="18"/>
+          <w:szCs w:val="18"/>
         </w:rPr>
-        <w:t xml:space="preserve">. (a) DeiT-Small, Block 8; (b) ViT-B/16 AugReg, Block 7. Rows show single-central, single-corner, global-coherent, random-sign, random-Gaussian, 25%-spatial-cluster, checkerboard, and smooth-spatial token patterns; columns show joint-margin-gradient top and near-null directions, activation-covariance PC1, calibration centroid, and an isotropic random direction. Both panels share a logarithmic color scale, also used in Supplementary Figure S14. Each model uses the same </w:t>
-      </w:r>
-      <m:oMath>
-        <m:r>
-          <w:rPr>
-            <w:rFonts w:ascii="Cambria Math" w:hAnsi="Cambria Math"/>
-          </w:rPr>
-          <m:t>N=100</m:t>
-        </m:r>
-      </m:oMath>
+        <w:t xml:space="preserve"> </w:t>
+      </w:r>
       <w:r>
         <w:rPr>
-          <w:i/>
-          <w:color w:val="4C5963"/>
-          <w:sz w:val="17"/>
+          <w:iCs/>
+          <w:color w:val="auto"/>
+          <w:sz w:val="18"/>
+          <w:szCs w:val="18"/>
         </w:rPr>
-        <w:t xml:space="preserve"> calibration images to construct directions and evaluate outcomes; cells are descriptive cohort means, without held-out evaluation or uncertainty intervals. The joint-stream gradient directions are not the downstream readout Jacobian </w:t>
-      </w:r>
-      <m:oMath>
-        <m:sSub>
-          <m:sSubPr>
-            <m:ctrlPr>
-              <w:rPr>
-                <w:rFonts w:ascii="Cambria Math" w:hAnsi="Cambria Math"/>
-              </w:rPr>
-            </m:ctrlPr>
-          </m:sSubPr>
-          <m:e>
-            <m:r>
-              <w:rPr>
-                <w:rFonts w:ascii="Cambria Math" w:hAnsi="Cambria Math"/>
-              </w:rPr>
-              <m:t>J</m:t>
-            </m:r>
-          </m:e>
-          <m:sub>
-            <m:r>
-              <m:rPr>
-                <m:scr m:val="script"/>
-              </m:rPr>
-              <w:rPr>
-                <w:rFonts w:ascii="Cambria Math" w:hAnsi="Cambria Math"/>
-              </w:rPr>
-              <m:t xml:space="preserve">l→ </m:t>
-            </m:r>
-            <m:r>
-              <w:rPr>
-                <w:rFonts w:ascii="Cambria Math" w:hAnsi="Cambria Math"/>
-              </w:rPr>
-              <m:t>L</m:t>
-            </m:r>
-          </m:sub>
-        </m:sSub>
-      </m:oMath>
-      <w:r>
-        <w:rPr>
-          <w:i/>
-          <w:color w:val="4C5963"/>
-          <w:sz w:val="17"/>
-        </w:rPr>
-        <w:t>.</w:t>
+        <w:t>Joint token–feature sensitivity to patch perturbations. Mean final-logit L₂ change across token perturbation patterns (rows) and feature-space directions (columns) at perturbation scale s = 1.0. (a) DeiT-Small, Block 8; (b) ViT-B/16 AugReg, Block 7. Both heatmaps share a logarithmic color scale. Directions and responses are evaluated using the same 100-image calibration cohort per model, yielding descriptive within-cohort results.</w:t>
       </w:r>
     </w:p>
     <w:p>
       <w:pPr>
+        <w:keepLines/>
+        <w:spacing w:after="80"/>
+        <w:jc w:val="both"/>
+        <w:rPr>
+          <w:iCs/>
+          <w:color w:val="auto"/>
+          <w:sz w:val="22"/>
+          <w:szCs w:val="24"/>
+        </w:rPr>
+      </w:pPr>
+    </w:p>
+    <w:p>
+      <w:pPr>
         <w:spacing w:after="100" w:line="259" w:lineRule="auto"/>
+        <w:jc w:val="both"/>
       </w:pPr>
       <w:r>
         <w:rPr>
@@ -7495,6 +7603,7 @@
     <w:p>
       <w:pPr>
         <w:spacing w:after="100" w:line="259" w:lineRule="auto"/>
+        <w:jc w:val="both"/>
       </w:pPr>
       <w:r>
         <w:t xml:space="preserve">For an </w:t>
@@ -7638,11 +7747,7 @@
         </m:r>
       </m:oMath>
       <w:r>
-        <w:t xml:space="preserve">. The Jacobian is defined through the pre-classifier readout, excluding the linear classification head; measured Top-1 and logit damage use the complete downstream model and classifier. The Jacobian is evaluated at the unperturbed </w:t>
-      </w:r>
-      <w:r>
-        <w:lastRenderedPageBreak/>
-        <w:t xml:space="preserve">activation, so its product is a local first-order readout prediction rather than an exact finite-perturbation identity. Unlike the feature-space margin metric </w:t>
+        <w:t xml:space="preserve">. The Jacobian is defined through the pre-classifier readout, excluding the linear classification head; measured Top-1 and logit damage use the complete downstream model and classifier. The Jacobian is evaluated at the unperturbed activation, so its product is a local first-order readout prediction rather than an exact finite-perturbation identity. Unlike the feature-space margin metric </w:t>
       </w:r>
       <m:oMath>
         <m:sSub>
@@ -7720,6 +7825,7 @@
     <w:p>
       <w:pPr>
         <w:spacing w:after="100" w:line="259" w:lineRule="auto"/>
+        <w:jc w:val="both"/>
       </w:pPr>
       <w:r>
         <w:rPr>
@@ -7968,12 +8074,16 @@
         </m:sSub>
       </m:oMath>
       <w:r>
-        <w:t xml:space="preserve"> is linearized at its first image. The higher aggregate correlations therefore indicate stronger predictive association for this prescribed mixture, not general superiority over arbitrary perturbations or independent image batches.</w:t>
+        <w:t xml:space="preserve"> is linearized at its first image. </w:t>
+      </w:r>
+      <w:r>
+        <w:t>For this prescribed perturbation mixture, the end-to-end Jacobian provides a stronger aggregate association with measured damage; broader generalization remains to be evaluated.</w:t>
       </w:r>
     </w:p>
     <w:p>
       <w:pPr>
         <w:spacing w:after="100" w:line="259" w:lineRule="auto"/>
+        <w:jc w:val="both"/>
       </w:pPr>
       <w:r>
         <w:rPr>
@@ -8078,227 +8188,74 @@
       <w:pPr>
         <w:keepLines/>
         <w:spacing w:after="80"/>
-        <w:jc w:val="center"/>
-      </w:pPr>
-      <w:r>
+        <w:jc w:val="both"/>
         <w:rPr>
-          <w:i/>
-          <w:color w:val="4C5963"/>
-          <w:sz w:val="17"/>
+          <w:iCs/>
+          <w:color w:val="auto"/>
+          <w:sz w:val="18"/>
+          <w:szCs w:val="18"/>
         </w:rPr>
-        <w:t xml:space="preserve">Figure 7. (a,b) Pearson and Spearman correlations of predicted and measured final-logit </w:t>
-      </w:r>
-      <m:oMath>
-        <m:sSub>
-          <m:sSubPr>
-            <m:ctrlPr>
-              <w:rPr>
-                <w:rFonts w:ascii="Cambria Math" w:hAnsi="Cambria Math"/>
-              </w:rPr>
-            </m:ctrlPr>
-          </m:sSubPr>
-          <m:e>
-            <m:r>
-              <w:rPr>
-                <w:rFonts w:ascii="Cambria Math" w:hAnsi="Cambria Math"/>
-              </w:rPr>
-              <m:t>L</m:t>
-            </m:r>
-          </m:e>
-          <m:sub>
-            <m:r>
-              <w:rPr>
-                <w:rFonts w:ascii="Cambria Math" w:hAnsi="Cambria Math"/>
-              </w:rPr>
-              <m:t>2</m:t>
-            </m:r>
-          </m:sub>
-        </m:sSub>
-      </m:oMath>
+      </w:pPr>
       <w:r>
         <w:rPr>
-          <w:i/>
-          <w:color w:val="4C5963"/>
-          <w:sz w:val="17"/>
+          <w:b/>
+          <w:bCs/>
+          <w:iCs/>
+          <w:color w:val="auto"/>
+          <w:sz w:val="18"/>
+          <w:szCs w:val="18"/>
         </w:rPr>
-        <w:t xml:space="preserve"> damage for single-block </w:t>
-      </w:r>
-      <m:oMath>
-        <m:sSub>
-          <m:sSubPr>
-            <m:ctrlPr>
-              <w:rPr>
-                <w:rFonts w:ascii="Cambria Math" w:hAnsi="Cambria Math"/>
-              </w:rPr>
-            </m:ctrlPr>
-          </m:sSubPr>
-          <m:e>
-            <m:r>
-              <w:rPr>
-                <w:rFonts w:ascii="Cambria Math" w:hAnsi="Cambria Math"/>
-              </w:rPr>
-              <m:t>A</m:t>
-            </m:r>
-          </m:e>
-          <m:sub>
-            <m:r>
-              <w:rPr>
-                <w:rFonts w:ascii="Cambria Math" w:hAnsi="Cambria Math"/>
-              </w:rPr>
-              <m:t>8</m:t>
-            </m:r>
-          </m:sub>
-        </m:sSub>
-      </m:oMath>
+        <w:t>Figure 7.</w:t>
+      </w:r>
       <w:r>
         <w:rPr>
-          <w:i/>
-          <w:color w:val="4C5963"/>
-          <w:sz w:val="17"/>
+          <w:iCs/>
+          <w:color w:val="auto"/>
+          <w:sz w:val="18"/>
+          <w:szCs w:val="18"/>
         </w:rPr>
-        <w:t xml:space="preserve"> and end-to-end </w:t>
-      </w:r>
-      <m:oMath>
-        <m:sSub>
-          <m:sSubPr>
-            <m:ctrlPr>
-              <w:rPr>
-                <w:rFonts w:ascii="Cambria Math" w:hAnsi="Cambria Math"/>
-              </w:rPr>
-            </m:ctrlPr>
-          </m:sSubPr>
-          <m:e>
-            <m:r>
-              <w:rPr>
-                <w:rFonts w:ascii="Cambria Math" w:hAnsi="Cambria Math"/>
-              </w:rPr>
-              <m:t>J</m:t>
-            </m:r>
-          </m:e>
-          <m:sub>
-            <m:r>
-              <w:rPr>
-                <w:rFonts w:ascii="Cambria Math" w:hAnsi="Cambria Math"/>
-              </w:rPr>
-              <m:t>8→ L</m:t>
-            </m:r>
-          </m:sub>
-        </m:sSub>
-      </m:oMath>
+        <w:t xml:space="preserve"> </w:t>
+      </w:r>
       <w:r>
         <w:rPr>
-          <w:i/>
-          <w:color w:val="4C5963"/>
-          <w:sz w:val="17"/>
+          <w:iCs/>
+          <w:color w:val="auto"/>
+          <w:sz w:val="18"/>
+          <w:szCs w:val="18"/>
         </w:rPr>
-        <w:t xml:space="preserve">, by architecture. Each estimate uses 100 designed perturbation vectors scored on a fixed 20-image reference batch; perturbation vectors are the sample unit. Error bars show stratified percentile-bootstrap 95% intervals (2,000 replicates, resampling 25 vectors within each of four families). </w:t>
-      </w:r>
-      <m:oMath>
-        <m:sSub>
-          <m:sSubPr>
-            <m:ctrlPr>
-              <w:rPr>
-                <w:rFonts w:ascii="Cambria Math" w:hAnsi="Cambria Math"/>
-              </w:rPr>
-            </m:ctrlPr>
-          </m:sSubPr>
-          <m:e>
-            <m:r>
-              <w:rPr>
-                <w:rFonts w:ascii="Cambria Math" w:hAnsi="Cambria Math"/>
-              </w:rPr>
-              <m:t>A</m:t>
-            </m:r>
-          </m:e>
-          <m:sub>
-            <m:r>
-              <w:rPr>
-                <w:rFonts w:ascii="Cambria Math" w:hAnsi="Cambria Math"/>
-              </w:rPr>
-              <m:t>8</m:t>
-            </m:r>
-          </m:sub>
-        </m:sSub>
-      </m:oMath>
-      <w:r>
-        <w:rPr>
-          <w:i/>
-          <w:color w:val="4C5963"/>
-          <w:sz w:val="17"/>
-        </w:rPr>
-        <w:t xml:space="preserve"> averages over the reference batch, whereas </w:t>
-      </w:r>
-      <m:oMath>
-        <m:r>
-          <w:rPr>
-            <w:rFonts w:ascii="Cambria Math" w:hAnsi="Cambria Math"/>
-          </w:rPr>
-          <m:t>J</m:t>
-        </m:r>
-      </m:oMath>
-      <w:r>
-        <w:rPr>
-          <w:i/>
-          <w:color w:val="4C5963"/>
-          <w:sz w:val="17"/>
-        </w:rPr>
-        <w:t xml:space="preserve"> is linearized at its first image. (c) Ratio of mean finite-radius final-logit </w:t>
-      </w:r>
-      <m:oMath>
-        <m:sSub>
-          <m:sSubPr>
-            <m:ctrlPr>
-              <w:rPr>
-                <w:rFonts w:ascii="Cambria Math" w:hAnsi="Cambria Math"/>
-              </w:rPr>
-            </m:ctrlPr>
-          </m:sSubPr>
-          <m:e>
-            <m:r>
-              <w:rPr>
-                <w:rFonts w:ascii="Cambria Math" w:hAnsi="Cambria Math"/>
-              </w:rPr>
-              <m:t>L</m:t>
-            </m:r>
-          </m:e>
-          <m:sub>
-            <m:r>
-              <w:rPr>
-                <w:rFonts w:ascii="Cambria Math" w:hAnsi="Cambria Math"/>
-              </w:rPr>
-              <m:t>2</m:t>
-            </m:r>
-          </m:sub>
-        </m:sSub>
-      </m:oMath>
-      <w:r>
-        <w:rPr>
-          <w:i/>
-          <w:color w:val="4C5963"/>
-          <w:sz w:val="17"/>
-        </w:rPr>
-        <w:t xml:space="preserve"> damage under the multi-block top mode to that under the multi-block near-null mode at </w:t>
-      </w:r>
-      <m:oMath>
-        <m:r>
-          <w:rPr>
-            <w:rFonts w:ascii="Cambria Math" w:hAnsi="Cambria Math"/>
-          </w:rPr>
-          <m:t>s=0.4</m:t>
-        </m:r>
-      </m:oMath>
-      <w:r>
-        <w:rPr>
-          <w:i/>
-          <w:color w:val="4C5963"/>
-          <w:sz w:val="17"/>
-        </w:rPr>
-        <w:t>. DINOv2 uses its official CLS-plus-mean-patch readout.</w:t>
+        <w:t>Local versus end-to-end functional transmission. (a,b) Pearson and Spearman correlations between predicted and measured final-logit L₂ damage for the single-block operator A₈ and end-to-end Jacobian J₈→L. Each model uses 100 designed perturbation vectors evaluated on a fixed 20-image reference batch; error bars indicate stratified-bootstrap 95% confidence intervals. (c) Ratio of final-logit damage along the multi-block top versus near-null mode at perturbation scale s = 0.4.</w:t>
       </w:r>
     </w:p>
     <w:p>
       <w:pPr>
+        <w:keepLines/>
+        <w:spacing w:after="80"/>
+        <w:jc w:val="both"/>
+        <w:rPr>
+          <w:iCs/>
+          <w:color w:val="auto"/>
+          <w:sz w:val="18"/>
+          <w:szCs w:val="18"/>
+        </w:rPr>
+      </w:pPr>
+    </w:p>
+    <w:p>
+      <w:pPr>
+        <w:keepLines/>
+        <w:spacing w:after="80"/>
+        <w:jc w:val="both"/>
+        <w:rPr>
+          <w:iCs/>
+          <w:color w:val="auto"/>
+          <w:sz w:val="18"/>
+          <w:szCs w:val="18"/>
+        </w:rPr>
+      </w:pPr>
+    </w:p>
+    <w:p>
+      <w:pPr>
         <w:spacing w:after="100" w:line="259" w:lineRule="auto"/>
+        <w:jc w:val="both"/>
       </w:pPr>
       <w:r>
         <w:rPr>
@@ -8408,6 +8365,7 @@
     <w:p>
       <w:pPr>
         <w:spacing w:after="100" w:line="259" w:lineRule="auto"/>
+        <w:jc w:val="both"/>
       </w:pPr>
       <w:r>
         <w:t xml:space="preserve">For each image, </w:t>
@@ -8976,6 +8934,7 @@
     <w:p>
       <w:pPr>
         <w:spacing w:after="100" w:line="259" w:lineRule="auto"/>
+        <w:jc w:val="both"/>
       </w:pPr>
       <w:r>
         <w:t xml:space="preserve">We define the reconstruction residual as (E(C)=P-SC), which depends on the carrier matrix (C). For the Group Mean baseline, let </w:t>
@@ -9032,6 +8991,7 @@
     <w:p>
       <w:pPr>
         <w:spacing w:after="100" w:line="259" w:lineRule="auto"/>
+        <w:jc w:val="both"/>
       </w:pPr>
       <w:r>
         <w:rPr>
@@ -9549,6 +9509,7 @@
     <w:p>
       <w:pPr>
         <w:spacing w:after="100" w:line="259" w:lineRule="auto"/>
+        <w:jc w:val="both"/>
       </w:pPr>
       <w:r>
         <w:t xml:space="preserve">The first term penalizes the readout change predicted by the selected operator, while the second is a trace-scaled Tikhonov penalty. Let </w:t>
@@ -10223,6 +10184,7 @@
     <w:p>
       <w:pPr>
         <w:spacing w:after="100" w:line="259" w:lineRule="auto"/>
+        <w:jc w:val="both"/>
       </w:pPr>
       <m:oMath>
         <m:sSub>
@@ -10258,6 +10220,7 @@
     <w:p>
       <w:pPr>
         <w:spacing w:after="100" w:line="259" w:lineRule="auto"/>
+        <w:jc w:val="both"/>
       </w:pPr>
       <w:r>
         <w:t>A separate post-hoc sensitivity analysis on 200 class-randomized calibration images found that factor 10 attained or tied the highest Top-1 in five of eight architecture–budget cells and was within 0.5 percentage points of the maximum in the other three (Supplementary Section S15). The maximizing factor varied across cells, while smaller factors consistently lowered the linearized residual and increased carrier displacement; factor 10 reduced nonlinear logit damage relative to Group Mean in all eight cells. These results support factor 10 as a reasonable empirical tradeoff in this cohort, not as a demonstrated global optimum, and do not verify the historical timing or rationale for its selection. The per-image closed-form carrier update is</w:t>
@@ -10775,6 +10738,7 @@
     <w:p>
       <w:pPr>
         <w:spacing w:after="100" w:line="259" w:lineRule="auto"/>
+        <w:jc w:val="both"/>
       </w:pPr>
       <w:r>
         <w:t>Because the Group Mean residual sums to zero within each group, these normal equations give the exact minimizer of the stated quadratic objective. This exactness applies to the local linearized objective, not to the nonlinear classifier loss. The full-J solution is computed per image and is an offline oracle; low-rank solves are evaluated against the full J on the same confirmatory cohort.</w:t>
@@ -10783,6 +10747,7 @@
     <w:p>
       <w:pPr>
         <w:spacing w:after="100" w:line="259" w:lineRule="auto"/>
+        <w:jc w:val="both"/>
       </w:pPr>
       <w:r>
         <w:t xml:space="preserve">Each compressed key also carries the number </w:t>
@@ -11340,6 +11305,7 @@
     <w:p>
       <w:pPr>
         <w:spacing w:after="100" w:line="259" w:lineRule="auto"/>
+        <w:jc w:val="both"/>
       </w:pPr>
       <w:r>
         <w:lastRenderedPageBreak/>
@@ -11450,32 +11416,62 @@
     <w:p>
       <w:pPr>
         <w:spacing w:after="100" w:line="259" w:lineRule="auto"/>
-      </w:pPr>
-      <w:r>
-        <w:t>At each architecture’s most aggressive tested token budget, Table IV compares the strongest of the tested conventional pruning baselines with Group Mean, ToMe, the per-image Full-J oracle, and rank-16 and rank-32 operator-aware variants. Operator-aware variants exceed the strongest pruning result by 4.2–12.0 percentage points in these rows. The margin is smaller against Group Mean and ToMe: Full-J ranges from 0.6 points below Group Mean for DeiT-Small to 1.3 points above it for DINOv2, and is 0.6 points below ToMe for DeiT-Small while exceeding it in the other three rows. The rank-restricted results also vary by architecture. These comparisons therefore do not show universal dominance over the stronger merging baselines. Full-J requires an image-specific downstream Jacobian and is an offline oracle, not a practical inference method. The budgets differ by architecture (32 retained tokens for DeiT-Tiny, DeiT-Small, and ViT-B/16 AugReg; 42 for DINOv2 ViT-S/14), so rows are within-architecture comparisons rather than a matched token-count experiment. Figure 8 presents the full accuracy-token curves.</w:t>
+        <w:jc w:val="both"/>
+      </w:pPr>
+      <w:r>
+        <w:t>At each architecture’s most aggressive tested token budget, Table</w:t>
+      </w:r>
+      <w:r>
+        <w:t xml:space="preserve"> 4</w:t>
+      </w:r>
+      <w:r>
+        <w:t xml:space="preserve"> compares the strongest of the tested conventional pruning baselines with Group Mean, ToMe, the per-image Full-J oracle, and rank-16 and rank-32 operator-aware variants. Operator-aware variants exceed the strongest pruning result by 4.2–12.0 percentage points in these rows. The margin is smaller against Group Mean and ToMe: Full-J ranges from 0.6 points below Group Mean for DeiT-Small to 1.3 points above it for DINOv2, and is 0.6 points below ToMe for DeiT-Small while exceeding it in the other three rows. The rank-restricted results also vary by architecture. </w:t>
+      </w:r>
+      <w:r>
+        <w:t>Performance relative to the stronger merging baselines varies by architecture and token budget.</w:t>
+      </w:r>
+      <w:r>
+        <w:t xml:space="preserve"> Full-J requires an image-specific downstream Jacobian and is an offline oracle, not a practical inference method. The budgets differ by architecture (32 retained tokens for DeiT-Tiny, DeiT-Small, and ViT-B/16 AugReg; 42 for DINOv2 ViT-S/14), so rows are within-architecture comparisons rather than a matched token-count experiment. Figure 8 presents the full accuracy-token curves.</w:t>
       </w:r>
     </w:p>
     <w:p>
       <w:pPr>
         <w:spacing w:after="100" w:line="259" w:lineRule="auto"/>
-      </w:pPr>
-      <w:r>
-        <w:t>TABLE IV</w:t>
+        <w:jc w:val="both"/>
+        <w:rPr>
+          <w:b/>
+          <w:bCs/>
+        </w:rPr>
+      </w:pPr>
+      <w:r>
+        <w:rPr>
+          <w:b/>
+          <w:bCs/>
+        </w:rPr>
+        <w:t>T</w:t>
+      </w:r>
+      <w:r>
+        <w:rPr>
+          <w:b/>
+          <w:bCs/>
+        </w:rPr>
+        <w:t>able 4</w:t>
       </w:r>
     </w:p>
     <w:p>
       <w:pPr>
         <w:spacing w:after="100" w:line="259" w:lineRule="auto"/>
-      </w:pPr>
-      <w:r>
-        <w:t>STRICT CONFIRMATORY TOP-1 ACCURACY AT THE MOST AGGRESSIVE TESTED BUDGET</w:t>
-      </w:r>
-    </w:p>
-    <w:p>
-      <w:pPr>
-        <w:spacing w:after="100" w:line="259" w:lineRule="auto"/>
-      </w:pPr>
-      <w:r>
+        <w:jc w:val="both"/>
+        <w:rPr>
+          <w:sz w:val="18"/>
+          <w:szCs w:val="20"/>
+        </w:rPr>
+      </w:pPr>
+      <w:r>
+        <w:rPr>
+          <w:sz w:val="18"/>
+          <w:szCs w:val="20"/>
+        </w:rPr>
         <w:t>Top-1 accuracy on N=1,000 held-out images per architecture. The pruning entry is the strongest among Random, Norm, and Attention Pruning at the listed budget; each budget is the lowest evaluated for its architecture.</w:t>
       </w:r>
     </w:p>
@@ -12657,9 +12653,34 @@
     <w:p>
       <w:pPr>
         <w:spacing w:after="100" w:line="259" w:lineRule="auto"/>
-      </w:pPr>
-      <w:r>
-        <w:t>A same-group control compares Group Mean and Operator-Aware carriers on the same image, at the same token budget, with identical assignments S. For primary feature-similarity grouping, the same-image, same-budget difference in linearized operator residual (Group Mean minus Operator-Aware) is positive on all 20,000 image-by-budget rows; averaging equally over five budgets and 1,000 held-out images per architecture gives mean Δ of 1.27 (DeiT-Tiny), 1.48 (DeiT-Small), 2.53 (ViT-B/16 AugReg), and 7.20 (DINOv2 ViT-S/14). These are descriptive operator-residual contrasts with images reused across budgets, not a significance test or evidence that Top-1 or nonlinear final-logit damage must improve. The accuracy comparisons in Table IV remain architecture- and budget-dependent: for example, Group Mean and ToMe tie for DeiT-Small at the most aggressive budget, while their ordering differs elsewhere. Across the evaluated method, budget, and seed conditions, operator residual ‖J E‖ is associated with measured logit-L2 distortion: per-architecture Pearson r ranges from 0.739 to 0.866, and Spearman ρ ranges from 0.792 to 0.916. Because the same held-out cohort is reused across conditions, this is a condition-level association rather than an image-level generalization estimate. Rank-16 and rank-32 outcomes vary by architecture and budget; the confirmatory data do not support a universal recovery fraction. Figure 8 reports the measured accuracy-token curves, while Table IV lists rank-16 and rank-32 Top-1 at each architecture's most aggressive tested budget.</w:t>
+        <w:jc w:val="both"/>
+      </w:pPr>
+      <w:r>
+        <w:t xml:space="preserve">A same-group control compares Group Mean and Operator-Aware carriers on the same image, at the same token budget, with identical assignments S. For primary feature-similarity grouping, the same-image, same-budget difference in linearized operator residual (Group Mean minus Operator-Aware) is positive on all 20,000 image-by-budget rows; averaging equally over five budgets and 1,000 held-out images per architecture gives mean Δ of 1.27 (DeiT-Tiny), 1.48 (DeiT-Small), 2.53 (ViT-B/16 AugReg), and 7.20 (DINOv2 ViT-S/14). </w:t>
+      </w:r>
+      <w:r>
+        <w:t>These contrasts characterize reductions in the linearized operator residual; corresponding classification and nonlinear distortion outcomes are evaluated separately.</w:t>
+      </w:r>
+      <w:r>
+        <w:t xml:space="preserve"> The accuracy comparisons in Table </w:t>
+      </w:r>
+      <w:r>
+        <w:t>4</w:t>
+      </w:r>
+      <w:r>
+        <w:t xml:space="preserve"> remain architecture- and budget-dependent: for example, Group Mean and ToMe tie for DeiT-Small at the most aggressive budget, while their ordering differs elsewhere. Across the evaluated method, budget, and seed conditions, operator residual ‖J E‖ is associated with measured logit-L2 distortion: per-architecture Pearson r ranges from 0.739 to 0.866, and Spearman ρ ranges from 0.792 to 0.916. Because the same held-out cohort is reused across conditions, this is a condition-level association rather than an image-level generalization estimate. Rank-16 and rank-32 outcomes vary by architecture and budget; </w:t>
+      </w:r>
+      <w:r>
+        <w:t>the retained benefit depends on architecture and token budget</w:t>
+      </w:r>
+      <w:r>
+        <w:t xml:space="preserve">. Figure 8 reports the measured accuracy-token curves, while Table </w:t>
+      </w:r>
+      <w:r>
+        <w:t>4</w:t>
+      </w:r>
+      <w:r>
+        <w:t xml:space="preserve"> lists rank-16 and rank-32 Top-1 at each architecture's most aggressive tested budget.</w:t>
       </w:r>
     </w:p>
     <w:p>
@@ -12715,23 +12736,69 @@
       <w:pPr>
         <w:keepLines/>
         <w:spacing w:after="80"/>
-        <w:jc w:val="center"/>
-      </w:pPr>
-      <w:r>
+        <w:jc w:val="both"/>
         <w:rPr>
-          <w:i/>
-          <w:color w:val="4C5963"/>
-          <w:sz w:val="17"/>
+          <w:iCs/>
+          <w:color w:val="auto"/>
+          <w:sz w:val="18"/>
+          <w:szCs w:val="18"/>
         </w:rPr>
-        <w:t>Figure 8. Confirmatory Top-1 accuracy versus retained patch-token fraction for four architectures. Curves show pruning, Group Mean, ToMe, the full-J oracle, and rank-32; rank-16 Top-1 is listed in Table IV at the most aggressive tested budget. Each architecture uses N=1,000 held-out images.</w:t>
+      </w:pPr>
+      <w:r>
+        <w:rPr>
+          <w:b/>
+          <w:bCs/>
+          <w:iCs/>
+          <w:color w:val="auto"/>
+          <w:sz w:val="18"/>
+          <w:szCs w:val="18"/>
+        </w:rPr>
+        <w:t>Figure 8.</w:t>
+      </w:r>
+      <w:r>
+        <w:rPr>
+          <w:iCs/>
+          <w:color w:val="auto"/>
+          <w:sz w:val="18"/>
+          <w:szCs w:val="18"/>
+        </w:rPr>
+        <w:t xml:space="preserve"> </w:t>
+      </w:r>
+      <w:r>
+        <w:rPr>
+          <w:iCs/>
+          <w:color w:val="auto"/>
+          <w:sz w:val="18"/>
+          <w:szCs w:val="18"/>
+        </w:rPr>
+        <w:t>Accuracy–token tradeoffs of operator-aware compression. Top-1 accuracy versus retained patch-token fraction across four ViT architectures, comparing conventional pruning, Group Mean, ToMe, Full-J oracle, and rank-32 operator-aware compression. Each architecture is evaluated on 1,000 held-out images. Rank-16 results at the most aggressive budget are reported in Table IV.</w:t>
       </w:r>
     </w:p>
     <w:p>
       <w:pPr>
+        <w:keepLines/>
+        <w:spacing w:after="80"/>
+        <w:jc w:val="both"/>
+        <w:rPr>
+          <w:iCs/>
+          <w:sz w:val="18"/>
+          <w:szCs w:val="18"/>
+        </w:rPr>
+      </w:pPr>
+    </w:p>
+    <w:p>
+      <w:pPr>
         <w:spacing w:after="100" w:line="259" w:lineRule="auto"/>
-      </w:pPr>
-      <w:r>
-        <w:t>The Full-J formulation is evaluated as an offline, image-conditioned oracle rather than a deployable efficient-inference algorithm. Calibration-frozen carrier approximations and measured accuracy–throughput tradeoffs are evaluated separately in Supplementary Section S13; these experiments do not establish a general deployment advantage.</w:t>
+        <w:jc w:val="both"/>
+      </w:pPr>
+      <w:r>
+        <w:t>Full-J provides an offline, image-conditioned reference for evaluating operator-aware compression.</w:t>
+      </w:r>
+      <w:r>
+        <w:t xml:space="preserve"> </w:t>
+      </w:r>
+      <w:r>
+        <w:t>Calibration-frozen carrier approximations and measured accuracy–throughput tradeoffs are evaluated separately in Supplementary Section S13; these experiments do not establish a general deployment advantage.</w:t>
       </w:r>
     </w:p>
     <w:p>
@@ -12748,9 +12815,10 @@
     <w:p>
       <w:pPr>
         <w:spacing w:after="100" w:line="259" w:lineRule="auto"/>
-      </w:pPr>
-      <w:r>
-        <w:t>Mechanistic evidence comes from finite, protocol-specific cohorts in Table I and four pretrained ViT families evaluated on one ImageNet validation subset; broader model and task coverage remains untested. The exploratory joint-stream grid reuses its N=100 images for direction estimation and response measurement, so it is descriptive rather than held out. The margin-gradient and readout-Jacobian analyses characterize local, first-order behavior, and a threshold-defined near-null fraction does not establish exact nonlinear invariance. Full-J requires a per-image Jacobian and is an offline oracle. The practical-carrier and operator-space studies use distinct protocols and endpoints, while measured full-model runtime is specific to the tested hardware, batch sizes, and implementations. The evidence does not establish a general deployment advantage.</w:t>
+        <w:jc w:val="both"/>
+      </w:pPr>
+      <w:r>
+        <w:t>This study focuses on four pretrained ViT families and ImageNet-1k classification, with broader architectures and tasks remaining open for investigation. The joint-stream geometry analysis uses the same 100-image cohorts for direction estimation and response measurement, providing descriptive within-cohort evidence. Margin-gradient and readout-Jacobian analyses characterize local, first-order functional structure, while spectral thresholds define approximate near-null directions. The Full-J compression method requires an image-specific Jacobian and serves as an offline oracle. Practical-carrier evaluations use separate protocols and endpoints, with throughput measurements specific to the tested hardware, batch sizes, and implementations. Developing computationally efficient approximations that translate these functional insights into consistent deployment benefits remains an important direction for future work.</w:t>
       </w:r>
     </w:p>
     <w:p>
@@ -12767,10 +12835,19 @@
     <w:p>
       <w:pPr>
         <w:spacing w:after="100" w:line="259" w:lineRule="auto"/>
-      </w:pPr>
-      <w:r>
-        <w:t>Across four tested ViT families, late-layer patch content is conditionally replaceable under feature-geometry and token-position-diversity constraints. The mechanistic evidence links this fixed-slot intervention to architecture-dependent functional sensitivity, coherent Value-path accumulation and cancellation, and depth-varying effective rank. End-to-end Jacobian predictions are more strongly associated with measured damage than single-block predictions under the tested mixture of 100 perturbation vectors per model. In the separate confirmatory compression benchmark, operator-aware variants exceed the strongest pruning baselines by 4.2–12.0 percentage points at the most aggressive tested budgets, but ToMe remains competitive, Group Mean is not uniformly worse, and rank-restricted outcomes vary across architectures. The bounded compression result uses an offline, image-conditioned Full-J oracle; practical carrier evidence is summarized in Supplementary Section S13, and the available measurements do not establish a general deployment advantage.</w:t>
-      </w:r>
+        <w:jc w:val="both"/>
+      </w:pPr>
+      <w:r>
+        <w:t xml:space="preserve">Across four tested ViT families, late-layer patch content is conditionally replaceable under feature-geometry and token-position-diversity constraints. The mechanistic evidence links this fixed-slot intervention to architecture-dependent functional sensitivity, coherent Value-path accumulation and cancellation, and depth-varying effective rank. End-to-end Jacobian predictions are more strongly associated with measured damage than single-block predictions under the tested mixture of 100 perturbation vectors per model. In the separate confirmatory compression benchmark, operator-aware variants exceed the strongest pruning baselines by 4.2–12.0 percentage points at the most aggressive tested budgets, but ToMe remains competitive, Group Mean is not uniformly worse, and rank-restricted outcomes vary across architectures. </w:t>
+      </w:r>
+      <w:r>
+        <w:t>These findings connect the observed geometry of patch-content fungibility with an operator-aware compression objective, demonstrating improvements over conventional pruning while revealing architecture-dependent tradeoffs against stronger merging baselines. The offline Full-J formulation provides a reference for future development of computationally efficient compression methods, with practical-carrier evaluations reported in Supplementary Section S13.</w:t>
+      </w:r>
+    </w:p>
+    <w:p>
+      <w:pPr>
+        <w:spacing w:after="100" w:line="259" w:lineRule="auto"/>
+      </w:pPr>
     </w:p>
     <w:p>
       <w:pPr>
@@ -12780,7 +12857,6 @@
         <w:rPr>
           <w:rFonts w:ascii="Times New Roman" w:hAnsi="Times New Roman"/>
         </w:rPr>
-        <w:lastRenderedPageBreak/>
         <w:t>Reproducibility and Evidence</w:t>
       </w:r>
     </w:p>
@@ -13083,6 +13159,7 @@
           <w:color w:val="26343D"/>
           <w:sz w:val="17"/>
         </w:rPr>
+        <w:lastRenderedPageBreak/>
         <w:t>[22] L. Yu, W. Xiang, “X-Pruner: eXplainable Pruning for Vision Transformers,” in Proc. IEEE/CVF Conf. Comput. Vis. Pattern Recognit., pp. 24355–24363, 2023. DOI: 10.1109/CVPR52729.2023.02333.</w:t>
       </w:r>
     </w:p>
@@ -13109,7 +13186,6 @@
           <w:color w:val="26343D"/>
           <w:sz w:val="17"/>
         </w:rPr>
-        <w:lastRenderedPageBreak/>
         <w:t>[24] S. Wei, T. Ye, S. Zhang, Y. Tang, J. Liang, “Joint Token Pruning and Squeezing Towards More Aggressive Compression of Vision Transformers,” in Proc. IEEE/CVF Conf. Comput. Vis. Pattern Recognit., pp. 2092–2101, 2023. DOI: 10.1109/CVPR52729.2023.00208.</w:t>
       </w:r>
     </w:p>
@@ -13422,6 +13498,7 @@
           <w:color w:val="26343D"/>
           <w:sz w:val="17"/>
         </w:rPr>
+        <w:lastRenderedPageBreak/>
         <w:t>[48] S. Jain, B. C. Wallace, “Attention Is Not Explanation,” in Proceedings of the 2019 Conference of the North American Chapter of the Association for Computational Linguistics: Human Language Technologies, pp. 3543–3556, 2019. DOI: 10.18653/v1/N19-1357.</w:t>
       </w:r>
     </w:p>
@@ -13448,7 +13525,6 @@
           <w:color w:val="26343D"/>
           <w:sz w:val="17"/>
         </w:rPr>
-        <w:lastRenderedPageBreak/>
         <w:t>[50] S. Wiegreffe, Y. Pinter, “Attention Is Not Not Explanation,” in Proceedings of the 2019 Conference on Empirical Methods in Natural Language Processing and the 9th International Joint Conference on Natural Language Processing, pp. 11–20, 2019. DOI: 10.18653/v1/D19-1002.</w:t>
       </w:r>
     </w:p>
@@ -14336,7 +14412,6 @@
   <w:style w:type="character" w:default="1" w:styleId="DefaultParagraphFont">
     <w:name w:val="Default Paragraph Font"/>
     <w:uiPriority w:val="1"/>
-    <w:semiHidden/>
     <w:unhideWhenUsed/>
   </w:style>
   <w:style w:type="table" w:default="1" w:styleId="TableNormal">
@@ -25110,6 +25185,19 @@
       </w:tcPr>
     </w:tblStylePr>
   </w:style>
+  <w:style w:type="paragraph" w:styleId="NormalWeb">
+    <w:name w:val="Normal (Web)"/>
+    <w:basedOn w:val="Normal"/>
+    <w:uiPriority w:val="99"/>
+    <w:semiHidden/>
+    <w:unhideWhenUsed/>
+    <w:rsid w:val="00967CE5"/>
+    <w:rPr>
+      <w:rFonts w:cs="Times New Roman"/>
+      <w:sz w:val="24"/>
+      <w:szCs w:val="24"/>
+    </w:rPr>
+  </w:style>
 </w:styles>
 </file>
 

</xml_diff>

<commit_message>
Fix manuscript citation references
</commit_message>
<xml_diff>
--- a/docs/PAPER_DRAFT_v5.docx
+++ b/docs/PAPER_DRAFT_v5.docx
@@ -245,13 +245,13 @@
       </w:pPr>
       <w:r>
         <w:lastRenderedPageBreak/>
-        <w:t xml:space="preserve">Surrogate substitution also has a close methodological precedent. Parodi et al. study mean, noise, and cross-image register-shuffling substitutions for specialized DINO register-token content. PCF examines ordinary spatial patch-token activations across depth and replacement fractions, and separates feature geometry from token-position diversity; </w:t>
-      </w:r>
-      <w:r>
-        <w:t xml:space="preserve">thereby extending surrogate-intervention analysis to ordinary spatial patch tokens </w:t>
-      </w:r>
-      <w:r>
-        <w:t>[44].</w:t>
+        <w:t xml:space="preserve">Surrogate substitution has close methodological precedents. Parodi et al. study mean, noise, and cross-image register-shuffling substitutions for specialized DINO register-token content [44]. Causal Attribution via Activation Patching (CAAP) intervenes on internal ViT spatial-patch activations by inserting source-image patch activations into a blank target context for attribution [45].</w:t>
+      </w:r>
+      <w:r>
+        <w:t xml:space="preserve"> PCF instead tests whether ordinary late-layer patch content can be replaced by class-agnostic calibration-derived surrogates across depths and replacement fractions, while preserving spatial slots, sequence length, model weights, and downstream computation.</w:t>
+      </w:r>
+      <w:r>
+        <w:t xml:space="preserve"> PCF also separates feature geometry from token-position diversity.</w:t>
       </w:r>
     </w:p>
     <w:p>
@@ -260,10 +260,10 @@
         <w:jc w:val="both"/>
       </w:pPr>
       <w:r>
-        <w:t>Sensitivity-weighted objectives and Jacobian-based measures provide established foundations for analyzing downstream functional effects</w:t>
-      </w:r>
-      <w:r>
-        <w:t xml:space="preserve"> [45], [46]. A recent public preprint, Output-aware Residual Stream Pruning, couples activation statistics with output sensitivity to prune LLM residual-stream dimensions [47]. That work supports the broader precedent for output-aware compression but studies a different model family and dimension-pruning intervention.</w:t>
+        <w:t>Second-order curvature-based pruning criteria have a long history</w:t>
+      </w:r>
+      <w:r>
+        <w:t xml:space="preserve"> [46], [47]. A recent public preprint, Output-aware Residual Stream Pruning, couples activation statistics with output sensitivity to prune LLM residual-stream dimensions [48]. That work supports the broader precedent for output-aware compression but studies a different model family and dimension-pruning intervention.</w:t>
       </w:r>
       <w:r>
         <w:t xml:space="preserve"> PCF</w:t>
@@ -284,7 +284,7 @@
         <w:jc w:val="both"/>
       </w:pPr>
       <w:r>
-        <w:t xml:space="preserve">Interpretability research cautions that attention weights alone need not explain a model's decision. Controlled studies examine whether attention is explanation and how explanation changes under interventions [48]–[50]. Attention flow, Integrated Gradients, saliency-map sanity checks, and transformer-specific relevance propagation provide complementary methods for tracing or attributing model behavior [51]–[54]. Causal abstraction offers a framework for connecting interventions to model-level causal structure [55]. Our evidence uses </w:t>
+        <w:t xml:space="preserve">Interpretability research cautions that attention weights alone need not explain a model's decision. Controlled studies examine whether attention is explanation and how explanation changes under interventions [49]–[51]. Attention flow, Integrated Gradients, saliency-map sanity checks, and transformer-specific relevance propagation provide complementary methods for tracing or attributing model behavior [52]–[55]. Causal abstraction offers a framework for connecting interventions to model-level causal structure [56]. Our evidence uses </w:t>
       </w:r>
       <w:r>
         <w:t>controlled activation interventions and held-out perturbation-damage prediction to investigate functional dependence in pretrained ViTs.</w:t>
@@ -4369,7 +4369,7 @@
         <w:jc w:val="both"/>
       </w:pPr>
       <w:r>
-        <w:t xml:space="preserve">The entropy-based effective rank of </w:t>
+        <w:t xml:space="preserve">The entropy-based effective rank [57] of </w:t>
       </w:r>
       <m:oMath>
         <m:sSub>
@@ -4402,7 +4402,7 @@
         </m:sSub>
       </m:oMath>
       <w:r>
-        <w:t xml:space="preserve">, normalized by feature dimension </w:t>
+        <w:t xml:space="preserve"> is divided by feature dimension </w:t>
       </w:r>
       <m:oMath>
         <m:r>
@@ -4413,7 +4413,7 @@
         </m:r>
       </m:oMath>
       <w:r>
-        <w:t xml:space="preserve">, is compared across depths 5–10 in Table </w:t>
+        <w:t xml:space="preserve"> as a PCF normalization and compared across depths 5–10 in Table </w:t>
       </w:r>
       <w:r>
         <w:t>3</w:t>
@@ -7711,7 +7711,7 @@
         </m:r>
       </m:oMath>
       <w:r>
-        <w:t xml:space="preserve"> concatenates normalized CLS and mean normalized patch features, so </w:t>
+        <w:t xml:space="preserve"> concatenates normalized CLS and mean normalized patch features [5], [58], so </w:t>
       </w:r>
       <m:oMath>
         <m:sSub>
@@ -13459,7 +13459,7 @@
           <w:color w:val="26343D"/>
           <w:sz w:val="17"/>
         </w:rPr>
-        <w:t>[45] Y. LeCun, J. S. Denker, S. A. Solla, “Optimal Brain Damage,” in Advances in Neural Information Processing Systems, vol. 2, pp. 598–605, 1989. Available: https://proceedings.neurips.cc/paper/1989/hash/6c9882bbac1c7093bd25041881277658-Abstract.html.</w:t>
+        <w:t>[45] A. Izadi, M. Banayeeanzade, A. Mirrokni, H. Hasani, M. Bagherian, F. Mehri, and M. S. Baghshah, “Causal Attribution via Activation Patching,” arXiv preprint arXiv:2603.13652v2 [cs.CV], 2026. DOI: 10.48550/arXiv.2603.13652. Available: https://arxiv.org/abs/2603.13652.</w:t>
       </w:r>
     </w:p>
     <w:p>
@@ -13472,7 +13472,7 @@
           <w:color w:val="26343D"/>
           <w:sz w:val="17"/>
         </w:rPr>
-        <w:t>[46] B. Hassibi, D. G. Stork, “Optimal Brain Surgeon and general network pruning,” in Proceedings of the IEEE Proc. IEEE Int. Conf. Neural Netw., vol. 1, pp. 293–299, 1993. DOI: 10.1109/ICNN.1993.298572.</w:t>
+        <w:t>[46] Y. LeCun, J. S. Denker, S. A. Solla, “Optimal Brain Damage,” in Advances in Neural Information Processing Systems, vol. 2, pp. 598–605, 1989. Available: https://proceedings.neurips.cc/paper/1989/hash/6c9882bbac1c7093bd25041881277658-Abstract.html.</w:t>
       </w:r>
     </w:p>
     <w:p>
@@ -13485,7 +13485,20 @@
           <w:color w:val="26343D"/>
           <w:sz w:val="17"/>
         </w:rPr>
-        <w:t>[47] C. Thrash, K. Chen, S. Kolouri, “Output-aware Residual Stream Pruning for Large Language Models,” in arXiv preprint arXiv:2609.35579, 2026. DOI: 10.48550/arXiv.2609.35579.</w:t>
+        <w:t>[47] B. Hassibi, D. G. Stork, and G. J. Wolff, “Optimal Brain Surgeon and general network pruning,” in Proceedings of the 1993 IEEE International Conference on Neural Networks, vol. 1, pp. 293–299, 1993. DOI: 10.1109/ICNN.1993.298572.</w:t>
+      </w:r>
+    </w:p>
+    <w:p>
+      <w:pPr>
+        <w:spacing w:after="80" w:line="240" w:lineRule="auto"/>
+        <w:ind w:left="403" w:hanging="403"/>
+      </w:pPr>
+      <w:r>
+        <w:rPr>
+          <w:color w:val="26343D"/>
+          <w:sz w:val="17"/>
+        </w:rPr>
+        <w:t>[48] C. Thrash, K. Chen, S. Kolouri, “Output-aware Residual Stream Pruning for Large Language Models,” in arXiv preprint arXiv:2609.35579, 2026. DOI: 10.48550/arXiv.2609.35579.</w:t>
       </w:r>
     </w:p>
     <w:p>
@@ -13499,7 +13512,7 @@
           <w:sz w:val="17"/>
         </w:rPr>
         <w:lastRenderedPageBreak/>
-        <w:t>[48] S. Jain, B. C. Wallace, “Attention Is Not Explanation,” in Proceedings of the 2019 Conference of the North American Chapter of the Association for Computational Linguistics: Human Language Technologies, pp. 3543–3556, 2019. DOI: 10.18653/v1/N19-1357.</w:t>
+        <w:t>[49] S. Jain, B. C. Wallace, “Attention Is Not Explanation,” in Proceedings of the 2019 Conference of the North American Chapter of the Association for Computational Linguistics: Human Language Technologies, pp. 3543–3556, 2019. DOI: 10.18653/v1/N19-1357.</w:t>
       </w:r>
     </w:p>
     <w:p>
@@ -13512,7 +13525,7 @@
           <w:color w:val="26343D"/>
           <w:sz w:val="17"/>
         </w:rPr>
-        <w:t>[49] S. Serrano, N. A. Smith, “Is Attention Interpretable?,” in Proceedings of the 57th Annual Meeting of the Association for Computational Linguistics, pp. 2931–2951, 2019. DOI: 10.18653/v1/P19-1282.</w:t>
+        <w:t>[50] S. Serrano, N. A. Smith, “Is Attention Interpretable?,” in Proceedings of the 57th Annual Meeting of the Association for Computational Linguistics, pp. 2931–2951, 2019. DOI: 10.18653/v1/P19-1282.</w:t>
       </w:r>
     </w:p>
     <w:p>
@@ -13525,7 +13538,7 @@
           <w:color w:val="26343D"/>
           <w:sz w:val="17"/>
         </w:rPr>
-        <w:t>[50] S. Wiegreffe, Y. Pinter, “Attention Is Not Not Explanation,” in Proceedings of the 2019 Conference on Empirical Methods in Natural Language Processing and the 9th International Joint Conference on Natural Language Processing, pp. 11–20, 2019. DOI: 10.18653/v1/D19-1002.</w:t>
+        <w:t>[51] S. Wiegreffe, Y. Pinter, “Attention Is Not Not Explanation,” in Proceedings of the 2019 Conference on Empirical Methods in Natural Language Processing and the 9th International Joint Conference on Natural Language Processing, pp. 11–20, 2019. DOI: 10.18653/v1/D19-1002.</w:t>
       </w:r>
     </w:p>
     <w:p>
@@ -13538,7 +13551,7 @@
           <w:color w:val="26343D"/>
           <w:sz w:val="17"/>
         </w:rPr>
-        <w:t>[51] S. Abnar, W. Zuidema, “Quantifying Attention Flow in Transformers,” in Proceedings of the 58th Annual Meeting of the Association for Computational Linguistics, pp. 4190–4197, 2020. DOI: 10.18653/v1/2020.acl-main.385.</w:t>
+        <w:t>[52] S. Abnar, W. Zuidema, “Quantifying Attention Flow in Transformers,” in Proceedings of the 58th Annual Meeting of the Association for Computational Linguistics, pp. 4190–4197, 2020. DOI: 10.18653/v1/2020.acl-main.385.</w:t>
       </w:r>
     </w:p>
     <w:p>
@@ -13551,7 +13564,7 @@
           <w:color w:val="26343D"/>
           <w:sz w:val="17"/>
         </w:rPr>
-        <w:t>[52] M. Sundararajan, A. Taly, Q. Yan, “Axiomatic Attribution for Deep Networks,” in Proc. 34th Int. Conf. Mach. Learn., vol. 70, pp. 3319–3328, 2017. Available: https://proceedings.mlr.press/v70/sundararajan17a.html.</w:t>
+        <w:t>[53] M. Sundararajan, A. Taly, Q. Yan, “Axiomatic Attribution for Deep Networks,” in Proc. 34th Int. Conf. Mach. Learn., vol. 70, pp. 3319–3328, 2017. Available: https://proceedings.mlr.press/v70/sundararajan17a.html.</w:t>
       </w:r>
     </w:p>
     <w:p>
@@ -13564,7 +13577,7 @@
           <w:color w:val="26343D"/>
           <w:sz w:val="17"/>
         </w:rPr>
-        <w:t>[53] J. Adebayo, J. Gilmer, M. Muelly, I. Goodfellow, M. Hardt, B. Kim, “Sanity Checks for Saliency Maps,” in Advances in Neural Information Processing Systems, vol. 31, pp. 9505–9515, 2018. Available: https://proceedings.neurips.cc/paper/2018/hash/294a8ed24b1ad22ec2e7efea049b8737-Abstract.html.</w:t>
+        <w:t>[54] J. Adebayo, J. Gilmer, M. Muelly, I. Goodfellow, M. Hardt, B. Kim, “Sanity Checks for Saliency Maps,” in Advances in Neural Information Processing Systems, vol. 31, pp. 9505–9515, 2018. Available: https://proceedings.neurips.cc/paper/2018/hash/294a8ed24b1ad22ec2e7efea049b8737-Abstract.html.</w:t>
       </w:r>
     </w:p>
     <w:p>
@@ -13577,7 +13590,7 @@
           <w:color w:val="26343D"/>
           <w:sz w:val="17"/>
         </w:rPr>
-        <w:t>[54] H. Chefer, S. Gur, L. Wolf, “Transformer Interpretability Beyond Attention Visualization,” in Proc. IEEE/CVF Conf. Comput. Vis. Pattern Recognit., pp. 782–791, 2021. DOI: 10.1109/CVPR46437.2021.00084.</w:t>
+        <w:t>[55] H. Chefer, S. Gur, L. Wolf, “Transformer Interpretability Beyond Attention Visualization,” in Proc. IEEE/CVF Conf. Comput. Vis. Pattern Recognit., pp. 782–791, 2021. DOI: 10.1109/CVPR46437.2021.00084.</w:t>
       </w:r>
     </w:p>
     <w:p>
@@ -13590,7 +13603,33 @@
           <w:color w:val="26343D"/>
           <w:sz w:val="17"/>
         </w:rPr>
-        <w:t>[55] A. Geiger, Z. Wu, C. Potts, T. Icard, N. Goodman, “Inducing Causal Structure for Interpretable Neural Networks,” in Proc. 39th Int. Conf. Mach. Learn., vol. 162, pp. 7324–7338, 2022. Available: https://proceedings.mlr.press/v162/geiger22a.html.</w:t>
+        <w:t>[56] A. Geiger, Z. Wu, C. Potts, T. Icard, N. Goodman, “Inducing Causal Structure for Interpretable Neural Networks,” in Proc. 39th Int. Conf. Mach. Learn., vol. 162, pp. 7324–7338, 2022. Available: https://proceedings.mlr.press/v162/geiger22a.html.</w:t>
+      </w:r>
+    </w:p>
+    <w:p>
+      <w:pPr>
+        <w:spacing w:after="80" w:line="240" w:lineRule="auto"/>
+        <w:ind w:left="403" w:hanging="403"/>
+      </w:pPr>
+      <w:r>
+        <w:rPr>
+          <w:color w:val="26343D"/>
+          <w:sz w:val="17"/>
+        </w:rPr>
+        <w:t>[57] O. Roy and M. Vetterli, “The Effective Rank: A Measure of Effective Dimensionality,” in Proc. 15th European Signal Processing Conference (EUSIPCO), pp. 606–610, 2007. Available: https://www.eurasip.org/Proceedings/Eusipco/Eusipco2007/Papers/a5p-h05.pdf. Archive DOI: 10.5281/zenodo.40328.</w:t>
+      </w:r>
+    </w:p>
+    <w:p>
+      <w:pPr>
+        <w:spacing w:after="80" w:line="240" w:lineRule="auto"/>
+        <w:ind w:left="403" w:hanging="403"/>
+      </w:pPr>
+      <w:r>
+        <w:rPr>
+          <w:color w:val="26343D"/>
+          <w:sz w:val="17"/>
+        </w:rPr>
+        <w:t>[58] Meta AI, “DINOv2 Model Card” and “Linear Classifier Implementation,” DINOv2 GitHub repository, n.d. Available: https://github.com/facebookresearch/dinov2/blob/main/MODEL_CARD.md; https://github.com/facebookresearch/dinov2/blob/main/dinov2/hub/classifiers.py. Accessed 11 Oct. 2026. Software documentation; no DOI.</w:t>
       </w:r>
     </w:p>
     <w:sectPr>

</xml_diff>

<commit_message>
Streamline supplementary figures and synchronize references
</commit_message>
<xml_diff>
--- a/docs/PAPER_DRAFT_v5.docx
+++ b/docs/PAPER_DRAFT_v5.docx
@@ -1977,7 +1977,7 @@
         <w:jc w:val="both"/>
       </w:pPr>
       <w:r>
-        <w:t>DINOv2 ViT-S/14 differs: Top-1 remains between 0.06% and 0.18% across K, with a paired K=1-to-256 change of −0.02 percentage points (95% CI −0.16 to 0.12; N=1,000). Its official readout includes a mean normalized-patch representation, so we report the true-class margin alongside accuracy. The mean margin changes from −9.233 to −7.982 (paired change +1.250, 95% CI 1.091–1.410; Supplementary Figure S10)</w:t>
+        <w:t>DINOv2 ViT-S/14 differs: Top-1 remains between 0.06% and 0.18% across K, with a paired K=1-to-256 change of −0.02 percentage points (95% CI −0.16 to 0.12; N=1,000). Its official readout includes a mean normalized-patch representation, so we report the true-class margin alongside accuracy. The mean margin changes from −9.233 to −7.982 (paired change +1.250, 95% CI 1.091–1.410; Supplementary Figure S3)</w:t>
       </w:r>
       <w:r>
         <w:t xml:space="preserve">. </w:t>
@@ -5434,7 +5434,7 @@
         <w:jc w:val="both"/>
       </w:pPr>
       <w:r>
-        <w:t xml:space="preserve">The primary projection-path audit remains limited to DeiT-Small and ViT-B/16 AugReg and is reported separately in Supplementary Figure S12. With the residual stream clean, the V-only immediate-readout norm is 97.4% and 99.4% of the corresponding </w:t>
+        <w:t xml:space="preserve">The primary projection-path audit remains limited to DeiT-Small and ViT-B/16 AugReg and is reported separately in Supplementary Figure S8. With the residual stream clean, the V-only immediate-readout norm is 97.4% and 99.4% of the corresponding </w:t>
       </w:r>
       <m:oMath>
         <m:r>
@@ -5466,7 +5466,7 @@
       </w:r>
       <w:r>
         <w:lastRenderedPageBreak/>
-        <w:t>the reduced DeiT-Tiny and DINOv2 replications are reported separately in Supplementary Figure S11; Figure 5 uses the immediate-readout norm for every architecture.</w:t>
+        <w:t>the reduced DeiT-Tiny and DINOv2 replications are reported separately in Supplementary Figure S6; Figure 5 uses the immediate-readout norm for every architecture.</w:t>
       </w:r>
     </w:p>
     <w:p>
@@ -6931,7 +6931,7 @@
         </m:r>
       </m:oMath>
       <w:r>
-        <w:t xml:space="preserve"> for DeiT-Small at Block 8 and ViT-B/16 AugReg at Block 7, with token patterns as rows and feature directions as columns. Supplementary Figure S14 extends the same 8-by-5 grid across the three tested depths for each architecture. The full grid contains 240 unique model–depth–pattern–direction conditions. DeiT-Tiny and DINOv2 have separate Block-8 replications and are not part of the six-panel depth grid.</w:t>
+        <w:t xml:space="preserve"> for DeiT-Small at Block 8 and ViT-B/16 AugReg at Block 7, with token patterns as rows and feature directions as columns. Supplementary Figure S7 extends the same 8-by-5 grid across the three tested depths for each architecture. The full grid contains 240 unique model–depth–pattern–direction conditions. DeiT-Tiny and DINOv2 have separate Block-8 replications and are not part of the six-panel depth grid.</w:t>
       </w:r>
     </w:p>
     <w:p>

</xml_diff>